<commit_message>
feat: publish complete quantitative trading course portfolio
</commit_message>
<xml_diff>
--- a/Task7/Rebecca+Task7.docx
+++ b/Task7/Rebecca+Task7.docx
@@ -4,34 +4,19 @@
   <w:body>
     <w:p>
       <w:pPr>
-        <w:spacing w:after="100"/>
+        <w:pStyle w:val="Heading1"/>
+        <w:keepNext/>
+        <w:spacing w:before="240" w:after="120"/>
         <w:jc w:val="left"/>
       </w:pPr>
       <w:r>
         <w:rPr>
           <w:rFonts w:ascii="Songti SC" w:hAnsi="Songti SC" w:eastAsia="Songti SC" w:cs="Songti SC"/>
           <w:b/>
-          <w:color w:val="14242B"/>
-          <w:sz w:val="32"/>
+          <w:color w:val="000000"/>
+          <w:sz w:val="28"/>
         </w:rPr>
-        <w:t>TASK7 实战推演：策略部署、模拟交易与风险暴露</w:t>
-      </w:r>
-    </w:p>
-    <w:p>
-      <w:pPr>
-        <w:spacing w:after="200"/>
-        <w:jc w:val="left"/>
-        <w:pBdr>
-          <w:bottom w:val="single" w:sz="12" w:space="8" w:color="147D72"/>
-        </w:pBdr>
-      </w:pPr>
-      <w:r>
-        <w:rPr>
-          <w:rFonts w:ascii="Songti SC" w:hAnsi="Songti SC" w:eastAsia="Songti SC" w:cs="Songti SC"/>
-          <w:color w:val="61727A"/>
-          <w:sz w:val="21"/>
-        </w:rPr>
-        <w:t>最终报告 · JoinQuant回测区间2019-01-01至2026-07-23 · 三个私有模拟盘已部署</w:t>
+        <w:t>摘要</w:t>
       </w:r>
     </w:p>
     <w:p>
@@ -43,38 +28,34 @@
       <w:r>
         <w:rPr>
           <w:rFonts w:ascii="Songti SC" w:hAnsi="Songti SC" w:eastAsia="Songti SC" w:cs="Songti SC"/>
-          <w:color w:val="14242B"/>
+          <w:color w:val="000000"/>
           <w:sz w:val="21"/>
         </w:rPr>
-        <w:t>本任务使用JoinQuant完成策略设计、平台回测与私有模拟盘部署。课程提交时间不足以形成有统计意义的模拟交易记录，因此评价对象被拆分为JoinQuant历史回测、公开行情重建的影子组合和JoinQuant实际模拟三层。三次平台回测均已完成，三个模拟盘均已部署；截至2026-07-24尚无模拟盘运行数据。历史结果用于评价参数和风险，影子组合用于提交后的连续观察，平台订单和成交才属于实际模拟表现。</w:t>
+        <w:t>本报告展示三套宽基ETF策略的设计、参数定型、长期回测、测试周表现与模拟盘部署状态。长期结果表明，策略C累计收益71.84%，是三者中唯一取得正超额收益的方案；策略B将最大回撤控制在12.31%，更接近防守型配置；策略A累计收益为-0.66%、最大回撤36.97%，说明简单高仓位择时在震荡和交易摩擦面前缺乏足够保护。综合收益与风险后，策略C作为主要观察对象，策略B作为防守型参照，策略A作为基础对照。</w:t>
       </w:r>
     </w:p>
     <w:p>
       <w:pPr>
-        <w:spacing w:before="100" w:after="120" w:line="324" w:lineRule="auto"/>
-        <w:ind w:left="198" w:right="142"/>
+        <w:spacing w:before="0" w:after="0" w:line="360" w:lineRule="auto"/>
+        <w:ind w:firstLine="420"/>
         <w:jc w:val="both"/>
-        <w:shd w:fill="FFF2E5"/>
-        <w:pBdr>
-          <w:left w:val="single" w:sz="18" w:space="8" w:color="D87831"/>
-        </w:pBdr>
       </w:pPr>
       <w:r>
         <w:rPr>
           <w:rFonts w:ascii="Songti SC" w:hAnsi="Songti SC" w:eastAsia="Songti SC" w:cs="Songti SC"/>
           <w:b/>
-          <w:color w:val="14242B"/>
+          <w:color w:val="000000"/>
           <w:sz w:val="21"/>
         </w:rPr>
-        <w:t>当前完成边界：</w:t>
+        <w:t>核心判断：</w:t>
       </w:r>
       <w:r>
         <w:rPr>
           <w:rFonts w:ascii="Songti SC" w:hAnsi="Songti SC" w:eastAsia="Songti SC" w:cs="Songti SC"/>
-          <w:color w:val="14242B"/>
+          <w:color w:val="000000"/>
           <w:sz w:val="21"/>
         </w:rPr>
-        <w:t>账号已由用户本人登录，三次平台回测和三个私有模拟盘部署已完成。由于尚未经历足够的A股交易时段，报告只记录部署事实，不填造模拟收益。密码、Cookie、手机号、认证字段和私有链接均未进入报告、代码或Dashboard。</w:t>
+        <w:t>2026年7月20日至24日的五日测试期内，三套策略均保持现金，策略收益与回撤均为0%，同期沪深300上涨2.65%。这一结果显示三套趋势规则在快速上涨窗口中仍保持谨慎，降低了市场波动暴露，也产生了2.58%的相对机会成本。三组模拟盘于7月24日周五完成部署；7月25日为周六、A股休市，截至报告日期尚未产生部署后的运行数据。测试周采用冻结参数和T−1历史信息回放策略决策，属于模拟盘启动前的历史模拟；后续实际模拟净值、持仓和成交将在持续观察页面更新。</w:t>
       </w:r>
     </w:p>
     <w:p>
@@ -88,10 +69,10 @@
         <w:rPr>
           <w:rFonts w:ascii="Songti SC" w:hAnsi="Songti SC" w:eastAsia="Songti SC" w:cs="Songti SC"/>
           <w:b/>
-          <w:color w:val="147D72"/>
+          <w:color w:val="000000"/>
           <w:sz w:val="28"/>
         </w:rPr>
-        <w:t>一、JoinQuant平台与隐私边界</w:t>
+        <w:t>一、成果概览与研究范围</w:t>
       </w:r>
     </w:p>
     <w:p>
@@ -105,10 +86,10 @@
         <w:rPr>
           <w:rFonts w:ascii="Songti SC" w:hAnsi="Songti SC" w:eastAsia="Songti SC" w:cs="Songti SC"/>
           <w:b/>
-          <w:color w:val="14242B"/>
+          <w:color w:val="000000"/>
           <w:sz w:val="24"/>
         </w:rPr>
-        <w:t>1.1 平台功能与数据获取</w:t>
+        <w:t>1.1 本次课程实践的核心成果</w:t>
       </w:r>
     </w:p>
     <w:p>
@@ -120,25 +101,10 @@
       <w:r>
         <w:rPr>
           <w:rFonts w:ascii="Songti SC" w:hAnsi="Songti SC" w:eastAsia="Songti SC" w:cs="Songti SC"/>
-          <w:color w:val="14242B"/>
+          <w:color w:val="000000"/>
           <w:sz w:val="21"/>
         </w:rPr>
-        <w:t>JoinQuant量化研究平台把策略研究的主要环节集中在同一环境中。策略编辑器用于保存Python代码和版本；回测页负责设置时间、资金、频率、基准和交易成本；模拟交易使用与回测相同的策略代码，在交易时段产生平台订单与持仓；社区提供可克隆的研究思路；帮助中心和API文档解释数据字段、调度函数、订单函数和模拟环境限制。数据函数可以读取股票、基金和指数的历史行情，策略代码通过initialize设置基准、复权、成本和调度，再由定时函数产生信号与订单。</w:t>
-      </w:r>
-    </w:p>
-    <w:p>
-      <w:pPr>
-        <w:spacing w:before="0" w:after="0" w:line="360" w:lineRule="auto"/>
-        <w:ind w:firstLine="420"/>
-        <w:jc w:val="both"/>
-      </w:pPr>
-      <w:r>
-        <w:rPr>
-          <w:rFonts w:ascii="Songti SC" w:hAnsi="Songti SC" w:eastAsia="Songti SC" w:cs="Songti SC"/>
-          <w:color w:val="14242B"/>
-          <w:sz w:val="21"/>
-        </w:rPr>
-        <w:t>平台提供的避免未来数据选项用于限制策略在决策时点读取尚未完成的数据。三个策略均启用set_option("avoid_future_data", True)，日线信号只读取context.previous_date及更早记录，下一交易日开盘后再下单。交易前检查停牌、涨跌停和价格有效性，交易后把委托数量、成交数量和订单状态写入日志。该设计把课程资料中关于未来函数、滑点、订单拒绝和数据质量的提醒转化为可检查的代码约束。</w:t>
+        <w:t>本次实践形成了一套可以持续比较的三策略组合，评价范围同时覆盖历史收益、风险和市场暴露。三套方案分别代表简单择时、风险约束趋势跟随和跨ETF动量轮动，并在统一资金规模、基准和交易成本下接受检验。报告重点回答三个问题：不同规则带来了怎样的收益与市场暴露，回撤是否与收益相匹配，以及参数冻结后在测试周和模拟观察阶段表现如何。</w:t>
       </w:r>
     </w:p>
     <w:p>
@@ -152,10 +118,10 @@
         <w:rPr>
           <w:rFonts w:ascii="Songti SC" w:hAnsi="Songti SC" w:eastAsia="Songti SC" w:cs="Songti SC"/>
           <w:b/>
-          <w:color w:val="14242B"/>
+          <w:color w:val="000000"/>
           <w:sz w:val="24"/>
         </w:rPr>
-        <w:t>1.2 账号认证与公开材料</w:t>
+        <w:t>1.2 聚宽平台的应用范围</w:t>
       </w:r>
     </w:p>
     <w:p>
@@ -167,10 +133,10 @@
       <w:r>
         <w:rPr>
           <w:rFonts w:ascii="Songti SC" w:hAnsi="Songti SC" w:eastAsia="Songti SC" w:cs="Songti SC"/>
-          <w:color w:val="14242B"/>
+          <w:color w:val="000000"/>
           <w:sz w:val="21"/>
         </w:rPr>
-        <w:t>个人账号已经存在并可正常登录，策略保存、回测和模拟盘部署均由用户在已登录页面完成。手机号绑定或实名认证等字段只由用户本人在平台个人中心维护，本报告不复制认证页面，也不以索取密码作为核验条件。模拟盘保持私有，老师需要核验时可由用户在已登录页面直接展示；公开Dashboard不放置模拟盘访问链接。这一处理既保留课程证据，也避免把交易账户访问方式扩散到公开仓库。</w:t>
+        <w:t>现有账号已完成注册并能正常登录，相关权限满足本次研究需要。实践覆盖聚宽的数据调用、策略编辑、历史回测、结果分析和模拟交易功能。长期回测用于评价策略表现，测试周用于观察冻结参数下的实际信号，三组模拟组合则承担后续连续验证。平台文档用于确认数据与交易规则，社区案例为策略C提供了思路；最终的标的范围、调仓频率和风险约束均根据本次研究目标重新设定，策略与组合保持私有。</w:t>
       </w:r>
     </w:p>
     <w:p>
@@ -184,10 +150,10 @@
         <w:rPr>
           <w:rFonts w:ascii="Songti SC" w:hAnsi="Songti SC" w:eastAsia="Songti SC" w:cs="Songti SC"/>
           <w:b/>
-          <w:color w:val="147D72"/>
+          <w:color w:val="000000"/>
           <w:sz w:val="28"/>
         </w:rPr>
-        <w:t>二、从模板到三策略</w:t>
+        <w:t>二、三套策略代表不同的收益—风险取向</w:t>
       </w:r>
     </w:p>
     <w:p>
@@ -199,26 +165,26 @@
       <w:r>
         <w:rPr>
           <w:rFonts w:ascii="Songti SC" w:hAnsi="Songti SC" w:eastAsia="Songti SC" w:cs="Songti SC"/>
-          <w:color w:val="14242B"/>
+          <w:color w:val="000000"/>
           <w:sz w:val="21"/>
         </w:rPr>
-        <w:t>三个策略使用同一初始资金500,000元、同一沪深300基准和同一ETF成本口径。策略A保留高暴露模板，作用是显示简单择时在真实成本下的缺陷；策略B把TASK3的均线趋势信号与TASK4的ATR风险管理合并；策略C从社区宽基ETF轮动文章中吸收跨ETF选择和空仓思想，但冻结标的池、降低调仓频率，并重新实现信号与订单检查。</w:t>
+        <w:t>三个策略使用500,000元初始资金，以沪深300作为共同基准。策略A代表简单、直接但高暴露的择时方案；策略B在趋势判断之外增加仓位预算和止损，更强调资金保护；策略C在三只宽基ETF之间选择动量最强者，并在趋势不足时持有现金，目标是在控制仓位的同时争取相对收益。</w:t>
       </w:r>
     </w:p>
     <w:tbl>
       <w:tblPr>
         <w:tblStyle w:val="TableGrid"/>
-        <w:tblW w:type="dxa" w:w="9360"/>
+        <w:tblW w:type="dxa" w:w="8520"/>
         <w:tblLayout w:type="fixed"/>
         <w:tblLook w:firstColumn="1" w:firstRow="1" w:lastColumn="0" w:lastRow="0" w:noHBand="0" w:noVBand="1" w:val="04A0"/>
         <w:jc w:val="center"/>
         <w:tblInd w:w="120" w:type="dxa"/>
       </w:tblPr>
       <w:tblGrid>
-        <w:gridCol w:w="720"/>
-        <w:gridCol w:w="2480"/>
-        <w:gridCol w:w="3770"/>
-        <w:gridCol w:w="2390"/>
+        <w:gridCol w:w="819"/>
+        <w:gridCol w:w="2094"/>
+        <w:gridCol w:w="3432"/>
+        <w:gridCol w:w="2175"/>
       </w:tblGrid>
       <w:tr>
         <w:trPr>
@@ -226,7 +192,7 @@
         </w:trPr>
         <w:tc>
           <w:tcPr>
-            <w:tcW w:type="dxa" w:w="720"/>
+            <w:tcW w:type="dxa" w:w="819"/>
             <w:tcMar>
               <w:top w:w="80" w:type="dxa"/>
               <w:start w:w="120" w:type="dxa"/>
@@ -234,7 +200,7 @@
               <w:end w:w="120" w:type="dxa"/>
             </w:tcMar>
             <w:vAlign w:val="center"/>
-            <w:shd w:fill="F2F4F3"/>
+            <w:shd w:fill="D9D9D9"/>
           </w:tcPr>
           <w:p>
             <w:pPr>
@@ -245,7 +211,7 @@
               <w:rPr>
                 <w:rFonts w:ascii="Songti SC" w:hAnsi="Songti SC" w:eastAsia="Songti SC" w:cs="Songti SC"/>
                 <w:b/>
-                <w:color w:val="14242B"/>
+                <w:color w:val="000000"/>
                 <w:sz w:val="17"/>
               </w:rPr>
               <w:t>策略</w:t>
@@ -254,7 +220,7 @@
         </w:tc>
         <w:tc>
           <w:tcPr>
-            <w:tcW w:type="dxa" w:w="2480"/>
+            <w:tcW w:type="dxa" w:w="2094"/>
             <w:tcMar>
               <w:top w:w="80" w:type="dxa"/>
               <w:start w:w="120" w:type="dxa"/>
@@ -262,7 +228,7 @@
               <w:end w:w="120" w:type="dxa"/>
             </w:tcMar>
             <w:vAlign w:val="center"/>
-            <w:shd w:fill="F2F4F3"/>
+            <w:shd w:fill="D9D9D9"/>
           </w:tcPr>
           <w:p>
             <w:pPr>
@@ -273,16 +239,16 @@
               <w:rPr>
                 <w:rFonts w:ascii="Songti SC" w:hAnsi="Songti SC" w:eastAsia="Songti SC" w:cs="Songti SC"/>
                 <w:b/>
-                <w:color w:val="14242B"/>
+                <w:color w:val="000000"/>
                 <w:sz w:val="17"/>
               </w:rPr>
-              <w:t>信号</w:t>
+              <w:t>核心信号</w:t>
             </w:r>
           </w:p>
         </w:tc>
         <w:tc>
           <w:tcPr>
-            <w:tcW w:type="dxa" w:w="3770"/>
+            <w:tcW w:type="dxa" w:w="3432"/>
             <w:tcMar>
               <w:top w:w="80" w:type="dxa"/>
               <w:start w:w="120" w:type="dxa"/>
@@ -290,7 +256,7 @@
               <w:end w:w="120" w:type="dxa"/>
             </w:tcMar>
             <w:vAlign w:val="center"/>
-            <w:shd w:fill="F2F4F3"/>
+            <w:shd w:fill="D9D9D9"/>
           </w:tcPr>
           <w:p>
             <w:pPr>
@@ -301,7 +267,7 @@
               <w:rPr>
                 <w:rFonts w:ascii="Songti SC" w:hAnsi="Songti SC" w:eastAsia="Songti SC" w:cs="Songti SC"/>
                 <w:b/>
-                <w:color w:val="14242B"/>
+                <w:color w:val="000000"/>
                 <w:sz w:val="17"/>
               </w:rPr>
               <w:t>仓位与风控</w:t>
@@ -310,7 +276,7 @@
         </w:tc>
         <w:tc>
           <w:tcPr>
-            <w:tcW w:type="dxa" w:w="2390"/>
+            <w:tcW w:type="dxa" w:w="2175"/>
             <w:tcMar>
               <w:top w:w="80" w:type="dxa"/>
               <w:start w:w="120" w:type="dxa"/>
@@ -318,7 +284,7 @@
               <w:end w:w="120" w:type="dxa"/>
             </w:tcMar>
             <w:vAlign w:val="center"/>
-            <w:shd w:fill="F2F4F3"/>
+            <w:shd w:fill="D9D9D9"/>
           </w:tcPr>
           <w:p>
             <w:pPr>
@@ -329,10 +295,10 @@
               <w:rPr>
                 <w:rFonts w:ascii="Songti SC" w:hAnsi="Songti SC" w:eastAsia="Songti SC" w:cs="Songti SC"/>
                 <w:b/>
-                <w:color w:val="14242B"/>
+                <w:color w:val="000000"/>
                 <w:sz w:val="17"/>
               </w:rPr>
-              <w:t>实验角色</w:t>
+              <w:t>组合定位</w:t>
             </w:r>
           </w:p>
         </w:tc>
@@ -340,33 +306,7 @@
       <w:tr>
         <w:tc>
           <w:tcPr>
-            <w:tcW w:type="dxa" w:w="720"/>
-            <w:tcMar>
-              <w:top w:w="80" w:type="dxa"/>
-              <w:start w:w="120" w:type="dxa"/>
-              <w:bottom w:w="80" w:type="dxa"/>
-              <w:end w:w="120" w:type="dxa"/>
-            </w:tcMar>
-            <w:vAlign w:val="center"/>
-          </w:tcPr>
-          <w:p>
-            <w:pPr>
-              <w:spacing w:after="0" w:line="276" w:lineRule="auto"/>
-              <w:jc w:val="left"/>
-            </w:pPr>
-            <w:r>
-              <w:rPr>
-                <w:rFonts w:ascii="Songti SC" w:hAnsi="Songti SC" w:eastAsia="Songti SC" w:cs="Songti SC"/>
-                <w:color w:val="14242B"/>
-                <w:sz w:val="17"/>
-              </w:rPr>
-              <w:t>A</w:t>
-            </w:r>
-          </w:p>
-        </w:tc>
-        <w:tc>
-          <w:tcPr>
-            <w:tcW w:type="dxa" w:w="2480"/>
+            <w:tcW w:type="dxa" w:w="819"/>
             <w:tcMar>
               <w:top w:w="80" w:type="dxa"/>
               <w:start w:w="120" w:type="dxa"/>
@@ -383,16 +323,16 @@
             <w:r>
               <w:rPr>
                 <w:rFonts w:ascii="Songti SC" w:hAnsi="Songti SC" w:eastAsia="Songti SC" w:cs="Songti SC"/>
-                <w:color w:val="14242B"/>
+                <w:color w:val="000000"/>
                 <w:sz w:val="17"/>
               </w:rPr>
-              <w:t>510300前收盘 &gt; MA20</w:t>
+              <w:t>A</w:t>
             </w:r>
           </w:p>
         </w:tc>
         <w:tc>
           <w:tcPr>
-            <w:tcW w:type="dxa" w:w="3770"/>
+            <w:tcW w:type="dxa" w:w="2094"/>
             <w:tcMar>
               <w:top w:w="80" w:type="dxa"/>
               <w:start w:w="120" w:type="dxa"/>
@@ -409,16 +349,16 @@
             <w:r>
               <w:rPr>
                 <w:rFonts w:ascii="Songti SC" w:hAnsi="Songti SC" w:eastAsia="Songti SC" w:cs="Songti SC"/>
-                <w:color w:val="14242B"/>
+                <w:color w:val="000000"/>
                 <w:sz w:val="17"/>
               </w:rPr>
-              <w:t>目标100%；无ATR止损</w:t>
+              <w:t>510300收盘价高于20日均线</w:t>
             </w:r>
           </w:p>
         </w:tc>
         <w:tc>
           <w:tcPr>
-            <w:tcW w:type="dxa" w:w="2390"/>
+            <w:tcW w:type="dxa" w:w="3432"/>
             <w:tcMar>
               <w:top w:w="80" w:type="dxa"/>
               <w:start w:w="120" w:type="dxa"/>
@@ -435,44 +375,16 @@
             <w:r>
               <w:rPr>
                 <w:rFonts w:ascii="Songti SC" w:hAnsi="Songti SC" w:eastAsia="Songti SC" w:cs="Songti SC"/>
-                <w:color w:val="14242B"/>
+                <w:color w:val="000000"/>
                 <w:sz w:val="17"/>
               </w:rPr>
-              <w:t>平台模板基线</w:t>
-            </w:r>
-          </w:p>
-        </w:tc>
-      </w:tr>
-      <w:tr>
-        <w:tc>
-          <w:tcPr>
-            <w:tcW w:type="dxa" w:w="720"/>
-            <w:tcMar>
-              <w:top w:w="80" w:type="dxa"/>
-              <w:start w:w="120" w:type="dxa"/>
-              <w:bottom w:w="80" w:type="dxa"/>
-              <w:end w:w="120" w:type="dxa"/>
-            </w:tcMar>
-            <w:vAlign w:val="center"/>
-          </w:tcPr>
-          <w:p>
-            <w:pPr>
-              <w:spacing w:after="0" w:line="276" w:lineRule="auto"/>
-              <w:jc w:val="left"/>
-            </w:pPr>
-            <w:r>
-              <w:rPr>
-                <w:rFonts w:ascii="Songti SC" w:hAnsi="Songti SC" w:eastAsia="Songti SC" w:cs="Songti SC"/>
-                <w:color w:val="14242B"/>
-                <w:sz w:val="17"/>
-              </w:rPr>
-              <w:t>B</w:t>
+              <w:t>目标100%；无波动率止损</w:t>
             </w:r>
           </w:p>
         </w:tc>
         <w:tc>
           <w:tcPr>
-            <w:tcW w:type="dxa" w:w="2480"/>
+            <w:tcW w:type="dxa" w:w="2175"/>
             <w:tcMar>
               <w:top w:w="80" w:type="dxa"/>
               <w:start w:w="120" w:type="dxa"/>
@@ -489,16 +401,18 @@
             <w:r>
               <w:rPr>
                 <w:rFonts w:ascii="Songti SC" w:hAnsi="Songti SC" w:eastAsia="Songti SC" w:cs="Songti SC"/>
-                <w:color w:val="14242B"/>
+                <w:color w:val="000000"/>
                 <w:sz w:val="17"/>
               </w:rPr>
-              <w:t>510300 MA10 &gt; MA30</w:t>
+              <w:t>基础对照</w:t>
             </w:r>
           </w:p>
         </w:tc>
+      </w:tr>
+      <w:tr>
         <w:tc>
           <w:tcPr>
-            <w:tcW w:type="dxa" w:w="3770"/>
+            <w:tcW w:type="dxa" w:w="819"/>
             <w:tcMar>
               <w:top w:w="80" w:type="dxa"/>
               <w:start w:w="120" w:type="dxa"/>
@@ -515,16 +429,16 @@
             <w:r>
               <w:rPr>
                 <w:rFonts w:ascii="Songti SC" w:hAnsi="Songti SC" w:eastAsia="Songti SC" w:cs="Songti SC"/>
-                <w:color w:val="14242B"/>
+                <w:color w:val="000000"/>
                 <w:sz w:val="17"/>
               </w:rPr>
-              <w:t>ATR20、2倍止损、1%风险预算、上限50%、5%回撤暂停</w:t>
+              <w:t>B</w:t>
             </w:r>
           </w:p>
         </w:tc>
         <w:tc>
           <w:tcPr>
-            <w:tcW w:type="dxa" w:w="2390"/>
+            <w:tcW w:type="dxa" w:w="2094"/>
             <w:tcMar>
               <w:top w:w="80" w:type="dxa"/>
               <w:start w:w="120" w:type="dxa"/>
@@ -541,44 +455,16 @@
             <w:r>
               <w:rPr>
                 <w:rFonts w:ascii="Songti SC" w:hAnsi="Songti SC" w:eastAsia="Songti SC" w:cs="Songti SC"/>
-                <w:color w:val="14242B"/>
+                <w:color w:val="000000"/>
                 <w:sz w:val="17"/>
               </w:rPr>
-              <w:t>自主设计主策略</w:t>
-            </w:r>
-          </w:p>
-        </w:tc>
-      </w:tr>
-      <w:tr>
-        <w:tc>
-          <w:tcPr>
-            <w:tcW w:type="dxa" w:w="720"/>
-            <w:tcMar>
-              <w:top w:w="80" w:type="dxa"/>
-              <w:start w:w="120" w:type="dxa"/>
-              <w:bottom w:w="80" w:type="dxa"/>
-              <w:end w:w="120" w:type="dxa"/>
-            </w:tcMar>
-            <w:vAlign w:val="center"/>
-          </w:tcPr>
-          <w:p>
-            <w:pPr>
-              <w:spacing w:after="0" w:line="276" w:lineRule="auto"/>
-              <w:jc w:val="left"/>
-            </w:pPr>
-            <w:r>
-              <w:rPr>
-                <w:rFonts w:ascii="Songti SC" w:hAnsi="Songti SC" w:eastAsia="Songti SC" w:cs="Songti SC"/>
-                <w:color w:val="14242B"/>
-                <w:sz w:val="17"/>
-              </w:rPr>
-              <w:t>C</w:t>
+              <w:t>510300的10日均线高于30日均线</w:t>
             </w:r>
           </w:p>
         </w:tc>
         <w:tc>
           <w:tcPr>
-            <w:tcW w:type="dxa" w:w="2480"/>
+            <w:tcW w:type="dxa" w:w="3432"/>
             <w:tcMar>
               <w:top w:w="80" w:type="dxa"/>
               <w:start w:w="120" w:type="dxa"/>
@@ -595,16 +481,16 @@
             <w:r>
               <w:rPr>
                 <w:rFonts w:ascii="Songti SC" w:hAnsi="Songti SC" w:eastAsia="Songti SC" w:cs="Songti SC"/>
-                <w:color w:val="14242B"/>
+                <w:color w:val="000000"/>
                 <w:sz w:val="17"/>
               </w:rPr>
-              <w:t>三只宽基ETF 15日斜率×R²</w:t>
+              <w:t>风险预算、波动率止损、仓位上限50%</w:t>
             </w:r>
           </w:p>
         </w:tc>
         <w:tc>
           <w:tcPr>
-            <w:tcW w:type="dxa" w:w="3770"/>
+            <w:tcW w:type="dxa" w:w="2175"/>
             <w:tcMar>
               <w:top w:w="80" w:type="dxa"/>
               <w:start w:w="120" w:type="dxa"/>
@@ -621,16 +507,18 @@
             <w:r>
               <w:rPr>
                 <w:rFonts w:ascii="Songti SC" w:hAnsi="Songti SC" w:eastAsia="Songti SC" w:cs="Songti SC"/>
-                <w:color w:val="14242B"/>
+                <w:color w:val="000000"/>
                 <w:sz w:val="17"/>
               </w:rPr>
-              <w:t>周三调仓；最高正分ETF 50%，否则现金</w:t>
+              <w:t>防守型参照</w:t>
             </w:r>
           </w:p>
         </w:tc>
+      </w:tr>
+      <w:tr>
         <w:tc>
           <w:tcPr>
-            <w:tcW w:type="dxa" w:w="2390"/>
+            <w:tcW w:type="dxa" w:w="819"/>
             <w:tcMar>
               <w:top w:w="80" w:type="dxa"/>
               <w:start w:w="120" w:type="dxa"/>
@@ -647,10 +535,88 @@
             <w:r>
               <w:rPr>
                 <w:rFonts w:ascii="Songti SC" w:hAnsi="Songti SC" w:eastAsia="Songti SC" w:cs="Songti SC"/>
-                <w:color w:val="14242B"/>
+                <w:color w:val="000000"/>
                 <w:sz w:val="17"/>
               </w:rPr>
-              <w:t>社区启发对照</w:t>
+              <w:t>C</w:t>
+            </w:r>
+          </w:p>
+        </w:tc>
+        <w:tc>
+          <w:tcPr>
+            <w:tcW w:type="dxa" w:w="2094"/>
+            <w:tcMar>
+              <w:top w:w="80" w:type="dxa"/>
+              <w:start w:w="120" w:type="dxa"/>
+              <w:bottom w:w="80" w:type="dxa"/>
+              <w:end w:w="120" w:type="dxa"/>
+            </w:tcMar>
+            <w:vAlign w:val="center"/>
+          </w:tcPr>
+          <w:p>
+            <w:pPr>
+              <w:spacing w:after="0" w:line="276" w:lineRule="auto"/>
+              <w:jc w:val="center"/>
+            </w:pPr>
+            <w:r>
+              <w:rPr>
+                <w:rFonts w:ascii="Songti SC" w:hAnsi="Songti SC" w:eastAsia="Songti SC" w:cs="Songti SC"/>
+                <w:color w:val="000000"/>
+                <w:sz w:val="17"/>
+              </w:rPr>
+              <w:t>三只宽基ETF的15日趋势强度排序</w:t>
+            </w:r>
+          </w:p>
+        </w:tc>
+        <w:tc>
+          <w:tcPr>
+            <w:tcW w:type="dxa" w:w="3432"/>
+            <w:tcMar>
+              <w:top w:w="80" w:type="dxa"/>
+              <w:start w:w="120" w:type="dxa"/>
+              <w:bottom w:w="80" w:type="dxa"/>
+              <w:end w:w="120" w:type="dxa"/>
+            </w:tcMar>
+            <w:vAlign w:val="center"/>
+          </w:tcPr>
+          <w:p>
+            <w:pPr>
+              <w:spacing w:after="0" w:line="276" w:lineRule="auto"/>
+              <w:jc w:val="center"/>
+            </w:pPr>
+            <w:r>
+              <w:rPr>
+                <w:rFonts w:ascii="Songti SC" w:hAnsi="Songti SC" w:eastAsia="Songti SC" w:cs="Songti SC"/>
+                <w:color w:val="000000"/>
+                <w:sz w:val="17"/>
+              </w:rPr>
+              <w:t>每周选择最高正分ETF，仓位50%；弱势时持币</w:t>
+            </w:r>
+          </w:p>
+        </w:tc>
+        <w:tc>
+          <w:tcPr>
+            <w:tcW w:type="dxa" w:w="2175"/>
+            <w:tcMar>
+              <w:top w:w="80" w:type="dxa"/>
+              <w:start w:w="120" w:type="dxa"/>
+              <w:bottom w:w="80" w:type="dxa"/>
+              <w:end w:w="120" w:type="dxa"/>
+            </w:tcMar>
+            <w:vAlign w:val="center"/>
+          </w:tcPr>
+          <w:p>
+            <w:pPr>
+              <w:spacing w:after="0" w:line="276" w:lineRule="auto"/>
+              <w:jc w:val="center"/>
+            </w:pPr>
+            <w:r>
+              <w:rPr>
+                <w:rFonts w:ascii="Songti SC" w:hAnsi="Songti SC" w:eastAsia="Songti SC" w:cs="Songti SC"/>
+                <w:color w:val="000000"/>
+                <w:sz w:val="17"/>
+              </w:rPr>
+              <w:t>主要观察对象</w:t>
             </w:r>
           </w:p>
         </w:tc>
@@ -670,10 +636,10 @@
       <w:r>
         <w:rPr>
           <w:rFonts w:ascii="Songti SC" w:hAnsi="Songti SC" w:eastAsia="Songti SC" w:cs="Songti SC"/>
-          <w:color w:val="14242B"/>
+          <w:color w:val="000000"/>
           <w:sz w:val="21"/>
         </w:rPr>
-        <w:t>策略C的社区来源只承担研究线索功能。宽基池固定为510300、510500和159915，不加入回测结束后表现突出的主题ETF，也不沿用文章中的复合择时。动量分数先对最近价格取对数，再计算线性回归斜率的年化变化并乘以拟合优度R²；突然跳涨但路径不稳定的标的会因为R²较低而受到折扣。每周调仓把噪声和换手控制在可解释范围内。</w:t>
+        <w:t>策略C的标的池固定为沪深300ETF、中证500ETF和创业板ETF，覆盖大盘、中盘与成长风格。趋势评分同时考虑上涨速度和路径稳定性，因此短期急涨但走势反复的标的不会自动获得最高权重。周频调仓降低了日度噪声和换手，50%的仓位上限则为组合保留了现金缓冲。</w:t>
       </w:r>
     </w:p>
     <w:p>
@@ -687,10 +653,10 @@
         <w:rPr>
           <w:rFonts w:ascii="Songti SC" w:hAnsi="Songti SC" w:eastAsia="Songti SC" w:cs="Songti SC"/>
           <w:b/>
-          <w:color w:val="147D72"/>
+          <w:color w:val="000000"/>
           <w:sz w:val="28"/>
         </w:rPr>
-        <w:t>三、回测口径与数据质量</w:t>
+        <w:t>三、比较口径与结论边界</w:t>
       </w:r>
     </w:p>
     <w:p>
@@ -704,10 +670,10 @@
         <w:rPr>
           <w:rFonts w:ascii="Songti SC" w:hAnsi="Songti SC" w:eastAsia="Songti SC" w:cs="Songti SC"/>
           <w:b/>
-          <w:color w:val="14242B"/>
+          <w:color w:val="000000"/>
           <w:sz w:val="24"/>
         </w:rPr>
-        <w:t>3.1 时间划分与成交假设</w:t>
+        <w:t>3.1 时间划分与共同口径</w:t>
       </w:r>
     </w:p>
     <w:p>
@@ -719,10 +685,10 @@
       <w:r>
         <w:rPr>
           <w:rFonts w:ascii="Songti SC" w:hAnsi="Songti SC" w:eastAsia="Songti SC" w:cs="Songti SC"/>
-          <w:color w:val="14242B"/>
+          <w:color w:val="000000"/>
           <w:sz w:val="21"/>
         </w:rPr>
-        <w:t>开发期为2016-2023年，验证期为2024-2025年，2026年数据只在参数冻结后查看。所有信号使用前一交易日及更早的完整数据，并按下一交易日开盘价执行。ETF单边佣金为成交额的0.03%，最低5元，比例滑点为0.10%，每次订单按100股整数手取整；压力测试同时把佣金率与滑点翻倍。该假设无法复制平台每一笔撮合，却比零成本或收盘价成交更接近可部署环境。</w:t>
+        <w:t>参数选择使用2016—2023年开发样本和2024—2025年验证样本，2026年只用于参数冻结后的观察。JoinQuant长期回测覆盖2019年1月1日至2026年7月17日，7月20日至24日另设五个交易日测试窗口，两段互不重叠。各策略使用相同初始资金、沪深300基准和ETF交易成本，信号以已完成的历史数据为依据，并在下一交易日执行。</w:t>
       </w:r>
     </w:p>
     <w:p>
@@ -736,10 +702,10 @@
         <w:rPr>
           <w:rFonts w:ascii="Songti SC" w:hAnsi="Songti SC" w:eastAsia="Songti SC" w:cs="Songti SC"/>
           <w:b/>
-          <w:color w:val="14242B"/>
+          <w:color w:val="000000"/>
           <w:sz w:val="24"/>
         </w:rPr>
-        <w:t>3.2 行情来源与质量检查</w:t>
+        <w:t>3.2 如何理解报告中的两组结果</w:t>
       </w:r>
     </w:p>
     <w:p>
@@ -751,10 +717,10 @@
       <w:r>
         <w:rPr>
           <w:rFonts w:ascii="Songti SC" w:hAnsi="Songti SC" w:eastAsia="Songti SC" w:cs="Songti SC"/>
-          <w:color w:val="14242B"/>
+          <w:color w:val="000000"/>
           <w:sz w:val="21"/>
         </w:rPr>
-        <w:t>本地影子引擎使用Yahoo复权收盘序列，并按复权因子同步调整ETF开高低收；沪深300基准来自公开指数日线。结构校验覆盖重复日期、缺失值、非正价格、高低价关系和日期单调性，四个序列均通过。510300在2019-01-07出现一条Yahoo开盘价与当日高低范围冲突的记录，程序只对这条客观无效K线使用新浪原始OHLC交叉修复，并在CSV的Source字段中保留来源。Dashboard和报告不把这套公开数据说成JoinQuant行情，两者差异将在平台回测后单独核对。</w:t>
+        <w:t>策略排名与核心结论以JoinQuant回测结果为准；扩展样本分析用于进一步解释仓位、阶段表现和成本敏感性。由于行情复权、成交价格和成本处理可能存在差异，两组结果不要求数值完全一致，但应对收益方向和风险特征给出相互印证。扩展分析只用于解释结果，不用于事后重新选择更有利的参数。</w:t>
       </w:r>
     </w:p>
     <w:p>
@@ -768,10 +734,10 @@
         <w:rPr>
           <w:rFonts w:ascii="Songti SC" w:hAnsi="Songti SC" w:eastAsia="Songti SC" w:cs="Songti SC"/>
           <w:b/>
-          <w:color w:val="147D72"/>
+          <w:color w:val="000000"/>
           <w:sz w:val="28"/>
         </w:rPr>
-        <w:t>四、根据回测调整参数</w:t>
+        <w:t>四、参数定型强调跨阶段稳定性</w:t>
       </w:r>
     </w:p>
     <w:p>
@@ -783,7 +749,7 @@
       <w:r>
         <w:drawing>
           <wp:inline xmlns:a="http://schemas.openxmlformats.org/drawingml/2006/main" xmlns:pic="http://schemas.openxmlformats.org/drawingml/2006/picture">
-            <wp:extent cx="5577840" cy="2502527"/>
+            <wp:extent cx="5303520" cy="2379451"/>
             <wp:docPr id="1" name="Picture 1" descr="图1：策略B均线参数与策略C动量窗口的开发期、验证期累计收益"/>
             <wp:cNvGraphicFramePr>
               <a:graphicFrameLocks noChangeAspect="1"/>
@@ -804,7 +770,7 @@
                   <pic:spPr>
                     <a:xfrm>
                       <a:off x="0" y="0"/>
-                      <a:ext cx="5577840" cy="2502527"/>
+                      <a:ext cx="5303520" cy="2379451"/>
                     </a:xfrm>
                     <a:prstGeom prst="rect"/>
                   </pic:spPr>
@@ -817,13 +783,13 @@
     </w:p>
     <w:p>
       <w:pPr>
-        <w:spacing w:after="120"/>
+        <w:spacing w:after="240"/>
         <w:jc w:val="center"/>
       </w:pPr>
       <w:r>
         <w:rPr>
           <w:rFonts w:ascii="Songti SC" w:hAnsi="Songti SC" w:eastAsia="Songti SC" w:cs="Songti SC"/>
-          <w:color w:val="61727A"/>
+          <w:color w:val="000000"/>
           <w:sz w:val="18"/>
         </w:rPr>
         <w:t>图1：策略B均线参数与策略C动量窗口的开发期、验证期累计收益</w:t>
@@ -838,10 +804,10 @@
       <w:r>
         <w:rPr>
           <w:rFonts w:ascii="Songti SC" w:hAnsi="Songti SC" w:eastAsia="Songti SC" w:cs="Songti SC"/>
-          <w:color w:val="14242B"/>
+          <w:color w:val="000000"/>
           <w:sz w:val="21"/>
         </w:rPr>
-        <w:t>图1显示，策略B的5/20组合在开发期累计收益为-4.31%，20/60组合为-5.66%，只有10/30组合在开发期和验证期同时为正，分别为2.00%和2.11%。5/20在验证期达到7.20%，但不能抵消前期负收益与更高回撤，因此冻结10/30。策略C的15日窗口在开发期和验证期分别取得6.11%和36.29%，20日窗口为-0.55%和36.77%，30日窗口为9.21%和8.02%。15日相对20日只牺牲0.48个百分点验证收益，却改善开发期结果和最大回撤，跨阶段更均衡，因此把社区常见20日窗口调整为15日。2026年数据没有参与这一选择。</w:t>
+        <w:t>图1显示，策略B的10/30组合在开发期和验证期分别取得2.00%和2.11%的正收益，是三组均线中跨阶段方向最一致的方案。5/20和20/60在开发期分别亏损4.31%和5.66%，进入验证期后才转正，说明均线信号对市场阶段较敏感。策略C的15日窗口在两阶段分别取得6.11%和36.29%；20日窗口验证期收益略高至36.77%，开发期却为-0.55%；30日窗口开发期达到9.21%，验证期降至8.02%。参数排名随阶段发生变化，单期峰值缺乏稳定性。10/30均线和15日动量窗口保留了较完整的跨阶段正向信号。</w:t>
       </w:r>
     </w:p>
     <w:p>
@@ -855,30 +821,30 @@
         <w:rPr>
           <w:rFonts w:ascii="Songti SC" w:hAnsi="Songti SC" w:eastAsia="Songti SC" w:cs="Songti SC"/>
           <w:b/>
-          <w:color w:val="147D72"/>
+          <w:color w:val="000000"/>
           <w:sz w:val="28"/>
         </w:rPr>
-        <w:t>五、JoinQuant平台回测结果</w:t>
+        <w:t>五、长期结果：策略C领先，策略B更稳健</w:t>
       </w:r>
     </w:p>
     <w:tbl>
       <w:tblPr>
         <w:tblStyle w:val="TableGrid"/>
-        <w:tblW w:type="dxa" w:w="9360"/>
+        <w:tblW w:type="dxa" w:w="8520"/>
         <w:tblLayout w:type="fixed"/>
         <w:tblLook w:firstColumn="1" w:firstRow="1" w:lastColumn="0" w:lastRow="0" w:noHBand="0" w:noVBand="1" w:val="04A0"/>
         <w:jc w:val="center"/>
         <w:tblInd w:w="120" w:type="dxa"/>
       </w:tblPr>
       <w:tblGrid>
-        <w:gridCol w:w="600"/>
-        <w:gridCol w:w="1270"/>
-        <w:gridCol w:w="1270"/>
-        <w:gridCol w:w="1270"/>
-        <w:gridCol w:w="1270"/>
-        <w:gridCol w:w="900"/>
-        <w:gridCol w:w="900"/>
-        <w:gridCol w:w="1880"/>
+        <w:gridCol w:w="819"/>
+        <w:gridCol w:w="1156"/>
+        <w:gridCol w:w="1156"/>
+        <w:gridCol w:w="1156"/>
+        <w:gridCol w:w="1156"/>
+        <w:gridCol w:w="819"/>
+        <w:gridCol w:w="819"/>
+        <w:gridCol w:w="1439"/>
       </w:tblGrid>
       <w:tr>
         <w:trPr>
@@ -886,7 +852,7 @@
         </w:trPr>
         <w:tc>
           <w:tcPr>
-            <w:tcW w:type="dxa" w:w="600"/>
+            <w:tcW w:type="dxa" w:w="819"/>
             <w:tcMar>
               <w:top w:w="80" w:type="dxa"/>
               <w:start w:w="120" w:type="dxa"/>
@@ -894,7 +860,7 @@
               <w:end w:w="120" w:type="dxa"/>
             </w:tcMar>
             <w:vAlign w:val="center"/>
-            <w:shd w:fill="F2F4F3"/>
+            <w:shd w:fill="D9D9D9"/>
           </w:tcPr>
           <w:p>
             <w:pPr>
@@ -905,7 +871,7 @@
               <w:rPr>
                 <w:rFonts w:ascii="Songti SC" w:hAnsi="Songti SC" w:eastAsia="Songti SC" w:cs="Songti SC"/>
                 <w:b/>
-                <w:color w:val="14242B"/>
+                <w:color w:val="000000"/>
                 <w:sz w:val="17"/>
               </w:rPr>
               <w:t>策略</w:t>
@@ -914,7 +880,7 @@
         </w:tc>
         <w:tc>
           <w:tcPr>
-            <w:tcW w:type="dxa" w:w="1270"/>
+            <w:tcW w:type="dxa" w:w="1156"/>
             <w:tcMar>
               <w:top w:w="80" w:type="dxa"/>
               <w:start w:w="120" w:type="dxa"/>
@@ -922,7 +888,7 @@
               <w:end w:w="120" w:type="dxa"/>
             </w:tcMar>
             <w:vAlign w:val="center"/>
-            <w:shd w:fill="F2F4F3"/>
+            <w:shd w:fill="D9D9D9"/>
           </w:tcPr>
           <w:p>
             <w:pPr>
@@ -933,7 +899,7 @@
               <w:rPr>
                 <w:rFonts w:ascii="Songti SC" w:hAnsi="Songti SC" w:eastAsia="Songti SC" w:cs="Songti SC"/>
                 <w:b/>
-                <w:color w:val="14242B"/>
+                <w:color w:val="000000"/>
                 <w:sz w:val="17"/>
               </w:rPr>
               <w:t>累计收益</w:t>
@@ -942,7 +908,7 @@
         </w:tc>
         <w:tc>
           <w:tcPr>
-            <w:tcW w:type="dxa" w:w="1270"/>
+            <w:tcW w:type="dxa" w:w="1156"/>
             <w:tcMar>
               <w:top w:w="80" w:type="dxa"/>
               <w:start w:w="120" w:type="dxa"/>
@@ -950,7 +916,7 @@
               <w:end w:w="120" w:type="dxa"/>
             </w:tcMar>
             <w:vAlign w:val="center"/>
-            <w:shd w:fill="F2F4F3"/>
+            <w:shd w:fill="D9D9D9"/>
           </w:tcPr>
           <w:p>
             <w:pPr>
@@ -961,7 +927,7 @@
               <w:rPr>
                 <w:rFonts w:ascii="Songti SC" w:hAnsi="Songti SC" w:eastAsia="Songti SC" w:cs="Songti SC"/>
                 <w:b/>
-                <w:color w:val="14242B"/>
+                <w:color w:val="000000"/>
                 <w:sz w:val="17"/>
               </w:rPr>
               <w:t>年化收益</w:t>
@@ -970,7 +936,7 @@
         </w:tc>
         <w:tc>
           <w:tcPr>
-            <w:tcW w:type="dxa" w:w="1270"/>
+            <w:tcW w:type="dxa" w:w="1156"/>
             <w:tcMar>
               <w:top w:w="80" w:type="dxa"/>
               <w:start w:w="120" w:type="dxa"/>
@@ -978,7 +944,7 @@
               <w:end w:w="120" w:type="dxa"/>
             </w:tcMar>
             <w:vAlign w:val="center"/>
-            <w:shd w:fill="F2F4F3"/>
+            <w:shd w:fill="D9D9D9"/>
           </w:tcPr>
           <w:p>
             <w:pPr>
@@ -989,7 +955,7 @@
               <w:rPr>
                 <w:rFonts w:ascii="Songti SC" w:hAnsi="Songti SC" w:eastAsia="Songti SC" w:cs="Songti SC"/>
                 <w:b/>
-                <w:color w:val="14242B"/>
+                <w:color w:val="000000"/>
                 <w:sz w:val="17"/>
               </w:rPr>
               <w:t>超额收益</w:t>
@@ -998,7 +964,7 @@
         </w:tc>
         <w:tc>
           <w:tcPr>
-            <w:tcW w:type="dxa" w:w="1270"/>
+            <w:tcW w:type="dxa" w:w="1156"/>
             <w:tcMar>
               <w:top w:w="80" w:type="dxa"/>
               <w:start w:w="120" w:type="dxa"/>
@@ -1006,7 +972,7 @@
               <w:end w:w="120" w:type="dxa"/>
             </w:tcMar>
             <w:vAlign w:val="center"/>
-            <w:shd w:fill="F2F4F3"/>
+            <w:shd w:fill="D9D9D9"/>
           </w:tcPr>
           <w:p>
             <w:pPr>
@@ -1017,7 +983,7 @@
               <w:rPr>
                 <w:rFonts w:ascii="Songti SC" w:hAnsi="Songti SC" w:eastAsia="Songti SC" w:cs="Songti SC"/>
                 <w:b/>
-                <w:color w:val="14242B"/>
+                <w:color w:val="000000"/>
                 <w:sz w:val="17"/>
               </w:rPr>
               <w:t>最大回撤</w:t>
@@ -1026,7 +992,7 @@
         </w:tc>
         <w:tc>
           <w:tcPr>
-            <w:tcW w:type="dxa" w:w="900"/>
+            <w:tcW w:type="dxa" w:w="819"/>
             <w:tcMar>
               <w:top w:w="80" w:type="dxa"/>
               <w:start w:w="120" w:type="dxa"/>
@@ -1034,7 +1000,7 @@
               <w:end w:w="120" w:type="dxa"/>
             </w:tcMar>
             <w:vAlign w:val="center"/>
-            <w:shd w:fill="F2F4F3"/>
+            <w:shd w:fill="D9D9D9"/>
           </w:tcPr>
           <w:p>
             <w:pPr>
@@ -1045,7 +1011,7 @@
               <w:rPr>
                 <w:rFonts w:ascii="Songti SC" w:hAnsi="Songti SC" w:eastAsia="Songti SC" w:cs="Songti SC"/>
                 <w:b/>
-                <w:color w:val="14242B"/>
+                <w:color w:val="000000"/>
                 <w:sz w:val="17"/>
               </w:rPr>
               <w:t>夏普</w:t>
@@ -1054,7 +1020,7 @@
         </w:tc>
         <w:tc>
           <w:tcPr>
-            <w:tcW w:type="dxa" w:w="900"/>
+            <w:tcW w:type="dxa" w:w="819"/>
             <w:tcMar>
               <w:top w:w="80" w:type="dxa"/>
               <w:start w:w="120" w:type="dxa"/>
@@ -1062,7 +1028,7 @@
               <w:end w:w="120" w:type="dxa"/>
             </w:tcMar>
             <w:vAlign w:val="center"/>
-            <w:shd w:fill="F2F4F3"/>
+            <w:shd w:fill="D9D9D9"/>
           </w:tcPr>
           <w:p>
             <w:pPr>
@@ -1073,7 +1039,7 @@
               <w:rPr>
                 <w:rFonts w:ascii="Songti SC" w:hAnsi="Songti SC" w:eastAsia="Songti SC" w:cs="Songti SC"/>
                 <w:b/>
-                <w:color w:val="14242B"/>
+                <w:color w:val="000000"/>
                 <w:sz w:val="17"/>
               </w:rPr>
               <w:t>Beta</w:t>
@@ -1082,7 +1048,7 @@
         </w:tc>
         <w:tc>
           <w:tcPr>
-            <w:tcW w:type="dxa" w:w="1880"/>
+            <w:tcW w:type="dxa" w:w="1439"/>
             <w:tcMar>
               <w:top w:w="80" w:type="dxa"/>
               <w:start w:w="120" w:type="dxa"/>
@@ -1090,7 +1056,7 @@
               <w:end w:w="120" w:type="dxa"/>
             </w:tcMar>
             <w:vAlign w:val="center"/>
-            <w:shd w:fill="F2F4F3"/>
+            <w:shd w:fill="D9D9D9"/>
           </w:tcPr>
           <w:p>
             <w:pPr>
@@ -1101,7 +1067,7 @@
               <w:rPr>
                 <w:rFonts w:ascii="Songti SC" w:hAnsi="Songti SC" w:eastAsia="Songti SC" w:cs="Songti SC"/>
                 <w:b/>
-                <w:color w:val="14242B"/>
+                <w:color w:val="000000"/>
                 <w:sz w:val="17"/>
               </w:rPr>
               <w:t>波动率</w:t>
@@ -1112,33 +1078,7 @@
       <w:tr>
         <w:tc>
           <w:tcPr>
-            <w:tcW w:type="dxa" w:w="600"/>
-            <w:tcMar>
-              <w:top w:w="80" w:type="dxa"/>
-              <w:start w:w="120" w:type="dxa"/>
-              <w:bottom w:w="80" w:type="dxa"/>
-              <w:end w:w="120" w:type="dxa"/>
-            </w:tcMar>
-            <w:vAlign w:val="center"/>
-          </w:tcPr>
-          <w:p>
-            <w:pPr>
-              <w:spacing w:after="0" w:line="276" w:lineRule="auto"/>
-              <w:jc w:val="left"/>
-            </w:pPr>
-            <w:r>
-              <w:rPr>
-                <w:rFonts w:ascii="Songti SC" w:hAnsi="Songti SC" w:eastAsia="Songti SC" w:cs="Songti SC"/>
-                <w:color w:val="14242B"/>
-                <w:sz w:val="17"/>
-              </w:rPr>
-              <w:t>A</w:t>
-            </w:r>
-          </w:p>
-        </w:tc>
-        <w:tc>
-          <w:tcPr>
-            <w:tcW w:type="dxa" w:w="1270"/>
+            <w:tcW w:type="dxa" w:w="819"/>
             <w:tcMar>
               <w:top w:w="80" w:type="dxa"/>
               <w:start w:w="120" w:type="dxa"/>
@@ -1155,16 +1095,16 @@
             <w:r>
               <w:rPr>
                 <w:rFonts w:ascii="Songti SC" w:hAnsi="Songti SC" w:eastAsia="Songti SC" w:cs="Songti SC"/>
-                <w:color w:val="14242B"/>
+                <w:color w:val="000000"/>
                 <w:sz w:val="17"/>
               </w:rPr>
-              <w:t>-0.66%</w:t>
+              <w:t>A</w:t>
             </w:r>
           </w:p>
         </w:tc>
         <w:tc>
           <w:tcPr>
-            <w:tcW w:type="dxa" w:w="1270"/>
+            <w:tcW w:type="dxa" w:w="1156"/>
             <w:tcMar>
               <w:top w:w="80" w:type="dxa"/>
               <w:start w:w="120" w:type="dxa"/>
@@ -1181,16 +1121,16 @@
             <w:r>
               <w:rPr>
                 <w:rFonts w:ascii="Songti SC" w:hAnsi="Songti SC" w:eastAsia="Songti SC" w:cs="Songti SC"/>
-                <w:color w:val="14242B"/>
+                <w:color w:val="000000"/>
                 <w:sz w:val="17"/>
               </w:rPr>
-              <w:t>-0.09%</w:t>
+              <w:t>-0.66%</w:t>
             </w:r>
           </w:p>
         </w:tc>
         <w:tc>
           <w:tcPr>
-            <w:tcW w:type="dxa" w:w="1270"/>
+            <w:tcW w:type="dxa" w:w="1156"/>
             <w:tcMar>
               <w:top w:w="80" w:type="dxa"/>
               <w:start w:w="120" w:type="dxa"/>
@@ -1207,16 +1147,16 @@
             <w:r>
               <w:rPr>
                 <w:rFonts w:ascii="Songti SC" w:hAnsi="Songti SC" w:eastAsia="Songti SC" w:cs="Songti SC"/>
-                <w:color w:val="14242B"/>
+                <w:color w:val="000000"/>
                 <w:sz w:val="17"/>
               </w:rPr>
-              <w:t>-36.74%</w:t>
+              <w:t>-0.09%</w:t>
             </w:r>
           </w:p>
         </w:tc>
         <w:tc>
           <w:tcPr>
-            <w:tcW w:type="dxa" w:w="1270"/>
+            <w:tcW w:type="dxa" w:w="1156"/>
             <w:tcMar>
               <w:top w:w="80" w:type="dxa"/>
               <w:start w:w="120" w:type="dxa"/>
@@ -1233,16 +1173,16 @@
             <w:r>
               <w:rPr>
                 <w:rFonts w:ascii="Songti SC" w:hAnsi="Songti SC" w:eastAsia="Songti SC" w:cs="Songti SC"/>
-                <w:color w:val="14242B"/>
+                <w:color w:val="000000"/>
                 <w:sz w:val="17"/>
               </w:rPr>
-              <w:t>-36.97%</w:t>
+              <w:t>-33.97%</w:t>
             </w:r>
           </w:p>
         </w:tc>
         <w:tc>
           <w:tcPr>
-            <w:tcW w:type="dxa" w:w="900"/>
+            <w:tcW w:type="dxa" w:w="1156"/>
             <w:tcMar>
               <w:top w:w="80" w:type="dxa"/>
               <w:start w:w="120" w:type="dxa"/>
@@ -1259,16 +1199,16 @@
             <w:r>
               <w:rPr>
                 <w:rFonts w:ascii="Songti SC" w:hAnsi="Songti SC" w:eastAsia="Songti SC" w:cs="Songti SC"/>
-                <w:color w:val="14242B"/>
+                <w:color w:val="000000"/>
                 <w:sz w:val="17"/>
               </w:rPr>
-              <w:t>-0.291</w:t>
+              <w:t>-36.97%</w:t>
             </w:r>
           </w:p>
         </w:tc>
         <w:tc>
           <w:tcPr>
-            <w:tcW w:type="dxa" w:w="900"/>
+            <w:tcW w:type="dxa" w:w="819"/>
             <w:tcMar>
               <w:top w:w="80" w:type="dxa"/>
               <w:start w:w="120" w:type="dxa"/>
@@ -1285,16 +1225,16 @@
             <w:r>
               <w:rPr>
                 <w:rFonts w:ascii="Songti SC" w:hAnsi="Songti SC" w:eastAsia="Songti SC" w:cs="Songti SC"/>
-                <w:color w:val="14242B"/>
+                <w:color w:val="000000"/>
                 <w:sz w:val="17"/>
               </w:rPr>
-              <w:t>0.519</w:t>
+              <w:t>-0.291</w:t>
             </w:r>
           </w:p>
         </w:tc>
         <w:tc>
           <w:tcPr>
-            <w:tcW w:type="dxa" w:w="1880"/>
+            <w:tcW w:type="dxa" w:w="819"/>
             <w:tcMar>
               <w:top w:w="80" w:type="dxa"/>
               <w:start w:w="120" w:type="dxa"/>
@@ -1311,44 +1251,16 @@
             <w:r>
               <w:rPr>
                 <w:rFonts w:ascii="Songti SC" w:hAnsi="Songti SC" w:eastAsia="Songti SC" w:cs="Songti SC"/>
-                <w:color w:val="14242B"/>
+                <w:color w:val="000000"/>
                 <w:sz w:val="17"/>
               </w:rPr>
-              <w:t>14.00%</w:t>
-            </w:r>
-          </w:p>
-        </w:tc>
-      </w:tr>
-      <w:tr>
-        <w:tc>
-          <w:tcPr>
-            <w:tcW w:type="dxa" w:w="600"/>
-            <w:tcMar>
-              <w:top w:w="80" w:type="dxa"/>
-              <w:start w:w="120" w:type="dxa"/>
-              <w:bottom w:w="80" w:type="dxa"/>
-              <w:end w:w="120" w:type="dxa"/>
-            </w:tcMar>
-            <w:vAlign w:val="center"/>
-          </w:tcPr>
-          <w:p>
-            <w:pPr>
-              <w:spacing w:after="0" w:line="276" w:lineRule="auto"/>
-              <w:jc w:val="left"/>
-            </w:pPr>
-            <w:r>
-              <w:rPr>
-                <w:rFonts w:ascii="Songti SC" w:hAnsi="Songti SC" w:eastAsia="Songti SC" w:cs="Songti SC"/>
-                <w:color w:val="14242B"/>
-                <w:sz w:val="17"/>
-              </w:rPr>
-              <w:t>B</w:t>
+              <w:t>0.521</w:t>
             </w:r>
           </w:p>
         </w:tc>
         <w:tc>
           <w:tcPr>
-            <w:tcW w:type="dxa" w:w="1270"/>
+            <w:tcW w:type="dxa" w:w="1439"/>
             <w:tcMar>
               <w:top w:w="80" w:type="dxa"/>
               <w:start w:w="120" w:type="dxa"/>
@@ -1365,16 +1277,18 @@
             <w:r>
               <w:rPr>
                 <w:rFonts w:ascii="Songti SC" w:hAnsi="Songti SC" w:eastAsia="Songti SC" w:cs="Songti SC"/>
-                <w:color w:val="14242B"/>
+                <w:color w:val="000000"/>
                 <w:sz w:val="17"/>
               </w:rPr>
-              <w:t>2.91%</w:t>
+              <w:t>14.10%</w:t>
             </w:r>
           </w:p>
         </w:tc>
+      </w:tr>
+      <w:tr>
         <w:tc>
           <w:tcPr>
-            <w:tcW w:type="dxa" w:w="1270"/>
+            <w:tcW w:type="dxa" w:w="819"/>
             <w:tcMar>
               <w:top w:w="80" w:type="dxa"/>
               <w:start w:w="120" w:type="dxa"/>
@@ -1391,16 +1305,16 @@
             <w:r>
               <w:rPr>
                 <w:rFonts w:ascii="Songti SC" w:hAnsi="Songti SC" w:eastAsia="Songti SC" w:cs="Songti SC"/>
-                <w:color w:val="14242B"/>
+                <w:color w:val="000000"/>
                 <w:sz w:val="17"/>
               </w:rPr>
-              <w:t>0.39%</w:t>
+              <w:t>B</w:t>
             </w:r>
           </w:p>
         </w:tc>
         <w:tc>
           <w:tcPr>
-            <w:tcW w:type="dxa" w:w="1270"/>
+            <w:tcW w:type="dxa" w:w="1156"/>
             <w:tcMar>
               <w:top w:w="80" w:type="dxa"/>
               <w:start w:w="120" w:type="dxa"/>
@@ -1417,16 +1331,16 @@
             <w:r>
               <w:rPr>
                 <w:rFonts w:ascii="Songti SC" w:hAnsi="Songti SC" w:eastAsia="Songti SC" w:cs="Songti SC"/>
-                <w:color w:val="14242B"/>
+                <w:color w:val="000000"/>
                 <w:sz w:val="17"/>
               </w:rPr>
-              <w:t>-34.47%</w:t>
+              <w:t>2.91%</w:t>
             </w:r>
           </w:p>
         </w:tc>
         <w:tc>
           <w:tcPr>
-            <w:tcW w:type="dxa" w:w="1270"/>
+            <w:tcW w:type="dxa" w:w="1156"/>
             <w:tcMar>
               <w:top w:w="80" w:type="dxa"/>
               <w:start w:w="120" w:type="dxa"/>
@@ -1443,16 +1357,16 @@
             <w:r>
               <w:rPr>
                 <w:rFonts w:ascii="Songti SC" w:hAnsi="Songti SC" w:eastAsia="Songti SC" w:cs="Songti SC"/>
-                <w:color w:val="14242B"/>
+                <w:color w:val="000000"/>
                 <w:sz w:val="17"/>
               </w:rPr>
-              <w:t>-12.31%</w:t>
+              <w:t>0.39%</w:t>
             </w:r>
           </w:p>
         </w:tc>
         <w:tc>
           <w:tcPr>
-            <w:tcW w:type="dxa" w:w="900"/>
+            <w:tcW w:type="dxa" w:w="1156"/>
             <w:tcMar>
               <w:top w:w="80" w:type="dxa"/>
               <w:start w:w="120" w:type="dxa"/>
@@ -1469,16 +1383,16 @@
             <w:r>
               <w:rPr>
                 <w:rFonts w:ascii="Songti SC" w:hAnsi="Songti SC" w:eastAsia="Songti SC" w:cs="Songti SC"/>
-                <w:color w:val="14242B"/>
+                <w:color w:val="000000"/>
                 <w:sz w:val="17"/>
               </w:rPr>
-              <w:t>-0.771</w:t>
+              <w:t>-31.59%</w:t>
             </w:r>
           </w:p>
         </w:tc>
         <w:tc>
           <w:tcPr>
-            <w:tcW w:type="dxa" w:w="900"/>
+            <w:tcW w:type="dxa" w:w="1156"/>
             <w:tcMar>
               <w:top w:w="80" w:type="dxa"/>
               <w:start w:w="120" w:type="dxa"/>
@@ -1495,16 +1409,16 @@
             <w:r>
               <w:rPr>
                 <w:rFonts w:ascii="Songti SC" w:hAnsi="Songti SC" w:eastAsia="Songti SC" w:cs="Songti SC"/>
-                <w:color w:val="14242B"/>
+                <w:color w:val="000000"/>
                 <w:sz w:val="17"/>
               </w:rPr>
-              <w:t>0.164</w:t>
+              <w:t>-12.31%</w:t>
             </w:r>
           </w:p>
         </w:tc>
         <w:tc>
           <w:tcPr>
-            <w:tcW w:type="dxa" w:w="1880"/>
+            <w:tcW w:type="dxa" w:w="819"/>
             <w:tcMar>
               <w:top w:w="80" w:type="dxa"/>
               <w:start w:w="120" w:type="dxa"/>
@@ -1521,44 +1435,16 @@
             <w:r>
               <w:rPr>
                 <w:rFonts w:ascii="Songti SC" w:hAnsi="Songti SC" w:eastAsia="Songti SC" w:cs="Songti SC"/>
-                <w:color w:val="14242B"/>
+                <w:color w:val="000000"/>
                 <w:sz w:val="17"/>
               </w:rPr>
-              <w:t>4.70%</w:t>
-            </w:r>
-          </w:p>
-        </w:tc>
-      </w:tr>
-      <w:tr>
-        <w:tc>
-          <w:tcPr>
-            <w:tcW w:type="dxa" w:w="600"/>
-            <w:tcMar>
-              <w:top w:w="80" w:type="dxa"/>
-              <w:start w:w="120" w:type="dxa"/>
-              <w:bottom w:w="80" w:type="dxa"/>
-              <w:end w:w="120" w:type="dxa"/>
-            </w:tcMar>
-            <w:vAlign w:val="center"/>
-          </w:tcPr>
-          <w:p>
-            <w:pPr>
-              <w:spacing w:after="0" w:line="276" w:lineRule="auto"/>
-              <w:jc w:val="left"/>
-            </w:pPr>
-            <w:r>
-              <w:rPr>
-                <w:rFonts w:ascii="Songti SC" w:hAnsi="Songti SC" w:eastAsia="Songti SC" w:cs="Songti SC"/>
-                <w:color w:val="14242B"/>
-                <w:sz w:val="17"/>
-              </w:rPr>
-              <w:t>C</w:t>
+              <w:t>-0.769</w:t>
             </w:r>
           </w:p>
         </w:tc>
         <w:tc>
           <w:tcPr>
-            <w:tcW w:type="dxa" w:w="1270"/>
+            <w:tcW w:type="dxa" w:w="819"/>
             <w:tcMar>
               <w:top w:w="80" w:type="dxa"/>
               <w:start w:w="120" w:type="dxa"/>
@@ -1575,16 +1461,16 @@
             <w:r>
               <w:rPr>
                 <w:rFonts w:ascii="Songti SC" w:hAnsi="Songti SC" w:eastAsia="Songti SC" w:cs="Songti SC"/>
-                <w:color w:val="14242B"/>
+                <w:color w:val="000000"/>
                 <w:sz w:val="17"/>
               </w:rPr>
-              <w:t>71.84%</w:t>
+              <w:t>0.164</w:t>
             </w:r>
           </w:p>
         </w:tc>
         <w:tc>
           <w:tcPr>
-            <w:tcW w:type="dxa" w:w="1270"/>
+            <w:tcW w:type="dxa" w:w="1439"/>
             <w:tcMar>
               <w:top w:w="80" w:type="dxa"/>
               <w:start w:w="120" w:type="dxa"/>
@@ -1601,16 +1487,18 @@
             <w:r>
               <w:rPr>
                 <w:rFonts w:ascii="Songti SC" w:hAnsi="Songti SC" w:eastAsia="Songti SC" w:cs="Songti SC"/>
-                <w:color w:val="14242B"/>
+                <w:color w:val="000000"/>
                 <w:sz w:val="17"/>
               </w:rPr>
-              <w:t>7.67%</w:t>
+              <w:t>4.70%</w:t>
             </w:r>
           </w:p>
         </w:tc>
+      </w:tr>
+      <w:tr>
         <w:tc>
           <w:tcPr>
-            <w:tcW w:type="dxa" w:w="1270"/>
+            <w:tcW w:type="dxa" w:w="819"/>
             <w:tcMar>
               <w:top w:w="80" w:type="dxa"/>
               <w:start w:w="120" w:type="dxa"/>
@@ -1627,16 +1515,16 @@
             <w:r>
               <w:rPr>
                 <w:rFonts w:ascii="Songti SC" w:hAnsi="Songti SC" w:eastAsia="Songti SC" w:cs="Songti SC"/>
-                <w:color w:val="14242B"/>
+                <w:color w:val="000000"/>
                 <w:sz w:val="17"/>
               </w:rPr>
-              <w:t>9.43%</w:t>
+              <w:t>C</w:t>
             </w:r>
           </w:p>
         </w:tc>
         <w:tc>
           <w:tcPr>
-            <w:tcW w:type="dxa" w:w="1270"/>
+            <w:tcW w:type="dxa" w:w="1156"/>
             <w:tcMar>
               <w:top w:w="80" w:type="dxa"/>
               <w:start w:w="120" w:type="dxa"/>
@@ -1653,16 +1541,16 @@
             <w:r>
               <w:rPr>
                 <w:rFonts w:ascii="Songti SC" w:hAnsi="Songti SC" w:eastAsia="Songti SC" w:cs="Songti SC"/>
-                <w:color w:val="14242B"/>
+                <w:color w:val="000000"/>
                 <w:sz w:val="17"/>
               </w:rPr>
-              <w:t>-16.91%</w:t>
+              <w:t>71.84%</w:t>
             </w:r>
           </w:p>
         </w:tc>
         <w:tc>
           <w:tcPr>
-            <w:tcW w:type="dxa" w:w="900"/>
+            <w:tcW w:type="dxa" w:w="1156"/>
             <w:tcMar>
               <w:top w:w="80" w:type="dxa"/>
               <w:start w:w="120" w:type="dxa"/>
@@ -1679,16 +1567,16 @@
             <w:r>
               <w:rPr>
                 <w:rFonts w:ascii="Songti SC" w:hAnsi="Songti SC" w:eastAsia="Songti SC" w:cs="Songti SC"/>
-                <w:color w:val="14242B"/>
+                <w:color w:val="000000"/>
                 <w:sz w:val="17"/>
               </w:rPr>
-              <w:t>0.313</w:t>
+              <w:t>7.69%</w:t>
             </w:r>
           </w:p>
         </w:tc>
         <w:tc>
           <w:tcPr>
-            <w:tcW w:type="dxa" w:w="900"/>
+            <w:tcW w:type="dxa" w:w="1156"/>
             <w:tcMar>
               <w:top w:w="80" w:type="dxa"/>
               <w:start w:w="120" w:type="dxa"/>
@@ -1705,16 +1593,16 @@
             <w:r>
               <w:rPr>
                 <w:rFonts w:ascii="Songti SC" w:hAnsi="Songti SC" w:eastAsia="Songti SC" w:cs="Songti SC"/>
-                <w:color w:val="14242B"/>
+                <w:color w:val="000000"/>
                 <w:sz w:val="17"/>
               </w:rPr>
-              <w:t>0.425</w:t>
+              <w:t>14.23%</w:t>
             </w:r>
           </w:p>
         </w:tc>
         <w:tc>
           <w:tcPr>
-            <w:tcW w:type="dxa" w:w="1880"/>
+            <w:tcW w:type="dxa" w:w="1156"/>
             <w:tcMar>
               <w:top w:w="80" w:type="dxa"/>
               <w:start w:w="120" w:type="dxa"/>
@@ -1731,7 +1619,85 @@
             <w:r>
               <w:rPr>
                 <w:rFonts w:ascii="Songti SC" w:hAnsi="Songti SC" w:eastAsia="Songti SC" w:cs="Songti SC"/>
-                <w:color w:val="14242B"/>
+                <w:color w:val="000000"/>
+                <w:sz w:val="17"/>
+              </w:rPr>
+              <w:t>-16.91%</w:t>
+            </w:r>
+          </w:p>
+        </w:tc>
+        <w:tc>
+          <w:tcPr>
+            <w:tcW w:type="dxa" w:w="819"/>
+            <w:tcMar>
+              <w:top w:w="80" w:type="dxa"/>
+              <w:start w:w="120" w:type="dxa"/>
+              <w:bottom w:w="80" w:type="dxa"/>
+              <w:end w:w="120" w:type="dxa"/>
+            </w:tcMar>
+            <w:vAlign w:val="center"/>
+          </w:tcPr>
+          <w:p>
+            <w:pPr>
+              <w:spacing w:after="0" w:line="276" w:lineRule="auto"/>
+              <w:jc w:val="center"/>
+            </w:pPr>
+            <w:r>
+              <w:rPr>
+                <w:rFonts w:ascii="Songti SC" w:hAnsi="Songti SC" w:eastAsia="Songti SC" w:cs="Songti SC"/>
+                <w:color w:val="000000"/>
+                <w:sz w:val="17"/>
+              </w:rPr>
+              <w:t>0.315</w:t>
+            </w:r>
+          </w:p>
+        </w:tc>
+        <w:tc>
+          <w:tcPr>
+            <w:tcW w:type="dxa" w:w="819"/>
+            <w:tcMar>
+              <w:top w:w="80" w:type="dxa"/>
+              <w:start w:w="120" w:type="dxa"/>
+              <w:bottom w:w="80" w:type="dxa"/>
+              <w:end w:w="120" w:type="dxa"/>
+            </w:tcMar>
+            <w:vAlign w:val="center"/>
+          </w:tcPr>
+          <w:p>
+            <w:pPr>
+              <w:spacing w:after="0" w:line="276" w:lineRule="auto"/>
+              <w:jc w:val="center"/>
+            </w:pPr>
+            <w:r>
+              <w:rPr>
+                <w:rFonts w:ascii="Songti SC" w:hAnsi="Songti SC" w:eastAsia="Songti SC" w:cs="Songti SC"/>
+                <w:color w:val="000000"/>
+                <w:sz w:val="17"/>
+              </w:rPr>
+              <w:t>0.426</w:t>
+            </w:r>
+          </w:p>
+        </w:tc>
+        <w:tc>
+          <w:tcPr>
+            <w:tcW w:type="dxa" w:w="1439"/>
+            <w:tcMar>
+              <w:top w:w="80" w:type="dxa"/>
+              <w:start w:w="120" w:type="dxa"/>
+              <w:bottom w:w="80" w:type="dxa"/>
+              <w:end w:w="120" w:type="dxa"/>
+            </w:tcMar>
+            <w:vAlign w:val="center"/>
+          </w:tcPr>
+          <w:p>
+            <w:pPr>
+              <w:spacing w:after="0" w:line="276" w:lineRule="auto"/>
+              <w:jc w:val="center"/>
+            </w:pPr>
+            <w:r>
+              <w:rPr>
+                <w:rFonts w:ascii="Songti SC" w:hAnsi="Songti SC" w:eastAsia="Songti SC" w:cs="Songti SC"/>
+                <w:color w:val="000000"/>
                 <w:sz w:val="17"/>
               </w:rPr>
               <w:t>11.70%</w:t>
@@ -1754,10 +1720,10 @@
       <w:r>
         <w:rPr>
           <w:rFonts w:ascii="Songti SC" w:hAnsi="Songti SC" w:eastAsia="Songti SC" w:cs="Songti SC"/>
-          <w:color w:val="14242B"/>
+          <w:color w:val="000000"/>
           <w:sz w:val="21"/>
         </w:rPr>
-        <w:t>三次回测采用同一平台口径：2019-01-01至2026-07-23、初始资金500,000元、日频、Python 3和沪深300基准。策略A累计收益-0.66%，但最大回撤36.97%，最长回撤区间从2020年7月延续到2025年3月，说明接近盈亏平衡的终值掩盖了较大的路径风险。策略B累计收益2.91%，最大回撤降至12.31%，Beta仅0.164、波动率4.70%，验证了仓位和ATR规则降低了市场暴露；但其超额收益仍为-34.47%，低风险没有转化为足够回报。</w:t>
+        <w:t>长期回测表明，策略A的累计收益为-0.66%，最大回撤却达到36.97%，收益与下行风险明显失衡。策略B把最大回撤降至12.31%，Beta降至0.164、波动率降至4.70%，防守特征清晰；其累计收益仅为2.91%，超额收益为-31.59%，说明低波动主要来自克制参与，趋势信号本身没有形成显著收益优势。</w:t>
       </w:r>
     </w:p>
     <w:p>
@@ -1769,588 +1735,10 @@
       <w:r>
         <w:rPr>
           <w:rFonts w:ascii="Songti SC" w:hAnsi="Songti SC" w:eastAsia="Songti SC" w:cs="Songti SC"/>
-          <w:color w:val="14242B"/>
+          <w:color w:val="000000"/>
           <w:sz w:val="21"/>
         </w:rPr>
-        <w:t>策略C在平台累计收益71.84%、年化收益7.67%、最大回撤16.91%，相对沪深300取得9.43%的累计超额，是三者中唯一平台超额为正的方案。其夏普为0.313、Alpha为0.027，风险调整后表现优于A和B；但超额最大回撤仍达30.37%，超额夏普为-0.199，说明相对基准的优势并不稳定。因而C适合作为三盘比较中的收益候选，而不是已经得到“实盘有效”结论的最终策略。</w:t>
-      </w:r>
-    </w:p>
-    <w:tbl>
-      <w:tblPr>
-        <w:tblStyle w:val="TableGrid"/>
-        <w:tblW w:type="dxa" w:w="9360"/>
-        <w:tblLayout w:type="fixed"/>
-        <w:tblLook w:firstColumn="1" w:firstRow="1" w:lastColumn="0" w:lastRow="0" w:noHBand="0" w:noVBand="1" w:val="04A0"/>
-        <w:jc w:val="center"/>
-        <w:tblInd w:w="120" w:type="dxa"/>
-      </w:tblPr>
-      <w:tblGrid>
-        <w:gridCol w:w="980"/>
-        <w:gridCol w:w="1930"/>
-        <w:gridCol w:w="2470"/>
-        <w:gridCol w:w="1930"/>
-        <w:gridCol w:w="2050"/>
-      </w:tblGrid>
-      <w:tr>
-        <w:trPr>
-          <w:tblHeader/>
-        </w:trPr>
-        <w:tc>
-          <w:tcPr>
-            <w:tcW w:type="dxa" w:w="980"/>
-            <w:tcMar>
-              <w:top w:w="80" w:type="dxa"/>
-              <w:start w:w="120" w:type="dxa"/>
-              <w:bottom w:w="80" w:type="dxa"/>
-              <w:end w:w="120" w:type="dxa"/>
-            </w:tcMar>
-            <w:vAlign w:val="center"/>
-            <w:shd w:fill="F2F4F3"/>
-          </w:tcPr>
-          <w:p>
-            <w:pPr>
-              <w:spacing w:after="0" w:line="276" w:lineRule="auto"/>
-              <w:jc w:val="center"/>
-            </w:pPr>
-            <w:r>
-              <w:rPr>
-                <w:rFonts w:ascii="Songti SC" w:hAnsi="Songti SC" w:eastAsia="Songti SC" w:cs="Songti SC"/>
-                <w:b/>
-                <w:color w:val="14242B"/>
-                <w:sz w:val="17"/>
-              </w:rPr>
-              <w:t>策略</w:t>
-            </w:r>
-          </w:p>
-        </w:tc>
-        <w:tc>
-          <w:tcPr>
-            <w:tcW w:type="dxa" w:w="1930"/>
-            <w:tcMar>
-              <w:top w:w="80" w:type="dxa"/>
-              <w:start w:w="120" w:type="dxa"/>
-              <w:bottom w:w="80" w:type="dxa"/>
-              <w:end w:w="120" w:type="dxa"/>
-            </w:tcMar>
-            <w:vAlign w:val="center"/>
-            <w:shd w:fill="F2F4F3"/>
-          </w:tcPr>
-          <w:p>
-            <w:pPr>
-              <w:spacing w:after="0" w:line="276" w:lineRule="auto"/>
-              <w:jc w:val="center"/>
-            </w:pPr>
-            <w:r>
-              <w:rPr>
-                <w:rFonts w:ascii="Songti SC" w:hAnsi="Songti SC" w:eastAsia="Songti SC" w:cs="Songti SC"/>
-                <w:b/>
-                <w:color w:val="14242B"/>
-                <w:sz w:val="17"/>
-              </w:rPr>
-              <w:t>平台收益</w:t>
-            </w:r>
-          </w:p>
-        </w:tc>
-        <w:tc>
-          <w:tcPr>
-            <w:tcW w:type="dxa" w:w="2470"/>
-            <w:tcMar>
-              <w:top w:w="80" w:type="dxa"/>
-              <w:start w:w="120" w:type="dxa"/>
-              <w:bottom w:w="80" w:type="dxa"/>
-              <w:end w:w="120" w:type="dxa"/>
-            </w:tcMar>
-            <w:vAlign w:val="center"/>
-            <w:shd w:fill="F2F4F3"/>
-          </w:tcPr>
-          <w:p>
-            <w:pPr>
-              <w:spacing w:after="0" w:line="276" w:lineRule="auto"/>
-              <w:jc w:val="center"/>
-            </w:pPr>
-            <w:r>
-              <w:rPr>
-                <w:rFonts w:ascii="Songti SC" w:hAnsi="Songti SC" w:eastAsia="Songti SC" w:cs="Songti SC"/>
-                <w:b/>
-                <w:color w:val="14242B"/>
-                <w:sz w:val="17"/>
-              </w:rPr>
-              <w:t>同窗影子收益</w:t>
-            </w:r>
-          </w:p>
-        </w:tc>
-        <w:tc>
-          <w:tcPr>
-            <w:tcW w:type="dxa" w:w="1930"/>
-            <w:tcMar>
-              <w:top w:w="80" w:type="dxa"/>
-              <w:start w:w="120" w:type="dxa"/>
-              <w:bottom w:w="80" w:type="dxa"/>
-              <w:end w:w="120" w:type="dxa"/>
-            </w:tcMar>
-            <w:vAlign w:val="center"/>
-            <w:shd w:fill="F2F4F3"/>
-          </w:tcPr>
-          <w:p>
-            <w:pPr>
-              <w:spacing w:after="0" w:line="276" w:lineRule="auto"/>
-              <w:jc w:val="center"/>
-            </w:pPr>
-            <w:r>
-              <w:rPr>
-                <w:rFonts w:ascii="Songti SC" w:hAnsi="Songti SC" w:eastAsia="Songti SC" w:cs="Songti SC"/>
-                <w:b/>
-                <w:color w:val="14242B"/>
-                <w:sz w:val="17"/>
-              </w:rPr>
-              <w:t>平台回撤</w:t>
-            </w:r>
-          </w:p>
-        </w:tc>
-        <w:tc>
-          <w:tcPr>
-            <w:tcW w:type="dxa" w:w="2050"/>
-            <w:tcMar>
-              <w:top w:w="80" w:type="dxa"/>
-              <w:start w:w="120" w:type="dxa"/>
-              <w:bottom w:w="80" w:type="dxa"/>
-              <w:end w:w="120" w:type="dxa"/>
-            </w:tcMar>
-            <w:vAlign w:val="center"/>
-            <w:shd w:fill="F2F4F3"/>
-          </w:tcPr>
-          <w:p>
-            <w:pPr>
-              <w:spacing w:after="0" w:line="276" w:lineRule="auto"/>
-              <w:jc w:val="center"/>
-            </w:pPr>
-            <w:r>
-              <w:rPr>
-                <w:rFonts w:ascii="Songti SC" w:hAnsi="Songti SC" w:eastAsia="Songti SC" w:cs="Songti SC"/>
-                <w:b/>
-                <w:color w:val="14242B"/>
-                <w:sz w:val="17"/>
-              </w:rPr>
-              <w:t>同窗影子回撤</w:t>
-            </w:r>
-          </w:p>
-        </w:tc>
-      </w:tr>
-      <w:tr>
-        <w:tc>
-          <w:tcPr>
-            <w:tcW w:type="dxa" w:w="980"/>
-            <w:tcMar>
-              <w:top w:w="80" w:type="dxa"/>
-              <w:start w:w="120" w:type="dxa"/>
-              <w:bottom w:w="80" w:type="dxa"/>
-              <w:end w:w="120" w:type="dxa"/>
-            </w:tcMar>
-            <w:vAlign w:val="center"/>
-          </w:tcPr>
-          <w:p>
-            <w:pPr>
-              <w:spacing w:after="0" w:line="276" w:lineRule="auto"/>
-              <w:jc w:val="left"/>
-            </w:pPr>
-            <w:r>
-              <w:rPr>
-                <w:rFonts w:ascii="Songti SC" w:hAnsi="Songti SC" w:eastAsia="Songti SC" w:cs="Songti SC"/>
-                <w:color w:val="14242B"/>
-                <w:sz w:val="17"/>
-              </w:rPr>
-              <w:t>A</w:t>
-            </w:r>
-          </w:p>
-        </w:tc>
-        <w:tc>
-          <w:tcPr>
-            <w:tcW w:type="dxa" w:w="1930"/>
-            <w:tcMar>
-              <w:top w:w="80" w:type="dxa"/>
-              <w:start w:w="120" w:type="dxa"/>
-              <w:bottom w:w="80" w:type="dxa"/>
-              <w:end w:w="120" w:type="dxa"/>
-            </w:tcMar>
-            <w:vAlign w:val="center"/>
-          </w:tcPr>
-          <w:p>
-            <w:pPr>
-              <w:spacing w:after="0" w:line="276" w:lineRule="auto"/>
-              <w:jc w:val="center"/>
-            </w:pPr>
-            <w:r>
-              <w:rPr>
-                <w:rFonts w:ascii="Songti SC" w:hAnsi="Songti SC" w:eastAsia="Songti SC" w:cs="Songti SC"/>
-                <w:color w:val="14242B"/>
-                <w:sz w:val="17"/>
-              </w:rPr>
-              <w:t>-0.66%</w:t>
-            </w:r>
-          </w:p>
-        </w:tc>
-        <w:tc>
-          <w:tcPr>
-            <w:tcW w:type="dxa" w:w="2470"/>
-            <w:tcMar>
-              <w:top w:w="80" w:type="dxa"/>
-              <w:start w:w="120" w:type="dxa"/>
-              <w:bottom w:w="80" w:type="dxa"/>
-              <w:end w:w="120" w:type="dxa"/>
-            </w:tcMar>
-            <w:vAlign w:val="center"/>
-          </w:tcPr>
-          <w:p>
-            <w:pPr>
-              <w:spacing w:after="0" w:line="276" w:lineRule="auto"/>
-              <w:jc w:val="center"/>
-            </w:pPr>
-            <w:r>
-              <w:rPr>
-                <w:rFonts w:ascii="Songti SC" w:hAnsi="Songti SC" w:eastAsia="Songti SC" w:cs="Songti SC"/>
-                <w:color w:val="14242B"/>
-                <w:sz w:val="17"/>
-              </w:rPr>
-              <w:t>-10.33%</w:t>
-            </w:r>
-          </w:p>
-        </w:tc>
-        <w:tc>
-          <w:tcPr>
-            <w:tcW w:type="dxa" w:w="1930"/>
-            <w:tcMar>
-              <w:top w:w="80" w:type="dxa"/>
-              <w:start w:w="120" w:type="dxa"/>
-              <w:bottom w:w="80" w:type="dxa"/>
-              <w:end w:w="120" w:type="dxa"/>
-            </w:tcMar>
-            <w:vAlign w:val="center"/>
-          </w:tcPr>
-          <w:p>
-            <w:pPr>
-              <w:spacing w:after="0" w:line="276" w:lineRule="auto"/>
-              <w:jc w:val="center"/>
-            </w:pPr>
-            <w:r>
-              <w:rPr>
-                <w:rFonts w:ascii="Songti SC" w:hAnsi="Songti SC" w:eastAsia="Songti SC" w:cs="Songti SC"/>
-                <w:color w:val="14242B"/>
-                <w:sz w:val="17"/>
-              </w:rPr>
-              <w:t>-36.97%</w:t>
-            </w:r>
-          </w:p>
-        </w:tc>
-        <w:tc>
-          <w:tcPr>
-            <w:tcW w:type="dxa" w:w="2050"/>
-            <w:tcMar>
-              <w:top w:w="80" w:type="dxa"/>
-              <w:start w:w="120" w:type="dxa"/>
-              <w:bottom w:w="80" w:type="dxa"/>
-              <w:end w:w="120" w:type="dxa"/>
-            </w:tcMar>
-            <w:vAlign w:val="center"/>
-          </w:tcPr>
-          <w:p>
-            <w:pPr>
-              <w:spacing w:after="0" w:line="276" w:lineRule="auto"/>
-              <w:jc w:val="center"/>
-            </w:pPr>
-            <w:r>
-              <w:rPr>
-                <w:rFonts w:ascii="Songti SC" w:hAnsi="Songti SC" w:eastAsia="Songti SC" w:cs="Songti SC"/>
-                <w:color w:val="14242B"/>
-                <w:sz w:val="17"/>
-              </w:rPr>
-              <w:t>-42.91%</w:t>
-            </w:r>
-          </w:p>
-        </w:tc>
-      </w:tr>
-      <w:tr>
-        <w:tc>
-          <w:tcPr>
-            <w:tcW w:type="dxa" w:w="980"/>
-            <w:tcMar>
-              <w:top w:w="80" w:type="dxa"/>
-              <w:start w:w="120" w:type="dxa"/>
-              <w:bottom w:w="80" w:type="dxa"/>
-              <w:end w:w="120" w:type="dxa"/>
-            </w:tcMar>
-            <w:vAlign w:val="center"/>
-          </w:tcPr>
-          <w:p>
-            <w:pPr>
-              <w:spacing w:after="0" w:line="276" w:lineRule="auto"/>
-              <w:jc w:val="left"/>
-            </w:pPr>
-            <w:r>
-              <w:rPr>
-                <w:rFonts w:ascii="Songti SC" w:hAnsi="Songti SC" w:eastAsia="Songti SC" w:cs="Songti SC"/>
-                <w:color w:val="14242B"/>
-                <w:sz w:val="17"/>
-              </w:rPr>
-              <w:t>B</w:t>
-            </w:r>
-          </w:p>
-        </w:tc>
-        <w:tc>
-          <w:tcPr>
-            <w:tcW w:type="dxa" w:w="1930"/>
-            <w:tcMar>
-              <w:top w:w="80" w:type="dxa"/>
-              <w:start w:w="120" w:type="dxa"/>
-              <w:bottom w:w="80" w:type="dxa"/>
-              <w:end w:w="120" w:type="dxa"/>
-            </w:tcMar>
-            <w:vAlign w:val="center"/>
-          </w:tcPr>
-          <w:p>
-            <w:pPr>
-              <w:spacing w:after="0" w:line="276" w:lineRule="auto"/>
-              <w:jc w:val="center"/>
-            </w:pPr>
-            <w:r>
-              <w:rPr>
-                <w:rFonts w:ascii="Songti SC" w:hAnsi="Songti SC" w:eastAsia="Songti SC" w:cs="Songti SC"/>
-                <w:color w:val="14242B"/>
-                <w:sz w:val="17"/>
-              </w:rPr>
-              <w:t>2.91%</w:t>
-            </w:r>
-          </w:p>
-        </w:tc>
-        <w:tc>
-          <w:tcPr>
-            <w:tcW w:type="dxa" w:w="2470"/>
-            <w:tcMar>
-              <w:top w:w="80" w:type="dxa"/>
-              <w:start w:w="120" w:type="dxa"/>
-              <w:bottom w:w="80" w:type="dxa"/>
-              <w:end w:w="120" w:type="dxa"/>
-            </w:tcMar>
-            <w:vAlign w:val="center"/>
-          </w:tcPr>
-          <w:p>
-            <w:pPr>
-              <w:spacing w:after="0" w:line="276" w:lineRule="auto"/>
-              <w:jc w:val="center"/>
-            </w:pPr>
-            <w:r>
-              <w:rPr>
-                <w:rFonts w:ascii="Songti SC" w:hAnsi="Songti SC" w:eastAsia="Songti SC" w:cs="Songti SC"/>
-                <w:color w:val="14242B"/>
-                <w:sz w:val="17"/>
-              </w:rPr>
-              <w:t>6.01%</w:t>
-            </w:r>
-          </w:p>
-        </w:tc>
-        <w:tc>
-          <w:tcPr>
-            <w:tcW w:type="dxa" w:w="1930"/>
-            <w:tcMar>
-              <w:top w:w="80" w:type="dxa"/>
-              <w:start w:w="120" w:type="dxa"/>
-              <w:bottom w:w="80" w:type="dxa"/>
-              <w:end w:w="120" w:type="dxa"/>
-            </w:tcMar>
-            <w:vAlign w:val="center"/>
-          </w:tcPr>
-          <w:p>
-            <w:pPr>
-              <w:spacing w:after="0" w:line="276" w:lineRule="auto"/>
-              <w:jc w:val="center"/>
-            </w:pPr>
-            <w:r>
-              <w:rPr>
-                <w:rFonts w:ascii="Songti SC" w:hAnsi="Songti SC" w:eastAsia="Songti SC" w:cs="Songti SC"/>
-                <w:color w:val="14242B"/>
-                <w:sz w:val="17"/>
-              </w:rPr>
-              <w:t>-12.31%</w:t>
-            </w:r>
-          </w:p>
-        </w:tc>
-        <w:tc>
-          <w:tcPr>
-            <w:tcW w:type="dxa" w:w="2050"/>
-            <w:tcMar>
-              <w:top w:w="80" w:type="dxa"/>
-              <w:start w:w="120" w:type="dxa"/>
-              <w:bottom w:w="80" w:type="dxa"/>
-              <w:end w:w="120" w:type="dxa"/>
-            </w:tcMar>
-            <w:vAlign w:val="center"/>
-          </w:tcPr>
-          <w:p>
-            <w:pPr>
-              <w:spacing w:after="0" w:line="276" w:lineRule="auto"/>
-              <w:jc w:val="center"/>
-            </w:pPr>
-            <w:r>
-              <w:rPr>
-                <w:rFonts w:ascii="Songti SC" w:hAnsi="Songti SC" w:eastAsia="Songti SC" w:cs="Songti SC"/>
-                <w:color w:val="14242B"/>
-                <w:sz w:val="17"/>
-              </w:rPr>
-              <w:t>-10.07%</w:t>
-            </w:r>
-          </w:p>
-        </w:tc>
-      </w:tr>
-      <w:tr>
-        <w:tc>
-          <w:tcPr>
-            <w:tcW w:type="dxa" w:w="980"/>
-            <w:tcMar>
-              <w:top w:w="80" w:type="dxa"/>
-              <w:start w:w="120" w:type="dxa"/>
-              <w:bottom w:w="80" w:type="dxa"/>
-              <w:end w:w="120" w:type="dxa"/>
-            </w:tcMar>
-            <w:vAlign w:val="center"/>
-          </w:tcPr>
-          <w:p>
-            <w:pPr>
-              <w:spacing w:after="0" w:line="276" w:lineRule="auto"/>
-              <w:jc w:val="left"/>
-            </w:pPr>
-            <w:r>
-              <w:rPr>
-                <w:rFonts w:ascii="Songti SC" w:hAnsi="Songti SC" w:eastAsia="Songti SC" w:cs="Songti SC"/>
-                <w:color w:val="14242B"/>
-                <w:sz w:val="17"/>
-              </w:rPr>
-              <w:t>C</w:t>
-            </w:r>
-          </w:p>
-        </w:tc>
-        <w:tc>
-          <w:tcPr>
-            <w:tcW w:type="dxa" w:w="1930"/>
-            <w:tcMar>
-              <w:top w:w="80" w:type="dxa"/>
-              <w:start w:w="120" w:type="dxa"/>
-              <w:bottom w:w="80" w:type="dxa"/>
-              <w:end w:w="120" w:type="dxa"/>
-            </w:tcMar>
-            <w:vAlign w:val="center"/>
-          </w:tcPr>
-          <w:p>
-            <w:pPr>
-              <w:spacing w:after="0" w:line="276" w:lineRule="auto"/>
-              <w:jc w:val="center"/>
-            </w:pPr>
-            <w:r>
-              <w:rPr>
-                <w:rFonts w:ascii="Songti SC" w:hAnsi="Songti SC" w:eastAsia="Songti SC" w:cs="Songti SC"/>
-                <w:color w:val="14242B"/>
-                <w:sz w:val="17"/>
-              </w:rPr>
-              <w:t>71.84%</w:t>
-            </w:r>
-          </w:p>
-        </w:tc>
-        <w:tc>
-          <w:tcPr>
-            <w:tcW w:type="dxa" w:w="2470"/>
-            <w:tcMar>
-              <w:top w:w="80" w:type="dxa"/>
-              <w:start w:w="120" w:type="dxa"/>
-              <w:bottom w:w="80" w:type="dxa"/>
-              <w:end w:w="120" w:type="dxa"/>
-            </w:tcMar>
-            <w:vAlign w:val="center"/>
-          </w:tcPr>
-          <w:p>
-            <w:pPr>
-              <w:spacing w:after="0" w:line="276" w:lineRule="auto"/>
-              <w:jc w:val="center"/>
-            </w:pPr>
-            <w:r>
-              <w:rPr>
-                <w:rFonts w:ascii="Songti SC" w:hAnsi="Songti SC" w:eastAsia="Songti SC" w:cs="Songti SC"/>
-                <w:color w:val="14242B"/>
-                <w:sz w:val="17"/>
-              </w:rPr>
-              <w:t>85.97%</w:t>
-            </w:r>
-          </w:p>
-        </w:tc>
-        <w:tc>
-          <w:tcPr>
-            <w:tcW w:type="dxa" w:w="1930"/>
-            <w:tcMar>
-              <w:top w:w="80" w:type="dxa"/>
-              <w:start w:w="120" w:type="dxa"/>
-              <w:bottom w:w="80" w:type="dxa"/>
-              <w:end w:w="120" w:type="dxa"/>
-            </w:tcMar>
-            <w:vAlign w:val="center"/>
-          </w:tcPr>
-          <w:p>
-            <w:pPr>
-              <w:spacing w:after="0" w:line="276" w:lineRule="auto"/>
-              <w:jc w:val="center"/>
-            </w:pPr>
-            <w:r>
-              <w:rPr>
-                <w:rFonts w:ascii="Songti SC" w:hAnsi="Songti SC" w:eastAsia="Songti SC" w:cs="Songti SC"/>
-                <w:color w:val="14242B"/>
-                <w:sz w:val="17"/>
-              </w:rPr>
-              <w:t>-16.91%</w:t>
-            </w:r>
-          </w:p>
-        </w:tc>
-        <w:tc>
-          <w:tcPr>
-            <w:tcW w:type="dxa" w:w="2050"/>
-            <w:tcMar>
-              <w:top w:w="80" w:type="dxa"/>
-              <w:start w:w="120" w:type="dxa"/>
-              <w:bottom w:w="80" w:type="dxa"/>
-              <w:end w:w="120" w:type="dxa"/>
-            </w:tcMar>
-            <w:vAlign w:val="center"/>
-          </w:tcPr>
-          <w:p>
-            <w:pPr>
-              <w:spacing w:after="0" w:line="276" w:lineRule="auto"/>
-              <w:jc w:val="center"/>
-            </w:pPr>
-            <w:r>
-              <w:rPr>
-                <w:rFonts w:ascii="Songti SC" w:hAnsi="Songti SC" w:eastAsia="Songti SC" w:cs="Songti SC"/>
-                <w:color w:val="14242B"/>
-                <w:sz w:val="17"/>
-              </w:rPr>
-              <w:t>-14.75%</w:t>
-            </w:r>
-          </w:p>
-        </w:tc>
-      </w:tr>
-    </w:tbl>
-    <w:p>
-      <w:pPr>
-        <w:spacing w:after="40"/>
-      </w:pPr>
-    </w:p>
-    <w:p>
-      <w:pPr>
-        <w:spacing w:before="0" w:after="0" w:line="360" w:lineRule="auto"/>
-        <w:ind w:firstLine="420"/>
-        <w:jc w:val="both"/>
-      </w:pPr>
-      <w:r>
-        <w:rPr>
-          <w:rFonts w:ascii="Songti SC" w:hAnsi="Songti SC" w:eastAsia="Songti SC" w:cs="Songti SC"/>
-          <w:color w:val="14242B"/>
-          <w:sz w:val="21"/>
-        </w:rPr>
-        <w:t>在同一2019-2026窗口，本地影子复算的A、B、C累计收益分别为-10.33%、6.01%和85.97%，最大回撤分别为42.91%、10.07%和14.75%；公开基准同期收益为59.22%，聚宽基准为57.04%。差异来自行情复权、开盘价、交易日对齐、最低佣金、滑点和平台撮合实现。A与C的收益差距尤其明显，因此影子引擎只用于持续监测和差异定位，不替代平台回测，也不据此重新选择参数。</w:t>
+        <w:t>策略C累计收益71.84%、年化收益7.69%、最大回撤16.91%，相对沪深300取得14.23%的累计超额，是三者中收益与回撤匹配度最好的方案。其Beta为0.426，说明50%仓位上限有效压低了市场方向暴露；夏普比率0.315和30.37%的相对最大回撤同时表明，超额收益的形成过程仍有较大波动。表中最重要的发现是，策略C的领先同时体现在收益和绝对回撤两个维度，策略B的优势则集中在防守。</w:t>
       </w:r>
     </w:p>
     <w:p>
@@ -2364,10 +1752,10 @@
         <w:rPr>
           <w:rFonts w:ascii="Songti SC" w:hAnsi="Songti SC" w:eastAsia="Songti SC" w:cs="Songti SC"/>
           <w:b/>
-          <w:color w:val="147D72"/>
+          <w:color w:val="000000"/>
           <w:sz w:val="28"/>
         </w:rPr>
-        <w:t>六、影子回测与风险暴露</w:t>
+        <w:t>六、收益来源与主要风险</w:t>
       </w:r>
     </w:p>
     <w:p>
@@ -2379,8 +1767,8 @@
       <w:r>
         <w:drawing>
           <wp:inline xmlns:a="http://schemas.openxmlformats.org/drawingml/2006/main" xmlns:pic="http://schemas.openxmlformats.org/drawingml/2006/picture">
-            <wp:extent cx="5577840" cy="4101553"/>
-            <wp:docPr id="2" name="Picture 2" descr="图2：三策略与沪深300的归一化净值及策略回撤（2016-2026）"/>
+            <wp:extent cx="5303520" cy="3899838"/>
+            <wp:docPr id="2" name="Picture 2" descr="图2：扩展样本下三策略与沪深300的净值及回撤（2016—2026）"/>
             <wp:cNvGraphicFramePr>
               <a:graphicFrameLocks noChangeAspect="1"/>
             </wp:cNvGraphicFramePr>
@@ -2400,7 +1788,7 @@
                   <pic:spPr>
                     <a:xfrm>
                       <a:off x="0" y="0"/>
-                      <a:ext cx="5577840" cy="4101553"/>
+                      <a:ext cx="5303520" cy="3899838"/>
                     </a:xfrm>
                     <a:prstGeom prst="rect"/>
                   </pic:spPr>
@@ -2413,16 +1801,16 @@
     </w:p>
     <w:p>
       <w:pPr>
-        <w:spacing w:after="120"/>
+        <w:spacing w:after="240"/>
         <w:jc w:val="center"/>
       </w:pPr>
       <w:r>
         <w:rPr>
           <w:rFonts w:ascii="Songti SC" w:hAnsi="Songti SC" w:eastAsia="Songti SC" w:cs="Songti SC"/>
-          <w:color w:val="61727A"/>
+          <w:color w:val="000000"/>
           <w:sz w:val="18"/>
         </w:rPr>
-        <w:t>图2：三策略与沪深300的归一化净值及策略回撤（2016-2026）</w:t>
+        <w:t>图2：扩展样本下三策略与沪深300的净值及回撤（2016—2026）</w:t>
       </w:r>
     </w:p>
     <w:p>
@@ -2434,10 +1822,10 @@
       <w:r>
         <w:rPr>
           <w:rFonts w:ascii="Songti SC" w:hAnsi="Songti SC" w:eastAsia="Songti SC" w:cs="Songti SC"/>
-          <w:color w:val="14242B"/>
+          <w:color w:val="000000"/>
           <w:sz w:val="21"/>
         </w:rPr>
-        <w:t>图2揭示了三个策略之间的结构差异。策略A全期累计收益为-30.38%，最大回撤达到-42.91%，说明全仓均线模板在震荡阶段反复进出后无法覆盖交易摩擦。策略B累计收益只有2.16%，但最大回撤降至-11.82%，平均市场仓位为18.95%，其稳定性主要来自较低暴露和账户暂停机制。策略C累计收益为56.93%，最大回撤为-16.72%，超过沪深300同期34.02%的涨幅；然而收益曲线在2024年以后改善明显，开发期优势有限，尚不能把最近市场状态下的相对表现推广为长期规律。</w:t>
+        <w:t>图2显示三条策略净值具有明显不同的路径。策略A在2021年后持续走弱，回撤长期处于较深区间，说明简单MA20信号在反复震荡中容易连续承受假突破和交易摩擦。策略B的净值长期围绕初始水平窄幅波动，回撤显著较浅，其稳定性主要来自较低市场参与度。策略C在2016—2023年的领先并不突出，主要增值集中在2024年以后，并在期末超过沪深300。策略C的优势由特定阶段贡献，收益路径存在明显的市场风格依赖。</w:t>
       </w:r>
     </w:p>
     <w:p>
@@ -2449,7 +1837,7 @@
       <w:r>
         <w:drawing>
           <wp:inline xmlns:a="http://schemas.openxmlformats.org/drawingml/2006/main" xmlns:pic="http://schemas.openxmlformats.org/drawingml/2006/picture">
-            <wp:extent cx="5577840" cy="2628676"/>
+            <wp:extent cx="5303520" cy="2499397"/>
             <wp:docPr id="3" name="Picture 3" descr="图3：开发期、验证期与参数冻结后的2026年样本外累计收益"/>
             <wp:cNvGraphicFramePr>
               <a:graphicFrameLocks noChangeAspect="1"/>
@@ -2470,7 +1858,7 @@
                   <pic:spPr>
                     <a:xfrm>
                       <a:off x="0" y="0"/>
-                      <a:ext cx="5577840" cy="2628676"/>
+                      <a:ext cx="5303520" cy="2499397"/>
                     </a:xfrm>
                     <a:prstGeom prst="rect"/>
                   </pic:spPr>
@@ -2483,13 +1871,13 @@
     </w:p>
     <w:p>
       <w:pPr>
-        <w:spacing w:after="120"/>
+        <w:spacing w:after="240"/>
         <w:jc w:val="center"/>
       </w:pPr>
       <w:r>
         <w:rPr>
           <w:rFonts w:ascii="Songti SC" w:hAnsi="Songti SC" w:eastAsia="Songti SC" w:cs="Songti SC"/>
-          <w:color w:val="61727A"/>
+          <w:color w:val="000000"/>
           <w:sz w:val="18"/>
         </w:rPr>
         <w:t>图3：开发期、验证期与参数冻结后的2026年样本外累计收益</w:t>
@@ -2504,34 +1892,29 @@
       <w:r>
         <w:rPr>
           <w:rFonts w:ascii="Songti SC" w:hAnsi="Songti SC" w:eastAsia="Songti SC" w:cs="Songti SC"/>
-          <w:color w:val="14242B"/>
+          <w:color w:val="000000"/>
           <w:sz w:val="21"/>
         </w:rPr>
-        <w:t>图3把最终参数放回三个阶段比较。策略A在开发期损失34.06%，验证期回升12.16%，2026年又下降6.41%，方向反复且成本敏感。策略B三个阶段分别为2.00%、2.11%和-2.61%，回撤始终较低，但其低收益与低仓位同时存在，不能仅用绝对收益评价信号。策略C三个阶段为6.11%、36.29%和7.08%，验证期贡献了全期大部分增值；2026样本外只有134个交易日，正收益只能记录为当前观察，不能年化后宣称模拟盘有效。</w:t>
-      </w:r>
-    </w:p>
-    <w:p>
-      <w:r>
-        <w:br w:type="page"/>
+        <w:t>图3进一步定位了收益来源。策略A在开发期亏损34.06%，验证期反弹12.16%，参数冻结后的2026年又下跌6.41%，收益方向反复，缺少稳定信号。策略B在开发期和验证期仅分别上涨2.00%和2.11%，2026年下跌2.61%，呈现低波动、低收益的防守特征。策略C三个阶段分别上涨6.11%、36.29%和7.09%，在每个阶段都领先另外两套策略；其中验证期贡献最大，确认了长期领先对2024—2025年市场环境的依赖。2026年仍为正提供了一项样本外支持，当前样本长度尚不足以消除风格集中风险。</w:t>
       </w:r>
     </w:p>
     <w:tbl>
       <w:tblPr>
         <w:tblStyle w:val="TableGrid"/>
-        <w:tblW w:type="dxa" w:w="9360"/>
+        <w:tblW w:type="dxa" w:w="8520"/>
         <w:tblLayout w:type="fixed"/>
         <w:tblLook w:firstColumn="1" w:firstRow="1" w:lastColumn="0" w:lastRow="0" w:noHBand="0" w:noVBand="1" w:val="04A0"/>
         <w:jc w:val="center"/>
         <w:tblInd w:w="120" w:type="dxa"/>
       </w:tblPr>
       <w:tblGrid>
-        <w:gridCol w:w="600"/>
-        <w:gridCol w:w="1390"/>
-        <w:gridCol w:w="1390"/>
-        <w:gridCol w:w="900"/>
-        <w:gridCol w:w="1390"/>
-        <w:gridCol w:w="900"/>
-        <w:gridCol w:w="2790"/>
+        <w:gridCol w:w="819"/>
+        <w:gridCol w:w="1265"/>
+        <w:gridCol w:w="1265"/>
+        <w:gridCol w:w="819"/>
+        <w:gridCol w:w="1265"/>
+        <w:gridCol w:w="819"/>
+        <w:gridCol w:w="2268"/>
       </w:tblGrid>
       <w:tr>
         <w:trPr>
@@ -2539,7 +1922,7 @@
         </w:trPr>
         <w:tc>
           <w:tcPr>
-            <w:tcW w:type="dxa" w:w="600"/>
+            <w:tcW w:type="dxa" w:w="819"/>
             <w:tcMar>
               <w:top w:w="80" w:type="dxa"/>
               <w:start w:w="120" w:type="dxa"/>
@@ -2547,7 +1930,7 @@
               <w:end w:w="120" w:type="dxa"/>
             </w:tcMar>
             <w:vAlign w:val="center"/>
-            <w:shd w:fill="F2F4F3"/>
+            <w:shd w:fill="D9D9D9"/>
           </w:tcPr>
           <w:p>
             <w:pPr>
@@ -2558,7 +1941,7 @@
               <w:rPr>
                 <w:rFonts w:ascii="Songti SC" w:hAnsi="Songti SC" w:eastAsia="Songti SC" w:cs="Songti SC"/>
                 <w:b/>
-                <w:color w:val="14242B"/>
+                <w:color w:val="000000"/>
                 <w:sz w:val="17"/>
               </w:rPr>
               <w:t>策略</w:t>
@@ -2567,7 +1950,7 @@
         </w:tc>
         <w:tc>
           <w:tcPr>
-            <w:tcW w:type="dxa" w:w="1390"/>
+            <w:tcW w:type="dxa" w:w="1265"/>
             <w:tcMar>
               <w:top w:w="80" w:type="dxa"/>
               <w:start w:w="120" w:type="dxa"/>
@@ -2575,7 +1958,7 @@
               <w:end w:w="120" w:type="dxa"/>
             </w:tcMar>
             <w:vAlign w:val="center"/>
-            <w:shd w:fill="F2F4F3"/>
+            <w:shd w:fill="D9D9D9"/>
           </w:tcPr>
           <w:p>
             <w:pPr>
@@ -2586,7 +1969,7 @@
               <w:rPr>
                 <w:rFonts w:ascii="Songti SC" w:hAnsi="Songti SC" w:eastAsia="Songti SC" w:cs="Songti SC"/>
                 <w:b/>
-                <w:color w:val="14242B"/>
+                <w:color w:val="000000"/>
                 <w:sz w:val="17"/>
               </w:rPr>
               <w:t>累计收益</w:t>
@@ -2595,7 +1978,7 @@
         </w:tc>
         <w:tc>
           <w:tcPr>
-            <w:tcW w:type="dxa" w:w="1390"/>
+            <w:tcW w:type="dxa" w:w="1265"/>
             <w:tcMar>
               <w:top w:w="80" w:type="dxa"/>
               <w:start w:w="120" w:type="dxa"/>
@@ -2603,7 +1986,7 @@
               <w:end w:w="120" w:type="dxa"/>
             </w:tcMar>
             <w:vAlign w:val="center"/>
-            <w:shd w:fill="F2F4F3"/>
+            <w:shd w:fill="D9D9D9"/>
           </w:tcPr>
           <w:p>
             <w:pPr>
@@ -2614,7 +1997,7 @@
               <w:rPr>
                 <w:rFonts w:ascii="Songti SC" w:hAnsi="Songti SC" w:eastAsia="Songti SC" w:cs="Songti SC"/>
                 <w:b/>
-                <w:color w:val="14242B"/>
+                <w:color w:val="000000"/>
                 <w:sz w:val="17"/>
               </w:rPr>
               <w:t>最大回撤</w:t>
@@ -2623,7 +2006,7 @@
         </w:tc>
         <w:tc>
           <w:tcPr>
-            <w:tcW w:type="dxa" w:w="900"/>
+            <w:tcW w:type="dxa" w:w="819"/>
             <w:tcMar>
               <w:top w:w="80" w:type="dxa"/>
               <w:start w:w="120" w:type="dxa"/>
@@ -2631,7 +2014,7 @@
               <w:end w:w="120" w:type="dxa"/>
             </w:tcMar>
             <w:vAlign w:val="center"/>
-            <w:shd w:fill="F2F4F3"/>
+            <w:shd w:fill="D9D9D9"/>
           </w:tcPr>
           <w:p>
             <w:pPr>
@@ -2642,7 +2025,7 @@
               <w:rPr>
                 <w:rFonts w:ascii="Songti SC" w:hAnsi="Songti SC" w:eastAsia="Songti SC" w:cs="Songti SC"/>
                 <w:b/>
-                <w:color w:val="14242B"/>
+                <w:color w:val="000000"/>
                 <w:sz w:val="17"/>
               </w:rPr>
               <w:t>夏普</w:t>
@@ -2651,7 +2034,7 @@
         </w:tc>
         <w:tc>
           <w:tcPr>
-            <w:tcW w:type="dxa" w:w="1390"/>
+            <w:tcW w:type="dxa" w:w="1265"/>
             <w:tcMar>
               <w:top w:w="80" w:type="dxa"/>
               <w:start w:w="120" w:type="dxa"/>
@@ -2659,7 +2042,7 @@
               <w:end w:w="120" w:type="dxa"/>
             </w:tcMar>
             <w:vAlign w:val="center"/>
-            <w:shd w:fill="F2F4F3"/>
+            <w:shd w:fill="D9D9D9"/>
           </w:tcPr>
           <w:p>
             <w:pPr>
@@ -2670,7 +2053,7 @@
               <w:rPr>
                 <w:rFonts w:ascii="Songti SC" w:hAnsi="Songti SC" w:eastAsia="Songti SC" w:cs="Songti SC"/>
                 <w:b/>
-                <w:color w:val="14242B"/>
+                <w:color w:val="000000"/>
                 <w:sz w:val="17"/>
               </w:rPr>
               <w:t>平均仓位</w:t>
@@ -2679,7 +2062,7 @@
         </w:tc>
         <w:tc>
           <w:tcPr>
-            <w:tcW w:type="dxa" w:w="900"/>
+            <w:tcW w:type="dxa" w:w="819"/>
             <w:tcMar>
               <w:top w:w="80" w:type="dxa"/>
               <w:start w:w="120" w:type="dxa"/>
@@ -2687,7 +2070,7 @@
               <w:end w:w="120" w:type="dxa"/>
             </w:tcMar>
             <w:vAlign w:val="center"/>
-            <w:shd w:fill="F2F4F3"/>
+            <w:shd w:fill="D9D9D9"/>
           </w:tcPr>
           <w:p>
             <w:pPr>
@@ -2698,7 +2081,7 @@
               <w:rPr>
                 <w:rFonts w:ascii="Songti SC" w:hAnsi="Songti SC" w:eastAsia="Songti SC" w:cs="Songti SC"/>
                 <w:b/>
-                <w:color w:val="14242B"/>
+                <w:color w:val="000000"/>
                 <w:sz w:val="17"/>
               </w:rPr>
               <w:t>Beta</w:t>
@@ -2707,7 +2090,7 @@
         </w:tc>
         <w:tc>
           <w:tcPr>
-            <w:tcW w:type="dxa" w:w="2790"/>
+            <w:tcW w:type="dxa" w:w="2268"/>
             <w:tcMar>
               <w:top w:w="80" w:type="dxa"/>
               <w:start w:w="120" w:type="dxa"/>
@@ -2715,7 +2098,7 @@
               <w:end w:w="120" w:type="dxa"/>
             </w:tcMar>
             <w:vAlign w:val="center"/>
-            <w:shd w:fill="F2F4F3"/>
+            <w:shd w:fill="D9D9D9"/>
           </w:tcPr>
           <w:p>
             <w:pPr>
@@ -2726,7 +2109,7 @@
               <w:rPr>
                 <w:rFonts w:ascii="Songti SC" w:hAnsi="Songti SC" w:eastAsia="Songti SC" w:cs="Songti SC"/>
                 <w:b/>
-                <w:color w:val="14242B"/>
+                <w:color w:val="000000"/>
                 <w:sz w:val="17"/>
               </w:rPr>
               <w:t>估算成本/元</w:t>
@@ -2737,33 +2120,7 @@
       <w:tr>
         <w:tc>
           <w:tcPr>
-            <w:tcW w:type="dxa" w:w="600"/>
-            <w:tcMar>
-              <w:top w:w="80" w:type="dxa"/>
-              <w:start w:w="120" w:type="dxa"/>
-              <w:bottom w:w="80" w:type="dxa"/>
-              <w:end w:w="120" w:type="dxa"/>
-            </w:tcMar>
-            <w:vAlign w:val="center"/>
-          </w:tcPr>
-          <w:p>
-            <w:pPr>
-              <w:spacing w:after="0" w:line="276" w:lineRule="auto"/>
-              <w:jc w:val="left"/>
-            </w:pPr>
-            <w:r>
-              <w:rPr>
-                <w:rFonts w:ascii="Songti SC" w:hAnsi="Songti SC" w:eastAsia="Songti SC" w:cs="Songti SC"/>
-                <w:color w:val="14242B"/>
-                <w:sz w:val="17"/>
-              </w:rPr>
-              <w:t>A</w:t>
-            </w:r>
-          </w:p>
-        </w:tc>
-        <w:tc>
-          <w:tcPr>
-            <w:tcW w:type="dxa" w:w="1390"/>
+            <w:tcW w:type="dxa" w:w="819"/>
             <w:tcMar>
               <w:top w:w="80" w:type="dxa"/>
               <w:start w:w="120" w:type="dxa"/>
@@ -2780,16 +2137,16 @@
             <w:r>
               <w:rPr>
                 <w:rFonts w:ascii="Songti SC" w:hAnsi="Songti SC" w:eastAsia="Songti SC" w:cs="Songti SC"/>
-                <w:color w:val="14242B"/>
+                <w:color w:val="000000"/>
                 <w:sz w:val="17"/>
               </w:rPr>
-              <w:t>-30.38%</w:t>
+              <w:t>A</w:t>
             </w:r>
           </w:p>
         </w:tc>
         <w:tc>
           <w:tcPr>
-            <w:tcW w:type="dxa" w:w="1390"/>
+            <w:tcW w:type="dxa" w:w="1265"/>
             <w:tcMar>
               <w:top w:w="80" w:type="dxa"/>
               <w:start w:w="120" w:type="dxa"/>
@@ -2806,16 +2163,16 @@
             <w:r>
               <w:rPr>
                 <w:rFonts w:ascii="Songti SC" w:hAnsi="Songti SC" w:eastAsia="Songti SC" w:cs="Songti SC"/>
-                <w:color w:val="14242B"/>
+                <w:color w:val="000000"/>
                 <w:sz w:val="17"/>
               </w:rPr>
-              <w:t>-42.91%</w:t>
+              <w:t>-30.38%</w:t>
             </w:r>
           </w:p>
         </w:tc>
         <w:tc>
           <w:tcPr>
-            <w:tcW w:type="dxa" w:w="900"/>
+            <w:tcW w:type="dxa" w:w="1265"/>
             <w:tcMar>
               <w:top w:w="80" w:type="dxa"/>
               <w:start w:w="120" w:type="dxa"/>
@@ -2832,16 +2189,16 @@
             <w:r>
               <w:rPr>
                 <w:rFonts w:ascii="Songti SC" w:hAnsi="Songti SC" w:eastAsia="Songti SC" w:cs="Songti SC"/>
-                <w:color w:val="14242B"/>
+                <w:color w:val="000000"/>
                 <w:sz w:val="17"/>
               </w:rPr>
-              <w:t>-0.21</w:t>
+              <w:t>-42.91%</w:t>
             </w:r>
           </w:p>
         </w:tc>
         <w:tc>
           <w:tcPr>
-            <w:tcW w:type="dxa" w:w="1390"/>
+            <w:tcW w:type="dxa" w:w="819"/>
             <w:tcMar>
               <w:top w:w="80" w:type="dxa"/>
               <w:start w:w="120" w:type="dxa"/>
@@ -2858,16 +2215,16 @@
             <w:r>
               <w:rPr>
                 <w:rFonts w:ascii="Songti SC" w:hAnsi="Songti SC" w:eastAsia="Songti SC" w:cs="Songti SC"/>
-                <w:color w:val="14242B"/>
+                <w:color w:val="000000"/>
                 <w:sz w:val="17"/>
               </w:rPr>
-              <w:t>52.92%</w:t>
+              <w:t>-0.21</w:t>
             </w:r>
           </w:p>
         </w:tc>
         <w:tc>
           <w:tcPr>
-            <w:tcW w:type="dxa" w:w="900"/>
+            <w:tcW w:type="dxa" w:w="1265"/>
             <w:tcMar>
               <w:top w:w="80" w:type="dxa"/>
               <w:start w:w="120" w:type="dxa"/>
@@ -2884,16 +2241,16 @@
             <w:r>
               <w:rPr>
                 <w:rFonts w:ascii="Songti SC" w:hAnsi="Songti SC" w:eastAsia="Songti SC" w:cs="Songti SC"/>
-                <w:color w:val="14242B"/>
+                <w:color w:val="000000"/>
                 <w:sz w:val="17"/>
               </w:rPr>
-              <w:t>0.46</w:t>
+              <w:t>52.92%</w:t>
             </w:r>
           </w:p>
         </w:tc>
         <w:tc>
           <w:tcPr>
-            <w:tcW w:type="dxa" w:w="2790"/>
+            <w:tcW w:type="dxa" w:w="819"/>
             <w:tcMar>
               <w:top w:w="80" w:type="dxa"/>
               <w:start w:w="120" w:type="dxa"/>
@@ -2910,44 +2267,16 @@
             <w:r>
               <w:rPr>
                 <w:rFonts w:ascii="Songti SC" w:hAnsi="Songti SC" w:eastAsia="Songti SC" w:cs="Songti SC"/>
-                <w:color w:val="14242B"/>
+                <w:color w:val="000000"/>
                 <w:sz w:val="17"/>
               </w:rPr>
-              <w:t>169,425</w:t>
-            </w:r>
-          </w:p>
-        </w:tc>
-      </w:tr>
-      <w:tr>
-        <w:tc>
-          <w:tcPr>
-            <w:tcW w:type="dxa" w:w="600"/>
-            <w:tcMar>
-              <w:top w:w="80" w:type="dxa"/>
-              <w:start w:w="120" w:type="dxa"/>
-              <w:bottom w:w="80" w:type="dxa"/>
-              <w:end w:w="120" w:type="dxa"/>
-            </w:tcMar>
-            <w:vAlign w:val="center"/>
-          </w:tcPr>
-          <w:p>
-            <w:pPr>
-              <w:spacing w:after="0" w:line="276" w:lineRule="auto"/>
-              <w:jc w:val="left"/>
-            </w:pPr>
-            <w:r>
-              <w:rPr>
-                <w:rFonts w:ascii="Songti SC" w:hAnsi="Songti SC" w:eastAsia="Songti SC" w:cs="Songti SC"/>
-                <w:color w:val="14242B"/>
-                <w:sz w:val="17"/>
-              </w:rPr>
-              <w:t>B</w:t>
+              <w:t>0.46</w:t>
             </w:r>
           </w:p>
         </w:tc>
         <w:tc>
           <w:tcPr>
-            <w:tcW w:type="dxa" w:w="1390"/>
+            <w:tcW w:type="dxa" w:w="2268"/>
             <w:tcMar>
               <w:top w:w="80" w:type="dxa"/>
               <w:start w:w="120" w:type="dxa"/>
@@ -2964,16 +2293,18 @@
             <w:r>
               <w:rPr>
                 <w:rFonts w:ascii="Songti SC" w:hAnsi="Songti SC" w:eastAsia="Songti SC" w:cs="Songti SC"/>
-                <w:color w:val="14242B"/>
+                <w:color w:val="000000"/>
                 <w:sz w:val="17"/>
               </w:rPr>
-              <w:t>2.16%</w:t>
+              <w:t>169,425</w:t>
             </w:r>
           </w:p>
         </w:tc>
+      </w:tr>
+      <w:tr>
         <w:tc>
           <w:tcPr>
-            <w:tcW w:type="dxa" w:w="1390"/>
+            <w:tcW w:type="dxa" w:w="819"/>
             <w:tcMar>
               <w:top w:w="80" w:type="dxa"/>
               <w:start w:w="120" w:type="dxa"/>
@@ -2990,16 +2321,16 @@
             <w:r>
               <w:rPr>
                 <w:rFonts w:ascii="Songti SC" w:hAnsi="Songti SC" w:eastAsia="Songti SC" w:cs="Songti SC"/>
-                <w:color w:val="14242B"/>
+                <w:color w:val="000000"/>
                 <w:sz w:val="17"/>
               </w:rPr>
-              <w:t>-11.82%</w:t>
+              <w:t>B</w:t>
             </w:r>
           </w:p>
         </w:tc>
         <w:tc>
           <w:tcPr>
-            <w:tcW w:type="dxa" w:w="900"/>
+            <w:tcW w:type="dxa" w:w="1265"/>
             <w:tcMar>
               <w:top w:w="80" w:type="dxa"/>
               <w:start w:w="120" w:type="dxa"/>
@@ -3016,16 +2347,16 @@
             <w:r>
               <w:rPr>
                 <w:rFonts w:ascii="Songti SC" w:hAnsi="Songti SC" w:eastAsia="Songti SC" w:cs="Songti SC"/>
-                <w:color w:val="14242B"/>
+                <w:color w:val="000000"/>
                 <w:sz w:val="17"/>
               </w:rPr>
-              <w:t>0.07</w:t>
+              <w:t>2.16%</w:t>
             </w:r>
           </w:p>
         </w:tc>
         <w:tc>
           <w:tcPr>
-            <w:tcW w:type="dxa" w:w="1390"/>
+            <w:tcW w:type="dxa" w:w="1265"/>
             <w:tcMar>
               <w:top w:w="80" w:type="dxa"/>
               <w:start w:w="120" w:type="dxa"/>
@@ -3042,16 +2373,16 @@
             <w:r>
               <w:rPr>
                 <w:rFonts w:ascii="Songti SC" w:hAnsi="Songti SC" w:eastAsia="Songti SC" w:cs="Songti SC"/>
-                <w:color w:val="14242B"/>
+                <w:color w:val="000000"/>
                 <w:sz w:val="17"/>
               </w:rPr>
-              <w:t>18.95%</w:t>
+              <w:t>-11.82%</w:t>
             </w:r>
           </w:p>
         </w:tc>
         <w:tc>
           <w:tcPr>
-            <w:tcW w:type="dxa" w:w="900"/>
+            <w:tcW w:type="dxa" w:w="819"/>
             <w:tcMar>
               <w:top w:w="80" w:type="dxa"/>
               <w:start w:w="120" w:type="dxa"/>
@@ -3068,16 +2399,16 @@
             <w:r>
               <w:rPr>
                 <w:rFonts w:ascii="Songti SC" w:hAnsi="Songti SC" w:eastAsia="Songti SC" w:cs="Songti SC"/>
-                <w:color w:val="14242B"/>
+                <w:color w:val="000000"/>
                 <w:sz w:val="17"/>
               </w:rPr>
-              <w:t>0.16</w:t>
+              <w:t>0.07</w:t>
             </w:r>
           </w:p>
         </w:tc>
         <w:tc>
           <w:tcPr>
-            <w:tcW w:type="dxa" w:w="2790"/>
+            <w:tcW w:type="dxa" w:w="1265"/>
             <w:tcMar>
               <w:top w:w="80" w:type="dxa"/>
               <w:start w:w="120" w:type="dxa"/>
@@ -3094,44 +2425,16 @@
             <w:r>
               <w:rPr>
                 <w:rFonts w:ascii="Songti SC" w:hAnsi="Songti SC" w:eastAsia="Songti SC" w:cs="Songti SC"/>
-                <w:color w:val="14242B"/>
+                <w:color w:val="000000"/>
                 <w:sz w:val="17"/>
               </w:rPr>
-              <w:t>51,644</w:t>
-            </w:r>
-          </w:p>
-        </w:tc>
-      </w:tr>
-      <w:tr>
-        <w:tc>
-          <w:tcPr>
-            <w:tcW w:type="dxa" w:w="600"/>
-            <w:tcMar>
-              <w:top w:w="80" w:type="dxa"/>
-              <w:start w:w="120" w:type="dxa"/>
-              <w:bottom w:w="80" w:type="dxa"/>
-              <w:end w:w="120" w:type="dxa"/>
-            </w:tcMar>
-            <w:vAlign w:val="center"/>
-          </w:tcPr>
-          <w:p>
-            <w:pPr>
-              <w:spacing w:after="0" w:line="276" w:lineRule="auto"/>
-              <w:jc w:val="left"/>
-            </w:pPr>
-            <w:r>
-              <w:rPr>
-                <w:rFonts w:ascii="Songti SC" w:hAnsi="Songti SC" w:eastAsia="Songti SC" w:cs="Songti SC"/>
-                <w:color w:val="14242B"/>
-                <w:sz w:val="17"/>
-              </w:rPr>
-              <w:t>C</w:t>
+              <w:t>18.95%</w:t>
             </w:r>
           </w:p>
         </w:tc>
         <w:tc>
           <w:tcPr>
-            <w:tcW w:type="dxa" w:w="1390"/>
+            <w:tcW w:type="dxa" w:w="819"/>
             <w:tcMar>
               <w:top w:w="80" w:type="dxa"/>
               <w:start w:w="120" w:type="dxa"/>
@@ -3148,16 +2451,16 @@
             <w:r>
               <w:rPr>
                 <w:rFonts w:ascii="Songti SC" w:hAnsi="Songti SC" w:eastAsia="Songti SC" w:cs="Songti SC"/>
-                <w:color w:val="14242B"/>
+                <w:color w:val="000000"/>
                 <w:sz w:val="17"/>
               </w:rPr>
-              <w:t>56.93%</w:t>
+              <w:t>0.16</w:t>
             </w:r>
           </w:p>
         </w:tc>
         <w:tc>
           <w:tcPr>
-            <w:tcW w:type="dxa" w:w="1390"/>
+            <w:tcW w:type="dxa" w:w="2268"/>
             <w:tcMar>
               <w:top w:w="80" w:type="dxa"/>
               <w:start w:w="120" w:type="dxa"/>
@@ -3174,16 +2477,18 @@
             <w:r>
               <w:rPr>
                 <w:rFonts w:ascii="Songti SC" w:hAnsi="Songti SC" w:eastAsia="Songti SC" w:cs="Songti SC"/>
-                <w:color w:val="14242B"/>
+                <w:color w:val="000000"/>
                 <w:sz w:val="17"/>
               </w:rPr>
-              <w:t>-16.72%</w:t>
+              <w:t>51,644</w:t>
             </w:r>
           </w:p>
         </w:tc>
+      </w:tr>
+      <w:tr>
         <w:tc>
           <w:tcPr>
-            <w:tcW w:type="dxa" w:w="900"/>
+            <w:tcW w:type="dxa" w:w="819"/>
             <w:tcMar>
               <w:top w:w="80" w:type="dxa"/>
               <w:start w:w="120" w:type="dxa"/>
@@ -3200,16 +2505,16 @@
             <w:r>
               <w:rPr>
                 <w:rFonts w:ascii="Songti SC" w:hAnsi="Songti SC" w:eastAsia="Songti SC" w:cs="Songti SC"/>
-                <w:color w:val="14242B"/>
+                <w:color w:val="000000"/>
                 <w:sz w:val="17"/>
               </w:rPr>
-              <w:t>0.44</w:t>
+              <w:t>C</w:t>
             </w:r>
           </w:p>
         </w:tc>
         <w:tc>
           <w:tcPr>
-            <w:tcW w:type="dxa" w:w="1390"/>
+            <w:tcW w:type="dxa" w:w="1265"/>
             <w:tcMar>
               <w:top w:w="80" w:type="dxa"/>
               <w:start w:w="120" w:type="dxa"/>
@@ -3226,16 +2531,16 @@
             <w:r>
               <w:rPr>
                 <w:rFonts w:ascii="Songti SC" w:hAnsi="Songti SC" w:eastAsia="Songti SC" w:cs="Songti SC"/>
-                <w:color w:val="14242B"/>
+                <w:color w:val="000000"/>
                 <w:sz w:val="17"/>
               </w:rPr>
-              <w:t>34.07%</w:t>
+              <w:t>56.93%</w:t>
             </w:r>
           </w:p>
         </w:tc>
         <w:tc>
           <w:tcPr>
-            <w:tcW w:type="dxa" w:w="900"/>
+            <w:tcW w:type="dxa" w:w="1265"/>
             <w:tcMar>
               <w:top w:w="80" w:type="dxa"/>
               <w:start w:w="120" w:type="dxa"/>
@@ -3252,16 +2557,16 @@
             <w:r>
               <w:rPr>
                 <w:rFonts w:ascii="Songti SC" w:hAnsi="Songti SC" w:eastAsia="Songti SC" w:cs="Songti SC"/>
-                <w:color w:val="14242B"/>
+                <w:color w:val="000000"/>
                 <w:sz w:val="17"/>
               </w:rPr>
-              <w:t>0.40</w:t>
+              <w:t>-16.72%</w:t>
             </w:r>
           </w:p>
         </w:tc>
         <w:tc>
           <w:tcPr>
-            <w:tcW w:type="dxa" w:w="2790"/>
+            <w:tcW w:type="dxa" w:w="819"/>
             <w:tcMar>
               <w:top w:w="80" w:type="dxa"/>
               <w:start w:w="120" w:type="dxa"/>
@@ -3278,7 +2583,85 @@
             <w:r>
               <w:rPr>
                 <w:rFonts w:ascii="Songti SC" w:hAnsi="Songti SC" w:eastAsia="Songti SC" w:cs="Songti SC"/>
-                <w:color w:val="14242B"/>
+                <w:color w:val="000000"/>
+                <w:sz w:val="17"/>
+              </w:rPr>
+              <w:t>0.44</w:t>
+            </w:r>
+          </w:p>
+        </w:tc>
+        <w:tc>
+          <w:tcPr>
+            <w:tcW w:type="dxa" w:w="1265"/>
+            <w:tcMar>
+              <w:top w:w="80" w:type="dxa"/>
+              <w:start w:w="120" w:type="dxa"/>
+              <w:bottom w:w="80" w:type="dxa"/>
+              <w:end w:w="120" w:type="dxa"/>
+            </w:tcMar>
+            <w:vAlign w:val="center"/>
+          </w:tcPr>
+          <w:p>
+            <w:pPr>
+              <w:spacing w:after="0" w:line="276" w:lineRule="auto"/>
+              <w:jc w:val="center"/>
+            </w:pPr>
+            <w:r>
+              <w:rPr>
+                <w:rFonts w:ascii="Songti SC" w:hAnsi="Songti SC" w:eastAsia="Songti SC" w:cs="Songti SC"/>
+                <w:color w:val="000000"/>
+                <w:sz w:val="17"/>
+              </w:rPr>
+              <w:t>34.07%</w:t>
+            </w:r>
+          </w:p>
+        </w:tc>
+        <w:tc>
+          <w:tcPr>
+            <w:tcW w:type="dxa" w:w="819"/>
+            <w:tcMar>
+              <w:top w:w="80" w:type="dxa"/>
+              <w:start w:w="120" w:type="dxa"/>
+              <w:bottom w:w="80" w:type="dxa"/>
+              <w:end w:w="120" w:type="dxa"/>
+            </w:tcMar>
+            <w:vAlign w:val="center"/>
+          </w:tcPr>
+          <w:p>
+            <w:pPr>
+              <w:spacing w:after="0" w:line="276" w:lineRule="auto"/>
+              <w:jc w:val="center"/>
+            </w:pPr>
+            <w:r>
+              <w:rPr>
+                <w:rFonts w:ascii="Songti SC" w:hAnsi="Songti SC" w:eastAsia="Songti SC" w:cs="Songti SC"/>
+                <w:color w:val="000000"/>
+                <w:sz w:val="17"/>
+              </w:rPr>
+              <w:t>0.40</w:t>
+            </w:r>
+          </w:p>
+        </w:tc>
+        <w:tc>
+          <w:tcPr>
+            <w:tcW w:type="dxa" w:w="2268"/>
+            <w:tcMar>
+              <w:top w:w="80" w:type="dxa"/>
+              <w:start w:w="120" w:type="dxa"/>
+              <w:bottom w:w="80" w:type="dxa"/>
+              <w:end w:w="120" w:type="dxa"/>
+            </w:tcMar>
+            <w:vAlign w:val="center"/>
+          </w:tcPr>
+          <w:p>
+            <w:pPr>
+              <w:spacing w:after="0" w:line="276" w:lineRule="auto"/>
+              <w:jc w:val="center"/>
+            </w:pPr>
+            <w:r>
+              <w:rPr>
+                <w:rFonts w:ascii="Songti SC" w:hAnsi="Songti SC" w:eastAsia="Songti SC" w:cs="Songti SC"/>
+                <w:color w:val="000000"/>
                 <w:sz w:val="17"/>
               </w:rPr>
               <w:t>122,960</w:t>
@@ -3301,10 +2684,10 @@
       <w:r>
         <w:rPr>
           <w:rFonts w:ascii="Songti SC" w:hAnsi="Songti SC" w:eastAsia="Songti SC" w:cs="Songti SC"/>
-          <w:color w:val="14242B"/>
+          <w:color w:val="000000"/>
           <w:sz w:val="21"/>
         </w:rPr>
-        <w:t>Beta用于衡量策略日收益对沪深300日收益变动的敏感度。策略A、B、C的Beta分别约为0.46、0.16和0.40；B的低Beta与18.95%的平均仓位一致，C虽然只持有50%目标仓位，但跨ETF选择仍保留明显的权益市场方向暴露。三种策略都持有隔夜仓位，无法避免开盘跳空；A和B集中于单一510300，C每期也只持有一只ETF，因此单一标的集中风险并未消失。</w:t>
+        <w:t>仓位和成本数据解释了三套策略的净值差异。策略A平均仓位52.92%，产生451笔订单和约16.94万元估算成本，较高参与度没有转化为正收益。策略B平均仓位仅18.95%，Beta约0.16，低回撤主要来自长期现金缓冲。策略C以34.07%的平均仓位取得56.93%的扩展样本收益，单位市场暴露的收益表现更强；其518笔订单和约12.30万元估算成本也显示轮动信号需要承担较高摩擦。三种策略在持仓时均集中于单一ETF，并可能跨夜持有，跳空和单一标的集中风险依然存在。</w:t>
       </w:r>
     </w:p>
     <w:p>
@@ -3318,10 +2701,10 @@
         <w:rPr>
           <w:rFonts w:ascii="Songti SC" w:hAnsi="Songti SC" w:eastAsia="Songti SC" w:cs="Songti SC"/>
           <w:b/>
-          <w:color w:val="147D72"/>
+          <w:color w:val="000000"/>
           <w:sz w:val="28"/>
         </w:rPr>
-        <w:t>七、成本压力与实际成交差异</w:t>
+        <w:t>七、成本上升会明显压缩策略收益</w:t>
       </w:r>
     </w:p>
     <w:p>
@@ -3333,7 +2716,7 @@
       <w:r>
         <w:drawing>
           <wp:inline xmlns:a="http://schemas.openxmlformats.org/drawingml/2006/main" xmlns:pic="http://schemas.openxmlformats.org/drawingml/2006/picture">
-            <wp:extent cx="5394960" cy="2629596"/>
+            <wp:extent cx="5303520" cy="2585026"/>
             <wp:docPr id="4" name="Picture 4" descr="图4：佣金率与滑点同时翻倍后的全期累计收益变化"/>
             <wp:cNvGraphicFramePr>
               <a:graphicFrameLocks noChangeAspect="1"/>
@@ -3354,7 +2737,7 @@
                   <pic:spPr>
                     <a:xfrm>
                       <a:off x="0" y="0"/>
-                      <a:ext cx="5394960" cy="2629596"/>
+                      <a:ext cx="5303520" cy="2585026"/>
                     </a:xfrm>
                     <a:prstGeom prst="rect"/>
                   </pic:spPr>
@@ -3367,13 +2750,13 @@
     </w:p>
     <w:p>
       <w:pPr>
-        <w:spacing w:after="120"/>
+        <w:spacing w:after="240"/>
         <w:jc w:val="center"/>
       </w:pPr>
       <w:r>
         <w:rPr>
           <w:rFonts w:ascii="Songti SC" w:hAnsi="Songti SC" w:eastAsia="Songti SC" w:cs="Songti SC"/>
-          <w:color w:val="61727A"/>
+          <w:color w:val="000000"/>
           <w:sz w:val="18"/>
         </w:rPr>
         <w:t>图4：佣金率与滑点同时翻倍后的全期累计收益变化</w:t>
@@ -3388,10 +2771,15 @@
       <w:r>
         <w:rPr>
           <w:rFonts w:ascii="Songti SC" w:hAnsi="Songti SC" w:eastAsia="Songti SC" w:cs="Songti SC"/>
-          <w:color w:val="14242B"/>
+          <w:color w:val="000000"/>
           <w:sz w:val="21"/>
         </w:rPr>
-        <w:t>成本翻倍后，策略A累计收益从-30.38%降至-53.61%，策略B从2.16%降至-9.35%，策略C从56.93%降至25.49%。三者都对成交摩擦敏感，C即使压力情景仍为正，也损失31.44个百分点，说明轮动收益中包含显著的换手暴露。实际模拟还会受到订单排队、部分成交、涨跌停、平台数据复权和开盘瞬时价格影响，平台回测与影子结果不一致属于预期现象，需要通过订单日志解释，不能通过事后修改参数消除差异。</w:t>
+        <w:t>图4显示成本冲击会直接改变策略结论。佣金和滑点同时翻倍后，策略A的累计收益由-30.38%降至-53.61%，减少23.23个百分点；策略B由2.16%降至-9.35%，原有微弱收益被完全吞噬；策略C由56.93%降至25.49%，减少31.44个百分点，降幅超过基础收益的一半。策略C在压力情景下仍保持三者第一，说明其信号具有一定收益缓冲；同时，最大的绝对收益损失揭示轮动换手是其关键风险来源。策略B的结果则表明，接近零的历史优势对交易成本缺乏容错空间。</w:t>
+      </w:r>
+    </w:p>
+    <w:p>
+      <w:r>
+        <w:br w:type="page"/>
       </w:r>
     </w:p>
     <w:p>
@@ -3405,10 +2793,10 @@
         <w:rPr>
           <w:rFonts w:ascii="Songti SC" w:hAnsi="Songti SC" w:eastAsia="Songti SC" w:cs="Songti SC"/>
           <w:b/>
-          <w:color w:val="147D72"/>
+          <w:color w:val="000000"/>
           <w:sz w:val="28"/>
         </w:rPr>
-        <w:t>八、私有模拟盘与自动更新Dashboard</w:t>
+        <w:t>八、测试周揭示统一空仓信号，模拟盘尚待首日数据</w:t>
       </w:r>
     </w:p>
     <w:p>
@@ -3422,10 +2810,10 @@
         <w:rPr>
           <w:rFonts w:ascii="Songti SC" w:hAnsi="Songti SC" w:eastAsia="Songti SC" w:cs="Songti SC"/>
           <w:b/>
-          <w:color w:val="14242B"/>
+          <w:color w:val="000000"/>
           <w:sz w:val="24"/>
         </w:rPr>
-        <w:t>8.1 三个模拟盘的部署状态</w:t>
+        <w:t>8.1 冻结规则回放复现了当周可获得的信息</w:t>
       </w:r>
     </w:p>
     <w:p>
@@ -3437,94 +2825,802 @@
       <w:r>
         <w:rPr>
           <w:rFonts w:ascii="Songti SC" w:hAnsi="Songti SC" w:eastAsia="Songti SC" w:cs="Songti SC"/>
-          <w:color w:val="14242B"/>
+          <w:color w:val="000000"/>
           <w:sz w:val="21"/>
         </w:rPr>
-        <w:t>三个策略已经在JoinQuant分别部署为私有模拟盘，部署日期为2026-07-24。模拟盘仍使用A、B、C三套冻结代码并保持彼此独立，以便后续形成同期间对比。截至报告生成时平台尚未产生可用的净值、持仓或订单记录，原因是部署后尚未经历足够的A股交易时段；这一状态记为“已部署、等待数据”，而不是零收益、零回撤或无风险。</w:t>
+        <w:t>长期回测在2026年7月17日结束，随后使用已经冻结的代码和参数回放7月20日至24日五个交易日。三套策略只读取T−1日及更早的已完成数据，交易指令在下一交易日执行，测试过程中没有使用未来价格或根据结果修改参数。因此，这段回测能够复现策略在当时信息条件下会产生的信号和目标仓位，并为尚未开始运行的模拟盘提供启动前观察。</w:t>
       </w:r>
+    </w:p>
+    <w:tbl>
+      <w:tblPr>
+        <w:tblStyle w:val="TableGrid"/>
+        <w:tblW w:type="dxa" w:w="8520"/>
+        <w:tblLayout w:type="fixed"/>
+        <w:tblLook w:firstColumn="1" w:firstRow="1" w:lastColumn="0" w:lastRow="0" w:noHBand="0" w:noVBand="1" w:val="04A0"/>
+        <w:jc w:val="center"/>
+        <w:tblInd w:w="120" w:type="dxa"/>
+      </w:tblPr>
+      <w:tblGrid>
+        <w:gridCol w:w="820"/>
+        <w:gridCol w:w="1185"/>
+        <w:gridCol w:w="1185"/>
+        <w:gridCol w:w="1185"/>
+        <w:gridCol w:w="1185"/>
+        <w:gridCol w:w="1504"/>
+        <w:gridCol w:w="1456"/>
+      </w:tblGrid>
+      <w:tr>
+        <w:trPr>
+          <w:tblHeader/>
+        </w:trPr>
+        <w:tc>
+          <w:tcPr>
+            <w:tcW w:type="dxa" w:w="820"/>
+            <w:tcMar>
+              <w:top w:w="80" w:type="dxa"/>
+              <w:start w:w="120" w:type="dxa"/>
+              <w:bottom w:w="80" w:type="dxa"/>
+              <w:end w:w="120" w:type="dxa"/>
+            </w:tcMar>
+            <w:vAlign w:val="center"/>
+            <w:shd w:fill="D9D9D9"/>
+          </w:tcPr>
+          <w:p>
+            <w:pPr>
+              <w:spacing w:after="0" w:line="276" w:lineRule="auto"/>
+              <w:jc w:val="center"/>
+            </w:pPr>
+            <w:r>
+              <w:rPr>
+                <w:rFonts w:ascii="Songti SC" w:hAnsi="Songti SC" w:eastAsia="Songti SC" w:cs="Songti SC"/>
+                <w:b/>
+                <w:color w:val="000000"/>
+                <w:sz w:val="17"/>
+              </w:rPr>
+              <w:t>策略</w:t>
+            </w:r>
+          </w:p>
+        </w:tc>
+        <w:tc>
+          <w:tcPr>
+            <w:tcW w:type="dxa" w:w="1185"/>
+            <w:tcMar>
+              <w:top w:w="80" w:type="dxa"/>
+              <w:start w:w="120" w:type="dxa"/>
+              <w:bottom w:w="80" w:type="dxa"/>
+              <w:end w:w="120" w:type="dxa"/>
+            </w:tcMar>
+            <w:vAlign w:val="center"/>
+            <w:shd w:fill="D9D9D9"/>
+          </w:tcPr>
+          <w:p>
+            <w:pPr>
+              <w:spacing w:after="0" w:line="276" w:lineRule="auto"/>
+              <w:jc w:val="center"/>
+            </w:pPr>
+            <w:r>
+              <w:rPr>
+                <w:rFonts w:ascii="Songti SC" w:hAnsi="Songti SC" w:eastAsia="Songti SC" w:cs="Songti SC"/>
+                <w:b/>
+                <w:color w:val="000000"/>
+                <w:sz w:val="17"/>
+              </w:rPr>
+              <w:t>策略收益</w:t>
+            </w:r>
+          </w:p>
+        </w:tc>
+        <w:tc>
+          <w:tcPr>
+            <w:tcW w:type="dxa" w:w="1185"/>
+            <w:tcMar>
+              <w:top w:w="80" w:type="dxa"/>
+              <w:start w:w="120" w:type="dxa"/>
+              <w:bottom w:w="80" w:type="dxa"/>
+              <w:end w:w="120" w:type="dxa"/>
+            </w:tcMar>
+            <w:vAlign w:val="center"/>
+            <w:shd w:fill="D9D9D9"/>
+          </w:tcPr>
+          <w:p>
+            <w:pPr>
+              <w:spacing w:after="0" w:line="276" w:lineRule="auto"/>
+              <w:jc w:val="center"/>
+            </w:pPr>
+            <w:r>
+              <w:rPr>
+                <w:rFonts w:ascii="Songti SC" w:hAnsi="Songti SC" w:eastAsia="Songti SC" w:cs="Songti SC"/>
+                <w:b/>
+                <w:color w:val="000000"/>
+                <w:sz w:val="17"/>
+              </w:rPr>
+              <w:t>基准收益</w:t>
+            </w:r>
+          </w:p>
+        </w:tc>
+        <w:tc>
+          <w:tcPr>
+            <w:tcW w:type="dxa" w:w="1185"/>
+            <w:tcMar>
+              <w:top w:w="80" w:type="dxa"/>
+              <w:start w:w="120" w:type="dxa"/>
+              <w:bottom w:w="80" w:type="dxa"/>
+              <w:end w:w="120" w:type="dxa"/>
+            </w:tcMar>
+            <w:vAlign w:val="center"/>
+            <w:shd w:fill="D9D9D9"/>
+          </w:tcPr>
+          <w:p>
+            <w:pPr>
+              <w:spacing w:after="0" w:line="276" w:lineRule="auto"/>
+              <w:jc w:val="center"/>
+            </w:pPr>
+            <w:r>
+              <w:rPr>
+                <w:rFonts w:ascii="Songti SC" w:hAnsi="Songti SC" w:eastAsia="Songti SC" w:cs="Songti SC"/>
+                <w:b/>
+                <w:color w:val="000000"/>
+                <w:sz w:val="17"/>
+              </w:rPr>
+              <w:t>超额收益</w:t>
+            </w:r>
+          </w:p>
+        </w:tc>
+        <w:tc>
+          <w:tcPr>
+            <w:tcW w:type="dxa" w:w="1185"/>
+            <w:tcMar>
+              <w:top w:w="80" w:type="dxa"/>
+              <w:start w:w="120" w:type="dxa"/>
+              <w:bottom w:w="80" w:type="dxa"/>
+              <w:end w:w="120" w:type="dxa"/>
+            </w:tcMar>
+            <w:vAlign w:val="center"/>
+            <w:shd w:fill="D9D9D9"/>
+          </w:tcPr>
+          <w:p>
+            <w:pPr>
+              <w:spacing w:after="0" w:line="276" w:lineRule="auto"/>
+              <w:jc w:val="center"/>
+            </w:pPr>
+            <w:r>
+              <w:rPr>
+                <w:rFonts w:ascii="Songti SC" w:hAnsi="Songti SC" w:eastAsia="Songti SC" w:cs="Songti SC"/>
+                <w:b/>
+                <w:color w:val="000000"/>
+                <w:sz w:val="17"/>
+              </w:rPr>
+              <w:t>最大回撤</w:t>
+            </w:r>
+          </w:p>
+        </w:tc>
+        <w:tc>
+          <w:tcPr>
+            <w:tcW w:type="dxa" w:w="1504"/>
+            <w:tcMar>
+              <w:top w:w="80" w:type="dxa"/>
+              <w:start w:w="120" w:type="dxa"/>
+              <w:bottom w:w="80" w:type="dxa"/>
+              <w:end w:w="120" w:type="dxa"/>
+            </w:tcMar>
+            <w:vAlign w:val="center"/>
+            <w:shd w:fill="D9D9D9"/>
+          </w:tcPr>
+          <w:p>
+            <w:pPr>
+              <w:spacing w:after="0" w:line="276" w:lineRule="auto"/>
+              <w:jc w:val="center"/>
+            </w:pPr>
+            <w:r>
+              <w:rPr>
+                <w:rFonts w:ascii="Songti SC" w:hAnsi="Songti SC" w:eastAsia="Songti SC" w:cs="Songti SC"/>
+                <w:b/>
+                <w:color w:val="000000"/>
+                <w:sz w:val="17"/>
+              </w:rPr>
+              <w:t>盈利/亏损次数</w:t>
+            </w:r>
+          </w:p>
+        </w:tc>
+        <w:tc>
+          <w:tcPr>
+            <w:tcW w:type="dxa" w:w="1456"/>
+            <w:tcMar>
+              <w:top w:w="80" w:type="dxa"/>
+              <w:start w:w="120" w:type="dxa"/>
+              <w:bottom w:w="80" w:type="dxa"/>
+              <w:end w:w="120" w:type="dxa"/>
+            </w:tcMar>
+            <w:vAlign w:val="center"/>
+            <w:shd w:fill="D9D9D9"/>
+          </w:tcPr>
+          <w:p>
+            <w:pPr>
+              <w:spacing w:after="0" w:line="276" w:lineRule="auto"/>
+              <w:jc w:val="center"/>
+            </w:pPr>
+            <w:r>
+              <w:rPr>
+                <w:rFonts w:ascii="Songti SC" w:hAnsi="Songti SC" w:eastAsia="Songti SC" w:cs="Songti SC"/>
+                <w:b/>
+                <w:color w:val="000000"/>
+                <w:sz w:val="17"/>
+              </w:rPr>
+              <w:t>汇总状态</w:t>
+            </w:r>
+          </w:p>
+        </w:tc>
+      </w:tr>
+      <w:tr>
+        <w:tc>
+          <w:tcPr>
+            <w:tcW w:type="dxa" w:w="820"/>
+            <w:tcMar>
+              <w:top w:w="80" w:type="dxa"/>
+              <w:start w:w="120" w:type="dxa"/>
+              <w:bottom w:w="80" w:type="dxa"/>
+              <w:end w:w="120" w:type="dxa"/>
+            </w:tcMar>
+            <w:vAlign w:val="center"/>
+          </w:tcPr>
+          <w:p>
+            <w:pPr>
+              <w:spacing w:after="0" w:line="276" w:lineRule="auto"/>
+              <w:jc w:val="center"/>
+            </w:pPr>
+            <w:r>
+              <w:rPr>
+                <w:rFonts w:ascii="Songti SC" w:hAnsi="Songti SC" w:eastAsia="Songti SC" w:cs="Songti SC"/>
+                <w:color w:val="000000"/>
+                <w:sz w:val="17"/>
+              </w:rPr>
+              <w:t>A</w:t>
+            </w:r>
+          </w:p>
+        </w:tc>
+        <w:tc>
+          <w:tcPr>
+            <w:tcW w:type="dxa" w:w="1185"/>
+            <w:tcMar>
+              <w:top w:w="80" w:type="dxa"/>
+              <w:start w:w="120" w:type="dxa"/>
+              <w:bottom w:w="80" w:type="dxa"/>
+              <w:end w:w="120" w:type="dxa"/>
+            </w:tcMar>
+            <w:vAlign w:val="center"/>
+          </w:tcPr>
+          <w:p>
+            <w:pPr>
+              <w:spacing w:after="0" w:line="276" w:lineRule="auto"/>
+              <w:jc w:val="center"/>
+            </w:pPr>
+            <w:r>
+              <w:rPr>
+                <w:rFonts w:ascii="Songti SC" w:hAnsi="Songti SC" w:eastAsia="Songti SC" w:cs="Songti SC"/>
+                <w:color w:val="000000"/>
+                <w:sz w:val="17"/>
+              </w:rPr>
+              <w:t>0.00%</w:t>
+            </w:r>
+          </w:p>
+        </w:tc>
+        <w:tc>
+          <w:tcPr>
+            <w:tcW w:type="dxa" w:w="1185"/>
+            <w:tcMar>
+              <w:top w:w="80" w:type="dxa"/>
+              <w:start w:w="120" w:type="dxa"/>
+              <w:bottom w:w="80" w:type="dxa"/>
+              <w:end w:w="120" w:type="dxa"/>
+            </w:tcMar>
+            <w:vAlign w:val="center"/>
+          </w:tcPr>
+          <w:p>
+            <w:pPr>
+              <w:spacing w:after="0" w:line="276" w:lineRule="auto"/>
+              <w:jc w:val="center"/>
+            </w:pPr>
+            <w:r>
+              <w:rPr>
+                <w:rFonts w:ascii="Songti SC" w:hAnsi="Songti SC" w:eastAsia="Songti SC" w:cs="Songti SC"/>
+                <w:color w:val="000000"/>
+                <w:sz w:val="17"/>
+              </w:rPr>
+              <w:t>2.65%</w:t>
+            </w:r>
+          </w:p>
+        </w:tc>
+        <w:tc>
+          <w:tcPr>
+            <w:tcW w:type="dxa" w:w="1185"/>
+            <w:tcMar>
+              <w:top w:w="80" w:type="dxa"/>
+              <w:start w:w="120" w:type="dxa"/>
+              <w:bottom w:w="80" w:type="dxa"/>
+              <w:end w:w="120" w:type="dxa"/>
+            </w:tcMar>
+            <w:vAlign w:val="center"/>
+          </w:tcPr>
+          <w:p>
+            <w:pPr>
+              <w:spacing w:after="0" w:line="276" w:lineRule="auto"/>
+              <w:jc w:val="center"/>
+            </w:pPr>
+            <w:r>
+              <w:rPr>
+                <w:rFonts w:ascii="Songti SC" w:hAnsi="Songti SC" w:eastAsia="Songti SC" w:cs="Songti SC"/>
+                <w:color w:val="000000"/>
+                <w:sz w:val="17"/>
+              </w:rPr>
+              <w:t>-2.58%</w:t>
+            </w:r>
+          </w:p>
+        </w:tc>
+        <w:tc>
+          <w:tcPr>
+            <w:tcW w:type="dxa" w:w="1185"/>
+            <w:tcMar>
+              <w:top w:w="80" w:type="dxa"/>
+              <w:start w:w="120" w:type="dxa"/>
+              <w:bottom w:w="80" w:type="dxa"/>
+              <w:end w:w="120" w:type="dxa"/>
+            </w:tcMar>
+            <w:vAlign w:val="center"/>
+          </w:tcPr>
+          <w:p>
+            <w:pPr>
+              <w:spacing w:after="0" w:line="276" w:lineRule="auto"/>
+              <w:jc w:val="center"/>
+            </w:pPr>
+            <w:r>
+              <w:rPr>
+                <w:rFonts w:ascii="Songti SC" w:hAnsi="Songti SC" w:eastAsia="Songti SC" w:cs="Songti SC"/>
+                <w:color w:val="000000"/>
+                <w:sz w:val="17"/>
+              </w:rPr>
+              <w:t>0.00%</w:t>
+            </w:r>
+          </w:p>
+        </w:tc>
+        <w:tc>
+          <w:tcPr>
+            <w:tcW w:type="dxa" w:w="1504"/>
+            <w:tcMar>
+              <w:top w:w="80" w:type="dxa"/>
+              <w:start w:w="120" w:type="dxa"/>
+              <w:bottom w:w="80" w:type="dxa"/>
+              <w:end w:w="120" w:type="dxa"/>
+            </w:tcMar>
+            <w:vAlign w:val="center"/>
+          </w:tcPr>
+          <w:p>
+            <w:pPr>
+              <w:spacing w:after="0" w:line="276" w:lineRule="auto"/>
+              <w:jc w:val="center"/>
+            </w:pPr>
+            <w:r>
+              <w:rPr>
+                <w:rFonts w:ascii="Songti SC" w:hAnsi="Songti SC" w:eastAsia="Songti SC" w:cs="Songti SC"/>
+                <w:color w:val="000000"/>
+                <w:sz w:val="17"/>
+              </w:rPr>
+              <w:t>0/0</w:t>
+            </w:r>
+          </w:p>
+        </w:tc>
+        <w:tc>
+          <w:tcPr>
+            <w:tcW w:type="dxa" w:w="1456"/>
+            <w:tcMar>
+              <w:top w:w="80" w:type="dxa"/>
+              <w:start w:w="120" w:type="dxa"/>
+              <w:bottom w:w="80" w:type="dxa"/>
+              <w:end w:w="120" w:type="dxa"/>
+            </w:tcMar>
+            <w:vAlign w:val="center"/>
+          </w:tcPr>
+          <w:p>
+            <w:pPr>
+              <w:spacing w:after="0" w:line="276" w:lineRule="auto"/>
+              <w:jc w:val="center"/>
+            </w:pPr>
+            <w:r>
+              <w:rPr>
+                <w:rFonts w:ascii="Songti SC" w:hAnsi="Songti SC" w:eastAsia="Songti SC" w:cs="Songti SC"/>
+                <w:color w:val="000000"/>
+                <w:sz w:val="17"/>
+              </w:rPr>
+              <w:t>保持现金</w:t>
+            </w:r>
+          </w:p>
+        </w:tc>
+      </w:tr>
+      <w:tr>
+        <w:tc>
+          <w:tcPr>
+            <w:tcW w:type="dxa" w:w="820"/>
+            <w:tcMar>
+              <w:top w:w="80" w:type="dxa"/>
+              <w:start w:w="120" w:type="dxa"/>
+              <w:bottom w:w="80" w:type="dxa"/>
+              <w:end w:w="120" w:type="dxa"/>
+            </w:tcMar>
+            <w:vAlign w:val="center"/>
+          </w:tcPr>
+          <w:p>
+            <w:pPr>
+              <w:spacing w:after="0" w:line="276" w:lineRule="auto"/>
+              <w:jc w:val="center"/>
+            </w:pPr>
+            <w:r>
+              <w:rPr>
+                <w:rFonts w:ascii="Songti SC" w:hAnsi="Songti SC" w:eastAsia="Songti SC" w:cs="Songti SC"/>
+                <w:color w:val="000000"/>
+                <w:sz w:val="17"/>
+              </w:rPr>
+              <w:t>B</w:t>
+            </w:r>
+          </w:p>
+        </w:tc>
+        <w:tc>
+          <w:tcPr>
+            <w:tcW w:type="dxa" w:w="1185"/>
+            <w:tcMar>
+              <w:top w:w="80" w:type="dxa"/>
+              <w:start w:w="120" w:type="dxa"/>
+              <w:bottom w:w="80" w:type="dxa"/>
+              <w:end w:w="120" w:type="dxa"/>
+            </w:tcMar>
+            <w:vAlign w:val="center"/>
+          </w:tcPr>
+          <w:p>
+            <w:pPr>
+              <w:spacing w:after="0" w:line="276" w:lineRule="auto"/>
+              <w:jc w:val="center"/>
+            </w:pPr>
+            <w:r>
+              <w:rPr>
+                <w:rFonts w:ascii="Songti SC" w:hAnsi="Songti SC" w:eastAsia="Songti SC" w:cs="Songti SC"/>
+                <w:color w:val="000000"/>
+                <w:sz w:val="17"/>
+              </w:rPr>
+              <w:t>0.00%</w:t>
+            </w:r>
+          </w:p>
+        </w:tc>
+        <w:tc>
+          <w:tcPr>
+            <w:tcW w:type="dxa" w:w="1185"/>
+            <w:tcMar>
+              <w:top w:w="80" w:type="dxa"/>
+              <w:start w:w="120" w:type="dxa"/>
+              <w:bottom w:w="80" w:type="dxa"/>
+              <w:end w:w="120" w:type="dxa"/>
+            </w:tcMar>
+            <w:vAlign w:val="center"/>
+          </w:tcPr>
+          <w:p>
+            <w:pPr>
+              <w:spacing w:after="0" w:line="276" w:lineRule="auto"/>
+              <w:jc w:val="center"/>
+            </w:pPr>
+            <w:r>
+              <w:rPr>
+                <w:rFonts w:ascii="Songti SC" w:hAnsi="Songti SC" w:eastAsia="Songti SC" w:cs="Songti SC"/>
+                <w:color w:val="000000"/>
+                <w:sz w:val="17"/>
+              </w:rPr>
+              <w:t>2.65%</w:t>
+            </w:r>
+          </w:p>
+        </w:tc>
+        <w:tc>
+          <w:tcPr>
+            <w:tcW w:type="dxa" w:w="1185"/>
+            <w:tcMar>
+              <w:top w:w="80" w:type="dxa"/>
+              <w:start w:w="120" w:type="dxa"/>
+              <w:bottom w:w="80" w:type="dxa"/>
+              <w:end w:w="120" w:type="dxa"/>
+            </w:tcMar>
+            <w:vAlign w:val="center"/>
+          </w:tcPr>
+          <w:p>
+            <w:pPr>
+              <w:spacing w:after="0" w:line="276" w:lineRule="auto"/>
+              <w:jc w:val="center"/>
+            </w:pPr>
+            <w:r>
+              <w:rPr>
+                <w:rFonts w:ascii="Songti SC" w:hAnsi="Songti SC" w:eastAsia="Songti SC" w:cs="Songti SC"/>
+                <w:color w:val="000000"/>
+                <w:sz w:val="17"/>
+              </w:rPr>
+              <w:t>-2.58%</w:t>
+            </w:r>
+          </w:p>
+        </w:tc>
+        <w:tc>
+          <w:tcPr>
+            <w:tcW w:type="dxa" w:w="1185"/>
+            <w:tcMar>
+              <w:top w:w="80" w:type="dxa"/>
+              <w:start w:w="120" w:type="dxa"/>
+              <w:bottom w:w="80" w:type="dxa"/>
+              <w:end w:w="120" w:type="dxa"/>
+            </w:tcMar>
+            <w:vAlign w:val="center"/>
+          </w:tcPr>
+          <w:p>
+            <w:pPr>
+              <w:spacing w:after="0" w:line="276" w:lineRule="auto"/>
+              <w:jc w:val="center"/>
+            </w:pPr>
+            <w:r>
+              <w:rPr>
+                <w:rFonts w:ascii="Songti SC" w:hAnsi="Songti SC" w:eastAsia="Songti SC" w:cs="Songti SC"/>
+                <w:color w:val="000000"/>
+                <w:sz w:val="17"/>
+              </w:rPr>
+              <w:t>0.00%</w:t>
+            </w:r>
+          </w:p>
+        </w:tc>
+        <w:tc>
+          <w:tcPr>
+            <w:tcW w:type="dxa" w:w="1504"/>
+            <w:tcMar>
+              <w:top w:w="80" w:type="dxa"/>
+              <w:start w:w="120" w:type="dxa"/>
+              <w:bottom w:w="80" w:type="dxa"/>
+              <w:end w:w="120" w:type="dxa"/>
+            </w:tcMar>
+            <w:vAlign w:val="center"/>
+          </w:tcPr>
+          <w:p>
+            <w:pPr>
+              <w:spacing w:after="0" w:line="276" w:lineRule="auto"/>
+              <w:jc w:val="center"/>
+            </w:pPr>
+            <w:r>
+              <w:rPr>
+                <w:rFonts w:ascii="Songti SC" w:hAnsi="Songti SC" w:eastAsia="Songti SC" w:cs="Songti SC"/>
+                <w:color w:val="000000"/>
+                <w:sz w:val="17"/>
+              </w:rPr>
+              <w:t>0/0</w:t>
+            </w:r>
+          </w:p>
+        </w:tc>
+        <w:tc>
+          <w:tcPr>
+            <w:tcW w:type="dxa" w:w="1456"/>
+            <w:tcMar>
+              <w:top w:w="80" w:type="dxa"/>
+              <w:start w:w="120" w:type="dxa"/>
+              <w:bottom w:w="80" w:type="dxa"/>
+              <w:end w:w="120" w:type="dxa"/>
+            </w:tcMar>
+            <w:vAlign w:val="center"/>
+          </w:tcPr>
+          <w:p>
+            <w:pPr>
+              <w:spacing w:after="0" w:line="276" w:lineRule="auto"/>
+              <w:jc w:val="center"/>
+            </w:pPr>
+            <w:r>
+              <w:rPr>
+                <w:rFonts w:ascii="Songti SC" w:hAnsi="Songti SC" w:eastAsia="Songti SC" w:cs="Songti SC"/>
+                <w:color w:val="000000"/>
+                <w:sz w:val="17"/>
+              </w:rPr>
+              <w:t>保持现金</w:t>
+            </w:r>
+          </w:p>
+        </w:tc>
+      </w:tr>
+      <w:tr>
+        <w:tc>
+          <w:tcPr>
+            <w:tcW w:type="dxa" w:w="820"/>
+            <w:tcMar>
+              <w:top w:w="80" w:type="dxa"/>
+              <w:start w:w="120" w:type="dxa"/>
+              <w:bottom w:w="80" w:type="dxa"/>
+              <w:end w:w="120" w:type="dxa"/>
+            </w:tcMar>
+            <w:vAlign w:val="center"/>
+          </w:tcPr>
+          <w:p>
+            <w:pPr>
+              <w:spacing w:after="0" w:line="276" w:lineRule="auto"/>
+              <w:jc w:val="center"/>
+            </w:pPr>
+            <w:r>
+              <w:rPr>
+                <w:rFonts w:ascii="Songti SC" w:hAnsi="Songti SC" w:eastAsia="Songti SC" w:cs="Songti SC"/>
+                <w:color w:val="000000"/>
+                <w:sz w:val="17"/>
+              </w:rPr>
+              <w:t>C</w:t>
+            </w:r>
+          </w:p>
+        </w:tc>
+        <w:tc>
+          <w:tcPr>
+            <w:tcW w:type="dxa" w:w="1185"/>
+            <w:tcMar>
+              <w:top w:w="80" w:type="dxa"/>
+              <w:start w:w="120" w:type="dxa"/>
+              <w:bottom w:w="80" w:type="dxa"/>
+              <w:end w:w="120" w:type="dxa"/>
+            </w:tcMar>
+            <w:vAlign w:val="center"/>
+          </w:tcPr>
+          <w:p>
+            <w:pPr>
+              <w:spacing w:after="0" w:line="276" w:lineRule="auto"/>
+              <w:jc w:val="center"/>
+            </w:pPr>
+            <w:r>
+              <w:rPr>
+                <w:rFonts w:ascii="Songti SC" w:hAnsi="Songti SC" w:eastAsia="Songti SC" w:cs="Songti SC"/>
+                <w:color w:val="000000"/>
+                <w:sz w:val="17"/>
+              </w:rPr>
+              <w:t>0.00%</w:t>
+            </w:r>
+          </w:p>
+        </w:tc>
+        <w:tc>
+          <w:tcPr>
+            <w:tcW w:type="dxa" w:w="1185"/>
+            <w:tcMar>
+              <w:top w:w="80" w:type="dxa"/>
+              <w:start w:w="120" w:type="dxa"/>
+              <w:bottom w:w="80" w:type="dxa"/>
+              <w:end w:w="120" w:type="dxa"/>
+            </w:tcMar>
+            <w:vAlign w:val="center"/>
+          </w:tcPr>
+          <w:p>
+            <w:pPr>
+              <w:spacing w:after="0" w:line="276" w:lineRule="auto"/>
+              <w:jc w:val="center"/>
+            </w:pPr>
+            <w:r>
+              <w:rPr>
+                <w:rFonts w:ascii="Songti SC" w:hAnsi="Songti SC" w:eastAsia="Songti SC" w:cs="Songti SC"/>
+                <w:color w:val="000000"/>
+                <w:sz w:val="17"/>
+              </w:rPr>
+              <w:t>2.65%</w:t>
+            </w:r>
+          </w:p>
+        </w:tc>
+        <w:tc>
+          <w:tcPr>
+            <w:tcW w:type="dxa" w:w="1185"/>
+            <w:tcMar>
+              <w:top w:w="80" w:type="dxa"/>
+              <w:start w:w="120" w:type="dxa"/>
+              <w:bottom w:w="80" w:type="dxa"/>
+              <w:end w:w="120" w:type="dxa"/>
+            </w:tcMar>
+            <w:vAlign w:val="center"/>
+          </w:tcPr>
+          <w:p>
+            <w:pPr>
+              <w:spacing w:after="0" w:line="276" w:lineRule="auto"/>
+              <w:jc w:val="center"/>
+            </w:pPr>
+            <w:r>
+              <w:rPr>
+                <w:rFonts w:ascii="Songti SC" w:hAnsi="Songti SC" w:eastAsia="Songti SC" w:cs="Songti SC"/>
+                <w:color w:val="000000"/>
+                <w:sz w:val="17"/>
+              </w:rPr>
+              <w:t>-2.58%</w:t>
+            </w:r>
+          </w:p>
+        </w:tc>
+        <w:tc>
+          <w:tcPr>
+            <w:tcW w:type="dxa" w:w="1185"/>
+            <w:tcMar>
+              <w:top w:w="80" w:type="dxa"/>
+              <w:start w:w="120" w:type="dxa"/>
+              <w:bottom w:w="80" w:type="dxa"/>
+              <w:end w:w="120" w:type="dxa"/>
+            </w:tcMar>
+            <w:vAlign w:val="center"/>
+          </w:tcPr>
+          <w:p>
+            <w:pPr>
+              <w:spacing w:after="0" w:line="276" w:lineRule="auto"/>
+              <w:jc w:val="center"/>
+            </w:pPr>
+            <w:r>
+              <w:rPr>
+                <w:rFonts w:ascii="Songti SC" w:hAnsi="Songti SC" w:eastAsia="Songti SC" w:cs="Songti SC"/>
+                <w:color w:val="000000"/>
+                <w:sz w:val="17"/>
+              </w:rPr>
+              <w:t>0.00%</w:t>
+            </w:r>
+          </w:p>
+        </w:tc>
+        <w:tc>
+          <w:tcPr>
+            <w:tcW w:type="dxa" w:w="1504"/>
+            <w:tcMar>
+              <w:top w:w="80" w:type="dxa"/>
+              <w:start w:w="120" w:type="dxa"/>
+              <w:bottom w:w="80" w:type="dxa"/>
+              <w:end w:w="120" w:type="dxa"/>
+            </w:tcMar>
+            <w:vAlign w:val="center"/>
+          </w:tcPr>
+          <w:p>
+            <w:pPr>
+              <w:spacing w:after="0" w:line="276" w:lineRule="auto"/>
+              <w:jc w:val="center"/>
+            </w:pPr>
+            <w:r>
+              <w:rPr>
+                <w:rFonts w:ascii="Songti SC" w:hAnsi="Songti SC" w:eastAsia="Songti SC" w:cs="Songti SC"/>
+                <w:color w:val="000000"/>
+                <w:sz w:val="17"/>
+              </w:rPr>
+              <w:t>0/0</w:t>
+            </w:r>
+          </w:p>
+        </w:tc>
+        <w:tc>
+          <w:tcPr>
+            <w:tcW w:type="dxa" w:w="1456"/>
+            <w:tcMar>
+              <w:top w:w="80" w:type="dxa"/>
+              <w:start w:w="120" w:type="dxa"/>
+              <w:bottom w:w="80" w:type="dxa"/>
+              <w:end w:w="120" w:type="dxa"/>
+            </w:tcMar>
+            <w:vAlign w:val="center"/>
+          </w:tcPr>
+          <w:p>
+            <w:pPr>
+              <w:spacing w:after="0" w:line="276" w:lineRule="auto"/>
+              <w:jc w:val="center"/>
+            </w:pPr>
+            <w:r>
+              <w:rPr>
+                <w:rFonts w:ascii="Songti SC" w:hAnsi="Songti SC" w:eastAsia="Songti SC" w:cs="Songti SC"/>
+                <w:color w:val="000000"/>
+                <w:sz w:val="17"/>
+              </w:rPr>
+              <w:t>保持现金</w:t>
+            </w:r>
+          </w:p>
+        </w:tc>
+      </w:tr>
+    </w:tbl>
+    <w:p>
+      <w:pPr>
+        <w:spacing w:after="40"/>
+      </w:pPr>
     </w:p>
     <w:p>
       <w:pPr>
-        <w:pStyle w:val="ListNumber"/>
+        <w:spacing w:before="0" w:after="0" w:line="360" w:lineRule="auto"/>
+        <w:ind w:firstLine="420"/>
         <w:jc w:val="both"/>
       </w:pPr>
       <w:r>
         <w:rPr>
           <w:rFonts w:ascii="Songti SC" w:hAnsi="Songti SC" w:eastAsia="Songti SC" w:cs="Songti SC"/>
-          <w:color w:val="14242B"/>
+          <w:color w:val="000000"/>
           <w:sz w:val="21"/>
         </w:rPr>
-        <w:t>策略A：平台回测已完成；私有模拟盘已部署；等待首批运行数据。</w:t>
-      </w:r>
-    </w:p>
-    <w:p>
-      <w:pPr>
-        <w:pStyle w:val="ListNumber"/>
-        <w:jc w:val="both"/>
-      </w:pPr>
-      <w:r>
-        <w:rPr>
-          <w:rFonts w:ascii="Songti SC" w:hAnsi="Songti SC" w:eastAsia="Songti SC" w:cs="Songti SC"/>
-          <w:color w:val="14242B"/>
-          <w:sz w:val="21"/>
-        </w:rPr>
-        <w:t>策略B：平台回测已完成；私有模拟盘已部署；等待首批运行数据。</w:t>
-      </w:r>
-    </w:p>
-    <w:p>
-      <w:pPr>
-        <w:pStyle w:val="ListNumber"/>
-        <w:jc w:val="both"/>
-      </w:pPr>
-      <w:r>
-        <w:rPr>
-          <w:rFonts w:ascii="Songti SC" w:hAnsi="Songti SC" w:eastAsia="Songti SC" w:cs="Songti SC"/>
-          <w:color w:val="14242B"/>
-          <w:sz w:val="21"/>
-        </w:rPr>
-        <w:t>策略C：平台回测已完成；私有模拟盘已部署；等待首批运行数据。</w:t>
-      </w:r>
-    </w:p>
-    <w:p>
-      <w:pPr>
-        <w:pStyle w:val="ListNumber"/>
-        <w:jc w:val="both"/>
-      </w:pPr>
-      <w:r>
-        <w:rPr>
-          <w:rFonts w:ascii="Songti SC" w:hAnsi="Songti SC" w:eastAsia="Songti SC" w:cs="Songti SC"/>
-          <w:color w:val="14242B"/>
-          <w:sz w:val="21"/>
-        </w:rPr>
-        <w:t>数据出现后只导出日期、策略代号、订单、持仓、现金、总资产和必要状态，不导出账号或访问方式。</w:t>
-      </w:r>
-    </w:p>
-    <w:p>
-      <w:pPr>
-        <w:spacing w:before="100" w:after="120" w:line="324" w:lineRule="auto"/>
-        <w:ind w:left="198" w:right="142"/>
-        <w:jc w:val="both"/>
-        <w:shd w:fill="FFF2E5"/>
-        <w:pBdr>
-          <w:left w:val="single" w:sz="18" w:space="8" w:color="D87831"/>
-        </w:pBdr>
-      </w:pPr>
-      <w:r>
-        <w:rPr>
-          <w:rFonts w:ascii="Songti SC" w:hAnsi="Songti SC" w:eastAsia="Songti SC" w:cs="Songti SC"/>
-          <w:b/>
-          <w:color w:val="14242B"/>
-          <w:sz w:val="21"/>
-        </w:rPr>
-        <w:t>模拟盘评价边界：</w:t>
-      </w:r>
-      <w:r>
-        <w:rPr>
-          <w:rFonts w:ascii="Songti SC" w:hAnsi="Songti SC" w:eastAsia="Songti SC" w:cs="Songti SC"/>
-          <w:color w:val="14242B"/>
-          <w:sz w:val="21"/>
-        </w:rPr>
-        <w:t>当前没有任何平台模拟收益可评价。至少积累一个交易日后可核对是否正常调度和下单；不足20个交易日只报告运行事实，三个月后做初步风险比较，六个月后再讨论稳定性。</w:t>
+        <w:t>表中最直接的信号是三套策略的净值均保持不变，交易次数均为0，五个交易日全部处于现金状态。策略A的MA20入场条件没有触发；策略B的MA10持续低于MA30；策略C的三只候选ETF动量得分均为负。不同规则在同一窗口给出了统一的风险规避判断，说明当时的中短期趋势强度没有达到预设入场标准。</w:t>
       </w:r>
     </w:p>
     <w:p>
@@ -3538,10 +3634,10 @@
         <w:rPr>
           <w:rFonts w:ascii="Songti SC" w:hAnsi="Songti SC" w:eastAsia="Songti SC" w:cs="Songti SC"/>
           <w:b/>
-          <w:color w:val="14242B"/>
+          <w:color w:val="000000"/>
           <w:sz w:val="24"/>
         </w:rPr>
-        <w:t>8.2 Dashboard更新链路</w:t>
+        <w:t>8.2 空仓规避了波动，也暴露出趋势信号的滞后</w:t>
       </w:r>
     </w:p>
     <w:p>
@@ -3553,10 +3649,89 @@
       <w:r>
         <w:rPr>
           <w:rFonts w:ascii="Songti SC" w:hAnsi="Songti SC" w:eastAsia="Songti SC" w:cs="Songti SC"/>
-          <w:color w:val="14242B"/>
+          <w:color w:val="000000"/>
           <w:sz w:val="21"/>
         </w:rPr>
-        <w:t>Dashboard作为持续实验记录页，每个工作日北京时间18:00通过GitHub Actions获取三只ETF与沪深300最新日线，执行数据质量检查，重算三套影子组合，再更新JSON和HTML。页面已经加入三次JoinQuant平台回测表和“3个已部署、等待数据”状态。策略卡片、净值、回撤、仓位、分阶段结果、成本压力和近期影子订单仍使用同一公开行情快照。网络源短暂失败时保留上次成功数据，并通过元数据标记回退状态，避免用空值覆盖历史。</w:t>
+        <w:t>沪深300在测试周上涨2.65%，三套策略收益均为0%，平台计算的超额收益均为-2.58%。市场价格已经上涨，滞后趋势指标仍未确认入场，反映出规则对快速反转或短促上涨行情的响应较慢。三套策略由此避开了价格波动、集中持仓和交易成本，也错过了当周上涨；测试周的主要风险表现为机会成本。</w:t>
+      </w:r>
+    </w:p>
+    <w:p>
+      <w:pPr>
+        <w:spacing w:before="0" w:after="0" w:line="360" w:lineRule="auto"/>
+        <w:ind w:firstLine="420"/>
+        <w:jc w:val="both"/>
+      </w:pPr>
+      <w:r>
+        <w:rPr>
+          <w:rFonts w:ascii="Songti SC" w:hAnsi="Songti SC" w:eastAsia="Songti SC" w:cs="Songti SC"/>
+          <w:color w:val="000000"/>
+          <w:sz w:val="21"/>
+        </w:rPr>
+        <w:t>0%回撤来自全程空仓，只能说明当周没有市场暴露，尚不能证明止损、仓位上限或轮动机制已经在持仓状态下有效控制风险。零成交也意味着该窗口没有形成可供分析的成交价格、滑点、拒单或部分成交样本。五日结果支持对信号行为和机会成本的判断，对执行质量及长期稳定性仍缺乏证据。</w:t>
+      </w:r>
+    </w:p>
+    <w:p>
+      <w:pPr>
+        <w:pStyle w:val="Heading2"/>
+        <w:keepNext/>
+        <w:spacing w:before="160" w:after="80"/>
+        <w:jc w:val="left"/>
+      </w:pPr>
+      <w:r>
+        <w:rPr>
+          <w:rFonts w:ascii="Songti SC" w:hAnsi="Songti SC" w:eastAsia="Songti SC" w:cs="Songti SC"/>
+          <w:b/>
+          <w:color w:val="000000"/>
+          <w:sz w:val="24"/>
+        </w:rPr>
+        <w:t>8.3 模拟盘已部署，部署后的实盘模拟尚未开始</w:t>
+      </w:r>
+    </w:p>
+    <w:p>
+      <w:pPr>
+        <w:spacing w:before="0" w:after="0" w:line="360" w:lineRule="auto"/>
+        <w:ind w:firstLine="420"/>
+        <w:jc w:val="both"/>
+      </w:pPr>
+      <w:r>
+        <w:rPr>
+          <w:rFonts w:ascii="Songti SC" w:hAnsi="Songti SC" w:eastAsia="Songti SC" w:cs="Songti SC"/>
+          <w:color w:val="000000"/>
+          <w:sz w:val="21"/>
+        </w:rPr>
+        <w:t>三个策略已于2026年7月24日周五分别建立独立JoinQuant模拟盘。7月25日为周六、A股休市，部署后尚未经历新的交易日，因此截至报告日期没有实际模拟订单、成交、持仓或净值变化。这里的“实盘模拟”指平台在真实交易时序下运行虚拟资金，不涉及真实资金。上一周回测复现了可获得信息和策略决策，仍缺少平台实时调度、成交价格与订单状态等执行证据，两类结果在报告中分开记录。</w:t>
+      </w:r>
+    </w:p>
+    <w:p>
+      <w:pPr>
+        <w:pStyle w:val="Heading2"/>
+        <w:keepNext/>
+        <w:spacing w:before="160" w:after="80"/>
+        <w:jc w:val="left"/>
+      </w:pPr>
+      <w:r>
+        <w:rPr>
+          <w:rFonts w:ascii="Songti SC" w:hAnsi="Songti SC" w:eastAsia="Songti SC" w:cs="Songti SC"/>
+          <w:b/>
+          <w:color w:val="000000"/>
+          <w:sz w:val="24"/>
+        </w:rPr>
+        <w:t>8.4 看板将持续更新实际模拟结果</w:t>
+      </w:r>
+    </w:p>
+    <w:p>
+      <w:pPr>
+        <w:spacing w:before="0" w:after="0" w:line="360" w:lineRule="auto"/>
+        <w:ind w:firstLine="420"/>
+        <w:jc w:val="both"/>
+      </w:pPr>
+      <w:r>
+        <w:rPr>
+          <w:rFonts w:ascii="Songti SC" w:hAnsi="Songti SC" w:eastAsia="Songti SC" w:cs="Songti SC"/>
+          <w:color w:val="000000"/>
+          <w:sz w:val="21"/>
+        </w:rPr>
+        <w:t>持续观察页面当前展示历史回测、冻结规则下的行情回放、成本敏感性和模拟盘等待状态。下一交易日起，页面将继续补充三套模拟盘的实际净值、持仓、订单、成交和风险指标，并与历史回测分区展示。这样可以直接识别理论信号与平台实际执行之间的偏差，也能避免把测试周回放误写成部署后的模拟业绩。</w:t>
       </w:r>
     </w:p>
     <w:p>
@@ -3568,20 +3743,20 @@
         <w:rPr>
           <w:rFonts w:ascii="Songti SC" w:hAnsi="Songti SC" w:eastAsia="Songti SC" w:cs="Songti SC"/>
           <w:b/>
-          <w:color w:val="14242B"/>
+          <w:color w:val="000000"/>
           <w:sz w:val="21"/>
         </w:rPr>
-        <w:t>Dashboard链接：</w:t>
+        <w:t>持续观察页面：</w:t>
       </w:r>
       <w:hyperlink r:id="rId13">
         <w:r>
           <w:rPr>
-            <w:color w:val="147D72"/>
+            <w:color w:val="000000"/>
             <w:u w:val="single"/>
             <w:rFonts w:ascii="Songti SC" w:hAnsi="Songti SC" w:eastAsia="Songti SC"/>
             <w:sz w:val="21"/>
           </w:rPr>
-          <w:t>TASK7三策略Dashboard（GitHub Pages）</w:t>
+          <w:t>TASK7三策略表现与风险观察</w:t>
         </w:r>
       </w:hyperlink>
     </w:p>
@@ -3594,10 +3769,10 @@
       <w:r>
         <w:rPr>
           <w:rFonts w:ascii="Songti SC" w:hAnsi="Songti SC" w:eastAsia="Songti SC" w:cs="Songti SC"/>
-          <w:color w:val="14242B"/>
+          <w:color w:val="000000"/>
           <w:sz w:val="21"/>
         </w:rPr>
-        <w:t>公开页内嵌最后一次成功快照，同时尝试读取同目录最新JSON，因此本地离线打开仍能展示历史内容，GitHub Pages发布后又能随工作流更新。页面明确区分“JoinQuant平台历史回测”“自动影子跟踪”和“JoinQuant实际模拟”三层，不读取账号、密码、Cookie或私有链接。平台模拟数据以后只通过用户手工导出的脱敏文件进入actual数据集，与影子净值并排显示，不混合计算。</w:t>
+        <w:t>看板公开内容不包含账户访问方式。实际模拟数据形成后，将按相同日期区间比较三套策略，并保持历史回测、行情回放和平台模拟记录三类数据相互独立。</w:t>
       </w:r>
     </w:p>
     <w:p>
@@ -3611,10 +3786,27 @@
         <w:rPr>
           <w:rFonts w:ascii="Songti SC" w:hAnsi="Songti SC" w:eastAsia="Songti SC" w:cs="Songti SC"/>
           <w:b/>
-          <w:color w:val="147D72"/>
+          <w:color w:val="000000"/>
           <w:sz w:val="28"/>
         </w:rPr>
-        <w:t>九、经验、教训与后续比较</w:t>
+        <w:t>九、结论、建议与实践反思</w:t>
+      </w:r>
+    </w:p>
+    <w:p>
+      <w:pPr>
+        <w:pStyle w:val="Heading2"/>
+        <w:keepNext/>
+        <w:spacing w:before="160" w:after="80"/>
+        <w:jc w:val="left"/>
+      </w:pPr>
+      <w:r>
+        <w:rPr>
+          <w:rFonts w:ascii="Songti SC" w:hAnsi="Songti SC" w:eastAsia="Songti SC" w:cs="Songti SC"/>
+          <w:b/>
+          <w:color w:val="000000"/>
+          <w:sz w:val="24"/>
+        </w:rPr>
+        <w:t>9.1 下一阶段以策略C为主、策略B为风险参照</w:t>
       </w:r>
     </w:p>
     <w:p>
@@ -3626,10 +3818,10 @@
       <w:r>
         <w:rPr>
           <w:rFonts w:ascii="Songti SC" w:hAnsi="Songti SC" w:eastAsia="Songti SC" w:cs="Songti SC"/>
-          <w:color w:val="14242B"/>
+          <w:color w:val="000000"/>
           <w:sz w:val="21"/>
         </w:rPr>
-        <w:t>平台模板适合学习API，却不适合直接作为投资结论。策略A的负结果说明，信号逻辑越简单，越需要先检查成本、换手和全仓暴露；只展示未扣成本净值会高估模板价值。策略B验证了风险预算确实能降低回撤，但低回撤同时来自长期现金仓位，风险控制改善不能自动转化为超额收益。策略C的社区思路经过冻结标的、周频执行和参数邻域检查后表现较好，但验证期收益集中和成本敏感性提示其仍可能依赖特定市场状态。</w:t>
+        <w:t>策略C应作为下一阶段的主要观察对象，因为它在长期回测中取得最高收益和唯一正超额，同时保持中等回撤；策略B应作为防守型参照，用于判断更低仓位是否能在真实成交环境中持续降低波动；策略A不适合作为主要方案，但保留它有助于衡量新增风控与轮动机制究竟创造了多少改进。</w:t>
       </w:r>
     </w:p>
     <w:p>
@@ -3641,10 +3833,57 @@
       <w:r>
         <w:rPr>
           <w:rFonts w:ascii="Songti SC" w:hAnsi="Songti SC" w:eastAsia="Songti SC" w:cs="Songti SC"/>
-          <w:color w:val="14242B"/>
+          <w:color w:val="000000"/>
           <w:sz w:val="21"/>
         </w:rPr>
-        <w:t>后续对比报告应以三种来源共同更新为前提。平台实际成交用于计算真实模拟净值、滑点和拒单；影子组合用于定位数据与撮合差异；平台历史基线用于判断模拟期是否偏离原风险区间。比较时同时报告收益、最大回撤、平均仓位、Beta、换手和成本，不用单一累计收益排序。模拟期积累不足20个交易日时只写运行事实，积累3个月后再做初步对比，至少6个月后才讨论策略稳定性。</w:t>
+        <w:t>后续判断不应只看累计收益。三策略对比需要同时覆盖最大回撤、平均仓位、市场Beta、换手、成本和空仓机会成本。若策略C的收益继续领先但成本和回撤明显放大，应优先降低调仓频率或仓位，避免再次追逐更短参数；若策略B长期保持低回撤但资金使用率过低，则应评估其作为组合防守层的价值，单独评价收益容易低估其风险缓冲作用。</w:t>
+      </w:r>
+    </w:p>
+    <w:p>
+      <w:pPr>
+        <w:pStyle w:val="Heading2"/>
+        <w:keepNext/>
+        <w:spacing w:before="160" w:after="80"/>
+        <w:jc w:val="left"/>
+      </w:pPr>
+      <w:r>
+        <w:rPr>
+          <w:rFonts w:ascii="Songti SC" w:hAnsi="Songti SC" w:eastAsia="Songti SC" w:cs="Songti SC"/>
+          <w:b/>
+          <w:color w:val="000000"/>
+          <w:sz w:val="24"/>
+        </w:rPr>
+        <w:t>9.2 本次实践的经验与教训</w:t>
+      </w:r>
+    </w:p>
+    <w:p>
+      <w:pPr>
+        <w:spacing w:before="0" w:after="0" w:line="360" w:lineRule="auto"/>
+        <w:ind w:firstLine="420"/>
+        <w:jc w:val="both"/>
+      </w:pPr>
+      <w:r>
+        <w:rPr>
+          <w:rFonts w:ascii="Songti SC" w:hAnsi="Songti SC" w:eastAsia="Songti SC" w:cs="Songti SC"/>
+          <w:color w:val="000000"/>
+          <w:sz w:val="21"/>
+        </w:rPr>
+        <w:t>第一，参数优化应重点考察跨阶段稳定性，单一区间的最高收益仅作参考；开发期与验证期表现方向一致，比某个窗口的峰值更有参考价值。第二，风险控制不会自动提高收益，策略B的低回撤主要来自较低仓位，必须同时评价资金使用效率。第三，测试周没有成交仍然提供了有效信号证据：三套规则在相同信息下保持现金，同时暴露了趋势判断滞后、上涨机会成本和缺少执行样本三项局限。</w:t>
+      </w:r>
+    </w:p>
+    <w:p>
+      <w:pPr>
+        <w:spacing w:before="0" w:after="0" w:line="360" w:lineRule="auto"/>
+        <w:ind w:firstLine="420"/>
+        <w:jc w:val="both"/>
+      </w:pPr>
+      <w:r>
+        <w:rPr>
+          <w:rFonts w:ascii="Songti SC" w:hAnsi="Songti SC" w:eastAsia="Songti SC" w:cs="Songti SC"/>
+          <w:color w:val="000000"/>
+          <w:sz w:val="21"/>
+        </w:rPr>
+        <w:t>最重要的教训是，长期回测、短窗口测试和模拟组合回答的是不同问题。长期回测用于识别收益与回撤结构，短窗口用于检查冻结规则在指定日期的行为，模拟组合则用于观察真实交易时序、成交和持续风险。只有保持参数冻结、统一比较区间并持续记录，后续三策略对比才具有解释力。</w:t>
       </w:r>
     </w:p>
     <w:p>
@@ -3658,7 +3897,7 @@
         <w:rPr>
           <w:rFonts w:ascii="Songti SC" w:hAnsi="Songti SC" w:eastAsia="Songti SC" w:cs="Songti SC"/>
           <w:b/>
-          <w:color w:val="147D72"/>
+          <w:color w:val="000000"/>
           <w:sz w:val="28"/>
         </w:rPr>
         <w:t>十、资料来源</w:t>
@@ -3672,7 +3911,7 @@
       <w:hyperlink r:id="rId14">
         <w:r>
           <w:rPr>
-            <w:color w:val="147D72"/>
+            <w:color w:val="000000"/>
             <w:u w:val="single"/>
             <w:rFonts w:ascii="Songti SC" w:hAnsi="Songti SC" w:eastAsia="Songti SC"/>
             <w:sz w:val="18"/>
@@ -3689,7 +3928,7 @@
       <w:hyperlink r:id="rId15">
         <w:r>
           <w:rPr>
-            <w:color w:val="147D72"/>
+            <w:color w:val="000000"/>
             <w:u w:val="single"/>
             <w:rFonts w:ascii="Songti SC" w:hAnsi="Songti SC" w:eastAsia="Songti SC"/>
             <w:sz w:val="18"/>
@@ -3706,7 +3945,7 @@
       <w:hyperlink r:id="rId16">
         <w:r>
           <w:rPr>
-            <w:color w:val="147D72"/>
+            <w:color w:val="000000"/>
             <w:u w:val="single"/>
             <w:rFonts w:ascii="Songti SC" w:hAnsi="Songti SC" w:eastAsia="Songti SC"/>
             <w:sz w:val="18"/>
@@ -3723,7 +3962,7 @@
       <w:hyperlink r:id="rId17">
         <w:r>
           <w:rPr>
-            <w:color w:val="147D72"/>
+            <w:color w:val="000000"/>
             <w:u w:val="single"/>
             <w:rFonts w:ascii="Songti SC" w:hAnsi="Songti SC" w:eastAsia="Songti SC"/>
             <w:sz w:val="18"/>
@@ -3736,7 +3975,6 @@
       <w:pPr>
         <w:pStyle w:val="Heading1"/>
         <w:keepNext/>
-        <w:pageBreakBefore/>
         <w:spacing w:before="240" w:after="120"/>
         <w:jc w:val="left"/>
       </w:pPr>
@@ -3744,10 +3982,10 @@
         <w:rPr>
           <w:rFonts w:ascii="Songti SC" w:hAnsi="Songti SC" w:eastAsia="Songti SC" w:cs="Songti SC"/>
           <w:b/>
-          <w:color w:val="147D72"/>
+          <w:color w:val="000000"/>
           <w:sz w:val="28"/>
         </w:rPr>
-        <w:t>附录：JoinQuant回测完成页</w:t>
+        <w:t>附录：聚宽回测凭证</w:t>
       </w:r>
     </w:p>
     <w:p>
@@ -3759,10 +3997,10 @@
       <w:r>
         <w:rPr>
           <w:rFonts w:ascii="Songti SC" w:hAnsi="Songti SC" w:eastAsia="Songti SC" w:cs="Songti SC"/>
-          <w:color w:val="14242B"/>
+          <w:color w:val="000000"/>
           <w:sz w:val="21"/>
         </w:rPr>
-        <w:t>以下三张截图对应本报告第五节的结构化指标。截图经隐私复核，未发现密码、Cookie、手机号或私有分享链接；图片仅用于证明策略名称、统一回测设置、完成状态和平台结果。</w:t>
+        <w:t>以下六张截图分别对应三套策略的长期回测结果，以及2026年7月20日至24日测试周回测结果。</w:t>
       </w:r>
     </w:p>
     <w:p>
@@ -3774,8 +4012,8 @@
       <w:r>
         <w:drawing>
           <wp:inline xmlns:a="http://schemas.openxmlformats.org/drawingml/2006/main" xmlns:pic="http://schemas.openxmlformats.org/drawingml/2006/picture">
-            <wp:extent cx="5577840" cy="3235764"/>
-            <wp:docPr id="5" name="Picture 5" descr="附图1：策略A（TASK7-A-MA20模板基线）JoinQuant回测完成页"/>
+            <wp:extent cx="5303520" cy="3025780"/>
+            <wp:docPr id="5" name="Picture 5" descr="附图1：策略A长期回测完成页（2019-01-01至2026-07-17）"/>
             <wp:cNvGraphicFramePr>
               <a:graphicFrameLocks noChangeAspect="1"/>
             </wp:cNvGraphicFramePr>
@@ -3783,7 +4021,7 @@
               <a:graphicData uri="http://schemas.openxmlformats.org/drawingml/2006/picture">
                 <pic:pic>
                   <pic:nvPicPr>
-                    <pic:cNvPr id="0" name="Screenshot 2026-07-24 at 23.13.04.png"/>
+                    <pic:cNvPr id="0" name="Screenshot 2026-07-25 at 00.17.55.png"/>
                     <pic:cNvPicPr/>
                   </pic:nvPicPr>
                   <pic:blipFill>
@@ -3795,7 +4033,7 @@
                   <pic:spPr>
                     <a:xfrm>
                       <a:off x="0" y="0"/>
-                      <a:ext cx="5577840" cy="3235764"/>
+                      <a:ext cx="5303520" cy="3025780"/>
                     </a:xfrm>
                     <a:prstGeom prst="rect"/>
                   </pic:spPr>
@@ -3808,16 +4046,16 @@
     </w:p>
     <w:p>
       <w:pPr>
-        <w:spacing w:after="120"/>
+        <w:spacing w:after="240"/>
         <w:jc w:val="center"/>
       </w:pPr>
       <w:r>
         <w:rPr>
           <w:rFonts w:ascii="Songti SC" w:hAnsi="Songti SC" w:eastAsia="Songti SC" w:cs="Songti SC"/>
-          <w:color w:val="61727A"/>
+          <w:color w:val="000000"/>
           <w:sz w:val="18"/>
         </w:rPr>
-        <w:t>附图1：策略A（TASK7-A-MA20模板基线）JoinQuant回测完成页</w:t>
+        <w:t>附图1：策略A长期回测完成页（2019-01-01至2026-07-17）</w:t>
       </w:r>
     </w:p>
     <w:p>
@@ -3834,8 +4072,8 @@
       <w:r>
         <w:drawing>
           <wp:inline xmlns:a="http://schemas.openxmlformats.org/drawingml/2006/main" xmlns:pic="http://schemas.openxmlformats.org/drawingml/2006/picture">
-            <wp:extent cx="5577840" cy="3206370"/>
-            <wp:docPr id="6" name="Picture 6" descr="附图2：策略B（TASK7-B-MA10_30-ATR风控）JoinQuant回测完成页"/>
+            <wp:extent cx="5303520" cy="3249458"/>
+            <wp:docPr id="6" name="Picture 6" descr="附图2：策略B长期回测完成页（2019-01-01至2026-07-17）"/>
             <wp:cNvGraphicFramePr>
               <a:graphicFrameLocks noChangeAspect="1"/>
             </wp:cNvGraphicFramePr>
@@ -3843,7 +4081,7 @@
               <a:graphicData uri="http://schemas.openxmlformats.org/drawingml/2006/picture">
                 <pic:pic>
                   <pic:nvPicPr>
-                    <pic:cNvPr id="0" name="Screenshot 2026-07-24 at 23.14.30.png"/>
+                    <pic:cNvPr id="0" name="Screenshot 2026-07-25 at 00.16.52.png"/>
                     <pic:cNvPicPr/>
                   </pic:nvPicPr>
                   <pic:blipFill>
@@ -3855,7 +4093,7 @@
                   <pic:spPr>
                     <a:xfrm>
                       <a:off x="0" y="0"/>
-                      <a:ext cx="5577840" cy="3206370"/>
+                      <a:ext cx="5303520" cy="3249458"/>
                     </a:xfrm>
                     <a:prstGeom prst="rect"/>
                   </pic:spPr>
@@ -3868,16 +4106,16 @@
     </w:p>
     <w:p>
       <w:pPr>
-        <w:spacing w:after="120"/>
+        <w:spacing w:after="240"/>
         <w:jc w:val="center"/>
       </w:pPr>
       <w:r>
         <w:rPr>
           <w:rFonts w:ascii="Songti SC" w:hAnsi="Songti SC" w:eastAsia="Songti SC" w:cs="Songti SC"/>
-          <w:color w:val="61727A"/>
+          <w:color w:val="000000"/>
           <w:sz w:val="18"/>
         </w:rPr>
-        <w:t>附图2：策略B（TASK7-B-MA10_30-ATR风控）JoinQuant回测完成页</w:t>
+        <w:t>附图2：策略B长期回测完成页（2019-01-01至2026-07-17）</w:t>
       </w:r>
     </w:p>
     <w:p>
@@ -3894,8 +4132,8 @@
       <w:r>
         <w:drawing>
           <wp:inline xmlns:a="http://schemas.openxmlformats.org/drawingml/2006/main" xmlns:pic="http://schemas.openxmlformats.org/drawingml/2006/picture">
-            <wp:extent cx="5577840" cy="3204385"/>
-            <wp:docPr id="7" name="Picture 7" descr="附图3：策略C（TASK7-C-ETF动量轮动15D）JoinQuant回测完成页"/>
+            <wp:extent cx="5303520" cy="3039567"/>
+            <wp:docPr id="7" name="Picture 7" descr="附图3：策略C长期回测完成页（2019-01-01至2026-07-17）"/>
             <wp:cNvGraphicFramePr>
               <a:graphicFrameLocks noChangeAspect="1"/>
             </wp:cNvGraphicFramePr>
@@ -3903,7 +4141,7 @@
               <a:graphicData uri="http://schemas.openxmlformats.org/drawingml/2006/picture">
                 <pic:pic>
                   <pic:nvPicPr>
-                    <pic:cNvPr id="0" name="Screenshot 2026-07-24 at 23.16.51.png"/>
+                    <pic:cNvPr id="0" name="Screenshot 2026-07-25 at 00.16.39.png"/>
                     <pic:cNvPicPr/>
                   </pic:nvPicPr>
                   <pic:blipFill>
@@ -3915,7 +4153,7 @@
                   <pic:spPr>
                     <a:xfrm>
                       <a:off x="0" y="0"/>
-                      <a:ext cx="5577840" cy="3204385"/>
+                      <a:ext cx="5303520" cy="3039567"/>
                     </a:xfrm>
                     <a:prstGeom prst="rect"/>
                   </pic:spPr>
@@ -3928,21 +4166,201 @@
     </w:p>
     <w:p>
       <w:pPr>
-        <w:spacing w:after="120"/>
+        <w:spacing w:after="240"/>
         <w:jc w:val="center"/>
       </w:pPr>
       <w:r>
         <w:rPr>
           <w:rFonts w:ascii="Songti SC" w:hAnsi="Songti SC" w:eastAsia="Songti SC" w:cs="Songti SC"/>
-          <w:color w:val="61727A"/>
+          <w:color w:val="000000"/>
           <w:sz w:val="18"/>
         </w:rPr>
-        <w:t>附图3：策略C（TASK7-C-ETF动量轮动15D）JoinQuant回测完成页</w:t>
+        <w:t>附图3：策略C长期回测完成页（2019-01-01至2026-07-17）</w:t>
+      </w:r>
+    </w:p>
+    <w:p>
+      <w:r>
+        <w:br w:type="page"/>
+      </w:r>
+    </w:p>
+    <w:p>
+      <w:pPr>
+        <w:keepNext/>
+        <w:spacing w:before="80" w:after="40"/>
+        <w:jc w:val="center"/>
+      </w:pPr>
+      <w:r>
+        <w:drawing>
+          <wp:inline xmlns:a="http://schemas.openxmlformats.org/drawingml/2006/main" xmlns:pic="http://schemas.openxmlformats.org/drawingml/2006/picture">
+            <wp:extent cx="5303520" cy="3045544"/>
+            <wp:docPr id="8" name="Picture 8" descr="附图4：策略A测试周回测完成页（2026-07-20至2026-07-24）"/>
+            <wp:cNvGraphicFramePr>
+              <a:graphicFrameLocks noChangeAspect="1"/>
+            </wp:cNvGraphicFramePr>
+            <a:graphic>
+              <a:graphicData uri="http://schemas.openxmlformats.org/drawingml/2006/picture">
+                <pic:pic>
+                  <pic:nvPicPr>
+                    <pic:cNvPr id="0" name="Screenshot 2026-07-25 at 00.19.23.png"/>
+                    <pic:cNvPicPr/>
+                  </pic:nvPicPr>
+                  <pic:blipFill>
+                    <a:blip r:embed="rId21"/>
+                    <a:stretch>
+                      <a:fillRect/>
+                    </a:stretch>
+                  </pic:blipFill>
+                  <pic:spPr>
+                    <a:xfrm>
+                      <a:off x="0" y="0"/>
+                      <a:ext cx="5303520" cy="3045544"/>
+                    </a:xfrm>
+                    <a:prstGeom prst="rect"/>
+                  </pic:spPr>
+                </pic:pic>
+              </a:graphicData>
+            </a:graphic>
+          </wp:inline>
+        </w:drawing>
+      </w:r>
+    </w:p>
+    <w:p>
+      <w:pPr>
+        <w:spacing w:after="240"/>
+        <w:jc w:val="center"/>
+      </w:pPr>
+      <w:r>
+        <w:rPr>
+          <w:rFonts w:ascii="Songti SC" w:hAnsi="Songti SC" w:eastAsia="Songti SC" w:cs="Songti SC"/>
+          <w:color w:val="000000"/>
+          <w:sz w:val="18"/>
+        </w:rPr>
+        <w:t>附图4：策略A测试周回测完成页（2026-07-20至2026-07-24）</w:t>
+      </w:r>
+    </w:p>
+    <w:p>
+      <w:r>
+        <w:br w:type="page"/>
+      </w:r>
+    </w:p>
+    <w:p>
+      <w:pPr>
+        <w:keepNext/>
+        <w:spacing w:before="80" w:after="40"/>
+        <w:jc w:val="center"/>
+      </w:pPr>
+      <w:r>
+        <w:drawing>
+          <wp:inline xmlns:a="http://schemas.openxmlformats.org/drawingml/2006/main" xmlns:pic="http://schemas.openxmlformats.org/drawingml/2006/picture">
+            <wp:extent cx="5303520" cy="3042590"/>
+            <wp:docPr id="9" name="Picture 9" descr="附图5：策略B测试周回测完成页（2026-07-20至2026-07-24）"/>
+            <wp:cNvGraphicFramePr>
+              <a:graphicFrameLocks noChangeAspect="1"/>
+            </wp:cNvGraphicFramePr>
+            <a:graphic>
+              <a:graphicData uri="http://schemas.openxmlformats.org/drawingml/2006/picture">
+                <pic:pic>
+                  <pic:nvPicPr>
+                    <pic:cNvPr id="0" name="Screenshot 2026-07-25 at 00.19.11.png"/>
+                    <pic:cNvPicPr/>
+                  </pic:nvPicPr>
+                  <pic:blipFill>
+                    <a:blip r:embed="rId22"/>
+                    <a:stretch>
+                      <a:fillRect/>
+                    </a:stretch>
+                  </pic:blipFill>
+                  <pic:spPr>
+                    <a:xfrm>
+                      <a:off x="0" y="0"/>
+                      <a:ext cx="5303520" cy="3042590"/>
+                    </a:xfrm>
+                    <a:prstGeom prst="rect"/>
+                  </pic:spPr>
+                </pic:pic>
+              </a:graphicData>
+            </a:graphic>
+          </wp:inline>
+        </w:drawing>
+      </w:r>
+    </w:p>
+    <w:p>
+      <w:pPr>
+        <w:spacing w:after="240"/>
+        <w:jc w:val="center"/>
+      </w:pPr>
+      <w:r>
+        <w:rPr>
+          <w:rFonts w:ascii="Songti SC" w:hAnsi="Songti SC" w:eastAsia="Songti SC" w:cs="Songti SC"/>
+          <w:color w:val="000000"/>
+          <w:sz w:val="18"/>
+        </w:rPr>
+        <w:t>附图5：策略B测试周回测完成页（2026-07-20至2026-07-24）</w:t>
+      </w:r>
+    </w:p>
+    <w:p>
+      <w:r>
+        <w:br w:type="page"/>
+      </w:r>
+    </w:p>
+    <w:p>
+      <w:pPr>
+        <w:keepNext/>
+        <w:spacing w:before="80" w:after="40"/>
+        <w:jc w:val="center"/>
+      </w:pPr>
+      <w:r>
+        <w:drawing>
+          <wp:inline xmlns:a="http://schemas.openxmlformats.org/drawingml/2006/main" xmlns:pic="http://schemas.openxmlformats.org/drawingml/2006/picture">
+            <wp:extent cx="5303520" cy="3047419"/>
+            <wp:docPr id="10" name="Picture 10" descr="附图6：策略C测试周回测完成页（2026-07-20至2026-07-24）"/>
+            <wp:cNvGraphicFramePr>
+              <a:graphicFrameLocks noChangeAspect="1"/>
+            </wp:cNvGraphicFramePr>
+            <a:graphic>
+              <a:graphicData uri="http://schemas.openxmlformats.org/drawingml/2006/picture">
+                <pic:pic>
+                  <pic:nvPicPr>
+                    <pic:cNvPr id="0" name="Screenshot 2026-07-25 at 00.19.00.png"/>
+                    <pic:cNvPicPr/>
+                  </pic:nvPicPr>
+                  <pic:blipFill>
+                    <a:blip r:embed="rId23"/>
+                    <a:stretch>
+                      <a:fillRect/>
+                    </a:stretch>
+                  </pic:blipFill>
+                  <pic:spPr>
+                    <a:xfrm>
+                      <a:off x="0" y="0"/>
+                      <a:ext cx="5303520" cy="3047419"/>
+                    </a:xfrm>
+                    <a:prstGeom prst="rect"/>
+                  </pic:spPr>
+                </pic:pic>
+              </a:graphicData>
+            </a:graphic>
+          </wp:inline>
+        </w:drawing>
+      </w:r>
+    </w:p>
+    <w:p>
+      <w:pPr>
+        <w:spacing w:after="240"/>
+        <w:jc w:val="center"/>
+      </w:pPr>
+      <w:r>
+        <w:rPr>
+          <w:rFonts w:ascii="Songti SC" w:hAnsi="Songti SC" w:eastAsia="Songti SC" w:cs="Songti SC"/>
+          <w:color w:val="000000"/>
+          <w:sz w:val="18"/>
+        </w:rPr>
+        <w:t>附图6：策略C测试周回测完成页（2026-07-20至2026-07-24）</w:t>
       </w:r>
     </w:p>
     <w:sectPr>
       <w:pgSz w:w="12240" w:h="15840"/>
-      <w:pgMar w:top="1440" w:right="1440" w:bottom="1440" w:left="1440" w:header="708" w:footer="708" w:gutter="0"/>
+      <w:pgMar w:top="1440" w:right="1800" w:bottom="1440" w:left="1800" w:header="708" w:footer="708" w:gutter="0"/>
       <w:cols w:space="720"/>
       <w:docGrid w:linePitch="360"/>
     </w:sectPr>
@@ -4384,7 +4802,7 @@
       <w:rFonts w:asciiTheme="majorHAnsi" w:eastAsiaTheme="majorEastAsia" w:hAnsiTheme="majorHAnsi" w:cstheme="majorBidi" w:ascii="Songti SC" w:hAnsi="Songti SC" w:eastAsia="Songti SC"/>
       <w:b/>
       <w:bCs/>
-      <w:color w:val="147D72"/>
+      <w:color w:val="000000"/>
       <w:sz w:val="28"/>
       <w:szCs w:val="28"/>
     </w:rPr>
@@ -4408,7 +4826,7 @@
       <w:rFonts w:asciiTheme="majorHAnsi" w:eastAsiaTheme="majorEastAsia" w:hAnsiTheme="majorHAnsi" w:cstheme="majorBidi" w:ascii="Songti SC" w:hAnsi="Songti SC" w:eastAsia="Songti SC"/>
       <w:b/>
       <w:bCs/>
-      <w:color w:val="14242B"/>
+      <w:color w:val="000000"/>
       <w:sz w:val="24"/>
       <w:szCs w:val="26"/>
     </w:rPr>

</xml_diff>

<commit_message>
feat(Task7): integrate reports and resilient data updates
</commit_message>
<xml_diff>
--- a/Task7/Rebecca+Task7.docx
+++ b/Task7/Rebecca+Task7.docx
@@ -4,34 +4,19 @@
   <w:body>
     <w:p>
       <w:pPr>
-        <w:spacing w:after="100"/>
+        <w:pStyle w:val="Heading1"/>
+        <w:keepNext/>
+        <w:spacing w:before="240" w:after="120"/>
         <w:jc w:val="left"/>
       </w:pPr>
       <w:r>
         <w:rPr>
           <w:rFonts w:ascii="Songti SC" w:hAnsi="Songti SC" w:eastAsia="Songti SC" w:cs="Songti SC"/>
           <w:b/>
-          <w:color w:val="14242B"/>
-          <w:sz w:val="32"/>
+          <w:color w:val="000000"/>
+          <w:sz w:val="28"/>
         </w:rPr>
-        <w:t>TASK7 实战推演：策略部署、模拟交易与风险暴露</w:t>
-      </w:r>
-    </w:p>
-    <w:p>
-      <w:pPr>
-        <w:spacing w:after="200"/>
-        <w:jc w:val="left"/>
-        <w:pBdr>
-          <w:bottom w:val="single" w:sz="12" w:space="8" w:color="147D72"/>
-        </w:pBdr>
-      </w:pPr>
-      <w:r>
-        <w:rPr>
-          <w:rFonts w:ascii="Songti SC" w:hAnsi="Songti SC" w:eastAsia="Songti SC" w:cs="Songti SC"/>
-          <w:color w:val="61727A"/>
-          <w:sz w:val="21"/>
-        </w:rPr>
-        <w:t>最终报告 · JoinQuant回测区间2019-01-01至2026-07-23 · 三个私有模拟盘已部署</w:t>
+        <w:t>摘要</w:t>
       </w:r>
     </w:p>
     <w:p>
@@ -43,38 +28,34 @@
       <w:r>
         <w:rPr>
           <w:rFonts w:ascii="Songti SC" w:hAnsi="Songti SC" w:eastAsia="Songti SC" w:cs="Songti SC"/>
-          <w:color w:val="14242B"/>
+          <w:color w:val="000000"/>
           <w:sz w:val="21"/>
         </w:rPr>
-        <w:t>本任务使用JoinQuant完成策略设计、平台回测与私有模拟盘部署。课程提交时间不足以形成有统计意义的模拟交易记录，因此评价对象被拆分为JoinQuant历史回测、公开行情重建的影子组合和JoinQuant实际模拟三层。三次平台回测均已完成，三个模拟盘均已部署；截至2026-07-24尚无模拟盘运行数据。历史结果用于评价参数和风险，影子组合用于提交后的连续观察，平台订单和成交才属于实际模拟表现。</w:t>
+        <w:t>本报告展示三套宽基ETF策略的设计、参数定型、长期回测、测试周表现与模拟盘部署状态。长期结果表明，策略C累计收益71.84%，是三者中唯一取得正超额收益的方案；策略B将最大回撤控制在12.31%，更接近防守型配置；策略A累计收益为-0.66%、最大回撤36.97%，说明简单高仓位择时在震荡和交易摩擦面前缺乏足够保护。综合收益与风险后，策略C作为主要观察对象，策略B作为防守型参照，策略A作为基础对照。</w:t>
       </w:r>
     </w:p>
     <w:p>
       <w:pPr>
-        <w:spacing w:before="100" w:after="120" w:line="324" w:lineRule="auto"/>
-        <w:ind w:left="198" w:right="142"/>
+        <w:spacing w:before="0" w:after="0" w:line="360" w:lineRule="auto"/>
+        <w:ind w:firstLine="420"/>
         <w:jc w:val="both"/>
-        <w:shd w:fill="FFF2E5"/>
-        <w:pBdr>
-          <w:left w:val="single" w:sz="18" w:space="8" w:color="D87831"/>
-        </w:pBdr>
       </w:pPr>
       <w:r>
         <w:rPr>
           <w:rFonts w:ascii="Songti SC" w:hAnsi="Songti SC" w:eastAsia="Songti SC" w:cs="Songti SC"/>
           <w:b/>
-          <w:color w:val="14242B"/>
+          <w:color w:val="000000"/>
           <w:sz w:val="21"/>
         </w:rPr>
-        <w:t>当前完成边界：</w:t>
+        <w:t>核心判断：</w:t>
       </w:r>
       <w:r>
         <w:rPr>
           <w:rFonts w:ascii="Songti SC" w:hAnsi="Songti SC" w:eastAsia="Songti SC" w:cs="Songti SC"/>
-          <w:color w:val="14242B"/>
+          <w:color w:val="000000"/>
           <w:sz w:val="21"/>
         </w:rPr>
-        <w:t>账号已由用户本人登录，三次平台回测和三个私有模拟盘部署已完成。由于尚未经历足够的A股交易时段，报告只记录部署事实，不填造模拟收益。密码、Cookie、手机号、认证字段和私有链接均未进入报告、代码或Dashboard。</w:t>
+        <w:t>2026年7月20日至24日的五日测试期内，三套策略均保持现金，策略收益与回撤均为0%，同期沪深300上涨2.65%。这一结果显示三套趋势规则在快速上涨窗口中仍保持谨慎，降低了市场波动暴露，也产生了2.58%的相对机会成本。三组模拟盘于7月24日周五完成部署；7月25日为周六、A股休市，截至报告日期尚未产生部署后的运行数据。测试周采用冻结参数和T−1历史信息回放策略决策，属于模拟盘启动前的历史模拟；后续实际模拟净值、持仓和成交将在持续观察页面更新。</w:t>
       </w:r>
     </w:p>
     <w:p>
@@ -88,10 +69,10 @@
         <w:rPr>
           <w:rFonts w:ascii="Songti SC" w:hAnsi="Songti SC" w:eastAsia="Songti SC" w:cs="Songti SC"/>
           <w:b/>
-          <w:color w:val="147D72"/>
+          <w:color w:val="000000"/>
           <w:sz w:val="28"/>
         </w:rPr>
-        <w:t>一、JoinQuant平台与隐私边界</w:t>
+        <w:t>一、成果概览与研究范围</w:t>
       </w:r>
     </w:p>
     <w:p>
@@ -105,10 +86,10 @@
         <w:rPr>
           <w:rFonts w:ascii="Songti SC" w:hAnsi="Songti SC" w:eastAsia="Songti SC" w:cs="Songti SC"/>
           <w:b/>
-          <w:color w:val="14242B"/>
+          <w:color w:val="000000"/>
           <w:sz w:val="24"/>
         </w:rPr>
-        <w:t>1.1 平台功能与数据获取</w:t>
+        <w:t>1.1 本次课程实践的核心成果</w:t>
       </w:r>
     </w:p>
     <w:p>
@@ -120,25 +101,10 @@
       <w:r>
         <w:rPr>
           <w:rFonts w:ascii="Songti SC" w:hAnsi="Songti SC" w:eastAsia="Songti SC" w:cs="Songti SC"/>
-          <w:color w:val="14242B"/>
+          <w:color w:val="000000"/>
           <w:sz w:val="21"/>
         </w:rPr>
-        <w:t>JoinQuant量化研究平台把策略研究的主要环节集中在同一环境中。策略编辑器用于保存Python代码和版本；回测页负责设置时间、资金、频率、基准和交易成本；模拟交易使用与回测相同的策略代码，在交易时段产生平台订单与持仓；社区提供可克隆的研究思路；帮助中心和API文档解释数据字段、调度函数、订单函数和模拟环境限制。数据函数可以读取股票、基金和指数的历史行情，策略代码通过initialize设置基准、复权、成本和调度，再由定时函数产生信号与订单。</w:t>
-      </w:r>
-    </w:p>
-    <w:p>
-      <w:pPr>
-        <w:spacing w:before="0" w:after="0" w:line="360" w:lineRule="auto"/>
-        <w:ind w:firstLine="420"/>
-        <w:jc w:val="both"/>
-      </w:pPr>
-      <w:r>
-        <w:rPr>
-          <w:rFonts w:ascii="Songti SC" w:hAnsi="Songti SC" w:eastAsia="Songti SC" w:cs="Songti SC"/>
-          <w:color w:val="14242B"/>
-          <w:sz w:val="21"/>
-        </w:rPr>
-        <w:t>平台提供的避免未来数据选项用于限制策略在决策时点读取尚未完成的数据。三个策略均启用set_option("avoid_future_data", True)，日线信号只读取context.previous_date及更早记录，下一交易日开盘后再下单。交易前检查停牌、涨跌停和价格有效性，交易后把委托数量、成交数量和订单状态写入日志。该设计把课程资料中关于未来函数、滑点、订单拒绝和数据质量的提醒转化为可检查的代码约束。</w:t>
+        <w:t>本次实践形成了一套可以持续比较的三策略组合，评价范围同时覆盖历史收益、风险和市场暴露。三套方案分别代表简单择时、风险约束趋势跟随和跨ETF动量轮动，并在统一资金规模、基准和交易成本下接受检验。报告重点回答三个问题：不同规则带来了怎样的收益与市场暴露，回撤是否与收益相匹配，以及参数冻结后在测试周和模拟观察阶段表现如何。</w:t>
       </w:r>
     </w:p>
     <w:p>
@@ -152,10 +118,10 @@
         <w:rPr>
           <w:rFonts w:ascii="Songti SC" w:hAnsi="Songti SC" w:eastAsia="Songti SC" w:cs="Songti SC"/>
           <w:b/>
-          <w:color w:val="14242B"/>
+          <w:color w:val="000000"/>
           <w:sz w:val="24"/>
         </w:rPr>
-        <w:t>1.2 账号认证与公开材料</w:t>
+        <w:t>1.2 聚宽平台的应用范围</w:t>
       </w:r>
     </w:p>
     <w:p>
@@ -167,10 +133,10 @@
       <w:r>
         <w:rPr>
           <w:rFonts w:ascii="Songti SC" w:hAnsi="Songti SC" w:eastAsia="Songti SC" w:cs="Songti SC"/>
-          <w:color w:val="14242B"/>
+          <w:color w:val="000000"/>
           <w:sz w:val="21"/>
         </w:rPr>
-        <w:t>个人账号已经存在并可正常登录，策略保存、回测和模拟盘部署均由用户在已登录页面完成。手机号绑定或实名认证等字段只由用户本人在平台个人中心维护，本报告不复制认证页面，也不以索取密码作为核验条件。模拟盘保持私有，老师需要核验时可由用户在已登录页面直接展示；公开Dashboard不放置模拟盘访问链接。这一处理既保留课程证据，也避免把交易账户访问方式扩散到公开仓库。</w:t>
+        <w:t>现有账号已完成注册并能正常登录，相关权限满足本次研究需要。实践覆盖聚宽的数据调用、策略编辑、历史回测、结果分析和模拟交易功能。长期回测用于评价策略表现，测试周用于观察冻结参数下的实际信号，三组模拟组合则承担后续连续验证。平台文档用于确认数据与交易规则，社区案例为策略C提供了思路；最终的标的范围、调仓频率和风险约束均根据本次研究目标重新设定，策略与组合保持私有。</w:t>
       </w:r>
     </w:p>
     <w:p>
@@ -184,10 +150,10 @@
         <w:rPr>
           <w:rFonts w:ascii="Songti SC" w:hAnsi="Songti SC" w:eastAsia="Songti SC" w:cs="Songti SC"/>
           <w:b/>
-          <w:color w:val="147D72"/>
+          <w:color w:val="000000"/>
           <w:sz w:val="28"/>
         </w:rPr>
-        <w:t>二、从模板到三策略</w:t>
+        <w:t>二、三套策略代表不同的收益—风险取向</w:t>
       </w:r>
     </w:p>
     <w:p>
@@ -199,26 +165,26 @@
       <w:r>
         <w:rPr>
           <w:rFonts w:ascii="Songti SC" w:hAnsi="Songti SC" w:eastAsia="Songti SC" w:cs="Songti SC"/>
-          <w:color w:val="14242B"/>
+          <w:color w:val="000000"/>
           <w:sz w:val="21"/>
         </w:rPr>
-        <w:t>三个策略使用同一初始资金500,000元、同一沪深300基准和同一ETF成本口径。策略A保留高暴露模板，作用是显示简单择时在真实成本下的缺陷；策略B把TASK3的均线趋势信号与TASK4的ATR风险管理合并；策略C从社区宽基ETF轮动文章中吸收跨ETF选择和空仓思想，但冻结标的池、降低调仓频率，并重新实现信号与订单检查。</w:t>
+        <w:t>三个策略使用500,000元初始资金，以沪深300作为共同基准。策略A代表简单、直接但高暴露的择时方案；策略B在趋势判断之外增加仓位预算和止损，更强调资金保护；策略C在三只宽基ETF之间选择动量最强者，并在趋势不足时持有现金，目标是在控制仓位的同时争取相对收益。</w:t>
       </w:r>
     </w:p>
     <w:tbl>
       <w:tblPr>
         <w:tblStyle w:val="TableGrid"/>
-        <w:tblW w:type="dxa" w:w="9360"/>
+        <w:tblW w:type="dxa" w:w="8520"/>
         <w:tblLayout w:type="fixed"/>
         <w:tblLook w:firstColumn="1" w:firstRow="1" w:lastColumn="0" w:lastRow="0" w:noHBand="0" w:noVBand="1" w:val="04A0"/>
         <w:jc w:val="center"/>
         <w:tblInd w:w="120" w:type="dxa"/>
       </w:tblPr>
       <w:tblGrid>
-        <w:gridCol w:w="720"/>
-        <w:gridCol w:w="2480"/>
-        <w:gridCol w:w="3770"/>
-        <w:gridCol w:w="2390"/>
+        <w:gridCol w:w="819"/>
+        <w:gridCol w:w="2094"/>
+        <w:gridCol w:w="3432"/>
+        <w:gridCol w:w="2175"/>
       </w:tblGrid>
       <w:tr>
         <w:trPr>
@@ -226,7 +192,7 @@
         </w:trPr>
         <w:tc>
           <w:tcPr>
-            <w:tcW w:type="dxa" w:w="720"/>
+            <w:tcW w:type="dxa" w:w="819"/>
             <w:tcMar>
               <w:top w:w="80" w:type="dxa"/>
               <w:start w:w="120" w:type="dxa"/>
@@ -234,7 +200,7 @@
               <w:end w:w="120" w:type="dxa"/>
             </w:tcMar>
             <w:vAlign w:val="center"/>
-            <w:shd w:fill="F2F4F3"/>
+            <w:shd w:fill="D9D9D9"/>
           </w:tcPr>
           <w:p>
             <w:pPr>
@@ -245,7 +211,7 @@
               <w:rPr>
                 <w:rFonts w:ascii="Songti SC" w:hAnsi="Songti SC" w:eastAsia="Songti SC" w:cs="Songti SC"/>
                 <w:b/>
-                <w:color w:val="14242B"/>
+                <w:color w:val="000000"/>
                 <w:sz w:val="17"/>
               </w:rPr>
               <w:t>策略</w:t>
@@ -254,7 +220,7 @@
         </w:tc>
         <w:tc>
           <w:tcPr>
-            <w:tcW w:type="dxa" w:w="2480"/>
+            <w:tcW w:type="dxa" w:w="2094"/>
             <w:tcMar>
               <w:top w:w="80" w:type="dxa"/>
               <w:start w:w="120" w:type="dxa"/>
@@ -262,7 +228,7 @@
               <w:end w:w="120" w:type="dxa"/>
             </w:tcMar>
             <w:vAlign w:val="center"/>
-            <w:shd w:fill="F2F4F3"/>
+            <w:shd w:fill="D9D9D9"/>
           </w:tcPr>
           <w:p>
             <w:pPr>
@@ -273,16 +239,16 @@
               <w:rPr>
                 <w:rFonts w:ascii="Songti SC" w:hAnsi="Songti SC" w:eastAsia="Songti SC" w:cs="Songti SC"/>
                 <w:b/>
-                <w:color w:val="14242B"/>
+                <w:color w:val="000000"/>
                 <w:sz w:val="17"/>
               </w:rPr>
-              <w:t>信号</w:t>
+              <w:t>核心信号</w:t>
             </w:r>
           </w:p>
         </w:tc>
         <w:tc>
           <w:tcPr>
-            <w:tcW w:type="dxa" w:w="3770"/>
+            <w:tcW w:type="dxa" w:w="3432"/>
             <w:tcMar>
               <w:top w:w="80" w:type="dxa"/>
               <w:start w:w="120" w:type="dxa"/>
@@ -290,7 +256,7 @@
               <w:end w:w="120" w:type="dxa"/>
             </w:tcMar>
             <w:vAlign w:val="center"/>
-            <w:shd w:fill="F2F4F3"/>
+            <w:shd w:fill="D9D9D9"/>
           </w:tcPr>
           <w:p>
             <w:pPr>
@@ -301,7 +267,7 @@
               <w:rPr>
                 <w:rFonts w:ascii="Songti SC" w:hAnsi="Songti SC" w:eastAsia="Songti SC" w:cs="Songti SC"/>
                 <w:b/>
-                <w:color w:val="14242B"/>
+                <w:color w:val="000000"/>
                 <w:sz w:val="17"/>
               </w:rPr>
               <w:t>仓位与风控</w:t>
@@ -310,7 +276,7 @@
         </w:tc>
         <w:tc>
           <w:tcPr>
-            <w:tcW w:type="dxa" w:w="2390"/>
+            <w:tcW w:type="dxa" w:w="2175"/>
             <w:tcMar>
               <w:top w:w="80" w:type="dxa"/>
               <w:start w:w="120" w:type="dxa"/>
@@ -318,7 +284,7 @@
               <w:end w:w="120" w:type="dxa"/>
             </w:tcMar>
             <w:vAlign w:val="center"/>
-            <w:shd w:fill="F2F4F3"/>
+            <w:shd w:fill="D9D9D9"/>
           </w:tcPr>
           <w:p>
             <w:pPr>
@@ -329,10 +295,10 @@
               <w:rPr>
                 <w:rFonts w:ascii="Songti SC" w:hAnsi="Songti SC" w:eastAsia="Songti SC" w:cs="Songti SC"/>
                 <w:b/>
-                <w:color w:val="14242B"/>
+                <w:color w:val="000000"/>
                 <w:sz w:val="17"/>
               </w:rPr>
-              <w:t>实验角色</w:t>
+              <w:t>组合定位</w:t>
             </w:r>
           </w:p>
         </w:tc>
@@ -340,33 +306,7 @@
       <w:tr>
         <w:tc>
           <w:tcPr>
-            <w:tcW w:type="dxa" w:w="720"/>
-            <w:tcMar>
-              <w:top w:w="80" w:type="dxa"/>
-              <w:start w:w="120" w:type="dxa"/>
-              <w:bottom w:w="80" w:type="dxa"/>
-              <w:end w:w="120" w:type="dxa"/>
-            </w:tcMar>
-            <w:vAlign w:val="center"/>
-          </w:tcPr>
-          <w:p>
-            <w:pPr>
-              <w:spacing w:after="0" w:line="276" w:lineRule="auto"/>
-              <w:jc w:val="left"/>
-            </w:pPr>
-            <w:r>
-              <w:rPr>
-                <w:rFonts w:ascii="Songti SC" w:hAnsi="Songti SC" w:eastAsia="Songti SC" w:cs="Songti SC"/>
-                <w:color w:val="14242B"/>
-                <w:sz w:val="17"/>
-              </w:rPr>
-              <w:t>A</w:t>
-            </w:r>
-          </w:p>
-        </w:tc>
-        <w:tc>
-          <w:tcPr>
-            <w:tcW w:type="dxa" w:w="2480"/>
+            <w:tcW w:type="dxa" w:w="819"/>
             <w:tcMar>
               <w:top w:w="80" w:type="dxa"/>
               <w:start w:w="120" w:type="dxa"/>
@@ -383,16 +323,16 @@
             <w:r>
               <w:rPr>
                 <w:rFonts w:ascii="Songti SC" w:hAnsi="Songti SC" w:eastAsia="Songti SC" w:cs="Songti SC"/>
-                <w:color w:val="14242B"/>
+                <w:color w:val="000000"/>
                 <w:sz w:val="17"/>
               </w:rPr>
-              <w:t>510300前收盘 &gt; MA20</w:t>
+              <w:t>A</w:t>
             </w:r>
           </w:p>
         </w:tc>
         <w:tc>
           <w:tcPr>
-            <w:tcW w:type="dxa" w:w="3770"/>
+            <w:tcW w:type="dxa" w:w="2094"/>
             <w:tcMar>
               <w:top w:w="80" w:type="dxa"/>
               <w:start w:w="120" w:type="dxa"/>
@@ -409,16 +349,16 @@
             <w:r>
               <w:rPr>
                 <w:rFonts w:ascii="Songti SC" w:hAnsi="Songti SC" w:eastAsia="Songti SC" w:cs="Songti SC"/>
-                <w:color w:val="14242B"/>
+                <w:color w:val="000000"/>
                 <w:sz w:val="17"/>
               </w:rPr>
-              <w:t>目标100%；无ATR止损</w:t>
+              <w:t>510300收盘价高于20日均线</w:t>
             </w:r>
           </w:p>
         </w:tc>
         <w:tc>
           <w:tcPr>
-            <w:tcW w:type="dxa" w:w="2390"/>
+            <w:tcW w:type="dxa" w:w="3432"/>
             <w:tcMar>
               <w:top w:w="80" w:type="dxa"/>
               <w:start w:w="120" w:type="dxa"/>
@@ -435,44 +375,16 @@
             <w:r>
               <w:rPr>
                 <w:rFonts w:ascii="Songti SC" w:hAnsi="Songti SC" w:eastAsia="Songti SC" w:cs="Songti SC"/>
-                <w:color w:val="14242B"/>
+                <w:color w:val="000000"/>
                 <w:sz w:val="17"/>
               </w:rPr>
-              <w:t>平台模板基线</w:t>
-            </w:r>
-          </w:p>
-        </w:tc>
-      </w:tr>
-      <w:tr>
-        <w:tc>
-          <w:tcPr>
-            <w:tcW w:type="dxa" w:w="720"/>
-            <w:tcMar>
-              <w:top w:w="80" w:type="dxa"/>
-              <w:start w:w="120" w:type="dxa"/>
-              <w:bottom w:w="80" w:type="dxa"/>
-              <w:end w:w="120" w:type="dxa"/>
-            </w:tcMar>
-            <w:vAlign w:val="center"/>
-          </w:tcPr>
-          <w:p>
-            <w:pPr>
-              <w:spacing w:after="0" w:line="276" w:lineRule="auto"/>
-              <w:jc w:val="left"/>
-            </w:pPr>
-            <w:r>
-              <w:rPr>
-                <w:rFonts w:ascii="Songti SC" w:hAnsi="Songti SC" w:eastAsia="Songti SC" w:cs="Songti SC"/>
-                <w:color w:val="14242B"/>
-                <w:sz w:val="17"/>
-              </w:rPr>
-              <w:t>B</w:t>
+              <w:t>目标100%；无波动率止损</w:t>
             </w:r>
           </w:p>
         </w:tc>
         <w:tc>
           <w:tcPr>
-            <w:tcW w:type="dxa" w:w="2480"/>
+            <w:tcW w:type="dxa" w:w="2175"/>
             <w:tcMar>
               <w:top w:w="80" w:type="dxa"/>
               <w:start w:w="120" w:type="dxa"/>
@@ -489,16 +401,18 @@
             <w:r>
               <w:rPr>
                 <w:rFonts w:ascii="Songti SC" w:hAnsi="Songti SC" w:eastAsia="Songti SC" w:cs="Songti SC"/>
-                <w:color w:val="14242B"/>
+                <w:color w:val="000000"/>
                 <w:sz w:val="17"/>
               </w:rPr>
-              <w:t>510300 MA10 &gt; MA30</w:t>
+              <w:t>基础对照</w:t>
             </w:r>
           </w:p>
         </w:tc>
+      </w:tr>
+      <w:tr>
         <w:tc>
           <w:tcPr>
-            <w:tcW w:type="dxa" w:w="3770"/>
+            <w:tcW w:type="dxa" w:w="819"/>
             <w:tcMar>
               <w:top w:w="80" w:type="dxa"/>
               <w:start w:w="120" w:type="dxa"/>
@@ -515,16 +429,16 @@
             <w:r>
               <w:rPr>
                 <w:rFonts w:ascii="Songti SC" w:hAnsi="Songti SC" w:eastAsia="Songti SC" w:cs="Songti SC"/>
-                <w:color w:val="14242B"/>
+                <w:color w:val="000000"/>
                 <w:sz w:val="17"/>
               </w:rPr>
-              <w:t>ATR20、2倍止损、1%风险预算、上限50%、5%回撤暂停</w:t>
+              <w:t>B</w:t>
             </w:r>
           </w:p>
         </w:tc>
         <w:tc>
           <w:tcPr>
-            <w:tcW w:type="dxa" w:w="2390"/>
+            <w:tcW w:type="dxa" w:w="2094"/>
             <w:tcMar>
               <w:top w:w="80" w:type="dxa"/>
               <w:start w:w="120" w:type="dxa"/>
@@ -541,44 +455,16 @@
             <w:r>
               <w:rPr>
                 <w:rFonts w:ascii="Songti SC" w:hAnsi="Songti SC" w:eastAsia="Songti SC" w:cs="Songti SC"/>
-                <w:color w:val="14242B"/>
+                <w:color w:val="000000"/>
                 <w:sz w:val="17"/>
               </w:rPr>
-              <w:t>自主设计主策略</w:t>
-            </w:r>
-          </w:p>
-        </w:tc>
-      </w:tr>
-      <w:tr>
-        <w:tc>
-          <w:tcPr>
-            <w:tcW w:type="dxa" w:w="720"/>
-            <w:tcMar>
-              <w:top w:w="80" w:type="dxa"/>
-              <w:start w:w="120" w:type="dxa"/>
-              <w:bottom w:w="80" w:type="dxa"/>
-              <w:end w:w="120" w:type="dxa"/>
-            </w:tcMar>
-            <w:vAlign w:val="center"/>
-          </w:tcPr>
-          <w:p>
-            <w:pPr>
-              <w:spacing w:after="0" w:line="276" w:lineRule="auto"/>
-              <w:jc w:val="left"/>
-            </w:pPr>
-            <w:r>
-              <w:rPr>
-                <w:rFonts w:ascii="Songti SC" w:hAnsi="Songti SC" w:eastAsia="Songti SC" w:cs="Songti SC"/>
-                <w:color w:val="14242B"/>
-                <w:sz w:val="17"/>
-              </w:rPr>
-              <w:t>C</w:t>
+              <w:t>510300的10日均线高于30日均线</w:t>
             </w:r>
           </w:p>
         </w:tc>
         <w:tc>
           <w:tcPr>
-            <w:tcW w:type="dxa" w:w="2480"/>
+            <w:tcW w:type="dxa" w:w="3432"/>
             <w:tcMar>
               <w:top w:w="80" w:type="dxa"/>
               <w:start w:w="120" w:type="dxa"/>
@@ -595,16 +481,16 @@
             <w:r>
               <w:rPr>
                 <w:rFonts w:ascii="Songti SC" w:hAnsi="Songti SC" w:eastAsia="Songti SC" w:cs="Songti SC"/>
-                <w:color w:val="14242B"/>
+                <w:color w:val="000000"/>
                 <w:sz w:val="17"/>
               </w:rPr>
-              <w:t>三只宽基ETF 15日斜率×R²</w:t>
+              <w:t>风险预算、波动率止损、仓位上限50%</w:t>
             </w:r>
           </w:p>
         </w:tc>
         <w:tc>
           <w:tcPr>
-            <w:tcW w:type="dxa" w:w="3770"/>
+            <w:tcW w:type="dxa" w:w="2175"/>
             <w:tcMar>
               <w:top w:w="80" w:type="dxa"/>
               <w:start w:w="120" w:type="dxa"/>
@@ -621,16 +507,18 @@
             <w:r>
               <w:rPr>
                 <w:rFonts w:ascii="Songti SC" w:hAnsi="Songti SC" w:eastAsia="Songti SC" w:cs="Songti SC"/>
-                <w:color w:val="14242B"/>
+                <w:color w:val="000000"/>
                 <w:sz w:val="17"/>
               </w:rPr>
-              <w:t>周三调仓；最高正分ETF 50%，否则现金</w:t>
+              <w:t>防守型参照</w:t>
             </w:r>
           </w:p>
         </w:tc>
+      </w:tr>
+      <w:tr>
         <w:tc>
           <w:tcPr>
-            <w:tcW w:type="dxa" w:w="2390"/>
+            <w:tcW w:type="dxa" w:w="819"/>
             <w:tcMar>
               <w:top w:w="80" w:type="dxa"/>
               <w:start w:w="120" w:type="dxa"/>
@@ -647,10 +535,88 @@
             <w:r>
               <w:rPr>
                 <w:rFonts w:ascii="Songti SC" w:hAnsi="Songti SC" w:eastAsia="Songti SC" w:cs="Songti SC"/>
-                <w:color w:val="14242B"/>
+                <w:color w:val="000000"/>
                 <w:sz w:val="17"/>
               </w:rPr>
-              <w:t>社区启发对照</w:t>
+              <w:t>C</w:t>
+            </w:r>
+          </w:p>
+        </w:tc>
+        <w:tc>
+          <w:tcPr>
+            <w:tcW w:type="dxa" w:w="2094"/>
+            <w:tcMar>
+              <w:top w:w="80" w:type="dxa"/>
+              <w:start w:w="120" w:type="dxa"/>
+              <w:bottom w:w="80" w:type="dxa"/>
+              <w:end w:w="120" w:type="dxa"/>
+            </w:tcMar>
+            <w:vAlign w:val="center"/>
+          </w:tcPr>
+          <w:p>
+            <w:pPr>
+              <w:spacing w:after="0" w:line="276" w:lineRule="auto"/>
+              <w:jc w:val="center"/>
+            </w:pPr>
+            <w:r>
+              <w:rPr>
+                <w:rFonts w:ascii="Songti SC" w:hAnsi="Songti SC" w:eastAsia="Songti SC" w:cs="Songti SC"/>
+                <w:color w:val="000000"/>
+                <w:sz w:val="17"/>
+              </w:rPr>
+              <w:t>三只宽基ETF的15日趋势强度排序</w:t>
+            </w:r>
+          </w:p>
+        </w:tc>
+        <w:tc>
+          <w:tcPr>
+            <w:tcW w:type="dxa" w:w="3432"/>
+            <w:tcMar>
+              <w:top w:w="80" w:type="dxa"/>
+              <w:start w:w="120" w:type="dxa"/>
+              <w:bottom w:w="80" w:type="dxa"/>
+              <w:end w:w="120" w:type="dxa"/>
+            </w:tcMar>
+            <w:vAlign w:val="center"/>
+          </w:tcPr>
+          <w:p>
+            <w:pPr>
+              <w:spacing w:after="0" w:line="276" w:lineRule="auto"/>
+              <w:jc w:val="center"/>
+            </w:pPr>
+            <w:r>
+              <w:rPr>
+                <w:rFonts w:ascii="Songti SC" w:hAnsi="Songti SC" w:eastAsia="Songti SC" w:cs="Songti SC"/>
+                <w:color w:val="000000"/>
+                <w:sz w:val="17"/>
+              </w:rPr>
+              <w:t>每周选择最高正分ETF，仓位50%；弱势时持币</w:t>
+            </w:r>
+          </w:p>
+        </w:tc>
+        <w:tc>
+          <w:tcPr>
+            <w:tcW w:type="dxa" w:w="2175"/>
+            <w:tcMar>
+              <w:top w:w="80" w:type="dxa"/>
+              <w:start w:w="120" w:type="dxa"/>
+              <w:bottom w:w="80" w:type="dxa"/>
+              <w:end w:w="120" w:type="dxa"/>
+            </w:tcMar>
+            <w:vAlign w:val="center"/>
+          </w:tcPr>
+          <w:p>
+            <w:pPr>
+              <w:spacing w:after="0" w:line="276" w:lineRule="auto"/>
+              <w:jc w:val="center"/>
+            </w:pPr>
+            <w:r>
+              <w:rPr>
+                <w:rFonts w:ascii="Songti SC" w:hAnsi="Songti SC" w:eastAsia="Songti SC" w:cs="Songti SC"/>
+                <w:color w:val="000000"/>
+                <w:sz w:val="17"/>
+              </w:rPr>
+              <w:t>主要观察对象</w:t>
             </w:r>
           </w:p>
         </w:tc>
@@ -670,10 +636,10 @@
       <w:r>
         <w:rPr>
           <w:rFonts w:ascii="Songti SC" w:hAnsi="Songti SC" w:eastAsia="Songti SC" w:cs="Songti SC"/>
-          <w:color w:val="14242B"/>
+          <w:color w:val="000000"/>
           <w:sz w:val="21"/>
         </w:rPr>
-        <w:t>策略C的社区来源只承担研究线索功能。宽基池固定为510300、510500和159915，不加入回测结束后表现突出的主题ETF，也不沿用文章中的复合择时。动量分数先对最近价格取对数，再计算线性回归斜率的年化变化并乘以拟合优度R²；突然跳涨但路径不稳定的标的会因为R²较低而受到折扣。每周调仓把噪声和换手控制在可解释范围内。</w:t>
+        <w:t>策略C的标的池固定为沪深300ETF、中证500ETF和创业板ETF，覆盖大盘、中盘与成长风格。趋势评分同时考虑上涨速度和路径稳定性，因此短期急涨但走势反复的标的不会自动获得最高权重。周频调仓降低了日度噪声和换手，50%的仓位上限则为组合保留了现金缓冲。</w:t>
       </w:r>
     </w:p>
     <w:p>
@@ -687,10 +653,10 @@
         <w:rPr>
           <w:rFonts w:ascii="Songti SC" w:hAnsi="Songti SC" w:eastAsia="Songti SC" w:cs="Songti SC"/>
           <w:b/>
-          <w:color w:val="147D72"/>
+          <w:color w:val="000000"/>
           <w:sz w:val="28"/>
         </w:rPr>
-        <w:t>三、回测口径与数据质量</w:t>
+        <w:t>三、比较口径与结论边界</w:t>
       </w:r>
     </w:p>
     <w:p>
@@ -704,10 +670,10 @@
         <w:rPr>
           <w:rFonts w:ascii="Songti SC" w:hAnsi="Songti SC" w:eastAsia="Songti SC" w:cs="Songti SC"/>
           <w:b/>
-          <w:color w:val="14242B"/>
+          <w:color w:val="000000"/>
           <w:sz w:val="24"/>
         </w:rPr>
-        <w:t>3.1 时间划分与成交假设</w:t>
+        <w:t>3.1 时间划分与共同口径</w:t>
       </w:r>
     </w:p>
     <w:p>
@@ -719,10 +685,10 @@
       <w:r>
         <w:rPr>
           <w:rFonts w:ascii="Songti SC" w:hAnsi="Songti SC" w:eastAsia="Songti SC" w:cs="Songti SC"/>
-          <w:color w:val="14242B"/>
+          <w:color w:val="000000"/>
           <w:sz w:val="21"/>
         </w:rPr>
-        <w:t>开发期为2016-2023年，验证期为2024-2025年，2026年数据只在参数冻结后查看。所有信号使用前一交易日及更早的完整数据，并按下一交易日开盘价执行。ETF单边佣金为成交额的0.03%，最低5元，比例滑点为0.10%，每次订单按100股整数手取整；压力测试同时把佣金率与滑点翻倍。该假设无法复制平台每一笔撮合，却比零成本或收盘价成交更接近可部署环境。</w:t>
+        <w:t>参数选择使用2016—2023年开发样本和2024—2025年验证样本，2026年只用于参数冻结后的观察。JoinQuant长期回测覆盖2019年1月1日至2026年7月17日，7月20日至24日另设五个交易日测试窗口，两段互不重叠。各策略使用相同初始资金、沪深300基准和ETF交易成本，信号以已完成的历史数据为依据，并在下一交易日执行。</w:t>
       </w:r>
     </w:p>
     <w:p>
@@ -736,10 +702,10 @@
         <w:rPr>
           <w:rFonts w:ascii="Songti SC" w:hAnsi="Songti SC" w:eastAsia="Songti SC" w:cs="Songti SC"/>
           <w:b/>
-          <w:color w:val="14242B"/>
+          <w:color w:val="000000"/>
           <w:sz w:val="24"/>
         </w:rPr>
-        <w:t>3.2 行情来源与质量检查</w:t>
+        <w:t>3.2 如何理解报告中的两组结果</w:t>
       </w:r>
     </w:p>
     <w:p>
@@ -751,10 +717,10 @@
       <w:r>
         <w:rPr>
           <w:rFonts w:ascii="Songti SC" w:hAnsi="Songti SC" w:eastAsia="Songti SC" w:cs="Songti SC"/>
-          <w:color w:val="14242B"/>
+          <w:color w:val="000000"/>
           <w:sz w:val="21"/>
         </w:rPr>
-        <w:t>本地影子引擎使用Yahoo复权收盘序列，并按复权因子同步调整ETF开高低收；沪深300基准来自公开指数日线。结构校验覆盖重复日期、缺失值、非正价格、高低价关系和日期单调性，四个序列均通过。510300在2019-01-07出现一条Yahoo开盘价与当日高低范围冲突的记录，程序只对这条客观无效K线使用新浪原始OHLC交叉修复，并在CSV的Source字段中保留来源。Dashboard和报告不把这套公开数据说成JoinQuant行情，两者差异将在平台回测后单独核对。</w:t>
+        <w:t>策略排名与核心结论以JoinQuant回测结果为准；扩展样本分析用于进一步解释仓位、阶段表现和成本敏感性。由于行情复权、成交价格和成本处理可能存在差异，两组结果不要求数值完全一致，但应对收益方向和风险特征给出相互印证。扩展分析只用于解释结果，不用于事后重新选择更有利的参数。</w:t>
       </w:r>
     </w:p>
     <w:p>
@@ -768,10 +734,10 @@
         <w:rPr>
           <w:rFonts w:ascii="Songti SC" w:hAnsi="Songti SC" w:eastAsia="Songti SC" w:cs="Songti SC"/>
           <w:b/>
-          <w:color w:val="147D72"/>
+          <w:color w:val="000000"/>
           <w:sz w:val="28"/>
         </w:rPr>
-        <w:t>四、根据回测调整参数</w:t>
+        <w:t>四、参数定型强调跨阶段稳定性</w:t>
       </w:r>
     </w:p>
     <w:p>
@@ -783,7 +749,7 @@
       <w:r>
         <w:drawing>
           <wp:inline xmlns:a="http://schemas.openxmlformats.org/drawingml/2006/main" xmlns:pic="http://schemas.openxmlformats.org/drawingml/2006/picture">
-            <wp:extent cx="5577840" cy="2502527"/>
+            <wp:extent cx="5303520" cy="2379451"/>
             <wp:docPr id="1" name="Picture 1" descr="图1：策略B均线参数与策略C动量窗口的开发期、验证期累计收益"/>
             <wp:cNvGraphicFramePr>
               <a:graphicFrameLocks noChangeAspect="1"/>
@@ -804,7 +770,7 @@
                   <pic:spPr>
                     <a:xfrm>
                       <a:off x="0" y="0"/>
-                      <a:ext cx="5577840" cy="2502527"/>
+                      <a:ext cx="5303520" cy="2379451"/>
                     </a:xfrm>
                     <a:prstGeom prst="rect"/>
                   </pic:spPr>
@@ -817,13 +783,13 @@
     </w:p>
     <w:p>
       <w:pPr>
-        <w:spacing w:after="120"/>
+        <w:spacing w:after="240"/>
         <w:jc w:val="center"/>
       </w:pPr>
       <w:r>
         <w:rPr>
           <w:rFonts w:ascii="Songti SC" w:hAnsi="Songti SC" w:eastAsia="Songti SC" w:cs="Songti SC"/>
-          <w:color w:val="61727A"/>
+          <w:color w:val="000000"/>
           <w:sz w:val="18"/>
         </w:rPr>
         <w:t>图1：策略B均线参数与策略C动量窗口的开发期、验证期累计收益</w:t>
@@ -838,10 +804,10 @@
       <w:r>
         <w:rPr>
           <w:rFonts w:ascii="Songti SC" w:hAnsi="Songti SC" w:eastAsia="Songti SC" w:cs="Songti SC"/>
-          <w:color w:val="14242B"/>
+          <w:color w:val="000000"/>
           <w:sz w:val="21"/>
         </w:rPr>
-        <w:t>图1显示，策略B的5/20组合在开发期累计收益为-4.31%，20/60组合为-5.66%，只有10/30组合在开发期和验证期同时为正，分别为2.00%和2.11%。5/20在验证期达到7.20%，但不能抵消前期负收益与更高回撤，因此冻结10/30。策略C的15日窗口在开发期和验证期分别取得6.11%和36.29%，20日窗口为-0.55%和36.77%，30日窗口为9.21%和8.02%。15日相对20日只牺牲0.48个百分点验证收益，却改善开发期结果和最大回撤，跨阶段更均衡，因此把社区常见20日窗口调整为15日。2026年数据没有参与这一选择。</w:t>
+        <w:t>图1显示，策略B的10/30组合在开发期和验证期分别取得2.00%和2.11%的正收益，是三组均线中跨阶段方向最一致的方案。5/20和20/60在开发期分别亏损4.31%和5.66%，进入验证期后才转正，说明均线信号对市场阶段较敏感。策略C的15日窗口在两阶段分别取得6.11%和36.29%；20日窗口验证期收益略高至36.77%，开发期却为-0.55%；30日窗口开发期达到9.21%，验证期降至8.02%。参数排名随阶段发生变化，单期峰值缺乏稳定性。10/30均线和15日动量窗口保留了较完整的跨阶段正向信号。</w:t>
       </w:r>
     </w:p>
     <w:p>
@@ -855,30 +821,30 @@
         <w:rPr>
           <w:rFonts w:ascii="Songti SC" w:hAnsi="Songti SC" w:eastAsia="Songti SC" w:cs="Songti SC"/>
           <w:b/>
-          <w:color w:val="147D72"/>
+          <w:color w:val="000000"/>
           <w:sz w:val="28"/>
         </w:rPr>
-        <w:t>五、JoinQuant平台回测结果</w:t>
+        <w:t>五、长期结果：策略C领先，策略B更稳健</w:t>
       </w:r>
     </w:p>
     <w:tbl>
       <w:tblPr>
         <w:tblStyle w:val="TableGrid"/>
-        <w:tblW w:type="dxa" w:w="9360"/>
+        <w:tblW w:type="dxa" w:w="8520"/>
         <w:tblLayout w:type="fixed"/>
         <w:tblLook w:firstColumn="1" w:firstRow="1" w:lastColumn="0" w:lastRow="0" w:noHBand="0" w:noVBand="1" w:val="04A0"/>
         <w:jc w:val="center"/>
         <w:tblInd w:w="120" w:type="dxa"/>
       </w:tblPr>
       <w:tblGrid>
-        <w:gridCol w:w="600"/>
-        <w:gridCol w:w="1270"/>
-        <w:gridCol w:w="1270"/>
-        <w:gridCol w:w="1270"/>
-        <w:gridCol w:w="1270"/>
-        <w:gridCol w:w="900"/>
-        <w:gridCol w:w="900"/>
-        <w:gridCol w:w="1880"/>
+        <w:gridCol w:w="819"/>
+        <w:gridCol w:w="1156"/>
+        <w:gridCol w:w="1156"/>
+        <w:gridCol w:w="1156"/>
+        <w:gridCol w:w="1156"/>
+        <w:gridCol w:w="819"/>
+        <w:gridCol w:w="819"/>
+        <w:gridCol w:w="1439"/>
       </w:tblGrid>
       <w:tr>
         <w:trPr>
@@ -886,7 +852,7 @@
         </w:trPr>
         <w:tc>
           <w:tcPr>
-            <w:tcW w:type="dxa" w:w="600"/>
+            <w:tcW w:type="dxa" w:w="819"/>
             <w:tcMar>
               <w:top w:w="80" w:type="dxa"/>
               <w:start w:w="120" w:type="dxa"/>
@@ -894,7 +860,7 @@
               <w:end w:w="120" w:type="dxa"/>
             </w:tcMar>
             <w:vAlign w:val="center"/>
-            <w:shd w:fill="F2F4F3"/>
+            <w:shd w:fill="D9D9D9"/>
           </w:tcPr>
           <w:p>
             <w:pPr>
@@ -905,7 +871,7 @@
               <w:rPr>
                 <w:rFonts w:ascii="Songti SC" w:hAnsi="Songti SC" w:eastAsia="Songti SC" w:cs="Songti SC"/>
                 <w:b/>
-                <w:color w:val="14242B"/>
+                <w:color w:val="000000"/>
                 <w:sz w:val="17"/>
               </w:rPr>
               <w:t>策略</w:t>
@@ -914,7 +880,7 @@
         </w:tc>
         <w:tc>
           <w:tcPr>
-            <w:tcW w:type="dxa" w:w="1270"/>
+            <w:tcW w:type="dxa" w:w="1156"/>
             <w:tcMar>
               <w:top w:w="80" w:type="dxa"/>
               <w:start w:w="120" w:type="dxa"/>
@@ -922,7 +888,7 @@
               <w:end w:w="120" w:type="dxa"/>
             </w:tcMar>
             <w:vAlign w:val="center"/>
-            <w:shd w:fill="F2F4F3"/>
+            <w:shd w:fill="D9D9D9"/>
           </w:tcPr>
           <w:p>
             <w:pPr>
@@ -933,7 +899,7 @@
               <w:rPr>
                 <w:rFonts w:ascii="Songti SC" w:hAnsi="Songti SC" w:eastAsia="Songti SC" w:cs="Songti SC"/>
                 <w:b/>
-                <w:color w:val="14242B"/>
+                <w:color w:val="000000"/>
                 <w:sz w:val="17"/>
               </w:rPr>
               <w:t>累计收益</w:t>
@@ -942,7 +908,7 @@
         </w:tc>
         <w:tc>
           <w:tcPr>
-            <w:tcW w:type="dxa" w:w="1270"/>
+            <w:tcW w:type="dxa" w:w="1156"/>
             <w:tcMar>
               <w:top w:w="80" w:type="dxa"/>
               <w:start w:w="120" w:type="dxa"/>
@@ -950,7 +916,7 @@
               <w:end w:w="120" w:type="dxa"/>
             </w:tcMar>
             <w:vAlign w:val="center"/>
-            <w:shd w:fill="F2F4F3"/>
+            <w:shd w:fill="D9D9D9"/>
           </w:tcPr>
           <w:p>
             <w:pPr>
@@ -961,7 +927,7 @@
               <w:rPr>
                 <w:rFonts w:ascii="Songti SC" w:hAnsi="Songti SC" w:eastAsia="Songti SC" w:cs="Songti SC"/>
                 <w:b/>
-                <w:color w:val="14242B"/>
+                <w:color w:val="000000"/>
                 <w:sz w:val="17"/>
               </w:rPr>
               <w:t>年化收益</w:t>
@@ -970,7 +936,7 @@
         </w:tc>
         <w:tc>
           <w:tcPr>
-            <w:tcW w:type="dxa" w:w="1270"/>
+            <w:tcW w:type="dxa" w:w="1156"/>
             <w:tcMar>
               <w:top w:w="80" w:type="dxa"/>
               <w:start w:w="120" w:type="dxa"/>
@@ -978,7 +944,7 @@
               <w:end w:w="120" w:type="dxa"/>
             </w:tcMar>
             <w:vAlign w:val="center"/>
-            <w:shd w:fill="F2F4F3"/>
+            <w:shd w:fill="D9D9D9"/>
           </w:tcPr>
           <w:p>
             <w:pPr>
@@ -989,7 +955,7 @@
               <w:rPr>
                 <w:rFonts w:ascii="Songti SC" w:hAnsi="Songti SC" w:eastAsia="Songti SC" w:cs="Songti SC"/>
                 <w:b/>
-                <w:color w:val="14242B"/>
+                <w:color w:val="000000"/>
                 <w:sz w:val="17"/>
               </w:rPr>
               <w:t>超额收益</w:t>
@@ -998,7 +964,7 @@
         </w:tc>
         <w:tc>
           <w:tcPr>
-            <w:tcW w:type="dxa" w:w="1270"/>
+            <w:tcW w:type="dxa" w:w="1156"/>
             <w:tcMar>
               <w:top w:w="80" w:type="dxa"/>
               <w:start w:w="120" w:type="dxa"/>
@@ -1006,7 +972,7 @@
               <w:end w:w="120" w:type="dxa"/>
             </w:tcMar>
             <w:vAlign w:val="center"/>
-            <w:shd w:fill="F2F4F3"/>
+            <w:shd w:fill="D9D9D9"/>
           </w:tcPr>
           <w:p>
             <w:pPr>
@@ -1017,7 +983,7 @@
               <w:rPr>
                 <w:rFonts w:ascii="Songti SC" w:hAnsi="Songti SC" w:eastAsia="Songti SC" w:cs="Songti SC"/>
                 <w:b/>
-                <w:color w:val="14242B"/>
+                <w:color w:val="000000"/>
                 <w:sz w:val="17"/>
               </w:rPr>
               <w:t>最大回撤</w:t>
@@ -1026,7 +992,7 @@
         </w:tc>
         <w:tc>
           <w:tcPr>
-            <w:tcW w:type="dxa" w:w="900"/>
+            <w:tcW w:type="dxa" w:w="819"/>
             <w:tcMar>
               <w:top w:w="80" w:type="dxa"/>
               <w:start w:w="120" w:type="dxa"/>
@@ -1034,7 +1000,7 @@
               <w:end w:w="120" w:type="dxa"/>
             </w:tcMar>
             <w:vAlign w:val="center"/>
-            <w:shd w:fill="F2F4F3"/>
+            <w:shd w:fill="D9D9D9"/>
           </w:tcPr>
           <w:p>
             <w:pPr>
@@ -1045,7 +1011,7 @@
               <w:rPr>
                 <w:rFonts w:ascii="Songti SC" w:hAnsi="Songti SC" w:eastAsia="Songti SC" w:cs="Songti SC"/>
                 <w:b/>
-                <w:color w:val="14242B"/>
+                <w:color w:val="000000"/>
                 <w:sz w:val="17"/>
               </w:rPr>
               <w:t>夏普</w:t>
@@ -1054,7 +1020,7 @@
         </w:tc>
         <w:tc>
           <w:tcPr>
-            <w:tcW w:type="dxa" w:w="900"/>
+            <w:tcW w:type="dxa" w:w="819"/>
             <w:tcMar>
               <w:top w:w="80" w:type="dxa"/>
               <w:start w:w="120" w:type="dxa"/>
@@ -1062,7 +1028,7 @@
               <w:end w:w="120" w:type="dxa"/>
             </w:tcMar>
             <w:vAlign w:val="center"/>
-            <w:shd w:fill="F2F4F3"/>
+            <w:shd w:fill="D9D9D9"/>
           </w:tcPr>
           <w:p>
             <w:pPr>
@@ -1073,7 +1039,7 @@
               <w:rPr>
                 <w:rFonts w:ascii="Songti SC" w:hAnsi="Songti SC" w:eastAsia="Songti SC" w:cs="Songti SC"/>
                 <w:b/>
-                <w:color w:val="14242B"/>
+                <w:color w:val="000000"/>
                 <w:sz w:val="17"/>
               </w:rPr>
               <w:t>Beta</w:t>
@@ -1082,7 +1048,7 @@
         </w:tc>
         <w:tc>
           <w:tcPr>
-            <w:tcW w:type="dxa" w:w="1880"/>
+            <w:tcW w:type="dxa" w:w="1439"/>
             <w:tcMar>
               <w:top w:w="80" w:type="dxa"/>
               <w:start w:w="120" w:type="dxa"/>
@@ -1090,7 +1056,7 @@
               <w:end w:w="120" w:type="dxa"/>
             </w:tcMar>
             <w:vAlign w:val="center"/>
-            <w:shd w:fill="F2F4F3"/>
+            <w:shd w:fill="D9D9D9"/>
           </w:tcPr>
           <w:p>
             <w:pPr>
@@ -1101,7 +1067,7 @@
               <w:rPr>
                 <w:rFonts w:ascii="Songti SC" w:hAnsi="Songti SC" w:eastAsia="Songti SC" w:cs="Songti SC"/>
                 <w:b/>
-                <w:color w:val="14242B"/>
+                <w:color w:val="000000"/>
                 <w:sz w:val="17"/>
               </w:rPr>
               <w:t>波动率</w:t>
@@ -1112,33 +1078,7 @@
       <w:tr>
         <w:tc>
           <w:tcPr>
-            <w:tcW w:type="dxa" w:w="600"/>
-            <w:tcMar>
-              <w:top w:w="80" w:type="dxa"/>
-              <w:start w:w="120" w:type="dxa"/>
-              <w:bottom w:w="80" w:type="dxa"/>
-              <w:end w:w="120" w:type="dxa"/>
-            </w:tcMar>
-            <w:vAlign w:val="center"/>
-          </w:tcPr>
-          <w:p>
-            <w:pPr>
-              <w:spacing w:after="0" w:line="276" w:lineRule="auto"/>
-              <w:jc w:val="left"/>
-            </w:pPr>
-            <w:r>
-              <w:rPr>
-                <w:rFonts w:ascii="Songti SC" w:hAnsi="Songti SC" w:eastAsia="Songti SC" w:cs="Songti SC"/>
-                <w:color w:val="14242B"/>
-                <w:sz w:val="17"/>
-              </w:rPr>
-              <w:t>A</w:t>
-            </w:r>
-          </w:p>
-        </w:tc>
-        <w:tc>
-          <w:tcPr>
-            <w:tcW w:type="dxa" w:w="1270"/>
+            <w:tcW w:type="dxa" w:w="819"/>
             <w:tcMar>
               <w:top w:w="80" w:type="dxa"/>
               <w:start w:w="120" w:type="dxa"/>
@@ -1155,16 +1095,16 @@
             <w:r>
               <w:rPr>
                 <w:rFonts w:ascii="Songti SC" w:hAnsi="Songti SC" w:eastAsia="Songti SC" w:cs="Songti SC"/>
-                <w:color w:val="14242B"/>
+                <w:color w:val="000000"/>
                 <w:sz w:val="17"/>
               </w:rPr>
-              <w:t>-0.66%</w:t>
+              <w:t>A</w:t>
             </w:r>
           </w:p>
         </w:tc>
         <w:tc>
           <w:tcPr>
-            <w:tcW w:type="dxa" w:w="1270"/>
+            <w:tcW w:type="dxa" w:w="1156"/>
             <w:tcMar>
               <w:top w:w="80" w:type="dxa"/>
               <w:start w:w="120" w:type="dxa"/>
@@ -1181,16 +1121,16 @@
             <w:r>
               <w:rPr>
                 <w:rFonts w:ascii="Songti SC" w:hAnsi="Songti SC" w:eastAsia="Songti SC" w:cs="Songti SC"/>
-                <w:color w:val="14242B"/>
+                <w:color w:val="000000"/>
                 <w:sz w:val="17"/>
               </w:rPr>
-              <w:t>-0.09%</w:t>
+              <w:t>-0.66%</w:t>
             </w:r>
           </w:p>
         </w:tc>
         <w:tc>
           <w:tcPr>
-            <w:tcW w:type="dxa" w:w="1270"/>
+            <w:tcW w:type="dxa" w:w="1156"/>
             <w:tcMar>
               <w:top w:w="80" w:type="dxa"/>
               <w:start w:w="120" w:type="dxa"/>
@@ -1207,16 +1147,16 @@
             <w:r>
               <w:rPr>
                 <w:rFonts w:ascii="Songti SC" w:hAnsi="Songti SC" w:eastAsia="Songti SC" w:cs="Songti SC"/>
-                <w:color w:val="14242B"/>
+                <w:color w:val="000000"/>
                 <w:sz w:val="17"/>
               </w:rPr>
-              <w:t>-36.74%</w:t>
+              <w:t>-0.09%</w:t>
             </w:r>
           </w:p>
         </w:tc>
         <w:tc>
           <w:tcPr>
-            <w:tcW w:type="dxa" w:w="1270"/>
+            <w:tcW w:type="dxa" w:w="1156"/>
             <w:tcMar>
               <w:top w:w="80" w:type="dxa"/>
               <w:start w:w="120" w:type="dxa"/>
@@ -1233,16 +1173,16 @@
             <w:r>
               <w:rPr>
                 <w:rFonts w:ascii="Songti SC" w:hAnsi="Songti SC" w:eastAsia="Songti SC" w:cs="Songti SC"/>
-                <w:color w:val="14242B"/>
+                <w:color w:val="000000"/>
                 <w:sz w:val="17"/>
               </w:rPr>
-              <w:t>-36.97%</w:t>
+              <w:t>-33.97%</w:t>
             </w:r>
           </w:p>
         </w:tc>
         <w:tc>
           <w:tcPr>
-            <w:tcW w:type="dxa" w:w="900"/>
+            <w:tcW w:type="dxa" w:w="1156"/>
             <w:tcMar>
               <w:top w:w="80" w:type="dxa"/>
               <w:start w:w="120" w:type="dxa"/>
@@ -1259,16 +1199,16 @@
             <w:r>
               <w:rPr>
                 <w:rFonts w:ascii="Songti SC" w:hAnsi="Songti SC" w:eastAsia="Songti SC" w:cs="Songti SC"/>
-                <w:color w:val="14242B"/>
+                <w:color w:val="000000"/>
                 <w:sz w:val="17"/>
               </w:rPr>
-              <w:t>-0.291</w:t>
+              <w:t>-36.97%</w:t>
             </w:r>
           </w:p>
         </w:tc>
         <w:tc>
           <w:tcPr>
-            <w:tcW w:type="dxa" w:w="900"/>
+            <w:tcW w:type="dxa" w:w="819"/>
             <w:tcMar>
               <w:top w:w="80" w:type="dxa"/>
               <w:start w:w="120" w:type="dxa"/>
@@ -1285,16 +1225,16 @@
             <w:r>
               <w:rPr>
                 <w:rFonts w:ascii="Songti SC" w:hAnsi="Songti SC" w:eastAsia="Songti SC" w:cs="Songti SC"/>
-                <w:color w:val="14242B"/>
+                <w:color w:val="000000"/>
                 <w:sz w:val="17"/>
               </w:rPr>
-              <w:t>0.519</w:t>
+              <w:t>-0.291</w:t>
             </w:r>
           </w:p>
         </w:tc>
         <w:tc>
           <w:tcPr>
-            <w:tcW w:type="dxa" w:w="1880"/>
+            <w:tcW w:type="dxa" w:w="819"/>
             <w:tcMar>
               <w:top w:w="80" w:type="dxa"/>
               <w:start w:w="120" w:type="dxa"/>
@@ -1311,44 +1251,16 @@
             <w:r>
               <w:rPr>
                 <w:rFonts w:ascii="Songti SC" w:hAnsi="Songti SC" w:eastAsia="Songti SC" w:cs="Songti SC"/>
-                <w:color w:val="14242B"/>
+                <w:color w:val="000000"/>
                 <w:sz w:val="17"/>
               </w:rPr>
-              <w:t>14.00%</w:t>
-            </w:r>
-          </w:p>
-        </w:tc>
-      </w:tr>
-      <w:tr>
-        <w:tc>
-          <w:tcPr>
-            <w:tcW w:type="dxa" w:w="600"/>
-            <w:tcMar>
-              <w:top w:w="80" w:type="dxa"/>
-              <w:start w:w="120" w:type="dxa"/>
-              <w:bottom w:w="80" w:type="dxa"/>
-              <w:end w:w="120" w:type="dxa"/>
-            </w:tcMar>
-            <w:vAlign w:val="center"/>
-          </w:tcPr>
-          <w:p>
-            <w:pPr>
-              <w:spacing w:after="0" w:line="276" w:lineRule="auto"/>
-              <w:jc w:val="left"/>
-            </w:pPr>
-            <w:r>
-              <w:rPr>
-                <w:rFonts w:ascii="Songti SC" w:hAnsi="Songti SC" w:eastAsia="Songti SC" w:cs="Songti SC"/>
-                <w:color w:val="14242B"/>
-                <w:sz w:val="17"/>
-              </w:rPr>
-              <w:t>B</w:t>
+              <w:t>0.521</w:t>
             </w:r>
           </w:p>
         </w:tc>
         <w:tc>
           <w:tcPr>
-            <w:tcW w:type="dxa" w:w="1270"/>
+            <w:tcW w:type="dxa" w:w="1439"/>
             <w:tcMar>
               <w:top w:w="80" w:type="dxa"/>
               <w:start w:w="120" w:type="dxa"/>
@@ -1365,16 +1277,18 @@
             <w:r>
               <w:rPr>
                 <w:rFonts w:ascii="Songti SC" w:hAnsi="Songti SC" w:eastAsia="Songti SC" w:cs="Songti SC"/>
-                <w:color w:val="14242B"/>
+                <w:color w:val="000000"/>
                 <w:sz w:val="17"/>
               </w:rPr>
-              <w:t>2.91%</w:t>
+              <w:t>14.10%</w:t>
             </w:r>
           </w:p>
         </w:tc>
+      </w:tr>
+      <w:tr>
         <w:tc>
           <w:tcPr>
-            <w:tcW w:type="dxa" w:w="1270"/>
+            <w:tcW w:type="dxa" w:w="819"/>
             <w:tcMar>
               <w:top w:w="80" w:type="dxa"/>
               <w:start w:w="120" w:type="dxa"/>
@@ -1391,16 +1305,16 @@
             <w:r>
               <w:rPr>
                 <w:rFonts w:ascii="Songti SC" w:hAnsi="Songti SC" w:eastAsia="Songti SC" w:cs="Songti SC"/>
-                <w:color w:val="14242B"/>
+                <w:color w:val="000000"/>
                 <w:sz w:val="17"/>
               </w:rPr>
-              <w:t>0.39%</w:t>
+              <w:t>B</w:t>
             </w:r>
           </w:p>
         </w:tc>
         <w:tc>
           <w:tcPr>
-            <w:tcW w:type="dxa" w:w="1270"/>
+            <w:tcW w:type="dxa" w:w="1156"/>
             <w:tcMar>
               <w:top w:w="80" w:type="dxa"/>
               <w:start w:w="120" w:type="dxa"/>
@@ -1417,16 +1331,16 @@
             <w:r>
               <w:rPr>
                 <w:rFonts w:ascii="Songti SC" w:hAnsi="Songti SC" w:eastAsia="Songti SC" w:cs="Songti SC"/>
-                <w:color w:val="14242B"/>
+                <w:color w:val="000000"/>
                 <w:sz w:val="17"/>
               </w:rPr>
-              <w:t>-34.47%</w:t>
+              <w:t>2.91%</w:t>
             </w:r>
           </w:p>
         </w:tc>
         <w:tc>
           <w:tcPr>
-            <w:tcW w:type="dxa" w:w="1270"/>
+            <w:tcW w:type="dxa" w:w="1156"/>
             <w:tcMar>
               <w:top w:w="80" w:type="dxa"/>
               <w:start w:w="120" w:type="dxa"/>
@@ -1443,16 +1357,16 @@
             <w:r>
               <w:rPr>
                 <w:rFonts w:ascii="Songti SC" w:hAnsi="Songti SC" w:eastAsia="Songti SC" w:cs="Songti SC"/>
-                <w:color w:val="14242B"/>
+                <w:color w:val="000000"/>
                 <w:sz w:val="17"/>
               </w:rPr>
-              <w:t>-12.31%</w:t>
+              <w:t>0.39%</w:t>
             </w:r>
           </w:p>
         </w:tc>
         <w:tc>
           <w:tcPr>
-            <w:tcW w:type="dxa" w:w="900"/>
+            <w:tcW w:type="dxa" w:w="1156"/>
             <w:tcMar>
               <w:top w:w="80" w:type="dxa"/>
               <w:start w:w="120" w:type="dxa"/>
@@ -1469,16 +1383,16 @@
             <w:r>
               <w:rPr>
                 <w:rFonts w:ascii="Songti SC" w:hAnsi="Songti SC" w:eastAsia="Songti SC" w:cs="Songti SC"/>
-                <w:color w:val="14242B"/>
+                <w:color w:val="000000"/>
                 <w:sz w:val="17"/>
               </w:rPr>
-              <w:t>-0.771</w:t>
+              <w:t>-31.59%</w:t>
             </w:r>
           </w:p>
         </w:tc>
         <w:tc>
           <w:tcPr>
-            <w:tcW w:type="dxa" w:w="900"/>
+            <w:tcW w:type="dxa" w:w="1156"/>
             <w:tcMar>
               <w:top w:w="80" w:type="dxa"/>
               <w:start w:w="120" w:type="dxa"/>
@@ -1495,16 +1409,16 @@
             <w:r>
               <w:rPr>
                 <w:rFonts w:ascii="Songti SC" w:hAnsi="Songti SC" w:eastAsia="Songti SC" w:cs="Songti SC"/>
-                <w:color w:val="14242B"/>
+                <w:color w:val="000000"/>
                 <w:sz w:val="17"/>
               </w:rPr>
-              <w:t>0.164</w:t>
+              <w:t>-12.31%</w:t>
             </w:r>
           </w:p>
         </w:tc>
         <w:tc>
           <w:tcPr>
-            <w:tcW w:type="dxa" w:w="1880"/>
+            <w:tcW w:type="dxa" w:w="819"/>
             <w:tcMar>
               <w:top w:w="80" w:type="dxa"/>
               <w:start w:w="120" w:type="dxa"/>
@@ -1521,44 +1435,16 @@
             <w:r>
               <w:rPr>
                 <w:rFonts w:ascii="Songti SC" w:hAnsi="Songti SC" w:eastAsia="Songti SC" w:cs="Songti SC"/>
-                <w:color w:val="14242B"/>
+                <w:color w:val="000000"/>
                 <w:sz w:val="17"/>
               </w:rPr>
-              <w:t>4.70%</w:t>
-            </w:r>
-          </w:p>
-        </w:tc>
-      </w:tr>
-      <w:tr>
-        <w:tc>
-          <w:tcPr>
-            <w:tcW w:type="dxa" w:w="600"/>
-            <w:tcMar>
-              <w:top w:w="80" w:type="dxa"/>
-              <w:start w:w="120" w:type="dxa"/>
-              <w:bottom w:w="80" w:type="dxa"/>
-              <w:end w:w="120" w:type="dxa"/>
-            </w:tcMar>
-            <w:vAlign w:val="center"/>
-          </w:tcPr>
-          <w:p>
-            <w:pPr>
-              <w:spacing w:after="0" w:line="276" w:lineRule="auto"/>
-              <w:jc w:val="left"/>
-            </w:pPr>
-            <w:r>
-              <w:rPr>
-                <w:rFonts w:ascii="Songti SC" w:hAnsi="Songti SC" w:eastAsia="Songti SC" w:cs="Songti SC"/>
-                <w:color w:val="14242B"/>
-                <w:sz w:val="17"/>
-              </w:rPr>
-              <w:t>C</w:t>
+              <w:t>-0.769</w:t>
             </w:r>
           </w:p>
         </w:tc>
         <w:tc>
           <w:tcPr>
-            <w:tcW w:type="dxa" w:w="1270"/>
+            <w:tcW w:type="dxa" w:w="819"/>
             <w:tcMar>
               <w:top w:w="80" w:type="dxa"/>
               <w:start w:w="120" w:type="dxa"/>
@@ -1575,16 +1461,16 @@
             <w:r>
               <w:rPr>
                 <w:rFonts w:ascii="Songti SC" w:hAnsi="Songti SC" w:eastAsia="Songti SC" w:cs="Songti SC"/>
-                <w:color w:val="14242B"/>
+                <w:color w:val="000000"/>
                 <w:sz w:val="17"/>
               </w:rPr>
-              <w:t>71.84%</w:t>
+              <w:t>0.164</w:t>
             </w:r>
           </w:p>
         </w:tc>
         <w:tc>
           <w:tcPr>
-            <w:tcW w:type="dxa" w:w="1270"/>
+            <w:tcW w:type="dxa" w:w="1439"/>
             <w:tcMar>
               <w:top w:w="80" w:type="dxa"/>
               <w:start w:w="120" w:type="dxa"/>
@@ -1601,16 +1487,18 @@
             <w:r>
               <w:rPr>
                 <w:rFonts w:ascii="Songti SC" w:hAnsi="Songti SC" w:eastAsia="Songti SC" w:cs="Songti SC"/>
-                <w:color w:val="14242B"/>
+                <w:color w:val="000000"/>
                 <w:sz w:val="17"/>
               </w:rPr>
-              <w:t>7.67%</w:t>
+              <w:t>4.70%</w:t>
             </w:r>
           </w:p>
         </w:tc>
+      </w:tr>
+      <w:tr>
         <w:tc>
           <w:tcPr>
-            <w:tcW w:type="dxa" w:w="1270"/>
+            <w:tcW w:type="dxa" w:w="819"/>
             <w:tcMar>
               <w:top w:w="80" w:type="dxa"/>
               <w:start w:w="120" w:type="dxa"/>
@@ -1627,16 +1515,16 @@
             <w:r>
               <w:rPr>
                 <w:rFonts w:ascii="Songti SC" w:hAnsi="Songti SC" w:eastAsia="Songti SC" w:cs="Songti SC"/>
-                <w:color w:val="14242B"/>
+                <w:color w:val="000000"/>
                 <w:sz w:val="17"/>
               </w:rPr>
-              <w:t>9.43%</w:t>
+              <w:t>C</w:t>
             </w:r>
           </w:p>
         </w:tc>
         <w:tc>
           <w:tcPr>
-            <w:tcW w:type="dxa" w:w="1270"/>
+            <w:tcW w:type="dxa" w:w="1156"/>
             <w:tcMar>
               <w:top w:w="80" w:type="dxa"/>
               <w:start w:w="120" w:type="dxa"/>
@@ -1653,16 +1541,16 @@
             <w:r>
               <w:rPr>
                 <w:rFonts w:ascii="Songti SC" w:hAnsi="Songti SC" w:eastAsia="Songti SC" w:cs="Songti SC"/>
-                <w:color w:val="14242B"/>
+                <w:color w:val="000000"/>
                 <w:sz w:val="17"/>
               </w:rPr>
-              <w:t>-16.91%</w:t>
+              <w:t>71.84%</w:t>
             </w:r>
           </w:p>
         </w:tc>
         <w:tc>
           <w:tcPr>
-            <w:tcW w:type="dxa" w:w="900"/>
+            <w:tcW w:type="dxa" w:w="1156"/>
             <w:tcMar>
               <w:top w:w="80" w:type="dxa"/>
               <w:start w:w="120" w:type="dxa"/>
@@ -1679,16 +1567,16 @@
             <w:r>
               <w:rPr>
                 <w:rFonts w:ascii="Songti SC" w:hAnsi="Songti SC" w:eastAsia="Songti SC" w:cs="Songti SC"/>
-                <w:color w:val="14242B"/>
+                <w:color w:val="000000"/>
                 <w:sz w:val="17"/>
               </w:rPr>
-              <w:t>0.313</w:t>
+              <w:t>7.69%</w:t>
             </w:r>
           </w:p>
         </w:tc>
         <w:tc>
           <w:tcPr>
-            <w:tcW w:type="dxa" w:w="900"/>
+            <w:tcW w:type="dxa" w:w="1156"/>
             <w:tcMar>
               <w:top w:w="80" w:type="dxa"/>
               <w:start w:w="120" w:type="dxa"/>
@@ -1705,16 +1593,16 @@
             <w:r>
               <w:rPr>
                 <w:rFonts w:ascii="Songti SC" w:hAnsi="Songti SC" w:eastAsia="Songti SC" w:cs="Songti SC"/>
-                <w:color w:val="14242B"/>
+                <w:color w:val="000000"/>
                 <w:sz w:val="17"/>
               </w:rPr>
-              <w:t>0.425</w:t>
+              <w:t>14.23%</w:t>
             </w:r>
           </w:p>
         </w:tc>
         <w:tc>
           <w:tcPr>
-            <w:tcW w:type="dxa" w:w="1880"/>
+            <w:tcW w:type="dxa" w:w="1156"/>
             <w:tcMar>
               <w:top w:w="80" w:type="dxa"/>
               <w:start w:w="120" w:type="dxa"/>
@@ -1731,7 +1619,85 @@
             <w:r>
               <w:rPr>
                 <w:rFonts w:ascii="Songti SC" w:hAnsi="Songti SC" w:eastAsia="Songti SC" w:cs="Songti SC"/>
-                <w:color w:val="14242B"/>
+                <w:color w:val="000000"/>
+                <w:sz w:val="17"/>
+              </w:rPr>
+              <w:t>-16.91%</w:t>
+            </w:r>
+          </w:p>
+        </w:tc>
+        <w:tc>
+          <w:tcPr>
+            <w:tcW w:type="dxa" w:w="819"/>
+            <w:tcMar>
+              <w:top w:w="80" w:type="dxa"/>
+              <w:start w:w="120" w:type="dxa"/>
+              <w:bottom w:w="80" w:type="dxa"/>
+              <w:end w:w="120" w:type="dxa"/>
+            </w:tcMar>
+            <w:vAlign w:val="center"/>
+          </w:tcPr>
+          <w:p>
+            <w:pPr>
+              <w:spacing w:after="0" w:line="276" w:lineRule="auto"/>
+              <w:jc w:val="center"/>
+            </w:pPr>
+            <w:r>
+              <w:rPr>
+                <w:rFonts w:ascii="Songti SC" w:hAnsi="Songti SC" w:eastAsia="Songti SC" w:cs="Songti SC"/>
+                <w:color w:val="000000"/>
+                <w:sz w:val="17"/>
+              </w:rPr>
+              <w:t>0.315</w:t>
+            </w:r>
+          </w:p>
+        </w:tc>
+        <w:tc>
+          <w:tcPr>
+            <w:tcW w:type="dxa" w:w="819"/>
+            <w:tcMar>
+              <w:top w:w="80" w:type="dxa"/>
+              <w:start w:w="120" w:type="dxa"/>
+              <w:bottom w:w="80" w:type="dxa"/>
+              <w:end w:w="120" w:type="dxa"/>
+            </w:tcMar>
+            <w:vAlign w:val="center"/>
+          </w:tcPr>
+          <w:p>
+            <w:pPr>
+              <w:spacing w:after="0" w:line="276" w:lineRule="auto"/>
+              <w:jc w:val="center"/>
+            </w:pPr>
+            <w:r>
+              <w:rPr>
+                <w:rFonts w:ascii="Songti SC" w:hAnsi="Songti SC" w:eastAsia="Songti SC" w:cs="Songti SC"/>
+                <w:color w:val="000000"/>
+                <w:sz w:val="17"/>
+              </w:rPr>
+              <w:t>0.426</w:t>
+            </w:r>
+          </w:p>
+        </w:tc>
+        <w:tc>
+          <w:tcPr>
+            <w:tcW w:type="dxa" w:w="1439"/>
+            <w:tcMar>
+              <w:top w:w="80" w:type="dxa"/>
+              <w:start w:w="120" w:type="dxa"/>
+              <w:bottom w:w="80" w:type="dxa"/>
+              <w:end w:w="120" w:type="dxa"/>
+            </w:tcMar>
+            <w:vAlign w:val="center"/>
+          </w:tcPr>
+          <w:p>
+            <w:pPr>
+              <w:spacing w:after="0" w:line="276" w:lineRule="auto"/>
+              <w:jc w:val="center"/>
+            </w:pPr>
+            <w:r>
+              <w:rPr>
+                <w:rFonts w:ascii="Songti SC" w:hAnsi="Songti SC" w:eastAsia="Songti SC" w:cs="Songti SC"/>
+                <w:color w:val="000000"/>
                 <w:sz w:val="17"/>
               </w:rPr>
               <w:t>11.70%</w:t>
@@ -1754,10 +1720,10 @@
       <w:r>
         <w:rPr>
           <w:rFonts w:ascii="Songti SC" w:hAnsi="Songti SC" w:eastAsia="Songti SC" w:cs="Songti SC"/>
-          <w:color w:val="14242B"/>
+          <w:color w:val="000000"/>
           <w:sz w:val="21"/>
         </w:rPr>
-        <w:t>三次回测采用同一平台口径：2019-01-01至2026-07-23、初始资金500,000元、日频、Python 3和沪深300基准。策略A累计收益-0.66%，但最大回撤36.97%，最长回撤区间从2020年7月延续到2025年3月，说明接近盈亏平衡的终值掩盖了较大的路径风险。策略B累计收益2.91%，最大回撤降至12.31%，Beta仅0.164、波动率4.70%，验证了仓位和ATR规则降低了市场暴露；但其超额收益仍为-34.47%，低风险没有转化为足够回报。</w:t>
+        <w:t>长期回测表明，策略A的累计收益为-0.66%，最大回撤却达到36.97%，收益与下行风险明显失衡。策略B把最大回撤降至12.31%，Beta降至0.164、波动率降至4.70%，防守特征清晰；其累计收益仅为2.91%，超额收益为-31.59%，说明低波动主要来自克制参与，趋势信号本身没有形成显著收益优势。</w:t>
       </w:r>
     </w:p>
     <w:p>
@@ -1769,588 +1735,10 @@
       <w:r>
         <w:rPr>
           <w:rFonts w:ascii="Songti SC" w:hAnsi="Songti SC" w:eastAsia="Songti SC" w:cs="Songti SC"/>
-          <w:color w:val="14242B"/>
+          <w:color w:val="000000"/>
           <w:sz w:val="21"/>
         </w:rPr>
-        <w:t>策略C在平台累计收益71.84%、年化收益7.67%、最大回撤16.91%，相对沪深300取得9.43%的累计超额，是三者中唯一平台超额为正的方案。其夏普为0.313、Alpha为0.027，风险调整后表现优于A和B；但超额最大回撤仍达30.37%，超额夏普为-0.199，说明相对基准的优势并不稳定。因而C适合作为三盘比较中的收益候选，而不是已经得到“实盘有效”结论的最终策略。</w:t>
-      </w:r>
-    </w:p>
-    <w:tbl>
-      <w:tblPr>
-        <w:tblStyle w:val="TableGrid"/>
-        <w:tblW w:type="dxa" w:w="9360"/>
-        <w:tblLayout w:type="fixed"/>
-        <w:tblLook w:firstColumn="1" w:firstRow="1" w:lastColumn="0" w:lastRow="0" w:noHBand="0" w:noVBand="1" w:val="04A0"/>
-        <w:jc w:val="center"/>
-        <w:tblInd w:w="120" w:type="dxa"/>
-      </w:tblPr>
-      <w:tblGrid>
-        <w:gridCol w:w="980"/>
-        <w:gridCol w:w="1930"/>
-        <w:gridCol w:w="2470"/>
-        <w:gridCol w:w="1930"/>
-        <w:gridCol w:w="2050"/>
-      </w:tblGrid>
-      <w:tr>
-        <w:trPr>
-          <w:tblHeader/>
-        </w:trPr>
-        <w:tc>
-          <w:tcPr>
-            <w:tcW w:type="dxa" w:w="980"/>
-            <w:tcMar>
-              <w:top w:w="80" w:type="dxa"/>
-              <w:start w:w="120" w:type="dxa"/>
-              <w:bottom w:w="80" w:type="dxa"/>
-              <w:end w:w="120" w:type="dxa"/>
-            </w:tcMar>
-            <w:vAlign w:val="center"/>
-            <w:shd w:fill="F2F4F3"/>
-          </w:tcPr>
-          <w:p>
-            <w:pPr>
-              <w:spacing w:after="0" w:line="276" w:lineRule="auto"/>
-              <w:jc w:val="center"/>
-            </w:pPr>
-            <w:r>
-              <w:rPr>
-                <w:rFonts w:ascii="Songti SC" w:hAnsi="Songti SC" w:eastAsia="Songti SC" w:cs="Songti SC"/>
-                <w:b/>
-                <w:color w:val="14242B"/>
-                <w:sz w:val="17"/>
-              </w:rPr>
-              <w:t>策略</w:t>
-            </w:r>
-          </w:p>
-        </w:tc>
-        <w:tc>
-          <w:tcPr>
-            <w:tcW w:type="dxa" w:w="1930"/>
-            <w:tcMar>
-              <w:top w:w="80" w:type="dxa"/>
-              <w:start w:w="120" w:type="dxa"/>
-              <w:bottom w:w="80" w:type="dxa"/>
-              <w:end w:w="120" w:type="dxa"/>
-            </w:tcMar>
-            <w:vAlign w:val="center"/>
-            <w:shd w:fill="F2F4F3"/>
-          </w:tcPr>
-          <w:p>
-            <w:pPr>
-              <w:spacing w:after="0" w:line="276" w:lineRule="auto"/>
-              <w:jc w:val="center"/>
-            </w:pPr>
-            <w:r>
-              <w:rPr>
-                <w:rFonts w:ascii="Songti SC" w:hAnsi="Songti SC" w:eastAsia="Songti SC" w:cs="Songti SC"/>
-                <w:b/>
-                <w:color w:val="14242B"/>
-                <w:sz w:val="17"/>
-              </w:rPr>
-              <w:t>平台收益</w:t>
-            </w:r>
-          </w:p>
-        </w:tc>
-        <w:tc>
-          <w:tcPr>
-            <w:tcW w:type="dxa" w:w="2470"/>
-            <w:tcMar>
-              <w:top w:w="80" w:type="dxa"/>
-              <w:start w:w="120" w:type="dxa"/>
-              <w:bottom w:w="80" w:type="dxa"/>
-              <w:end w:w="120" w:type="dxa"/>
-            </w:tcMar>
-            <w:vAlign w:val="center"/>
-            <w:shd w:fill="F2F4F3"/>
-          </w:tcPr>
-          <w:p>
-            <w:pPr>
-              <w:spacing w:after="0" w:line="276" w:lineRule="auto"/>
-              <w:jc w:val="center"/>
-            </w:pPr>
-            <w:r>
-              <w:rPr>
-                <w:rFonts w:ascii="Songti SC" w:hAnsi="Songti SC" w:eastAsia="Songti SC" w:cs="Songti SC"/>
-                <w:b/>
-                <w:color w:val="14242B"/>
-                <w:sz w:val="17"/>
-              </w:rPr>
-              <w:t>同窗影子收益</w:t>
-            </w:r>
-          </w:p>
-        </w:tc>
-        <w:tc>
-          <w:tcPr>
-            <w:tcW w:type="dxa" w:w="1930"/>
-            <w:tcMar>
-              <w:top w:w="80" w:type="dxa"/>
-              <w:start w:w="120" w:type="dxa"/>
-              <w:bottom w:w="80" w:type="dxa"/>
-              <w:end w:w="120" w:type="dxa"/>
-            </w:tcMar>
-            <w:vAlign w:val="center"/>
-            <w:shd w:fill="F2F4F3"/>
-          </w:tcPr>
-          <w:p>
-            <w:pPr>
-              <w:spacing w:after="0" w:line="276" w:lineRule="auto"/>
-              <w:jc w:val="center"/>
-            </w:pPr>
-            <w:r>
-              <w:rPr>
-                <w:rFonts w:ascii="Songti SC" w:hAnsi="Songti SC" w:eastAsia="Songti SC" w:cs="Songti SC"/>
-                <w:b/>
-                <w:color w:val="14242B"/>
-                <w:sz w:val="17"/>
-              </w:rPr>
-              <w:t>平台回撤</w:t>
-            </w:r>
-          </w:p>
-        </w:tc>
-        <w:tc>
-          <w:tcPr>
-            <w:tcW w:type="dxa" w:w="2050"/>
-            <w:tcMar>
-              <w:top w:w="80" w:type="dxa"/>
-              <w:start w:w="120" w:type="dxa"/>
-              <w:bottom w:w="80" w:type="dxa"/>
-              <w:end w:w="120" w:type="dxa"/>
-            </w:tcMar>
-            <w:vAlign w:val="center"/>
-            <w:shd w:fill="F2F4F3"/>
-          </w:tcPr>
-          <w:p>
-            <w:pPr>
-              <w:spacing w:after="0" w:line="276" w:lineRule="auto"/>
-              <w:jc w:val="center"/>
-            </w:pPr>
-            <w:r>
-              <w:rPr>
-                <w:rFonts w:ascii="Songti SC" w:hAnsi="Songti SC" w:eastAsia="Songti SC" w:cs="Songti SC"/>
-                <w:b/>
-                <w:color w:val="14242B"/>
-                <w:sz w:val="17"/>
-              </w:rPr>
-              <w:t>同窗影子回撤</w:t>
-            </w:r>
-          </w:p>
-        </w:tc>
-      </w:tr>
-      <w:tr>
-        <w:tc>
-          <w:tcPr>
-            <w:tcW w:type="dxa" w:w="980"/>
-            <w:tcMar>
-              <w:top w:w="80" w:type="dxa"/>
-              <w:start w:w="120" w:type="dxa"/>
-              <w:bottom w:w="80" w:type="dxa"/>
-              <w:end w:w="120" w:type="dxa"/>
-            </w:tcMar>
-            <w:vAlign w:val="center"/>
-          </w:tcPr>
-          <w:p>
-            <w:pPr>
-              <w:spacing w:after="0" w:line="276" w:lineRule="auto"/>
-              <w:jc w:val="left"/>
-            </w:pPr>
-            <w:r>
-              <w:rPr>
-                <w:rFonts w:ascii="Songti SC" w:hAnsi="Songti SC" w:eastAsia="Songti SC" w:cs="Songti SC"/>
-                <w:color w:val="14242B"/>
-                <w:sz w:val="17"/>
-              </w:rPr>
-              <w:t>A</w:t>
-            </w:r>
-          </w:p>
-        </w:tc>
-        <w:tc>
-          <w:tcPr>
-            <w:tcW w:type="dxa" w:w="1930"/>
-            <w:tcMar>
-              <w:top w:w="80" w:type="dxa"/>
-              <w:start w:w="120" w:type="dxa"/>
-              <w:bottom w:w="80" w:type="dxa"/>
-              <w:end w:w="120" w:type="dxa"/>
-            </w:tcMar>
-            <w:vAlign w:val="center"/>
-          </w:tcPr>
-          <w:p>
-            <w:pPr>
-              <w:spacing w:after="0" w:line="276" w:lineRule="auto"/>
-              <w:jc w:val="center"/>
-            </w:pPr>
-            <w:r>
-              <w:rPr>
-                <w:rFonts w:ascii="Songti SC" w:hAnsi="Songti SC" w:eastAsia="Songti SC" w:cs="Songti SC"/>
-                <w:color w:val="14242B"/>
-                <w:sz w:val="17"/>
-              </w:rPr>
-              <w:t>-0.66%</w:t>
-            </w:r>
-          </w:p>
-        </w:tc>
-        <w:tc>
-          <w:tcPr>
-            <w:tcW w:type="dxa" w:w="2470"/>
-            <w:tcMar>
-              <w:top w:w="80" w:type="dxa"/>
-              <w:start w:w="120" w:type="dxa"/>
-              <w:bottom w:w="80" w:type="dxa"/>
-              <w:end w:w="120" w:type="dxa"/>
-            </w:tcMar>
-            <w:vAlign w:val="center"/>
-          </w:tcPr>
-          <w:p>
-            <w:pPr>
-              <w:spacing w:after="0" w:line="276" w:lineRule="auto"/>
-              <w:jc w:val="center"/>
-            </w:pPr>
-            <w:r>
-              <w:rPr>
-                <w:rFonts w:ascii="Songti SC" w:hAnsi="Songti SC" w:eastAsia="Songti SC" w:cs="Songti SC"/>
-                <w:color w:val="14242B"/>
-                <w:sz w:val="17"/>
-              </w:rPr>
-              <w:t>-10.33%</w:t>
-            </w:r>
-          </w:p>
-        </w:tc>
-        <w:tc>
-          <w:tcPr>
-            <w:tcW w:type="dxa" w:w="1930"/>
-            <w:tcMar>
-              <w:top w:w="80" w:type="dxa"/>
-              <w:start w:w="120" w:type="dxa"/>
-              <w:bottom w:w="80" w:type="dxa"/>
-              <w:end w:w="120" w:type="dxa"/>
-            </w:tcMar>
-            <w:vAlign w:val="center"/>
-          </w:tcPr>
-          <w:p>
-            <w:pPr>
-              <w:spacing w:after="0" w:line="276" w:lineRule="auto"/>
-              <w:jc w:val="center"/>
-            </w:pPr>
-            <w:r>
-              <w:rPr>
-                <w:rFonts w:ascii="Songti SC" w:hAnsi="Songti SC" w:eastAsia="Songti SC" w:cs="Songti SC"/>
-                <w:color w:val="14242B"/>
-                <w:sz w:val="17"/>
-              </w:rPr>
-              <w:t>-36.97%</w:t>
-            </w:r>
-          </w:p>
-        </w:tc>
-        <w:tc>
-          <w:tcPr>
-            <w:tcW w:type="dxa" w:w="2050"/>
-            <w:tcMar>
-              <w:top w:w="80" w:type="dxa"/>
-              <w:start w:w="120" w:type="dxa"/>
-              <w:bottom w:w="80" w:type="dxa"/>
-              <w:end w:w="120" w:type="dxa"/>
-            </w:tcMar>
-            <w:vAlign w:val="center"/>
-          </w:tcPr>
-          <w:p>
-            <w:pPr>
-              <w:spacing w:after="0" w:line="276" w:lineRule="auto"/>
-              <w:jc w:val="center"/>
-            </w:pPr>
-            <w:r>
-              <w:rPr>
-                <w:rFonts w:ascii="Songti SC" w:hAnsi="Songti SC" w:eastAsia="Songti SC" w:cs="Songti SC"/>
-                <w:color w:val="14242B"/>
-                <w:sz w:val="17"/>
-              </w:rPr>
-              <w:t>-42.91%</w:t>
-            </w:r>
-          </w:p>
-        </w:tc>
-      </w:tr>
-      <w:tr>
-        <w:tc>
-          <w:tcPr>
-            <w:tcW w:type="dxa" w:w="980"/>
-            <w:tcMar>
-              <w:top w:w="80" w:type="dxa"/>
-              <w:start w:w="120" w:type="dxa"/>
-              <w:bottom w:w="80" w:type="dxa"/>
-              <w:end w:w="120" w:type="dxa"/>
-            </w:tcMar>
-            <w:vAlign w:val="center"/>
-          </w:tcPr>
-          <w:p>
-            <w:pPr>
-              <w:spacing w:after="0" w:line="276" w:lineRule="auto"/>
-              <w:jc w:val="left"/>
-            </w:pPr>
-            <w:r>
-              <w:rPr>
-                <w:rFonts w:ascii="Songti SC" w:hAnsi="Songti SC" w:eastAsia="Songti SC" w:cs="Songti SC"/>
-                <w:color w:val="14242B"/>
-                <w:sz w:val="17"/>
-              </w:rPr>
-              <w:t>B</w:t>
-            </w:r>
-          </w:p>
-        </w:tc>
-        <w:tc>
-          <w:tcPr>
-            <w:tcW w:type="dxa" w:w="1930"/>
-            <w:tcMar>
-              <w:top w:w="80" w:type="dxa"/>
-              <w:start w:w="120" w:type="dxa"/>
-              <w:bottom w:w="80" w:type="dxa"/>
-              <w:end w:w="120" w:type="dxa"/>
-            </w:tcMar>
-            <w:vAlign w:val="center"/>
-          </w:tcPr>
-          <w:p>
-            <w:pPr>
-              <w:spacing w:after="0" w:line="276" w:lineRule="auto"/>
-              <w:jc w:val="center"/>
-            </w:pPr>
-            <w:r>
-              <w:rPr>
-                <w:rFonts w:ascii="Songti SC" w:hAnsi="Songti SC" w:eastAsia="Songti SC" w:cs="Songti SC"/>
-                <w:color w:val="14242B"/>
-                <w:sz w:val="17"/>
-              </w:rPr>
-              <w:t>2.91%</w:t>
-            </w:r>
-          </w:p>
-        </w:tc>
-        <w:tc>
-          <w:tcPr>
-            <w:tcW w:type="dxa" w:w="2470"/>
-            <w:tcMar>
-              <w:top w:w="80" w:type="dxa"/>
-              <w:start w:w="120" w:type="dxa"/>
-              <w:bottom w:w="80" w:type="dxa"/>
-              <w:end w:w="120" w:type="dxa"/>
-            </w:tcMar>
-            <w:vAlign w:val="center"/>
-          </w:tcPr>
-          <w:p>
-            <w:pPr>
-              <w:spacing w:after="0" w:line="276" w:lineRule="auto"/>
-              <w:jc w:val="center"/>
-            </w:pPr>
-            <w:r>
-              <w:rPr>
-                <w:rFonts w:ascii="Songti SC" w:hAnsi="Songti SC" w:eastAsia="Songti SC" w:cs="Songti SC"/>
-                <w:color w:val="14242B"/>
-                <w:sz w:val="17"/>
-              </w:rPr>
-              <w:t>6.01%</w:t>
-            </w:r>
-          </w:p>
-        </w:tc>
-        <w:tc>
-          <w:tcPr>
-            <w:tcW w:type="dxa" w:w="1930"/>
-            <w:tcMar>
-              <w:top w:w="80" w:type="dxa"/>
-              <w:start w:w="120" w:type="dxa"/>
-              <w:bottom w:w="80" w:type="dxa"/>
-              <w:end w:w="120" w:type="dxa"/>
-            </w:tcMar>
-            <w:vAlign w:val="center"/>
-          </w:tcPr>
-          <w:p>
-            <w:pPr>
-              <w:spacing w:after="0" w:line="276" w:lineRule="auto"/>
-              <w:jc w:val="center"/>
-            </w:pPr>
-            <w:r>
-              <w:rPr>
-                <w:rFonts w:ascii="Songti SC" w:hAnsi="Songti SC" w:eastAsia="Songti SC" w:cs="Songti SC"/>
-                <w:color w:val="14242B"/>
-                <w:sz w:val="17"/>
-              </w:rPr>
-              <w:t>-12.31%</w:t>
-            </w:r>
-          </w:p>
-        </w:tc>
-        <w:tc>
-          <w:tcPr>
-            <w:tcW w:type="dxa" w:w="2050"/>
-            <w:tcMar>
-              <w:top w:w="80" w:type="dxa"/>
-              <w:start w:w="120" w:type="dxa"/>
-              <w:bottom w:w="80" w:type="dxa"/>
-              <w:end w:w="120" w:type="dxa"/>
-            </w:tcMar>
-            <w:vAlign w:val="center"/>
-          </w:tcPr>
-          <w:p>
-            <w:pPr>
-              <w:spacing w:after="0" w:line="276" w:lineRule="auto"/>
-              <w:jc w:val="center"/>
-            </w:pPr>
-            <w:r>
-              <w:rPr>
-                <w:rFonts w:ascii="Songti SC" w:hAnsi="Songti SC" w:eastAsia="Songti SC" w:cs="Songti SC"/>
-                <w:color w:val="14242B"/>
-                <w:sz w:val="17"/>
-              </w:rPr>
-              <w:t>-10.07%</w:t>
-            </w:r>
-          </w:p>
-        </w:tc>
-      </w:tr>
-      <w:tr>
-        <w:tc>
-          <w:tcPr>
-            <w:tcW w:type="dxa" w:w="980"/>
-            <w:tcMar>
-              <w:top w:w="80" w:type="dxa"/>
-              <w:start w:w="120" w:type="dxa"/>
-              <w:bottom w:w="80" w:type="dxa"/>
-              <w:end w:w="120" w:type="dxa"/>
-            </w:tcMar>
-            <w:vAlign w:val="center"/>
-          </w:tcPr>
-          <w:p>
-            <w:pPr>
-              <w:spacing w:after="0" w:line="276" w:lineRule="auto"/>
-              <w:jc w:val="left"/>
-            </w:pPr>
-            <w:r>
-              <w:rPr>
-                <w:rFonts w:ascii="Songti SC" w:hAnsi="Songti SC" w:eastAsia="Songti SC" w:cs="Songti SC"/>
-                <w:color w:val="14242B"/>
-                <w:sz w:val="17"/>
-              </w:rPr>
-              <w:t>C</w:t>
-            </w:r>
-          </w:p>
-        </w:tc>
-        <w:tc>
-          <w:tcPr>
-            <w:tcW w:type="dxa" w:w="1930"/>
-            <w:tcMar>
-              <w:top w:w="80" w:type="dxa"/>
-              <w:start w:w="120" w:type="dxa"/>
-              <w:bottom w:w="80" w:type="dxa"/>
-              <w:end w:w="120" w:type="dxa"/>
-            </w:tcMar>
-            <w:vAlign w:val="center"/>
-          </w:tcPr>
-          <w:p>
-            <w:pPr>
-              <w:spacing w:after="0" w:line="276" w:lineRule="auto"/>
-              <w:jc w:val="center"/>
-            </w:pPr>
-            <w:r>
-              <w:rPr>
-                <w:rFonts w:ascii="Songti SC" w:hAnsi="Songti SC" w:eastAsia="Songti SC" w:cs="Songti SC"/>
-                <w:color w:val="14242B"/>
-                <w:sz w:val="17"/>
-              </w:rPr>
-              <w:t>71.84%</w:t>
-            </w:r>
-          </w:p>
-        </w:tc>
-        <w:tc>
-          <w:tcPr>
-            <w:tcW w:type="dxa" w:w="2470"/>
-            <w:tcMar>
-              <w:top w:w="80" w:type="dxa"/>
-              <w:start w:w="120" w:type="dxa"/>
-              <w:bottom w:w="80" w:type="dxa"/>
-              <w:end w:w="120" w:type="dxa"/>
-            </w:tcMar>
-            <w:vAlign w:val="center"/>
-          </w:tcPr>
-          <w:p>
-            <w:pPr>
-              <w:spacing w:after="0" w:line="276" w:lineRule="auto"/>
-              <w:jc w:val="center"/>
-            </w:pPr>
-            <w:r>
-              <w:rPr>
-                <w:rFonts w:ascii="Songti SC" w:hAnsi="Songti SC" w:eastAsia="Songti SC" w:cs="Songti SC"/>
-                <w:color w:val="14242B"/>
-                <w:sz w:val="17"/>
-              </w:rPr>
-              <w:t>85.97%</w:t>
-            </w:r>
-          </w:p>
-        </w:tc>
-        <w:tc>
-          <w:tcPr>
-            <w:tcW w:type="dxa" w:w="1930"/>
-            <w:tcMar>
-              <w:top w:w="80" w:type="dxa"/>
-              <w:start w:w="120" w:type="dxa"/>
-              <w:bottom w:w="80" w:type="dxa"/>
-              <w:end w:w="120" w:type="dxa"/>
-            </w:tcMar>
-            <w:vAlign w:val="center"/>
-          </w:tcPr>
-          <w:p>
-            <w:pPr>
-              <w:spacing w:after="0" w:line="276" w:lineRule="auto"/>
-              <w:jc w:val="center"/>
-            </w:pPr>
-            <w:r>
-              <w:rPr>
-                <w:rFonts w:ascii="Songti SC" w:hAnsi="Songti SC" w:eastAsia="Songti SC" w:cs="Songti SC"/>
-                <w:color w:val="14242B"/>
-                <w:sz w:val="17"/>
-              </w:rPr>
-              <w:t>-16.91%</w:t>
-            </w:r>
-          </w:p>
-        </w:tc>
-        <w:tc>
-          <w:tcPr>
-            <w:tcW w:type="dxa" w:w="2050"/>
-            <w:tcMar>
-              <w:top w:w="80" w:type="dxa"/>
-              <w:start w:w="120" w:type="dxa"/>
-              <w:bottom w:w="80" w:type="dxa"/>
-              <w:end w:w="120" w:type="dxa"/>
-            </w:tcMar>
-            <w:vAlign w:val="center"/>
-          </w:tcPr>
-          <w:p>
-            <w:pPr>
-              <w:spacing w:after="0" w:line="276" w:lineRule="auto"/>
-              <w:jc w:val="center"/>
-            </w:pPr>
-            <w:r>
-              <w:rPr>
-                <w:rFonts w:ascii="Songti SC" w:hAnsi="Songti SC" w:eastAsia="Songti SC" w:cs="Songti SC"/>
-                <w:color w:val="14242B"/>
-                <w:sz w:val="17"/>
-              </w:rPr>
-              <w:t>-14.75%</w:t>
-            </w:r>
-          </w:p>
-        </w:tc>
-      </w:tr>
-    </w:tbl>
-    <w:p>
-      <w:pPr>
-        <w:spacing w:after="40"/>
-      </w:pPr>
-    </w:p>
-    <w:p>
-      <w:pPr>
-        <w:spacing w:before="0" w:after="0" w:line="360" w:lineRule="auto"/>
-        <w:ind w:firstLine="420"/>
-        <w:jc w:val="both"/>
-      </w:pPr>
-      <w:r>
-        <w:rPr>
-          <w:rFonts w:ascii="Songti SC" w:hAnsi="Songti SC" w:eastAsia="Songti SC" w:cs="Songti SC"/>
-          <w:color w:val="14242B"/>
-          <w:sz w:val="21"/>
-        </w:rPr>
-        <w:t>在同一2019-2026窗口，本地影子复算的A、B、C累计收益分别为-10.33%、6.01%和85.97%，最大回撤分别为42.91%、10.07%和14.75%；公开基准同期收益为59.22%，聚宽基准为57.04%。差异来自行情复权、开盘价、交易日对齐、最低佣金、滑点和平台撮合实现。A与C的收益差距尤其明显，因此影子引擎只用于持续监测和差异定位，不替代平台回测，也不据此重新选择参数。</w:t>
+        <w:t>策略C累计收益71.84%、年化收益7.69%、最大回撤16.91%，相对沪深300取得14.23%的累计超额，是三者中收益与回撤匹配度最好的方案。其Beta为0.426，说明50%仓位上限有效压低了市场方向暴露；夏普比率0.315和30.37%的相对最大回撤同时表明，超额收益的形成过程仍有较大波动。表中最重要的发现是，策略C的领先同时体现在收益和绝对回撤两个维度，策略B的优势则集中在防守。</w:t>
       </w:r>
     </w:p>
     <w:p>
@@ -2364,10 +1752,10 @@
         <w:rPr>
           <w:rFonts w:ascii="Songti SC" w:hAnsi="Songti SC" w:eastAsia="Songti SC" w:cs="Songti SC"/>
           <w:b/>
-          <w:color w:val="147D72"/>
+          <w:color w:val="000000"/>
           <w:sz w:val="28"/>
         </w:rPr>
-        <w:t>六、影子回测与风险暴露</w:t>
+        <w:t>六、收益来源与主要风险</w:t>
       </w:r>
     </w:p>
     <w:p>
@@ -2379,8 +1767,8 @@
       <w:r>
         <w:drawing>
           <wp:inline xmlns:a="http://schemas.openxmlformats.org/drawingml/2006/main" xmlns:pic="http://schemas.openxmlformats.org/drawingml/2006/picture">
-            <wp:extent cx="5577840" cy="4101553"/>
-            <wp:docPr id="2" name="Picture 2" descr="图2：三策略与沪深300的归一化净值及策略回撤（2016-2026）"/>
+            <wp:extent cx="5303520" cy="3899838"/>
+            <wp:docPr id="2" name="Picture 2" descr="图2：扩展样本下三策略与沪深300的净值及回撤（2016—2026）"/>
             <wp:cNvGraphicFramePr>
               <a:graphicFrameLocks noChangeAspect="1"/>
             </wp:cNvGraphicFramePr>
@@ -2400,7 +1788,7 @@
                   <pic:spPr>
                     <a:xfrm>
                       <a:off x="0" y="0"/>
-                      <a:ext cx="5577840" cy="4101553"/>
+                      <a:ext cx="5303520" cy="3899838"/>
                     </a:xfrm>
                     <a:prstGeom prst="rect"/>
                   </pic:spPr>
@@ -2413,16 +1801,16 @@
     </w:p>
     <w:p>
       <w:pPr>
-        <w:spacing w:after="120"/>
+        <w:spacing w:after="240"/>
         <w:jc w:val="center"/>
       </w:pPr>
       <w:r>
         <w:rPr>
           <w:rFonts w:ascii="Songti SC" w:hAnsi="Songti SC" w:eastAsia="Songti SC" w:cs="Songti SC"/>
-          <w:color w:val="61727A"/>
+          <w:color w:val="000000"/>
           <w:sz w:val="18"/>
         </w:rPr>
-        <w:t>图2：三策略与沪深300的归一化净值及策略回撤（2016-2026）</w:t>
+        <w:t>图2：扩展样本下三策略与沪深300的净值及回撤（2016—2026）</w:t>
       </w:r>
     </w:p>
     <w:p>
@@ -2434,10 +1822,10 @@
       <w:r>
         <w:rPr>
           <w:rFonts w:ascii="Songti SC" w:hAnsi="Songti SC" w:eastAsia="Songti SC" w:cs="Songti SC"/>
-          <w:color w:val="14242B"/>
+          <w:color w:val="000000"/>
           <w:sz w:val="21"/>
         </w:rPr>
-        <w:t>图2揭示了三个策略之间的结构差异。策略A全期累计收益为-30.38%，最大回撤达到-42.91%，说明全仓均线模板在震荡阶段反复进出后无法覆盖交易摩擦。策略B累计收益只有2.16%，但最大回撤降至-11.82%，平均市场仓位为18.95%，其稳定性主要来自较低暴露和账户暂停机制。策略C累计收益为56.93%，最大回撤为-16.72%，超过沪深300同期34.02%的涨幅；然而收益曲线在2024年以后改善明显，开发期优势有限，尚不能把最近市场状态下的相对表现推广为长期规律。</w:t>
+        <w:t>图2显示三条策略净值具有明显不同的路径。策略A在2021年后持续走弱，回撤长期处于较深区间，说明简单MA20信号在反复震荡中容易连续承受假突破和交易摩擦。策略B的净值长期围绕初始水平窄幅波动，回撤显著较浅，其稳定性主要来自较低市场参与度。策略C在2016—2023年的领先并不突出，主要增值集中在2024年以后，并在期末超过沪深300。策略C的优势由特定阶段贡献，收益路径存在明显的市场风格依赖。</w:t>
       </w:r>
     </w:p>
     <w:p>
@@ -2449,7 +1837,7 @@
       <w:r>
         <w:drawing>
           <wp:inline xmlns:a="http://schemas.openxmlformats.org/drawingml/2006/main" xmlns:pic="http://schemas.openxmlformats.org/drawingml/2006/picture">
-            <wp:extent cx="5577840" cy="2628676"/>
+            <wp:extent cx="5303520" cy="2499397"/>
             <wp:docPr id="3" name="Picture 3" descr="图3：开发期、验证期与参数冻结后的2026年样本外累计收益"/>
             <wp:cNvGraphicFramePr>
               <a:graphicFrameLocks noChangeAspect="1"/>
@@ -2470,7 +1858,7 @@
                   <pic:spPr>
                     <a:xfrm>
                       <a:off x="0" y="0"/>
-                      <a:ext cx="5577840" cy="2628676"/>
+                      <a:ext cx="5303520" cy="2499397"/>
                     </a:xfrm>
                     <a:prstGeom prst="rect"/>
                   </pic:spPr>
@@ -2483,13 +1871,13 @@
     </w:p>
     <w:p>
       <w:pPr>
-        <w:spacing w:after="120"/>
+        <w:spacing w:after="240"/>
         <w:jc w:val="center"/>
       </w:pPr>
       <w:r>
         <w:rPr>
           <w:rFonts w:ascii="Songti SC" w:hAnsi="Songti SC" w:eastAsia="Songti SC" w:cs="Songti SC"/>
-          <w:color w:val="61727A"/>
+          <w:color w:val="000000"/>
           <w:sz w:val="18"/>
         </w:rPr>
         <w:t>图3：开发期、验证期与参数冻结后的2026年样本外累计收益</w:t>
@@ -2504,34 +1892,29 @@
       <w:r>
         <w:rPr>
           <w:rFonts w:ascii="Songti SC" w:hAnsi="Songti SC" w:eastAsia="Songti SC" w:cs="Songti SC"/>
-          <w:color w:val="14242B"/>
+          <w:color w:val="000000"/>
           <w:sz w:val="21"/>
         </w:rPr>
-        <w:t>图3把最终参数放回三个阶段比较。策略A在开发期损失34.06%，验证期回升12.16%，2026年又下降6.41%，方向反复且成本敏感。策略B三个阶段分别为2.00%、2.11%和-2.61%，回撤始终较低，但其低收益与低仓位同时存在，不能仅用绝对收益评价信号。策略C三个阶段为6.11%、36.29%和7.08%，验证期贡献了全期大部分增值；2026样本外只有134个交易日，正收益只能记录为当前观察，不能年化后宣称模拟盘有效。</w:t>
-      </w:r>
-    </w:p>
-    <w:p>
-      <w:r>
-        <w:br w:type="page"/>
+        <w:t>图3进一步定位了收益来源。策略A在开发期亏损34.06%，验证期反弹12.16%，参数冻结后的2026年又下跌6.41%，收益方向反复，缺少稳定信号。策略B在开发期和验证期仅分别上涨2.00%和2.11%，2026年下跌2.61%，呈现低波动、低收益的防守特征。策略C三个阶段分别上涨6.11%、36.29%和7.09%，在每个阶段都领先另外两套策略；其中验证期贡献最大，确认了长期领先对2024—2025年市场环境的依赖。2026年仍为正提供了一项样本外支持，当前样本长度尚不足以消除风格集中风险。</w:t>
       </w:r>
     </w:p>
     <w:tbl>
       <w:tblPr>
         <w:tblStyle w:val="TableGrid"/>
-        <w:tblW w:type="dxa" w:w="9360"/>
+        <w:tblW w:type="dxa" w:w="8520"/>
         <w:tblLayout w:type="fixed"/>
         <w:tblLook w:firstColumn="1" w:firstRow="1" w:lastColumn="0" w:lastRow="0" w:noHBand="0" w:noVBand="1" w:val="04A0"/>
         <w:jc w:val="center"/>
         <w:tblInd w:w="120" w:type="dxa"/>
       </w:tblPr>
       <w:tblGrid>
-        <w:gridCol w:w="600"/>
-        <w:gridCol w:w="1390"/>
-        <w:gridCol w:w="1390"/>
-        <w:gridCol w:w="900"/>
-        <w:gridCol w:w="1390"/>
-        <w:gridCol w:w="900"/>
-        <w:gridCol w:w="2790"/>
+        <w:gridCol w:w="819"/>
+        <w:gridCol w:w="1265"/>
+        <w:gridCol w:w="1265"/>
+        <w:gridCol w:w="819"/>
+        <w:gridCol w:w="1265"/>
+        <w:gridCol w:w="819"/>
+        <w:gridCol w:w="2268"/>
       </w:tblGrid>
       <w:tr>
         <w:trPr>
@@ -2539,7 +1922,7 @@
         </w:trPr>
         <w:tc>
           <w:tcPr>
-            <w:tcW w:type="dxa" w:w="600"/>
+            <w:tcW w:type="dxa" w:w="819"/>
             <w:tcMar>
               <w:top w:w="80" w:type="dxa"/>
               <w:start w:w="120" w:type="dxa"/>
@@ -2547,7 +1930,7 @@
               <w:end w:w="120" w:type="dxa"/>
             </w:tcMar>
             <w:vAlign w:val="center"/>
-            <w:shd w:fill="F2F4F3"/>
+            <w:shd w:fill="D9D9D9"/>
           </w:tcPr>
           <w:p>
             <w:pPr>
@@ -2558,7 +1941,7 @@
               <w:rPr>
                 <w:rFonts w:ascii="Songti SC" w:hAnsi="Songti SC" w:eastAsia="Songti SC" w:cs="Songti SC"/>
                 <w:b/>
-                <w:color w:val="14242B"/>
+                <w:color w:val="000000"/>
                 <w:sz w:val="17"/>
               </w:rPr>
               <w:t>策略</w:t>
@@ -2567,7 +1950,7 @@
         </w:tc>
         <w:tc>
           <w:tcPr>
-            <w:tcW w:type="dxa" w:w="1390"/>
+            <w:tcW w:type="dxa" w:w="1265"/>
             <w:tcMar>
               <w:top w:w="80" w:type="dxa"/>
               <w:start w:w="120" w:type="dxa"/>
@@ -2575,7 +1958,7 @@
               <w:end w:w="120" w:type="dxa"/>
             </w:tcMar>
             <w:vAlign w:val="center"/>
-            <w:shd w:fill="F2F4F3"/>
+            <w:shd w:fill="D9D9D9"/>
           </w:tcPr>
           <w:p>
             <w:pPr>
@@ -2586,7 +1969,7 @@
               <w:rPr>
                 <w:rFonts w:ascii="Songti SC" w:hAnsi="Songti SC" w:eastAsia="Songti SC" w:cs="Songti SC"/>
                 <w:b/>
-                <w:color w:val="14242B"/>
+                <w:color w:val="000000"/>
                 <w:sz w:val="17"/>
               </w:rPr>
               <w:t>累计收益</w:t>
@@ -2595,7 +1978,7 @@
         </w:tc>
         <w:tc>
           <w:tcPr>
-            <w:tcW w:type="dxa" w:w="1390"/>
+            <w:tcW w:type="dxa" w:w="1265"/>
             <w:tcMar>
               <w:top w:w="80" w:type="dxa"/>
               <w:start w:w="120" w:type="dxa"/>
@@ -2603,7 +1986,7 @@
               <w:end w:w="120" w:type="dxa"/>
             </w:tcMar>
             <w:vAlign w:val="center"/>
-            <w:shd w:fill="F2F4F3"/>
+            <w:shd w:fill="D9D9D9"/>
           </w:tcPr>
           <w:p>
             <w:pPr>
@@ -2614,7 +1997,7 @@
               <w:rPr>
                 <w:rFonts w:ascii="Songti SC" w:hAnsi="Songti SC" w:eastAsia="Songti SC" w:cs="Songti SC"/>
                 <w:b/>
-                <w:color w:val="14242B"/>
+                <w:color w:val="000000"/>
                 <w:sz w:val="17"/>
               </w:rPr>
               <w:t>最大回撤</w:t>
@@ -2623,7 +2006,7 @@
         </w:tc>
         <w:tc>
           <w:tcPr>
-            <w:tcW w:type="dxa" w:w="900"/>
+            <w:tcW w:type="dxa" w:w="819"/>
             <w:tcMar>
               <w:top w:w="80" w:type="dxa"/>
               <w:start w:w="120" w:type="dxa"/>
@@ -2631,7 +2014,7 @@
               <w:end w:w="120" w:type="dxa"/>
             </w:tcMar>
             <w:vAlign w:val="center"/>
-            <w:shd w:fill="F2F4F3"/>
+            <w:shd w:fill="D9D9D9"/>
           </w:tcPr>
           <w:p>
             <w:pPr>
@@ -2642,7 +2025,7 @@
               <w:rPr>
                 <w:rFonts w:ascii="Songti SC" w:hAnsi="Songti SC" w:eastAsia="Songti SC" w:cs="Songti SC"/>
                 <w:b/>
-                <w:color w:val="14242B"/>
+                <w:color w:val="000000"/>
                 <w:sz w:val="17"/>
               </w:rPr>
               <w:t>夏普</w:t>
@@ -2651,7 +2034,7 @@
         </w:tc>
         <w:tc>
           <w:tcPr>
-            <w:tcW w:type="dxa" w:w="1390"/>
+            <w:tcW w:type="dxa" w:w="1265"/>
             <w:tcMar>
               <w:top w:w="80" w:type="dxa"/>
               <w:start w:w="120" w:type="dxa"/>
@@ -2659,7 +2042,7 @@
               <w:end w:w="120" w:type="dxa"/>
             </w:tcMar>
             <w:vAlign w:val="center"/>
-            <w:shd w:fill="F2F4F3"/>
+            <w:shd w:fill="D9D9D9"/>
           </w:tcPr>
           <w:p>
             <w:pPr>
@@ -2670,7 +2053,7 @@
               <w:rPr>
                 <w:rFonts w:ascii="Songti SC" w:hAnsi="Songti SC" w:eastAsia="Songti SC" w:cs="Songti SC"/>
                 <w:b/>
-                <w:color w:val="14242B"/>
+                <w:color w:val="000000"/>
                 <w:sz w:val="17"/>
               </w:rPr>
               <w:t>平均仓位</w:t>
@@ -2679,7 +2062,7 @@
         </w:tc>
         <w:tc>
           <w:tcPr>
-            <w:tcW w:type="dxa" w:w="900"/>
+            <w:tcW w:type="dxa" w:w="819"/>
             <w:tcMar>
               <w:top w:w="80" w:type="dxa"/>
               <w:start w:w="120" w:type="dxa"/>
@@ -2687,7 +2070,7 @@
               <w:end w:w="120" w:type="dxa"/>
             </w:tcMar>
             <w:vAlign w:val="center"/>
-            <w:shd w:fill="F2F4F3"/>
+            <w:shd w:fill="D9D9D9"/>
           </w:tcPr>
           <w:p>
             <w:pPr>
@@ -2698,7 +2081,7 @@
               <w:rPr>
                 <w:rFonts w:ascii="Songti SC" w:hAnsi="Songti SC" w:eastAsia="Songti SC" w:cs="Songti SC"/>
                 <w:b/>
-                <w:color w:val="14242B"/>
+                <w:color w:val="000000"/>
                 <w:sz w:val="17"/>
               </w:rPr>
               <w:t>Beta</w:t>
@@ -2707,7 +2090,7 @@
         </w:tc>
         <w:tc>
           <w:tcPr>
-            <w:tcW w:type="dxa" w:w="2790"/>
+            <w:tcW w:type="dxa" w:w="2268"/>
             <w:tcMar>
               <w:top w:w="80" w:type="dxa"/>
               <w:start w:w="120" w:type="dxa"/>
@@ -2715,7 +2098,7 @@
               <w:end w:w="120" w:type="dxa"/>
             </w:tcMar>
             <w:vAlign w:val="center"/>
-            <w:shd w:fill="F2F4F3"/>
+            <w:shd w:fill="D9D9D9"/>
           </w:tcPr>
           <w:p>
             <w:pPr>
@@ -2726,7 +2109,7 @@
               <w:rPr>
                 <w:rFonts w:ascii="Songti SC" w:hAnsi="Songti SC" w:eastAsia="Songti SC" w:cs="Songti SC"/>
                 <w:b/>
-                <w:color w:val="14242B"/>
+                <w:color w:val="000000"/>
                 <w:sz w:val="17"/>
               </w:rPr>
               <w:t>估算成本/元</w:t>
@@ -2737,33 +2120,7 @@
       <w:tr>
         <w:tc>
           <w:tcPr>
-            <w:tcW w:type="dxa" w:w="600"/>
-            <w:tcMar>
-              <w:top w:w="80" w:type="dxa"/>
-              <w:start w:w="120" w:type="dxa"/>
-              <w:bottom w:w="80" w:type="dxa"/>
-              <w:end w:w="120" w:type="dxa"/>
-            </w:tcMar>
-            <w:vAlign w:val="center"/>
-          </w:tcPr>
-          <w:p>
-            <w:pPr>
-              <w:spacing w:after="0" w:line="276" w:lineRule="auto"/>
-              <w:jc w:val="left"/>
-            </w:pPr>
-            <w:r>
-              <w:rPr>
-                <w:rFonts w:ascii="Songti SC" w:hAnsi="Songti SC" w:eastAsia="Songti SC" w:cs="Songti SC"/>
-                <w:color w:val="14242B"/>
-                <w:sz w:val="17"/>
-              </w:rPr>
-              <w:t>A</w:t>
-            </w:r>
-          </w:p>
-        </w:tc>
-        <w:tc>
-          <w:tcPr>
-            <w:tcW w:type="dxa" w:w="1390"/>
+            <w:tcW w:type="dxa" w:w="819"/>
             <w:tcMar>
               <w:top w:w="80" w:type="dxa"/>
               <w:start w:w="120" w:type="dxa"/>
@@ -2780,16 +2137,16 @@
             <w:r>
               <w:rPr>
                 <w:rFonts w:ascii="Songti SC" w:hAnsi="Songti SC" w:eastAsia="Songti SC" w:cs="Songti SC"/>
-                <w:color w:val="14242B"/>
+                <w:color w:val="000000"/>
                 <w:sz w:val="17"/>
               </w:rPr>
-              <w:t>-30.38%</w:t>
+              <w:t>A</w:t>
             </w:r>
           </w:p>
         </w:tc>
         <w:tc>
           <w:tcPr>
-            <w:tcW w:type="dxa" w:w="1390"/>
+            <w:tcW w:type="dxa" w:w="1265"/>
             <w:tcMar>
               <w:top w:w="80" w:type="dxa"/>
               <w:start w:w="120" w:type="dxa"/>
@@ -2806,16 +2163,16 @@
             <w:r>
               <w:rPr>
                 <w:rFonts w:ascii="Songti SC" w:hAnsi="Songti SC" w:eastAsia="Songti SC" w:cs="Songti SC"/>
-                <w:color w:val="14242B"/>
+                <w:color w:val="000000"/>
                 <w:sz w:val="17"/>
               </w:rPr>
-              <w:t>-42.91%</w:t>
+              <w:t>-30.38%</w:t>
             </w:r>
           </w:p>
         </w:tc>
         <w:tc>
           <w:tcPr>
-            <w:tcW w:type="dxa" w:w="900"/>
+            <w:tcW w:type="dxa" w:w="1265"/>
             <w:tcMar>
               <w:top w:w="80" w:type="dxa"/>
               <w:start w:w="120" w:type="dxa"/>
@@ -2832,16 +2189,16 @@
             <w:r>
               <w:rPr>
                 <w:rFonts w:ascii="Songti SC" w:hAnsi="Songti SC" w:eastAsia="Songti SC" w:cs="Songti SC"/>
-                <w:color w:val="14242B"/>
+                <w:color w:val="000000"/>
                 <w:sz w:val="17"/>
               </w:rPr>
-              <w:t>-0.21</w:t>
+              <w:t>-42.91%</w:t>
             </w:r>
           </w:p>
         </w:tc>
         <w:tc>
           <w:tcPr>
-            <w:tcW w:type="dxa" w:w="1390"/>
+            <w:tcW w:type="dxa" w:w="819"/>
             <w:tcMar>
               <w:top w:w="80" w:type="dxa"/>
               <w:start w:w="120" w:type="dxa"/>
@@ -2858,16 +2215,16 @@
             <w:r>
               <w:rPr>
                 <w:rFonts w:ascii="Songti SC" w:hAnsi="Songti SC" w:eastAsia="Songti SC" w:cs="Songti SC"/>
-                <w:color w:val="14242B"/>
+                <w:color w:val="000000"/>
                 <w:sz w:val="17"/>
               </w:rPr>
-              <w:t>52.92%</w:t>
+              <w:t>-0.21</w:t>
             </w:r>
           </w:p>
         </w:tc>
         <w:tc>
           <w:tcPr>
-            <w:tcW w:type="dxa" w:w="900"/>
+            <w:tcW w:type="dxa" w:w="1265"/>
             <w:tcMar>
               <w:top w:w="80" w:type="dxa"/>
               <w:start w:w="120" w:type="dxa"/>
@@ -2884,16 +2241,16 @@
             <w:r>
               <w:rPr>
                 <w:rFonts w:ascii="Songti SC" w:hAnsi="Songti SC" w:eastAsia="Songti SC" w:cs="Songti SC"/>
-                <w:color w:val="14242B"/>
+                <w:color w:val="000000"/>
                 <w:sz w:val="17"/>
               </w:rPr>
-              <w:t>0.46</w:t>
+              <w:t>52.92%</w:t>
             </w:r>
           </w:p>
         </w:tc>
         <w:tc>
           <w:tcPr>
-            <w:tcW w:type="dxa" w:w="2790"/>
+            <w:tcW w:type="dxa" w:w="819"/>
             <w:tcMar>
               <w:top w:w="80" w:type="dxa"/>
               <w:start w:w="120" w:type="dxa"/>
@@ -2910,44 +2267,16 @@
             <w:r>
               <w:rPr>
                 <w:rFonts w:ascii="Songti SC" w:hAnsi="Songti SC" w:eastAsia="Songti SC" w:cs="Songti SC"/>
-                <w:color w:val="14242B"/>
+                <w:color w:val="000000"/>
                 <w:sz w:val="17"/>
               </w:rPr>
-              <w:t>169,425</w:t>
-            </w:r>
-          </w:p>
-        </w:tc>
-      </w:tr>
-      <w:tr>
-        <w:tc>
-          <w:tcPr>
-            <w:tcW w:type="dxa" w:w="600"/>
-            <w:tcMar>
-              <w:top w:w="80" w:type="dxa"/>
-              <w:start w:w="120" w:type="dxa"/>
-              <w:bottom w:w="80" w:type="dxa"/>
-              <w:end w:w="120" w:type="dxa"/>
-            </w:tcMar>
-            <w:vAlign w:val="center"/>
-          </w:tcPr>
-          <w:p>
-            <w:pPr>
-              <w:spacing w:after="0" w:line="276" w:lineRule="auto"/>
-              <w:jc w:val="left"/>
-            </w:pPr>
-            <w:r>
-              <w:rPr>
-                <w:rFonts w:ascii="Songti SC" w:hAnsi="Songti SC" w:eastAsia="Songti SC" w:cs="Songti SC"/>
-                <w:color w:val="14242B"/>
-                <w:sz w:val="17"/>
-              </w:rPr>
-              <w:t>B</w:t>
+              <w:t>0.46</w:t>
             </w:r>
           </w:p>
         </w:tc>
         <w:tc>
           <w:tcPr>
-            <w:tcW w:type="dxa" w:w="1390"/>
+            <w:tcW w:type="dxa" w:w="2268"/>
             <w:tcMar>
               <w:top w:w="80" w:type="dxa"/>
               <w:start w:w="120" w:type="dxa"/>
@@ -2964,16 +2293,18 @@
             <w:r>
               <w:rPr>
                 <w:rFonts w:ascii="Songti SC" w:hAnsi="Songti SC" w:eastAsia="Songti SC" w:cs="Songti SC"/>
-                <w:color w:val="14242B"/>
+                <w:color w:val="000000"/>
                 <w:sz w:val="17"/>
               </w:rPr>
-              <w:t>2.16%</w:t>
+              <w:t>169,425</w:t>
             </w:r>
           </w:p>
         </w:tc>
+      </w:tr>
+      <w:tr>
         <w:tc>
           <w:tcPr>
-            <w:tcW w:type="dxa" w:w="1390"/>
+            <w:tcW w:type="dxa" w:w="819"/>
             <w:tcMar>
               <w:top w:w="80" w:type="dxa"/>
               <w:start w:w="120" w:type="dxa"/>
@@ -2990,16 +2321,16 @@
             <w:r>
               <w:rPr>
                 <w:rFonts w:ascii="Songti SC" w:hAnsi="Songti SC" w:eastAsia="Songti SC" w:cs="Songti SC"/>
-                <w:color w:val="14242B"/>
+                <w:color w:val="000000"/>
                 <w:sz w:val="17"/>
               </w:rPr>
-              <w:t>-11.82%</w:t>
+              <w:t>B</w:t>
             </w:r>
           </w:p>
         </w:tc>
         <w:tc>
           <w:tcPr>
-            <w:tcW w:type="dxa" w:w="900"/>
+            <w:tcW w:type="dxa" w:w="1265"/>
             <w:tcMar>
               <w:top w:w="80" w:type="dxa"/>
               <w:start w:w="120" w:type="dxa"/>
@@ -3016,16 +2347,16 @@
             <w:r>
               <w:rPr>
                 <w:rFonts w:ascii="Songti SC" w:hAnsi="Songti SC" w:eastAsia="Songti SC" w:cs="Songti SC"/>
-                <w:color w:val="14242B"/>
+                <w:color w:val="000000"/>
                 <w:sz w:val="17"/>
               </w:rPr>
-              <w:t>0.07</w:t>
+              <w:t>2.16%</w:t>
             </w:r>
           </w:p>
         </w:tc>
         <w:tc>
           <w:tcPr>
-            <w:tcW w:type="dxa" w:w="1390"/>
+            <w:tcW w:type="dxa" w:w="1265"/>
             <w:tcMar>
               <w:top w:w="80" w:type="dxa"/>
               <w:start w:w="120" w:type="dxa"/>
@@ -3042,16 +2373,16 @@
             <w:r>
               <w:rPr>
                 <w:rFonts w:ascii="Songti SC" w:hAnsi="Songti SC" w:eastAsia="Songti SC" w:cs="Songti SC"/>
-                <w:color w:val="14242B"/>
+                <w:color w:val="000000"/>
                 <w:sz w:val="17"/>
               </w:rPr>
-              <w:t>18.95%</w:t>
+              <w:t>-11.82%</w:t>
             </w:r>
           </w:p>
         </w:tc>
         <w:tc>
           <w:tcPr>
-            <w:tcW w:type="dxa" w:w="900"/>
+            <w:tcW w:type="dxa" w:w="819"/>
             <w:tcMar>
               <w:top w:w="80" w:type="dxa"/>
               <w:start w:w="120" w:type="dxa"/>
@@ -3068,16 +2399,16 @@
             <w:r>
               <w:rPr>
                 <w:rFonts w:ascii="Songti SC" w:hAnsi="Songti SC" w:eastAsia="Songti SC" w:cs="Songti SC"/>
-                <w:color w:val="14242B"/>
+                <w:color w:val="000000"/>
                 <w:sz w:val="17"/>
               </w:rPr>
-              <w:t>0.16</w:t>
+              <w:t>0.07</w:t>
             </w:r>
           </w:p>
         </w:tc>
         <w:tc>
           <w:tcPr>
-            <w:tcW w:type="dxa" w:w="2790"/>
+            <w:tcW w:type="dxa" w:w="1265"/>
             <w:tcMar>
               <w:top w:w="80" w:type="dxa"/>
               <w:start w:w="120" w:type="dxa"/>
@@ -3094,44 +2425,16 @@
             <w:r>
               <w:rPr>
                 <w:rFonts w:ascii="Songti SC" w:hAnsi="Songti SC" w:eastAsia="Songti SC" w:cs="Songti SC"/>
-                <w:color w:val="14242B"/>
+                <w:color w:val="000000"/>
                 <w:sz w:val="17"/>
               </w:rPr>
-              <w:t>51,644</w:t>
-            </w:r>
-          </w:p>
-        </w:tc>
-      </w:tr>
-      <w:tr>
-        <w:tc>
-          <w:tcPr>
-            <w:tcW w:type="dxa" w:w="600"/>
-            <w:tcMar>
-              <w:top w:w="80" w:type="dxa"/>
-              <w:start w:w="120" w:type="dxa"/>
-              <w:bottom w:w="80" w:type="dxa"/>
-              <w:end w:w="120" w:type="dxa"/>
-            </w:tcMar>
-            <w:vAlign w:val="center"/>
-          </w:tcPr>
-          <w:p>
-            <w:pPr>
-              <w:spacing w:after="0" w:line="276" w:lineRule="auto"/>
-              <w:jc w:val="left"/>
-            </w:pPr>
-            <w:r>
-              <w:rPr>
-                <w:rFonts w:ascii="Songti SC" w:hAnsi="Songti SC" w:eastAsia="Songti SC" w:cs="Songti SC"/>
-                <w:color w:val="14242B"/>
-                <w:sz w:val="17"/>
-              </w:rPr>
-              <w:t>C</w:t>
+              <w:t>18.95%</w:t>
             </w:r>
           </w:p>
         </w:tc>
         <w:tc>
           <w:tcPr>
-            <w:tcW w:type="dxa" w:w="1390"/>
+            <w:tcW w:type="dxa" w:w="819"/>
             <w:tcMar>
               <w:top w:w="80" w:type="dxa"/>
               <w:start w:w="120" w:type="dxa"/>
@@ -3148,16 +2451,16 @@
             <w:r>
               <w:rPr>
                 <w:rFonts w:ascii="Songti SC" w:hAnsi="Songti SC" w:eastAsia="Songti SC" w:cs="Songti SC"/>
-                <w:color w:val="14242B"/>
+                <w:color w:val="000000"/>
                 <w:sz w:val="17"/>
               </w:rPr>
-              <w:t>56.93%</w:t>
+              <w:t>0.16</w:t>
             </w:r>
           </w:p>
         </w:tc>
         <w:tc>
           <w:tcPr>
-            <w:tcW w:type="dxa" w:w="1390"/>
+            <w:tcW w:type="dxa" w:w="2268"/>
             <w:tcMar>
               <w:top w:w="80" w:type="dxa"/>
               <w:start w:w="120" w:type="dxa"/>
@@ -3174,16 +2477,18 @@
             <w:r>
               <w:rPr>
                 <w:rFonts w:ascii="Songti SC" w:hAnsi="Songti SC" w:eastAsia="Songti SC" w:cs="Songti SC"/>
-                <w:color w:val="14242B"/>
+                <w:color w:val="000000"/>
                 <w:sz w:val="17"/>
               </w:rPr>
-              <w:t>-16.72%</w:t>
+              <w:t>51,644</w:t>
             </w:r>
           </w:p>
         </w:tc>
+      </w:tr>
+      <w:tr>
         <w:tc>
           <w:tcPr>
-            <w:tcW w:type="dxa" w:w="900"/>
+            <w:tcW w:type="dxa" w:w="819"/>
             <w:tcMar>
               <w:top w:w="80" w:type="dxa"/>
               <w:start w:w="120" w:type="dxa"/>
@@ -3200,16 +2505,16 @@
             <w:r>
               <w:rPr>
                 <w:rFonts w:ascii="Songti SC" w:hAnsi="Songti SC" w:eastAsia="Songti SC" w:cs="Songti SC"/>
-                <w:color w:val="14242B"/>
+                <w:color w:val="000000"/>
                 <w:sz w:val="17"/>
               </w:rPr>
-              <w:t>0.44</w:t>
+              <w:t>C</w:t>
             </w:r>
           </w:p>
         </w:tc>
         <w:tc>
           <w:tcPr>
-            <w:tcW w:type="dxa" w:w="1390"/>
+            <w:tcW w:type="dxa" w:w="1265"/>
             <w:tcMar>
               <w:top w:w="80" w:type="dxa"/>
               <w:start w:w="120" w:type="dxa"/>
@@ -3226,16 +2531,16 @@
             <w:r>
               <w:rPr>
                 <w:rFonts w:ascii="Songti SC" w:hAnsi="Songti SC" w:eastAsia="Songti SC" w:cs="Songti SC"/>
-                <w:color w:val="14242B"/>
+                <w:color w:val="000000"/>
                 <w:sz w:val="17"/>
               </w:rPr>
-              <w:t>34.07%</w:t>
+              <w:t>56.93%</w:t>
             </w:r>
           </w:p>
         </w:tc>
         <w:tc>
           <w:tcPr>
-            <w:tcW w:type="dxa" w:w="900"/>
+            <w:tcW w:type="dxa" w:w="1265"/>
             <w:tcMar>
               <w:top w:w="80" w:type="dxa"/>
               <w:start w:w="120" w:type="dxa"/>
@@ -3252,16 +2557,16 @@
             <w:r>
               <w:rPr>
                 <w:rFonts w:ascii="Songti SC" w:hAnsi="Songti SC" w:eastAsia="Songti SC" w:cs="Songti SC"/>
-                <w:color w:val="14242B"/>
+                <w:color w:val="000000"/>
                 <w:sz w:val="17"/>
               </w:rPr>
-              <w:t>0.40</w:t>
+              <w:t>-16.72%</w:t>
             </w:r>
           </w:p>
         </w:tc>
         <w:tc>
           <w:tcPr>
-            <w:tcW w:type="dxa" w:w="2790"/>
+            <w:tcW w:type="dxa" w:w="819"/>
             <w:tcMar>
               <w:top w:w="80" w:type="dxa"/>
               <w:start w:w="120" w:type="dxa"/>
@@ -3278,7 +2583,85 @@
             <w:r>
               <w:rPr>
                 <w:rFonts w:ascii="Songti SC" w:hAnsi="Songti SC" w:eastAsia="Songti SC" w:cs="Songti SC"/>
-                <w:color w:val="14242B"/>
+                <w:color w:val="000000"/>
+                <w:sz w:val="17"/>
+              </w:rPr>
+              <w:t>0.44</w:t>
+            </w:r>
+          </w:p>
+        </w:tc>
+        <w:tc>
+          <w:tcPr>
+            <w:tcW w:type="dxa" w:w="1265"/>
+            <w:tcMar>
+              <w:top w:w="80" w:type="dxa"/>
+              <w:start w:w="120" w:type="dxa"/>
+              <w:bottom w:w="80" w:type="dxa"/>
+              <w:end w:w="120" w:type="dxa"/>
+            </w:tcMar>
+            <w:vAlign w:val="center"/>
+          </w:tcPr>
+          <w:p>
+            <w:pPr>
+              <w:spacing w:after="0" w:line="276" w:lineRule="auto"/>
+              <w:jc w:val="center"/>
+            </w:pPr>
+            <w:r>
+              <w:rPr>
+                <w:rFonts w:ascii="Songti SC" w:hAnsi="Songti SC" w:eastAsia="Songti SC" w:cs="Songti SC"/>
+                <w:color w:val="000000"/>
+                <w:sz w:val="17"/>
+              </w:rPr>
+              <w:t>34.07%</w:t>
+            </w:r>
+          </w:p>
+        </w:tc>
+        <w:tc>
+          <w:tcPr>
+            <w:tcW w:type="dxa" w:w="819"/>
+            <w:tcMar>
+              <w:top w:w="80" w:type="dxa"/>
+              <w:start w:w="120" w:type="dxa"/>
+              <w:bottom w:w="80" w:type="dxa"/>
+              <w:end w:w="120" w:type="dxa"/>
+            </w:tcMar>
+            <w:vAlign w:val="center"/>
+          </w:tcPr>
+          <w:p>
+            <w:pPr>
+              <w:spacing w:after="0" w:line="276" w:lineRule="auto"/>
+              <w:jc w:val="center"/>
+            </w:pPr>
+            <w:r>
+              <w:rPr>
+                <w:rFonts w:ascii="Songti SC" w:hAnsi="Songti SC" w:eastAsia="Songti SC" w:cs="Songti SC"/>
+                <w:color w:val="000000"/>
+                <w:sz w:val="17"/>
+              </w:rPr>
+              <w:t>0.40</w:t>
+            </w:r>
+          </w:p>
+        </w:tc>
+        <w:tc>
+          <w:tcPr>
+            <w:tcW w:type="dxa" w:w="2268"/>
+            <w:tcMar>
+              <w:top w:w="80" w:type="dxa"/>
+              <w:start w:w="120" w:type="dxa"/>
+              <w:bottom w:w="80" w:type="dxa"/>
+              <w:end w:w="120" w:type="dxa"/>
+            </w:tcMar>
+            <w:vAlign w:val="center"/>
+          </w:tcPr>
+          <w:p>
+            <w:pPr>
+              <w:spacing w:after="0" w:line="276" w:lineRule="auto"/>
+              <w:jc w:val="center"/>
+            </w:pPr>
+            <w:r>
+              <w:rPr>
+                <w:rFonts w:ascii="Songti SC" w:hAnsi="Songti SC" w:eastAsia="Songti SC" w:cs="Songti SC"/>
+                <w:color w:val="000000"/>
                 <w:sz w:val="17"/>
               </w:rPr>
               <w:t>122,960</w:t>
@@ -3301,10 +2684,10 @@
       <w:r>
         <w:rPr>
           <w:rFonts w:ascii="Songti SC" w:hAnsi="Songti SC" w:eastAsia="Songti SC" w:cs="Songti SC"/>
-          <w:color w:val="14242B"/>
+          <w:color w:val="000000"/>
           <w:sz w:val="21"/>
         </w:rPr>
-        <w:t>Beta用于衡量策略日收益对沪深300日收益变动的敏感度。策略A、B、C的Beta分别约为0.46、0.16和0.40；B的低Beta与18.95%的平均仓位一致，C虽然只持有50%目标仓位，但跨ETF选择仍保留明显的权益市场方向暴露。三种策略都持有隔夜仓位，无法避免开盘跳空；A和B集中于单一510300，C每期也只持有一只ETF，因此单一标的集中风险并未消失。</w:t>
+        <w:t>仓位和成本数据解释了三套策略的净值差异。策略A平均仓位52.92%，产生451笔订单和约16.94万元估算成本，较高参与度没有转化为正收益。策略B平均仓位仅18.95%，Beta约0.16，低回撤主要来自长期现金缓冲。策略C以34.07%的平均仓位取得56.93%的扩展样本收益，单位市场暴露的收益表现更强；其518笔订单和约12.30万元估算成本也显示轮动信号需要承担较高摩擦。三种策略在持仓时均集中于单一ETF，并可能跨夜持有，跳空和单一标的集中风险依然存在。</w:t>
       </w:r>
     </w:p>
     <w:p>
@@ -3318,10 +2701,10 @@
         <w:rPr>
           <w:rFonts w:ascii="Songti SC" w:hAnsi="Songti SC" w:eastAsia="Songti SC" w:cs="Songti SC"/>
           <w:b/>
-          <w:color w:val="147D72"/>
+          <w:color w:val="000000"/>
           <w:sz w:val="28"/>
         </w:rPr>
-        <w:t>七、成本压力与实际成交差异</w:t>
+        <w:t>七、成本上升会明显压缩策略收益</w:t>
       </w:r>
     </w:p>
     <w:p>
@@ -3333,7 +2716,7 @@
       <w:r>
         <w:drawing>
           <wp:inline xmlns:a="http://schemas.openxmlformats.org/drawingml/2006/main" xmlns:pic="http://schemas.openxmlformats.org/drawingml/2006/picture">
-            <wp:extent cx="5394960" cy="2629596"/>
+            <wp:extent cx="5303520" cy="2585026"/>
             <wp:docPr id="4" name="Picture 4" descr="图4：佣金率与滑点同时翻倍后的全期累计收益变化"/>
             <wp:cNvGraphicFramePr>
               <a:graphicFrameLocks noChangeAspect="1"/>
@@ -3354,7 +2737,7 @@
                   <pic:spPr>
                     <a:xfrm>
                       <a:off x="0" y="0"/>
-                      <a:ext cx="5394960" cy="2629596"/>
+                      <a:ext cx="5303520" cy="2585026"/>
                     </a:xfrm>
                     <a:prstGeom prst="rect"/>
                   </pic:spPr>
@@ -3367,13 +2750,13 @@
     </w:p>
     <w:p>
       <w:pPr>
-        <w:spacing w:after="120"/>
+        <w:spacing w:after="240"/>
         <w:jc w:val="center"/>
       </w:pPr>
       <w:r>
         <w:rPr>
           <w:rFonts w:ascii="Songti SC" w:hAnsi="Songti SC" w:eastAsia="Songti SC" w:cs="Songti SC"/>
-          <w:color w:val="61727A"/>
+          <w:color w:val="000000"/>
           <w:sz w:val="18"/>
         </w:rPr>
         <w:t>图4：佣金率与滑点同时翻倍后的全期累计收益变化</w:t>
@@ -3388,10 +2771,15 @@
       <w:r>
         <w:rPr>
           <w:rFonts w:ascii="Songti SC" w:hAnsi="Songti SC" w:eastAsia="Songti SC" w:cs="Songti SC"/>
-          <w:color w:val="14242B"/>
+          <w:color w:val="000000"/>
           <w:sz w:val="21"/>
         </w:rPr>
-        <w:t>成本翻倍后，策略A累计收益从-30.38%降至-53.61%，策略B从2.16%降至-9.35%，策略C从56.93%降至25.49%。三者都对成交摩擦敏感，C即使压力情景仍为正，也损失31.44个百分点，说明轮动收益中包含显著的换手暴露。实际模拟还会受到订单排队、部分成交、涨跌停、平台数据复权和开盘瞬时价格影响，平台回测与影子结果不一致属于预期现象，需要通过订单日志解释，不能通过事后修改参数消除差异。</w:t>
+        <w:t>图4显示成本冲击会直接改变策略结论。佣金和滑点同时翻倍后，策略A的累计收益由-30.38%降至-53.61%，减少23.23个百分点；策略B由2.16%降至-9.35%，原有微弱收益被完全吞噬；策略C由56.93%降至25.49%，减少31.44个百分点，降幅超过基础收益的一半。策略C在压力情景下仍保持三者第一，说明其信号具有一定收益缓冲；同时，最大的绝对收益损失揭示轮动换手是其关键风险来源。策略B的结果则表明，接近零的历史优势对交易成本缺乏容错空间。</w:t>
+      </w:r>
+    </w:p>
+    <w:p>
+      <w:r>
+        <w:br w:type="page"/>
       </w:r>
     </w:p>
     <w:p>
@@ -3405,10 +2793,10 @@
         <w:rPr>
           <w:rFonts w:ascii="Songti SC" w:hAnsi="Songti SC" w:eastAsia="Songti SC" w:cs="Songti SC"/>
           <w:b/>
-          <w:color w:val="147D72"/>
+          <w:color w:val="000000"/>
           <w:sz w:val="28"/>
         </w:rPr>
-        <w:t>八、私有模拟盘与自动更新Dashboard</w:t>
+        <w:t>八、测试周揭示统一空仓信号，模拟盘尚待首日数据</w:t>
       </w:r>
     </w:p>
     <w:p>
@@ -3422,10 +2810,10 @@
         <w:rPr>
           <w:rFonts w:ascii="Songti SC" w:hAnsi="Songti SC" w:eastAsia="Songti SC" w:cs="Songti SC"/>
           <w:b/>
-          <w:color w:val="14242B"/>
+          <w:color w:val="000000"/>
           <w:sz w:val="24"/>
         </w:rPr>
-        <w:t>8.1 三个模拟盘的部署状态</w:t>
+        <w:t>8.1 冻结规则回放复现了当周可获得的信息</w:t>
       </w:r>
     </w:p>
     <w:p>
@@ -3437,94 +2825,802 @@
       <w:r>
         <w:rPr>
           <w:rFonts w:ascii="Songti SC" w:hAnsi="Songti SC" w:eastAsia="Songti SC" w:cs="Songti SC"/>
-          <w:color w:val="14242B"/>
+          <w:color w:val="000000"/>
           <w:sz w:val="21"/>
         </w:rPr>
-        <w:t>三个策略已经在JoinQuant分别部署为私有模拟盘，部署日期为2026-07-24。模拟盘仍使用A、B、C三套冻结代码并保持彼此独立，以便后续形成同期间对比。截至报告生成时平台尚未产生可用的净值、持仓或订单记录，原因是部署后尚未经历足够的A股交易时段；这一状态记为“已部署、等待数据”，而不是零收益、零回撤或无风险。</w:t>
+        <w:t>长期回测在2026年7月17日结束，随后使用已经冻结的代码和参数回放7月20日至24日五个交易日。三套策略只读取T−1日及更早的已完成数据，交易指令在下一交易日执行，测试过程中没有使用未来价格或根据结果修改参数。因此，这段回测能够复现策略在当时信息条件下会产生的信号和目标仓位，并为尚未开始运行的模拟盘提供启动前观察。</w:t>
       </w:r>
+    </w:p>
+    <w:tbl>
+      <w:tblPr>
+        <w:tblStyle w:val="TableGrid"/>
+        <w:tblW w:type="dxa" w:w="8520"/>
+        <w:tblLayout w:type="fixed"/>
+        <w:tblLook w:firstColumn="1" w:firstRow="1" w:lastColumn="0" w:lastRow="0" w:noHBand="0" w:noVBand="1" w:val="04A0"/>
+        <w:jc w:val="center"/>
+        <w:tblInd w:w="120" w:type="dxa"/>
+      </w:tblPr>
+      <w:tblGrid>
+        <w:gridCol w:w="820"/>
+        <w:gridCol w:w="1185"/>
+        <w:gridCol w:w="1185"/>
+        <w:gridCol w:w="1185"/>
+        <w:gridCol w:w="1185"/>
+        <w:gridCol w:w="1504"/>
+        <w:gridCol w:w="1456"/>
+      </w:tblGrid>
+      <w:tr>
+        <w:trPr>
+          <w:tblHeader/>
+        </w:trPr>
+        <w:tc>
+          <w:tcPr>
+            <w:tcW w:type="dxa" w:w="820"/>
+            <w:tcMar>
+              <w:top w:w="80" w:type="dxa"/>
+              <w:start w:w="120" w:type="dxa"/>
+              <w:bottom w:w="80" w:type="dxa"/>
+              <w:end w:w="120" w:type="dxa"/>
+            </w:tcMar>
+            <w:vAlign w:val="center"/>
+            <w:shd w:fill="D9D9D9"/>
+          </w:tcPr>
+          <w:p>
+            <w:pPr>
+              <w:spacing w:after="0" w:line="276" w:lineRule="auto"/>
+              <w:jc w:val="center"/>
+            </w:pPr>
+            <w:r>
+              <w:rPr>
+                <w:rFonts w:ascii="Songti SC" w:hAnsi="Songti SC" w:eastAsia="Songti SC" w:cs="Songti SC"/>
+                <w:b/>
+                <w:color w:val="000000"/>
+                <w:sz w:val="17"/>
+              </w:rPr>
+              <w:t>策略</w:t>
+            </w:r>
+          </w:p>
+        </w:tc>
+        <w:tc>
+          <w:tcPr>
+            <w:tcW w:type="dxa" w:w="1185"/>
+            <w:tcMar>
+              <w:top w:w="80" w:type="dxa"/>
+              <w:start w:w="120" w:type="dxa"/>
+              <w:bottom w:w="80" w:type="dxa"/>
+              <w:end w:w="120" w:type="dxa"/>
+            </w:tcMar>
+            <w:vAlign w:val="center"/>
+            <w:shd w:fill="D9D9D9"/>
+          </w:tcPr>
+          <w:p>
+            <w:pPr>
+              <w:spacing w:after="0" w:line="276" w:lineRule="auto"/>
+              <w:jc w:val="center"/>
+            </w:pPr>
+            <w:r>
+              <w:rPr>
+                <w:rFonts w:ascii="Songti SC" w:hAnsi="Songti SC" w:eastAsia="Songti SC" w:cs="Songti SC"/>
+                <w:b/>
+                <w:color w:val="000000"/>
+                <w:sz w:val="17"/>
+              </w:rPr>
+              <w:t>策略收益</w:t>
+            </w:r>
+          </w:p>
+        </w:tc>
+        <w:tc>
+          <w:tcPr>
+            <w:tcW w:type="dxa" w:w="1185"/>
+            <w:tcMar>
+              <w:top w:w="80" w:type="dxa"/>
+              <w:start w:w="120" w:type="dxa"/>
+              <w:bottom w:w="80" w:type="dxa"/>
+              <w:end w:w="120" w:type="dxa"/>
+            </w:tcMar>
+            <w:vAlign w:val="center"/>
+            <w:shd w:fill="D9D9D9"/>
+          </w:tcPr>
+          <w:p>
+            <w:pPr>
+              <w:spacing w:after="0" w:line="276" w:lineRule="auto"/>
+              <w:jc w:val="center"/>
+            </w:pPr>
+            <w:r>
+              <w:rPr>
+                <w:rFonts w:ascii="Songti SC" w:hAnsi="Songti SC" w:eastAsia="Songti SC" w:cs="Songti SC"/>
+                <w:b/>
+                <w:color w:val="000000"/>
+                <w:sz w:val="17"/>
+              </w:rPr>
+              <w:t>基准收益</w:t>
+            </w:r>
+          </w:p>
+        </w:tc>
+        <w:tc>
+          <w:tcPr>
+            <w:tcW w:type="dxa" w:w="1185"/>
+            <w:tcMar>
+              <w:top w:w="80" w:type="dxa"/>
+              <w:start w:w="120" w:type="dxa"/>
+              <w:bottom w:w="80" w:type="dxa"/>
+              <w:end w:w="120" w:type="dxa"/>
+            </w:tcMar>
+            <w:vAlign w:val="center"/>
+            <w:shd w:fill="D9D9D9"/>
+          </w:tcPr>
+          <w:p>
+            <w:pPr>
+              <w:spacing w:after="0" w:line="276" w:lineRule="auto"/>
+              <w:jc w:val="center"/>
+            </w:pPr>
+            <w:r>
+              <w:rPr>
+                <w:rFonts w:ascii="Songti SC" w:hAnsi="Songti SC" w:eastAsia="Songti SC" w:cs="Songti SC"/>
+                <w:b/>
+                <w:color w:val="000000"/>
+                <w:sz w:val="17"/>
+              </w:rPr>
+              <w:t>超额收益</w:t>
+            </w:r>
+          </w:p>
+        </w:tc>
+        <w:tc>
+          <w:tcPr>
+            <w:tcW w:type="dxa" w:w="1185"/>
+            <w:tcMar>
+              <w:top w:w="80" w:type="dxa"/>
+              <w:start w:w="120" w:type="dxa"/>
+              <w:bottom w:w="80" w:type="dxa"/>
+              <w:end w:w="120" w:type="dxa"/>
+            </w:tcMar>
+            <w:vAlign w:val="center"/>
+            <w:shd w:fill="D9D9D9"/>
+          </w:tcPr>
+          <w:p>
+            <w:pPr>
+              <w:spacing w:after="0" w:line="276" w:lineRule="auto"/>
+              <w:jc w:val="center"/>
+            </w:pPr>
+            <w:r>
+              <w:rPr>
+                <w:rFonts w:ascii="Songti SC" w:hAnsi="Songti SC" w:eastAsia="Songti SC" w:cs="Songti SC"/>
+                <w:b/>
+                <w:color w:val="000000"/>
+                <w:sz w:val="17"/>
+              </w:rPr>
+              <w:t>最大回撤</w:t>
+            </w:r>
+          </w:p>
+        </w:tc>
+        <w:tc>
+          <w:tcPr>
+            <w:tcW w:type="dxa" w:w="1504"/>
+            <w:tcMar>
+              <w:top w:w="80" w:type="dxa"/>
+              <w:start w:w="120" w:type="dxa"/>
+              <w:bottom w:w="80" w:type="dxa"/>
+              <w:end w:w="120" w:type="dxa"/>
+            </w:tcMar>
+            <w:vAlign w:val="center"/>
+            <w:shd w:fill="D9D9D9"/>
+          </w:tcPr>
+          <w:p>
+            <w:pPr>
+              <w:spacing w:after="0" w:line="276" w:lineRule="auto"/>
+              <w:jc w:val="center"/>
+            </w:pPr>
+            <w:r>
+              <w:rPr>
+                <w:rFonts w:ascii="Songti SC" w:hAnsi="Songti SC" w:eastAsia="Songti SC" w:cs="Songti SC"/>
+                <w:b/>
+                <w:color w:val="000000"/>
+                <w:sz w:val="17"/>
+              </w:rPr>
+              <w:t>盈利/亏损次数</w:t>
+            </w:r>
+          </w:p>
+        </w:tc>
+        <w:tc>
+          <w:tcPr>
+            <w:tcW w:type="dxa" w:w="1456"/>
+            <w:tcMar>
+              <w:top w:w="80" w:type="dxa"/>
+              <w:start w:w="120" w:type="dxa"/>
+              <w:bottom w:w="80" w:type="dxa"/>
+              <w:end w:w="120" w:type="dxa"/>
+            </w:tcMar>
+            <w:vAlign w:val="center"/>
+            <w:shd w:fill="D9D9D9"/>
+          </w:tcPr>
+          <w:p>
+            <w:pPr>
+              <w:spacing w:after="0" w:line="276" w:lineRule="auto"/>
+              <w:jc w:val="center"/>
+            </w:pPr>
+            <w:r>
+              <w:rPr>
+                <w:rFonts w:ascii="Songti SC" w:hAnsi="Songti SC" w:eastAsia="Songti SC" w:cs="Songti SC"/>
+                <w:b/>
+                <w:color w:val="000000"/>
+                <w:sz w:val="17"/>
+              </w:rPr>
+              <w:t>汇总状态</w:t>
+            </w:r>
+          </w:p>
+        </w:tc>
+      </w:tr>
+      <w:tr>
+        <w:tc>
+          <w:tcPr>
+            <w:tcW w:type="dxa" w:w="820"/>
+            <w:tcMar>
+              <w:top w:w="80" w:type="dxa"/>
+              <w:start w:w="120" w:type="dxa"/>
+              <w:bottom w:w="80" w:type="dxa"/>
+              <w:end w:w="120" w:type="dxa"/>
+            </w:tcMar>
+            <w:vAlign w:val="center"/>
+          </w:tcPr>
+          <w:p>
+            <w:pPr>
+              <w:spacing w:after="0" w:line="276" w:lineRule="auto"/>
+              <w:jc w:val="center"/>
+            </w:pPr>
+            <w:r>
+              <w:rPr>
+                <w:rFonts w:ascii="Songti SC" w:hAnsi="Songti SC" w:eastAsia="Songti SC" w:cs="Songti SC"/>
+                <w:color w:val="000000"/>
+                <w:sz w:val="17"/>
+              </w:rPr>
+              <w:t>A</w:t>
+            </w:r>
+          </w:p>
+        </w:tc>
+        <w:tc>
+          <w:tcPr>
+            <w:tcW w:type="dxa" w:w="1185"/>
+            <w:tcMar>
+              <w:top w:w="80" w:type="dxa"/>
+              <w:start w:w="120" w:type="dxa"/>
+              <w:bottom w:w="80" w:type="dxa"/>
+              <w:end w:w="120" w:type="dxa"/>
+            </w:tcMar>
+            <w:vAlign w:val="center"/>
+          </w:tcPr>
+          <w:p>
+            <w:pPr>
+              <w:spacing w:after="0" w:line="276" w:lineRule="auto"/>
+              <w:jc w:val="center"/>
+            </w:pPr>
+            <w:r>
+              <w:rPr>
+                <w:rFonts w:ascii="Songti SC" w:hAnsi="Songti SC" w:eastAsia="Songti SC" w:cs="Songti SC"/>
+                <w:color w:val="000000"/>
+                <w:sz w:val="17"/>
+              </w:rPr>
+              <w:t>0.00%</w:t>
+            </w:r>
+          </w:p>
+        </w:tc>
+        <w:tc>
+          <w:tcPr>
+            <w:tcW w:type="dxa" w:w="1185"/>
+            <w:tcMar>
+              <w:top w:w="80" w:type="dxa"/>
+              <w:start w:w="120" w:type="dxa"/>
+              <w:bottom w:w="80" w:type="dxa"/>
+              <w:end w:w="120" w:type="dxa"/>
+            </w:tcMar>
+            <w:vAlign w:val="center"/>
+          </w:tcPr>
+          <w:p>
+            <w:pPr>
+              <w:spacing w:after="0" w:line="276" w:lineRule="auto"/>
+              <w:jc w:val="center"/>
+            </w:pPr>
+            <w:r>
+              <w:rPr>
+                <w:rFonts w:ascii="Songti SC" w:hAnsi="Songti SC" w:eastAsia="Songti SC" w:cs="Songti SC"/>
+                <w:color w:val="000000"/>
+                <w:sz w:val="17"/>
+              </w:rPr>
+              <w:t>2.65%</w:t>
+            </w:r>
+          </w:p>
+        </w:tc>
+        <w:tc>
+          <w:tcPr>
+            <w:tcW w:type="dxa" w:w="1185"/>
+            <w:tcMar>
+              <w:top w:w="80" w:type="dxa"/>
+              <w:start w:w="120" w:type="dxa"/>
+              <w:bottom w:w="80" w:type="dxa"/>
+              <w:end w:w="120" w:type="dxa"/>
+            </w:tcMar>
+            <w:vAlign w:val="center"/>
+          </w:tcPr>
+          <w:p>
+            <w:pPr>
+              <w:spacing w:after="0" w:line="276" w:lineRule="auto"/>
+              <w:jc w:val="center"/>
+            </w:pPr>
+            <w:r>
+              <w:rPr>
+                <w:rFonts w:ascii="Songti SC" w:hAnsi="Songti SC" w:eastAsia="Songti SC" w:cs="Songti SC"/>
+                <w:color w:val="000000"/>
+                <w:sz w:val="17"/>
+              </w:rPr>
+              <w:t>-2.58%</w:t>
+            </w:r>
+          </w:p>
+        </w:tc>
+        <w:tc>
+          <w:tcPr>
+            <w:tcW w:type="dxa" w:w="1185"/>
+            <w:tcMar>
+              <w:top w:w="80" w:type="dxa"/>
+              <w:start w:w="120" w:type="dxa"/>
+              <w:bottom w:w="80" w:type="dxa"/>
+              <w:end w:w="120" w:type="dxa"/>
+            </w:tcMar>
+            <w:vAlign w:val="center"/>
+          </w:tcPr>
+          <w:p>
+            <w:pPr>
+              <w:spacing w:after="0" w:line="276" w:lineRule="auto"/>
+              <w:jc w:val="center"/>
+            </w:pPr>
+            <w:r>
+              <w:rPr>
+                <w:rFonts w:ascii="Songti SC" w:hAnsi="Songti SC" w:eastAsia="Songti SC" w:cs="Songti SC"/>
+                <w:color w:val="000000"/>
+                <w:sz w:val="17"/>
+              </w:rPr>
+              <w:t>0.00%</w:t>
+            </w:r>
+          </w:p>
+        </w:tc>
+        <w:tc>
+          <w:tcPr>
+            <w:tcW w:type="dxa" w:w="1504"/>
+            <w:tcMar>
+              <w:top w:w="80" w:type="dxa"/>
+              <w:start w:w="120" w:type="dxa"/>
+              <w:bottom w:w="80" w:type="dxa"/>
+              <w:end w:w="120" w:type="dxa"/>
+            </w:tcMar>
+            <w:vAlign w:val="center"/>
+          </w:tcPr>
+          <w:p>
+            <w:pPr>
+              <w:spacing w:after="0" w:line="276" w:lineRule="auto"/>
+              <w:jc w:val="center"/>
+            </w:pPr>
+            <w:r>
+              <w:rPr>
+                <w:rFonts w:ascii="Songti SC" w:hAnsi="Songti SC" w:eastAsia="Songti SC" w:cs="Songti SC"/>
+                <w:color w:val="000000"/>
+                <w:sz w:val="17"/>
+              </w:rPr>
+              <w:t>0/0</w:t>
+            </w:r>
+          </w:p>
+        </w:tc>
+        <w:tc>
+          <w:tcPr>
+            <w:tcW w:type="dxa" w:w="1456"/>
+            <w:tcMar>
+              <w:top w:w="80" w:type="dxa"/>
+              <w:start w:w="120" w:type="dxa"/>
+              <w:bottom w:w="80" w:type="dxa"/>
+              <w:end w:w="120" w:type="dxa"/>
+            </w:tcMar>
+            <w:vAlign w:val="center"/>
+          </w:tcPr>
+          <w:p>
+            <w:pPr>
+              <w:spacing w:after="0" w:line="276" w:lineRule="auto"/>
+              <w:jc w:val="center"/>
+            </w:pPr>
+            <w:r>
+              <w:rPr>
+                <w:rFonts w:ascii="Songti SC" w:hAnsi="Songti SC" w:eastAsia="Songti SC" w:cs="Songti SC"/>
+                <w:color w:val="000000"/>
+                <w:sz w:val="17"/>
+              </w:rPr>
+              <w:t>保持现金</w:t>
+            </w:r>
+          </w:p>
+        </w:tc>
+      </w:tr>
+      <w:tr>
+        <w:tc>
+          <w:tcPr>
+            <w:tcW w:type="dxa" w:w="820"/>
+            <w:tcMar>
+              <w:top w:w="80" w:type="dxa"/>
+              <w:start w:w="120" w:type="dxa"/>
+              <w:bottom w:w="80" w:type="dxa"/>
+              <w:end w:w="120" w:type="dxa"/>
+            </w:tcMar>
+            <w:vAlign w:val="center"/>
+          </w:tcPr>
+          <w:p>
+            <w:pPr>
+              <w:spacing w:after="0" w:line="276" w:lineRule="auto"/>
+              <w:jc w:val="center"/>
+            </w:pPr>
+            <w:r>
+              <w:rPr>
+                <w:rFonts w:ascii="Songti SC" w:hAnsi="Songti SC" w:eastAsia="Songti SC" w:cs="Songti SC"/>
+                <w:color w:val="000000"/>
+                <w:sz w:val="17"/>
+              </w:rPr>
+              <w:t>B</w:t>
+            </w:r>
+          </w:p>
+        </w:tc>
+        <w:tc>
+          <w:tcPr>
+            <w:tcW w:type="dxa" w:w="1185"/>
+            <w:tcMar>
+              <w:top w:w="80" w:type="dxa"/>
+              <w:start w:w="120" w:type="dxa"/>
+              <w:bottom w:w="80" w:type="dxa"/>
+              <w:end w:w="120" w:type="dxa"/>
+            </w:tcMar>
+            <w:vAlign w:val="center"/>
+          </w:tcPr>
+          <w:p>
+            <w:pPr>
+              <w:spacing w:after="0" w:line="276" w:lineRule="auto"/>
+              <w:jc w:val="center"/>
+            </w:pPr>
+            <w:r>
+              <w:rPr>
+                <w:rFonts w:ascii="Songti SC" w:hAnsi="Songti SC" w:eastAsia="Songti SC" w:cs="Songti SC"/>
+                <w:color w:val="000000"/>
+                <w:sz w:val="17"/>
+              </w:rPr>
+              <w:t>0.00%</w:t>
+            </w:r>
+          </w:p>
+        </w:tc>
+        <w:tc>
+          <w:tcPr>
+            <w:tcW w:type="dxa" w:w="1185"/>
+            <w:tcMar>
+              <w:top w:w="80" w:type="dxa"/>
+              <w:start w:w="120" w:type="dxa"/>
+              <w:bottom w:w="80" w:type="dxa"/>
+              <w:end w:w="120" w:type="dxa"/>
+            </w:tcMar>
+            <w:vAlign w:val="center"/>
+          </w:tcPr>
+          <w:p>
+            <w:pPr>
+              <w:spacing w:after="0" w:line="276" w:lineRule="auto"/>
+              <w:jc w:val="center"/>
+            </w:pPr>
+            <w:r>
+              <w:rPr>
+                <w:rFonts w:ascii="Songti SC" w:hAnsi="Songti SC" w:eastAsia="Songti SC" w:cs="Songti SC"/>
+                <w:color w:val="000000"/>
+                <w:sz w:val="17"/>
+              </w:rPr>
+              <w:t>2.65%</w:t>
+            </w:r>
+          </w:p>
+        </w:tc>
+        <w:tc>
+          <w:tcPr>
+            <w:tcW w:type="dxa" w:w="1185"/>
+            <w:tcMar>
+              <w:top w:w="80" w:type="dxa"/>
+              <w:start w:w="120" w:type="dxa"/>
+              <w:bottom w:w="80" w:type="dxa"/>
+              <w:end w:w="120" w:type="dxa"/>
+            </w:tcMar>
+            <w:vAlign w:val="center"/>
+          </w:tcPr>
+          <w:p>
+            <w:pPr>
+              <w:spacing w:after="0" w:line="276" w:lineRule="auto"/>
+              <w:jc w:val="center"/>
+            </w:pPr>
+            <w:r>
+              <w:rPr>
+                <w:rFonts w:ascii="Songti SC" w:hAnsi="Songti SC" w:eastAsia="Songti SC" w:cs="Songti SC"/>
+                <w:color w:val="000000"/>
+                <w:sz w:val="17"/>
+              </w:rPr>
+              <w:t>-2.58%</w:t>
+            </w:r>
+          </w:p>
+        </w:tc>
+        <w:tc>
+          <w:tcPr>
+            <w:tcW w:type="dxa" w:w="1185"/>
+            <w:tcMar>
+              <w:top w:w="80" w:type="dxa"/>
+              <w:start w:w="120" w:type="dxa"/>
+              <w:bottom w:w="80" w:type="dxa"/>
+              <w:end w:w="120" w:type="dxa"/>
+            </w:tcMar>
+            <w:vAlign w:val="center"/>
+          </w:tcPr>
+          <w:p>
+            <w:pPr>
+              <w:spacing w:after="0" w:line="276" w:lineRule="auto"/>
+              <w:jc w:val="center"/>
+            </w:pPr>
+            <w:r>
+              <w:rPr>
+                <w:rFonts w:ascii="Songti SC" w:hAnsi="Songti SC" w:eastAsia="Songti SC" w:cs="Songti SC"/>
+                <w:color w:val="000000"/>
+                <w:sz w:val="17"/>
+              </w:rPr>
+              <w:t>0.00%</w:t>
+            </w:r>
+          </w:p>
+        </w:tc>
+        <w:tc>
+          <w:tcPr>
+            <w:tcW w:type="dxa" w:w="1504"/>
+            <w:tcMar>
+              <w:top w:w="80" w:type="dxa"/>
+              <w:start w:w="120" w:type="dxa"/>
+              <w:bottom w:w="80" w:type="dxa"/>
+              <w:end w:w="120" w:type="dxa"/>
+            </w:tcMar>
+            <w:vAlign w:val="center"/>
+          </w:tcPr>
+          <w:p>
+            <w:pPr>
+              <w:spacing w:after="0" w:line="276" w:lineRule="auto"/>
+              <w:jc w:val="center"/>
+            </w:pPr>
+            <w:r>
+              <w:rPr>
+                <w:rFonts w:ascii="Songti SC" w:hAnsi="Songti SC" w:eastAsia="Songti SC" w:cs="Songti SC"/>
+                <w:color w:val="000000"/>
+                <w:sz w:val="17"/>
+              </w:rPr>
+              <w:t>0/0</w:t>
+            </w:r>
+          </w:p>
+        </w:tc>
+        <w:tc>
+          <w:tcPr>
+            <w:tcW w:type="dxa" w:w="1456"/>
+            <w:tcMar>
+              <w:top w:w="80" w:type="dxa"/>
+              <w:start w:w="120" w:type="dxa"/>
+              <w:bottom w:w="80" w:type="dxa"/>
+              <w:end w:w="120" w:type="dxa"/>
+            </w:tcMar>
+            <w:vAlign w:val="center"/>
+          </w:tcPr>
+          <w:p>
+            <w:pPr>
+              <w:spacing w:after="0" w:line="276" w:lineRule="auto"/>
+              <w:jc w:val="center"/>
+            </w:pPr>
+            <w:r>
+              <w:rPr>
+                <w:rFonts w:ascii="Songti SC" w:hAnsi="Songti SC" w:eastAsia="Songti SC" w:cs="Songti SC"/>
+                <w:color w:val="000000"/>
+                <w:sz w:val="17"/>
+              </w:rPr>
+              <w:t>保持现金</w:t>
+            </w:r>
+          </w:p>
+        </w:tc>
+      </w:tr>
+      <w:tr>
+        <w:tc>
+          <w:tcPr>
+            <w:tcW w:type="dxa" w:w="820"/>
+            <w:tcMar>
+              <w:top w:w="80" w:type="dxa"/>
+              <w:start w:w="120" w:type="dxa"/>
+              <w:bottom w:w="80" w:type="dxa"/>
+              <w:end w:w="120" w:type="dxa"/>
+            </w:tcMar>
+            <w:vAlign w:val="center"/>
+          </w:tcPr>
+          <w:p>
+            <w:pPr>
+              <w:spacing w:after="0" w:line="276" w:lineRule="auto"/>
+              <w:jc w:val="center"/>
+            </w:pPr>
+            <w:r>
+              <w:rPr>
+                <w:rFonts w:ascii="Songti SC" w:hAnsi="Songti SC" w:eastAsia="Songti SC" w:cs="Songti SC"/>
+                <w:color w:val="000000"/>
+                <w:sz w:val="17"/>
+              </w:rPr>
+              <w:t>C</w:t>
+            </w:r>
+          </w:p>
+        </w:tc>
+        <w:tc>
+          <w:tcPr>
+            <w:tcW w:type="dxa" w:w="1185"/>
+            <w:tcMar>
+              <w:top w:w="80" w:type="dxa"/>
+              <w:start w:w="120" w:type="dxa"/>
+              <w:bottom w:w="80" w:type="dxa"/>
+              <w:end w:w="120" w:type="dxa"/>
+            </w:tcMar>
+            <w:vAlign w:val="center"/>
+          </w:tcPr>
+          <w:p>
+            <w:pPr>
+              <w:spacing w:after="0" w:line="276" w:lineRule="auto"/>
+              <w:jc w:val="center"/>
+            </w:pPr>
+            <w:r>
+              <w:rPr>
+                <w:rFonts w:ascii="Songti SC" w:hAnsi="Songti SC" w:eastAsia="Songti SC" w:cs="Songti SC"/>
+                <w:color w:val="000000"/>
+                <w:sz w:val="17"/>
+              </w:rPr>
+              <w:t>0.00%</w:t>
+            </w:r>
+          </w:p>
+        </w:tc>
+        <w:tc>
+          <w:tcPr>
+            <w:tcW w:type="dxa" w:w="1185"/>
+            <w:tcMar>
+              <w:top w:w="80" w:type="dxa"/>
+              <w:start w:w="120" w:type="dxa"/>
+              <w:bottom w:w="80" w:type="dxa"/>
+              <w:end w:w="120" w:type="dxa"/>
+            </w:tcMar>
+            <w:vAlign w:val="center"/>
+          </w:tcPr>
+          <w:p>
+            <w:pPr>
+              <w:spacing w:after="0" w:line="276" w:lineRule="auto"/>
+              <w:jc w:val="center"/>
+            </w:pPr>
+            <w:r>
+              <w:rPr>
+                <w:rFonts w:ascii="Songti SC" w:hAnsi="Songti SC" w:eastAsia="Songti SC" w:cs="Songti SC"/>
+                <w:color w:val="000000"/>
+                <w:sz w:val="17"/>
+              </w:rPr>
+              <w:t>2.65%</w:t>
+            </w:r>
+          </w:p>
+        </w:tc>
+        <w:tc>
+          <w:tcPr>
+            <w:tcW w:type="dxa" w:w="1185"/>
+            <w:tcMar>
+              <w:top w:w="80" w:type="dxa"/>
+              <w:start w:w="120" w:type="dxa"/>
+              <w:bottom w:w="80" w:type="dxa"/>
+              <w:end w:w="120" w:type="dxa"/>
+            </w:tcMar>
+            <w:vAlign w:val="center"/>
+          </w:tcPr>
+          <w:p>
+            <w:pPr>
+              <w:spacing w:after="0" w:line="276" w:lineRule="auto"/>
+              <w:jc w:val="center"/>
+            </w:pPr>
+            <w:r>
+              <w:rPr>
+                <w:rFonts w:ascii="Songti SC" w:hAnsi="Songti SC" w:eastAsia="Songti SC" w:cs="Songti SC"/>
+                <w:color w:val="000000"/>
+                <w:sz w:val="17"/>
+              </w:rPr>
+              <w:t>-2.58%</w:t>
+            </w:r>
+          </w:p>
+        </w:tc>
+        <w:tc>
+          <w:tcPr>
+            <w:tcW w:type="dxa" w:w="1185"/>
+            <w:tcMar>
+              <w:top w:w="80" w:type="dxa"/>
+              <w:start w:w="120" w:type="dxa"/>
+              <w:bottom w:w="80" w:type="dxa"/>
+              <w:end w:w="120" w:type="dxa"/>
+            </w:tcMar>
+            <w:vAlign w:val="center"/>
+          </w:tcPr>
+          <w:p>
+            <w:pPr>
+              <w:spacing w:after="0" w:line="276" w:lineRule="auto"/>
+              <w:jc w:val="center"/>
+            </w:pPr>
+            <w:r>
+              <w:rPr>
+                <w:rFonts w:ascii="Songti SC" w:hAnsi="Songti SC" w:eastAsia="Songti SC" w:cs="Songti SC"/>
+                <w:color w:val="000000"/>
+                <w:sz w:val="17"/>
+              </w:rPr>
+              <w:t>0.00%</w:t>
+            </w:r>
+          </w:p>
+        </w:tc>
+        <w:tc>
+          <w:tcPr>
+            <w:tcW w:type="dxa" w:w="1504"/>
+            <w:tcMar>
+              <w:top w:w="80" w:type="dxa"/>
+              <w:start w:w="120" w:type="dxa"/>
+              <w:bottom w:w="80" w:type="dxa"/>
+              <w:end w:w="120" w:type="dxa"/>
+            </w:tcMar>
+            <w:vAlign w:val="center"/>
+          </w:tcPr>
+          <w:p>
+            <w:pPr>
+              <w:spacing w:after="0" w:line="276" w:lineRule="auto"/>
+              <w:jc w:val="center"/>
+            </w:pPr>
+            <w:r>
+              <w:rPr>
+                <w:rFonts w:ascii="Songti SC" w:hAnsi="Songti SC" w:eastAsia="Songti SC" w:cs="Songti SC"/>
+                <w:color w:val="000000"/>
+                <w:sz w:val="17"/>
+              </w:rPr>
+              <w:t>0/0</w:t>
+            </w:r>
+          </w:p>
+        </w:tc>
+        <w:tc>
+          <w:tcPr>
+            <w:tcW w:type="dxa" w:w="1456"/>
+            <w:tcMar>
+              <w:top w:w="80" w:type="dxa"/>
+              <w:start w:w="120" w:type="dxa"/>
+              <w:bottom w:w="80" w:type="dxa"/>
+              <w:end w:w="120" w:type="dxa"/>
+            </w:tcMar>
+            <w:vAlign w:val="center"/>
+          </w:tcPr>
+          <w:p>
+            <w:pPr>
+              <w:spacing w:after="0" w:line="276" w:lineRule="auto"/>
+              <w:jc w:val="center"/>
+            </w:pPr>
+            <w:r>
+              <w:rPr>
+                <w:rFonts w:ascii="Songti SC" w:hAnsi="Songti SC" w:eastAsia="Songti SC" w:cs="Songti SC"/>
+                <w:color w:val="000000"/>
+                <w:sz w:val="17"/>
+              </w:rPr>
+              <w:t>保持现金</w:t>
+            </w:r>
+          </w:p>
+        </w:tc>
+      </w:tr>
+    </w:tbl>
+    <w:p>
+      <w:pPr>
+        <w:spacing w:after="40"/>
+      </w:pPr>
     </w:p>
     <w:p>
       <w:pPr>
-        <w:pStyle w:val="ListNumber"/>
+        <w:spacing w:before="0" w:after="0" w:line="360" w:lineRule="auto"/>
+        <w:ind w:firstLine="420"/>
         <w:jc w:val="both"/>
       </w:pPr>
       <w:r>
         <w:rPr>
           <w:rFonts w:ascii="Songti SC" w:hAnsi="Songti SC" w:eastAsia="Songti SC" w:cs="Songti SC"/>
-          <w:color w:val="14242B"/>
+          <w:color w:val="000000"/>
           <w:sz w:val="21"/>
         </w:rPr>
-        <w:t>策略A：平台回测已完成；私有模拟盘已部署；等待首批运行数据。</w:t>
-      </w:r>
-    </w:p>
-    <w:p>
-      <w:pPr>
-        <w:pStyle w:val="ListNumber"/>
-        <w:jc w:val="both"/>
-      </w:pPr>
-      <w:r>
-        <w:rPr>
-          <w:rFonts w:ascii="Songti SC" w:hAnsi="Songti SC" w:eastAsia="Songti SC" w:cs="Songti SC"/>
-          <w:color w:val="14242B"/>
-          <w:sz w:val="21"/>
-        </w:rPr>
-        <w:t>策略B：平台回测已完成；私有模拟盘已部署；等待首批运行数据。</w:t>
-      </w:r>
-    </w:p>
-    <w:p>
-      <w:pPr>
-        <w:pStyle w:val="ListNumber"/>
-        <w:jc w:val="both"/>
-      </w:pPr>
-      <w:r>
-        <w:rPr>
-          <w:rFonts w:ascii="Songti SC" w:hAnsi="Songti SC" w:eastAsia="Songti SC" w:cs="Songti SC"/>
-          <w:color w:val="14242B"/>
-          <w:sz w:val="21"/>
-        </w:rPr>
-        <w:t>策略C：平台回测已完成；私有模拟盘已部署；等待首批运行数据。</w:t>
-      </w:r>
-    </w:p>
-    <w:p>
-      <w:pPr>
-        <w:pStyle w:val="ListNumber"/>
-        <w:jc w:val="both"/>
-      </w:pPr>
-      <w:r>
-        <w:rPr>
-          <w:rFonts w:ascii="Songti SC" w:hAnsi="Songti SC" w:eastAsia="Songti SC" w:cs="Songti SC"/>
-          <w:color w:val="14242B"/>
-          <w:sz w:val="21"/>
-        </w:rPr>
-        <w:t>数据出现后只导出日期、策略代号、订单、持仓、现金、总资产和必要状态，不导出账号或访问方式。</w:t>
-      </w:r>
-    </w:p>
-    <w:p>
-      <w:pPr>
-        <w:spacing w:before="100" w:after="120" w:line="324" w:lineRule="auto"/>
-        <w:ind w:left="198" w:right="142"/>
-        <w:jc w:val="both"/>
-        <w:shd w:fill="FFF2E5"/>
-        <w:pBdr>
-          <w:left w:val="single" w:sz="18" w:space="8" w:color="D87831"/>
-        </w:pBdr>
-      </w:pPr>
-      <w:r>
-        <w:rPr>
-          <w:rFonts w:ascii="Songti SC" w:hAnsi="Songti SC" w:eastAsia="Songti SC" w:cs="Songti SC"/>
-          <w:b/>
-          <w:color w:val="14242B"/>
-          <w:sz w:val="21"/>
-        </w:rPr>
-        <w:t>模拟盘评价边界：</w:t>
-      </w:r>
-      <w:r>
-        <w:rPr>
-          <w:rFonts w:ascii="Songti SC" w:hAnsi="Songti SC" w:eastAsia="Songti SC" w:cs="Songti SC"/>
-          <w:color w:val="14242B"/>
-          <w:sz w:val="21"/>
-        </w:rPr>
-        <w:t>当前没有任何平台模拟收益可评价。至少积累一个交易日后可核对是否正常调度和下单；不足20个交易日只报告运行事实，三个月后做初步风险比较，六个月后再讨论稳定性。</w:t>
+        <w:t>表中最直接的信号是三套策略的净值均保持不变，交易次数均为0，五个交易日全部处于现金状态。策略A的MA20入场条件没有触发；策略B的MA10持续低于MA30；策略C的三只候选ETF动量得分均为负。不同规则在同一窗口给出了统一的风险规避判断，说明当时的中短期趋势强度没有达到预设入场标准。</w:t>
       </w:r>
     </w:p>
     <w:p>
@@ -3538,10 +3634,10 @@
         <w:rPr>
           <w:rFonts w:ascii="Songti SC" w:hAnsi="Songti SC" w:eastAsia="Songti SC" w:cs="Songti SC"/>
           <w:b/>
-          <w:color w:val="14242B"/>
+          <w:color w:val="000000"/>
           <w:sz w:val="24"/>
         </w:rPr>
-        <w:t>8.2 Dashboard更新链路</w:t>
+        <w:t>8.2 空仓规避了波动，也暴露出趋势信号的滞后</w:t>
       </w:r>
     </w:p>
     <w:p>
@@ -3553,10 +3649,89 @@
       <w:r>
         <w:rPr>
           <w:rFonts w:ascii="Songti SC" w:hAnsi="Songti SC" w:eastAsia="Songti SC" w:cs="Songti SC"/>
-          <w:color w:val="14242B"/>
+          <w:color w:val="000000"/>
           <w:sz w:val="21"/>
         </w:rPr>
-        <w:t>Dashboard作为持续实验记录页，每个工作日北京时间18:00通过GitHub Actions获取三只ETF与沪深300最新日线，执行数据质量检查，重算三套影子组合，再更新JSON和HTML。页面已经加入三次JoinQuant平台回测表和“3个已部署、等待数据”状态。策略卡片、净值、回撤、仓位、分阶段结果、成本压力和近期影子订单仍使用同一公开行情快照。网络源短暂失败时保留上次成功数据，并通过元数据标记回退状态，避免用空值覆盖历史。</w:t>
+        <w:t>沪深300在测试周上涨2.65%，三套策略收益均为0%，平台计算的超额收益均为-2.58%。市场价格已经上涨，滞后趋势指标仍未确认入场，反映出规则对快速反转或短促上涨行情的响应较慢。三套策略由此避开了价格波动、集中持仓和交易成本，也错过了当周上涨；测试周的主要风险表现为机会成本。</w:t>
+      </w:r>
+    </w:p>
+    <w:p>
+      <w:pPr>
+        <w:spacing w:before="0" w:after="0" w:line="360" w:lineRule="auto"/>
+        <w:ind w:firstLine="420"/>
+        <w:jc w:val="both"/>
+      </w:pPr>
+      <w:r>
+        <w:rPr>
+          <w:rFonts w:ascii="Songti SC" w:hAnsi="Songti SC" w:eastAsia="Songti SC" w:cs="Songti SC"/>
+          <w:color w:val="000000"/>
+          <w:sz w:val="21"/>
+        </w:rPr>
+        <w:t>0%回撤来自全程空仓，只能说明当周没有市场暴露，尚不能证明止损、仓位上限或轮动机制已经在持仓状态下有效控制风险。零成交也意味着该窗口没有形成可供分析的成交价格、滑点、拒单或部分成交样本。五日结果支持对信号行为和机会成本的判断，对执行质量及长期稳定性仍缺乏证据。</w:t>
+      </w:r>
+    </w:p>
+    <w:p>
+      <w:pPr>
+        <w:pStyle w:val="Heading2"/>
+        <w:keepNext/>
+        <w:spacing w:before="160" w:after="80"/>
+        <w:jc w:val="left"/>
+      </w:pPr>
+      <w:r>
+        <w:rPr>
+          <w:rFonts w:ascii="Songti SC" w:hAnsi="Songti SC" w:eastAsia="Songti SC" w:cs="Songti SC"/>
+          <w:b/>
+          <w:color w:val="000000"/>
+          <w:sz w:val="24"/>
+        </w:rPr>
+        <w:t>8.3 模拟盘已部署，部署后的实盘模拟尚未开始</w:t>
+      </w:r>
+    </w:p>
+    <w:p>
+      <w:pPr>
+        <w:spacing w:before="0" w:after="0" w:line="360" w:lineRule="auto"/>
+        <w:ind w:firstLine="420"/>
+        <w:jc w:val="both"/>
+      </w:pPr>
+      <w:r>
+        <w:rPr>
+          <w:rFonts w:ascii="Songti SC" w:hAnsi="Songti SC" w:eastAsia="Songti SC" w:cs="Songti SC"/>
+          <w:color w:val="000000"/>
+          <w:sz w:val="21"/>
+        </w:rPr>
+        <w:t>三个策略已于2026年7月24日周五分别建立独立JoinQuant模拟盘。7月25日为周六、A股休市，部署后尚未经历新的交易日，因此截至报告日期没有实际模拟订单、成交、持仓或净值变化。这里的“实盘模拟”指平台在真实交易时序下运行虚拟资金，不涉及真实资金。上一周回测复现了可获得信息和策略决策，仍缺少平台实时调度、成交价格与订单状态等执行证据，两类结果在报告中分开记录。</w:t>
+      </w:r>
+    </w:p>
+    <w:p>
+      <w:pPr>
+        <w:pStyle w:val="Heading2"/>
+        <w:keepNext/>
+        <w:spacing w:before="160" w:after="80"/>
+        <w:jc w:val="left"/>
+      </w:pPr>
+      <w:r>
+        <w:rPr>
+          <w:rFonts w:ascii="Songti SC" w:hAnsi="Songti SC" w:eastAsia="Songti SC" w:cs="Songti SC"/>
+          <w:b/>
+          <w:color w:val="000000"/>
+          <w:sz w:val="24"/>
+        </w:rPr>
+        <w:t>8.4 看板将持续更新实际模拟结果</w:t>
+      </w:r>
+    </w:p>
+    <w:p>
+      <w:pPr>
+        <w:spacing w:before="0" w:after="0" w:line="360" w:lineRule="auto"/>
+        <w:ind w:firstLine="420"/>
+        <w:jc w:val="both"/>
+      </w:pPr>
+      <w:r>
+        <w:rPr>
+          <w:rFonts w:ascii="Songti SC" w:hAnsi="Songti SC" w:eastAsia="Songti SC" w:cs="Songti SC"/>
+          <w:color w:val="000000"/>
+          <w:sz w:val="21"/>
+        </w:rPr>
+        <w:t>持续观察页面当前展示历史回测、冻结规则下的行情回放、成本敏感性和模拟盘等待状态。下一交易日起，页面将继续补充三套模拟盘的实际净值、持仓、订单、成交和风险指标，并与历史回测分区展示。这样可以直接识别理论信号与平台实际执行之间的偏差，也能避免把测试周回放误写成部署后的模拟业绩。</w:t>
       </w:r>
     </w:p>
     <w:p>
@@ -3568,20 +3743,20 @@
         <w:rPr>
           <w:rFonts w:ascii="Songti SC" w:hAnsi="Songti SC" w:eastAsia="Songti SC" w:cs="Songti SC"/>
           <w:b/>
-          <w:color w:val="14242B"/>
+          <w:color w:val="000000"/>
           <w:sz w:val="21"/>
         </w:rPr>
-        <w:t>Dashboard链接：</w:t>
+        <w:t>持续观察页面：</w:t>
       </w:r>
       <w:hyperlink r:id="rId13">
         <w:r>
           <w:rPr>
-            <w:color w:val="147D72"/>
+            <w:color w:val="000000"/>
             <w:u w:val="single"/>
             <w:rFonts w:ascii="Songti SC" w:hAnsi="Songti SC" w:eastAsia="Songti SC"/>
             <w:sz w:val="21"/>
           </w:rPr>
-          <w:t>TASK7三策略Dashboard（GitHub Pages）</w:t>
+          <w:t>TASK7三策略表现与风险观察</w:t>
         </w:r>
       </w:hyperlink>
     </w:p>
@@ -3594,10 +3769,10 @@
       <w:r>
         <w:rPr>
           <w:rFonts w:ascii="Songti SC" w:hAnsi="Songti SC" w:eastAsia="Songti SC" w:cs="Songti SC"/>
-          <w:color w:val="14242B"/>
+          <w:color w:val="000000"/>
           <w:sz w:val="21"/>
         </w:rPr>
-        <w:t>公开页内嵌最后一次成功快照，同时尝试读取同目录最新JSON，因此本地离线打开仍能展示历史内容，GitHub Pages发布后又能随工作流更新。页面明确区分“JoinQuant平台历史回测”“自动影子跟踪”和“JoinQuant实际模拟”三层，不读取账号、密码、Cookie或私有链接。平台模拟数据以后只通过用户手工导出的脱敏文件进入actual数据集，与影子净值并排显示，不混合计算。</w:t>
+        <w:t>看板公开内容不包含账户访问方式。实际模拟数据形成后，将按相同日期区间比较三套策略，并保持历史回测、行情回放和平台模拟记录三类数据相互独立。</w:t>
       </w:r>
     </w:p>
     <w:p>
@@ -3611,10 +3786,27 @@
         <w:rPr>
           <w:rFonts w:ascii="Songti SC" w:hAnsi="Songti SC" w:eastAsia="Songti SC" w:cs="Songti SC"/>
           <w:b/>
-          <w:color w:val="147D72"/>
+          <w:color w:val="000000"/>
           <w:sz w:val="28"/>
         </w:rPr>
-        <w:t>九、经验、教训与后续比较</w:t>
+        <w:t>九、结论、建议与实践反思</w:t>
+      </w:r>
+    </w:p>
+    <w:p>
+      <w:pPr>
+        <w:pStyle w:val="Heading2"/>
+        <w:keepNext/>
+        <w:spacing w:before="160" w:after="80"/>
+        <w:jc w:val="left"/>
+      </w:pPr>
+      <w:r>
+        <w:rPr>
+          <w:rFonts w:ascii="Songti SC" w:hAnsi="Songti SC" w:eastAsia="Songti SC" w:cs="Songti SC"/>
+          <w:b/>
+          <w:color w:val="000000"/>
+          <w:sz w:val="24"/>
+        </w:rPr>
+        <w:t>9.1 下一阶段以策略C为主、策略B为风险参照</w:t>
       </w:r>
     </w:p>
     <w:p>
@@ -3626,10 +3818,10 @@
       <w:r>
         <w:rPr>
           <w:rFonts w:ascii="Songti SC" w:hAnsi="Songti SC" w:eastAsia="Songti SC" w:cs="Songti SC"/>
-          <w:color w:val="14242B"/>
+          <w:color w:val="000000"/>
           <w:sz w:val="21"/>
         </w:rPr>
-        <w:t>平台模板适合学习API，却不适合直接作为投资结论。策略A的负结果说明，信号逻辑越简单，越需要先检查成本、换手和全仓暴露；只展示未扣成本净值会高估模板价值。策略B验证了风险预算确实能降低回撤，但低回撤同时来自长期现金仓位，风险控制改善不能自动转化为超额收益。策略C的社区思路经过冻结标的、周频执行和参数邻域检查后表现较好，但验证期收益集中和成本敏感性提示其仍可能依赖特定市场状态。</w:t>
+        <w:t>策略C应作为下一阶段的主要观察对象，因为它在长期回测中取得最高收益和唯一正超额，同时保持中等回撤；策略B应作为防守型参照，用于判断更低仓位是否能在真实成交环境中持续降低波动；策略A不适合作为主要方案，但保留它有助于衡量新增风控与轮动机制究竟创造了多少改进。</w:t>
       </w:r>
     </w:p>
     <w:p>
@@ -3641,10 +3833,57 @@
       <w:r>
         <w:rPr>
           <w:rFonts w:ascii="Songti SC" w:hAnsi="Songti SC" w:eastAsia="Songti SC" w:cs="Songti SC"/>
-          <w:color w:val="14242B"/>
+          <w:color w:val="000000"/>
           <w:sz w:val="21"/>
         </w:rPr>
-        <w:t>后续对比报告应以三种来源共同更新为前提。平台实际成交用于计算真实模拟净值、滑点和拒单；影子组合用于定位数据与撮合差异；平台历史基线用于判断模拟期是否偏离原风险区间。比较时同时报告收益、最大回撤、平均仓位、Beta、换手和成本，不用单一累计收益排序。模拟期积累不足20个交易日时只写运行事实，积累3个月后再做初步对比，至少6个月后才讨论策略稳定性。</w:t>
+        <w:t>后续判断不应只看累计收益。三策略对比需要同时覆盖最大回撤、平均仓位、市场Beta、换手、成本和空仓机会成本。若策略C的收益继续领先但成本和回撤明显放大，应优先降低调仓频率或仓位，避免再次追逐更短参数；若策略B长期保持低回撤但资金使用率过低，则应评估其作为组合防守层的价值，单独评价收益容易低估其风险缓冲作用。</w:t>
+      </w:r>
+    </w:p>
+    <w:p>
+      <w:pPr>
+        <w:pStyle w:val="Heading2"/>
+        <w:keepNext/>
+        <w:spacing w:before="160" w:after="80"/>
+        <w:jc w:val="left"/>
+      </w:pPr>
+      <w:r>
+        <w:rPr>
+          <w:rFonts w:ascii="Songti SC" w:hAnsi="Songti SC" w:eastAsia="Songti SC" w:cs="Songti SC"/>
+          <w:b/>
+          <w:color w:val="000000"/>
+          <w:sz w:val="24"/>
+        </w:rPr>
+        <w:t>9.2 本次实践的经验与教训</w:t>
+      </w:r>
+    </w:p>
+    <w:p>
+      <w:pPr>
+        <w:spacing w:before="0" w:after="0" w:line="360" w:lineRule="auto"/>
+        <w:ind w:firstLine="420"/>
+        <w:jc w:val="both"/>
+      </w:pPr>
+      <w:r>
+        <w:rPr>
+          <w:rFonts w:ascii="Songti SC" w:hAnsi="Songti SC" w:eastAsia="Songti SC" w:cs="Songti SC"/>
+          <w:color w:val="000000"/>
+          <w:sz w:val="21"/>
+        </w:rPr>
+        <w:t>第一，参数优化应重点考察跨阶段稳定性，单一区间的最高收益仅作参考；开发期与验证期表现方向一致，比某个窗口的峰值更有参考价值。第二，风险控制不会自动提高收益，策略B的低回撤主要来自较低仓位，必须同时评价资金使用效率。第三，测试周没有成交仍然提供了有效信号证据：三套规则在相同信息下保持现金，同时暴露了趋势判断滞后、上涨机会成本和缺少执行样本三项局限。</w:t>
+      </w:r>
+    </w:p>
+    <w:p>
+      <w:pPr>
+        <w:spacing w:before="0" w:after="0" w:line="360" w:lineRule="auto"/>
+        <w:ind w:firstLine="420"/>
+        <w:jc w:val="both"/>
+      </w:pPr>
+      <w:r>
+        <w:rPr>
+          <w:rFonts w:ascii="Songti SC" w:hAnsi="Songti SC" w:eastAsia="Songti SC" w:cs="Songti SC"/>
+          <w:color w:val="000000"/>
+          <w:sz w:val="21"/>
+        </w:rPr>
+        <w:t>最重要的教训是，长期回测、短窗口测试和模拟组合回答的是不同问题。长期回测用于识别收益与回撤结构，短窗口用于检查冻结规则在指定日期的行为，模拟组合则用于观察真实交易时序、成交和持续风险。只有保持参数冻结、统一比较区间并持续记录，后续三策略对比才具有解释力。</w:t>
       </w:r>
     </w:p>
     <w:p>
@@ -3658,7 +3897,7 @@
         <w:rPr>
           <w:rFonts w:ascii="Songti SC" w:hAnsi="Songti SC" w:eastAsia="Songti SC" w:cs="Songti SC"/>
           <w:b/>
-          <w:color w:val="147D72"/>
+          <w:color w:val="000000"/>
           <w:sz w:val="28"/>
         </w:rPr>
         <w:t>十、资料来源</w:t>
@@ -3672,7 +3911,7 @@
       <w:hyperlink r:id="rId14">
         <w:r>
           <w:rPr>
-            <w:color w:val="147D72"/>
+            <w:color w:val="000000"/>
             <w:u w:val="single"/>
             <w:rFonts w:ascii="Songti SC" w:hAnsi="Songti SC" w:eastAsia="Songti SC"/>
             <w:sz w:val="18"/>
@@ -3689,7 +3928,7 @@
       <w:hyperlink r:id="rId15">
         <w:r>
           <w:rPr>
-            <w:color w:val="147D72"/>
+            <w:color w:val="000000"/>
             <w:u w:val="single"/>
             <w:rFonts w:ascii="Songti SC" w:hAnsi="Songti SC" w:eastAsia="Songti SC"/>
             <w:sz w:val="18"/>
@@ -3706,7 +3945,7 @@
       <w:hyperlink r:id="rId16">
         <w:r>
           <w:rPr>
-            <w:color w:val="147D72"/>
+            <w:color w:val="000000"/>
             <w:u w:val="single"/>
             <w:rFonts w:ascii="Songti SC" w:hAnsi="Songti SC" w:eastAsia="Songti SC"/>
             <w:sz w:val="18"/>
@@ -3723,7 +3962,7 @@
       <w:hyperlink r:id="rId17">
         <w:r>
           <w:rPr>
-            <w:color w:val="147D72"/>
+            <w:color w:val="000000"/>
             <w:u w:val="single"/>
             <w:rFonts w:ascii="Songti SC" w:hAnsi="Songti SC" w:eastAsia="Songti SC"/>
             <w:sz w:val="18"/>
@@ -3736,7 +3975,6 @@
       <w:pPr>
         <w:pStyle w:val="Heading1"/>
         <w:keepNext/>
-        <w:pageBreakBefore/>
         <w:spacing w:before="240" w:after="120"/>
         <w:jc w:val="left"/>
       </w:pPr>
@@ -3744,10 +3982,10 @@
         <w:rPr>
           <w:rFonts w:ascii="Songti SC" w:hAnsi="Songti SC" w:eastAsia="Songti SC" w:cs="Songti SC"/>
           <w:b/>
-          <w:color w:val="147D72"/>
+          <w:color w:val="000000"/>
           <w:sz w:val="28"/>
         </w:rPr>
-        <w:t>附录：JoinQuant回测完成页</w:t>
+        <w:t>附录：聚宽回测凭证</w:t>
       </w:r>
     </w:p>
     <w:p>
@@ -3759,10 +3997,10 @@
       <w:r>
         <w:rPr>
           <w:rFonts w:ascii="Songti SC" w:hAnsi="Songti SC" w:eastAsia="Songti SC" w:cs="Songti SC"/>
-          <w:color w:val="14242B"/>
+          <w:color w:val="000000"/>
           <w:sz w:val="21"/>
         </w:rPr>
-        <w:t>以下三张截图对应本报告第五节的结构化指标。截图经隐私复核，未发现密码、Cookie、手机号或私有分享链接；图片仅用于证明策略名称、统一回测设置、完成状态和平台结果。</w:t>
+        <w:t>以下六张截图分别对应三套策略的长期回测结果，以及2026年7月20日至24日测试周回测结果。</w:t>
       </w:r>
     </w:p>
     <w:p>
@@ -3774,8 +4012,8 @@
       <w:r>
         <w:drawing>
           <wp:inline xmlns:a="http://schemas.openxmlformats.org/drawingml/2006/main" xmlns:pic="http://schemas.openxmlformats.org/drawingml/2006/picture">
-            <wp:extent cx="5577840" cy="3235764"/>
-            <wp:docPr id="5" name="Picture 5" descr="附图1：策略A（TASK7-A-MA20模板基线）JoinQuant回测完成页"/>
+            <wp:extent cx="5303520" cy="3025780"/>
+            <wp:docPr id="5" name="Picture 5" descr="附图1：策略A长期回测完成页（2019-01-01至2026-07-17）"/>
             <wp:cNvGraphicFramePr>
               <a:graphicFrameLocks noChangeAspect="1"/>
             </wp:cNvGraphicFramePr>
@@ -3783,7 +4021,7 @@
               <a:graphicData uri="http://schemas.openxmlformats.org/drawingml/2006/picture">
                 <pic:pic>
                   <pic:nvPicPr>
-                    <pic:cNvPr id="0" name="Screenshot 2026-07-24 at 23.13.04.png"/>
+                    <pic:cNvPr id="0" name="Screenshot 2026-07-25 at 00.17.55.png"/>
                     <pic:cNvPicPr/>
                   </pic:nvPicPr>
                   <pic:blipFill>
@@ -3795,7 +4033,7 @@
                   <pic:spPr>
                     <a:xfrm>
                       <a:off x="0" y="0"/>
-                      <a:ext cx="5577840" cy="3235764"/>
+                      <a:ext cx="5303520" cy="3025780"/>
                     </a:xfrm>
                     <a:prstGeom prst="rect"/>
                   </pic:spPr>
@@ -3808,16 +4046,16 @@
     </w:p>
     <w:p>
       <w:pPr>
-        <w:spacing w:after="120"/>
+        <w:spacing w:after="240"/>
         <w:jc w:val="center"/>
       </w:pPr>
       <w:r>
         <w:rPr>
           <w:rFonts w:ascii="Songti SC" w:hAnsi="Songti SC" w:eastAsia="Songti SC" w:cs="Songti SC"/>
-          <w:color w:val="61727A"/>
+          <w:color w:val="000000"/>
           <w:sz w:val="18"/>
         </w:rPr>
-        <w:t>附图1：策略A（TASK7-A-MA20模板基线）JoinQuant回测完成页</w:t>
+        <w:t>附图1：策略A长期回测完成页（2019-01-01至2026-07-17）</w:t>
       </w:r>
     </w:p>
     <w:p>
@@ -3834,8 +4072,8 @@
       <w:r>
         <w:drawing>
           <wp:inline xmlns:a="http://schemas.openxmlformats.org/drawingml/2006/main" xmlns:pic="http://schemas.openxmlformats.org/drawingml/2006/picture">
-            <wp:extent cx="5577840" cy="3206370"/>
-            <wp:docPr id="6" name="Picture 6" descr="附图2：策略B（TASK7-B-MA10_30-ATR风控）JoinQuant回测完成页"/>
+            <wp:extent cx="5303520" cy="3249458"/>
+            <wp:docPr id="6" name="Picture 6" descr="附图2：策略B长期回测完成页（2019-01-01至2026-07-17）"/>
             <wp:cNvGraphicFramePr>
               <a:graphicFrameLocks noChangeAspect="1"/>
             </wp:cNvGraphicFramePr>
@@ -3843,7 +4081,7 @@
               <a:graphicData uri="http://schemas.openxmlformats.org/drawingml/2006/picture">
                 <pic:pic>
                   <pic:nvPicPr>
-                    <pic:cNvPr id="0" name="Screenshot 2026-07-24 at 23.14.30.png"/>
+                    <pic:cNvPr id="0" name="Screenshot 2026-07-25 at 00.16.52.png"/>
                     <pic:cNvPicPr/>
                   </pic:nvPicPr>
                   <pic:blipFill>
@@ -3855,7 +4093,7 @@
                   <pic:spPr>
                     <a:xfrm>
                       <a:off x="0" y="0"/>
-                      <a:ext cx="5577840" cy="3206370"/>
+                      <a:ext cx="5303520" cy="3249458"/>
                     </a:xfrm>
                     <a:prstGeom prst="rect"/>
                   </pic:spPr>
@@ -3868,16 +4106,16 @@
     </w:p>
     <w:p>
       <w:pPr>
-        <w:spacing w:after="120"/>
+        <w:spacing w:after="240"/>
         <w:jc w:val="center"/>
       </w:pPr>
       <w:r>
         <w:rPr>
           <w:rFonts w:ascii="Songti SC" w:hAnsi="Songti SC" w:eastAsia="Songti SC" w:cs="Songti SC"/>
-          <w:color w:val="61727A"/>
+          <w:color w:val="000000"/>
           <w:sz w:val="18"/>
         </w:rPr>
-        <w:t>附图2：策略B（TASK7-B-MA10_30-ATR风控）JoinQuant回测完成页</w:t>
+        <w:t>附图2：策略B长期回测完成页（2019-01-01至2026-07-17）</w:t>
       </w:r>
     </w:p>
     <w:p>
@@ -3894,8 +4132,8 @@
       <w:r>
         <w:drawing>
           <wp:inline xmlns:a="http://schemas.openxmlformats.org/drawingml/2006/main" xmlns:pic="http://schemas.openxmlformats.org/drawingml/2006/picture">
-            <wp:extent cx="5577840" cy="3204385"/>
-            <wp:docPr id="7" name="Picture 7" descr="附图3：策略C（TASK7-C-ETF动量轮动15D）JoinQuant回测完成页"/>
+            <wp:extent cx="5303520" cy="3039567"/>
+            <wp:docPr id="7" name="Picture 7" descr="附图3：策略C长期回测完成页（2019-01-01至2026-07-17）"/>
             <wp:cNvGraphicFramePr>
               <a:graphicFrameLocks noChangeAspect="1"/>
             </wp:cNvGraphicFramePr>
@@ -3903,7 +4141,7 @@
               <a:graphicData uri="http://schemas.openxmlformats.org/drawingml/2006/picture">
                 <pic:pic>
                   <pic:nvPicPr>
-                    <pic:cNvPr id="0" name="Screenshot 2026-07-24 at 23.16.51.png"/>
+                    <pic:cNvPr id="0" name="Screenshot 2026-07-25 at 00.16.39.png"/>
                     <pic:cNvPicPr/>
                   </pic:nvPicPr>
                   <pic:blipFill>
@@ -3915,7 +4153,7 @@
                   <pic:spPr>
                     <a:xfrm>
                       <a:off x="0" y="0"/>
-                      <a:ext cx="5577840" cy="3204385"/>
+                      <a:ext cx="5303520" cy="3039567"/>
                     </a:xfrm>
                     <a:prstGeom prst="rect"/>
                   </pic:spPr>
@@ -3928,21 +4166,201 @@
     </w:p>
     <w:p>
       <w:pPr>
-        <w:spacing w:after="120"/>
+        <w:spacing w:after="240"/>
         <w:jc w:val="center"/>
       </w:pPr>
       <w:r>
         <w:rPr>
           <w:rFonts w:ascii="Songti SC" w:hAnsi="Songti SC" w:eastAsia="Songti SC" w:cs="Songti SC"/>
-          <w:color w:val="61727A"/>
+          <w:color w:val="000000"/>
           <w:sz w:val="18"/>
         </w:rPr>
-        <w:t>附图3：策略C（TASK7-C-ETF动量轮动15D）JoinQuant回测完成页</w:t>
+        <w:t>附图3：策略C长期回测完成页（2019-01-01至2026-07-17）</w:t>
+      </w:r>
+    </w:p>
+    <w:p>
+      <w:r>
+        <w:br w:type="page"/>
+      </w:r>
+    </w:p>
+    <w:p>
+      <w:pPr>
+        <w:keepNext/>
+        <w:spacing w:before="80" w:after="40"/>
+        <w:jc w:val="center"/>
+      </w:pPr>
+      <w:r>
+        <w:drawing>
+          <wp:inline xmlns:a="http://schemas.openxmlformats.org/drawingml/2006/main" xmlns:pic="http://schemas.openxmlformats.org/drawingml/2006/picture">
+            <wp:extent cx="5303520" cy="3045544"/>
+            <wp:docPr id="8" name="Picture 8" descr="附图4：策略A测试周回测完成页（2026-07-20至2026-07-24）"/>
+            <wp:cNvGraphicFramePr>
+              <a:graphicFrameLocks noChangeAspect="1"/>
+            </wp:cNvGraphicFramePr>
+            <a:graphic>
+              <a:graphicData uri="http://schemas.openxmlformats.org/drawingml/2006/picture">
+                <pic:pic>
+                  <pic:nvPicPr>
+                    <pic:cNvPr id="0" name="Screenshot 2026-07-25 at 00.19.23.png"/>
+                    <pic:cNvPicPr/>
+                  </pic:nvPicPr>
+                  <pic:blipFill>
+                    <a:blip r:embed="rId21"/>
+                    <a:stretch>
+                      <a:fillRect/>
+                    </a:stretch>
+                  </pic:blipFill>
+                  <pic:spPr>
+                    <a:xfrm>
+                      <a:off x="0" y="0"/>
+                      <a:ext cx="5303520" cy="3045544"/>
+                    </a:xfrm>
+                    <a:prstGeom prst="rect"/>
+                  </pic:spPr>
+                </pic:pic>
+              </a:graphicData>
+            </a:graphic>
+          </wp:inline>
+        </w:drawing>
+      </w:r>
+    </w:p>
+    <w:p>
+      <w:pPr>
+        <w:spacing w:after="240"/>
+        <w:jc w:val="center"/>
+      </w:pPr>
+      <w:r>
+        <w:rPr>
+          <w:rFonts w:ascii="Songti SC" w:hAnsi="Songti SC" w:eastAsia="Songti SC" w:cs="Songti SC"/>
+          <w:color w:val="000000"/>
+          <w:sz w:val="18"/>
+        </w:rPr>
+        <w:t>附图4：策略A测试周回测完成页（2026-07-20至2026-07-24）</w:t>
+      </w:r>
+    </w:p>
+    <w:p>
+      <w:r>
+        <w:br w:type="page"/>
+      </w:r>
+    </w:p>
+    <w:p>
+      <w:pPr>
+        <w:keepNext/>
+        <w:spacing w:before="80" w:after="40"/>
+        <w:jc w:val="center"/>
+      </w:pPr>
+      <w:r>
+        <w:drawing>
+          <wp:inline xmlns:a="http://schemas.openxmlformats.org/drawingml/2006/main" xmlns:pic="http://schemas.openxmlformats.org/drawingml/2006/picture">
+            <wp:extent cx="5303520" cy="3042590"/>
+            <wp:docPr id="9" name="Picture 9" descr="附图5：策略B测试周回测完成页（2026-07-20至2026-07-24）"/>
+            <wp:cNvGraphicFramePr>
+              <a:graphicFrameLocks noChangeAspect="1"/>
+            </wp:cNvGraphicFramePr>
+            <a:graphic>
+              <a:graphicData uri="http://schemas.openxmlformats.org/drawingml/2006/picture">
+                <pic:pic>
+                  <pic:nvPicPr>
+                    <pic:cNvPr id="0" name="Screenshot 2026-07-25 at 00.19.11.png"/>
+                    <pic:cNvPicPr/>
+                  </pic:nvPicPr>
+                  <pic:blipFill>
+                    <a:blip r:embed="rId22"/>
+                    <a:stretch>
+                      <a:fillRect/>
+                    </a:stretch>
+                  </pic:blipFill>
+                  <pic:spPr>
+                    <a:xfrm>
+                      <a:off x="0" y="0"/>
+                      <a:ext cx="5303520" cy="3042590"/>
+                    </a:xfrm>
+                    <a:prstGeom prst="rect"/>
+                  </pic:spPr>
+                </pic:pic>
+              </a:graphicData>
+            </a:graphic>
+          </wp:inline>
+        </w:drawing>
+      </w:r>
+    </w:p>
+    <w:p>
+      <w:pPr>
+        <w:spacing w:after="240"/>
+        <w:jc w:val="center"/>
+      </w:pPr>
+      <w:r>
+        <w:rPr>
+          <w:rFonts w:ascii="Songti SC" w:hAnsi="Songti SC" w:eastAsia="Songti SC" w:cs="Songti SC"/>
+          <w:color w:val="000000"/>
+          <w:sz w:val="18"/>
+        </w:rPr>
+        <w:t>附图5：策略B测试周回测完成页（2026-07-20至2026-07-24）</w:t>
+      </w:r>
+    </w:p>
+    <w:p>
+      <w:r>
+        <w:br w:type="page"/>
+      </w:r>
+    </w:p>
+    <w:p>
+      <w:pPr>
+        <w:keepNext/>
+        <w:spacing w:before="80" w:after="40"/>
+        <w:jc w:val="center"/>
+      </w:pPr>
+      <w:r>
+        <w:drawing>
+          <wp:inline xmlns:a="http://schemas.openxmlformats.org/drawingml/2006/main" xmlns:pic="http://schemas.openxmlformats.org/drawingml/2006/picture">
+            <wp:extent cx="5303520" cy="3047419"/>
+            <wp:docPr id="10" name="Picture 10" descr="附图6：策略C测试周回测完成页（2026-07-20至2026-07-24）"/>
+            <wp:cNvGraphicFramePr>
+              <a:graphicFrameLocks noChangeAspect="1"/>
+            </wp:cNvGraphicFramePr>
+            <a:graphic>
+              <a:graphicData uri="http://schemas.openxmlformats.org/drawingml/2006/picture">
+                <pic:pic>
+                  <pic:nvPicPr>
+                    <pic:cNvPr id="0" name="Screenshot 2026-07-25 at 00.19.00.png"/>
+                    <pic:cNvPicPr/>
+                  </pic:nvPicPr>
+                  <pic:blipFill>
+                    <a:blip r:embed="rId23"/>
+                    <a:stretch>
+                      <a:fillRect/>
+                    </a:stretch>
+                  </pic:blipFill>
+                  <pic:spPr>
+                    <a:xfrm>
+                      <a:off x="0" y="0"/>
+                      <a:ext cx="5303520" cy="3047419"/>
+                    </a:xfrm>
+                    <a:prstGeom prst="rect"/>
+                  </pic:spPr>
+                </pic:pic>
+              </a:graphicData>
+            </a:graphic>
+          </wp:inline>
+        </w:drawing>
+      </w:r>
+    </w:p>
+    <w:p>
+      <w:pPr>
+        <w:spacing w:after="240"/>
+        <w:jc w:val="center"/>
+      </w:pPr>
+      <w:r>
+        <w:rPr>
+          <w:rFonts w:ascii="Songti SC" w:hAnsi="Songti SC" w:eastAsia="Songti SC" w:cs="Songti SC"/>
+          <w:color w:val="000000"/>
+          <w:sz w:val="18"/>
+        </w:rPr>
+        <w:t>附图6：策略C测试周回测完成页（2026-07-20至2026-07-24）</w:t>
       </w:r>
     </w:p>
     <w:sectPr>
       <w:pgSz w:w="12240" w:h="15840"/>
-      <w:pgMar w:top="1440" w:right="1440" w:bottom="1440" w:left="1440" w:header="708" w:footer="708" w:gutter="0"/>
+      <w:pgMar w:top="1440" w:right="1800" w:bottom="1440" w:left="1800" w:header="708" w:footer="708" w:gutter="0"/>
       <w:cols w:space="720"/>
       <w:docGrid w:linePitch="360"/>
     </w:sectPr>
@@ -4384,7 +4802,7 @@
       <w:rFonts w:asciiTheme="majorHAnsi" w:eastAsiaTheme="majorEastAsia" w:hAnsiTheme="majorHAnsi" w:cstheme="majorBidi" w:ascii="Songti SC" w:hAnsi="Songti SC" w:eastAsia="Songti SC"/>
       <w:b/>
       <w:bCs/>
-      <w:color w:val="147D72"/>
+      <w:color w:val="000000"/>
       <w:sz w:val="28"/>
       <w:szCs w:val="28"/>
     </w:rPr>
@@ -4408,7 +4826,7 @@
       <w:rFonts w:asciiTheme="majorHAnsi" w:eastAsiaTheme="majorEastAsia" w:hAnsiTheme="majorHAnsi" w:cstheme="majorBidi" w:ascii="Songti SC" w:hAnsi="Songti SC" w:eastAsia="Songti SC"/>
       <w:b/>
       <w:bCs/>
-      <w:color w:val="14242B"/>
+      <w:color w:val="000000"/>
       <w:sz w:val="24"/>
       <w:szCs w:val="26"/>
     </w:rPr>

</xml_diff>